<commit_message>
Prototype 1 doc uptade
Refocused prototype 1 on food first. Added specifications on work method for DeepSeek in technocal doc
</commit_message>
<xml_diff>
--- a/Docs/Prototipo 1.docx
+++ b/Docs/Prototipo 1.docx
@@ -634,35 +634,49 @@
           <w:bCs/>
           <w:lang w:val="it-IT"/>
         </w:rPr>
-        <w:t>MVP1 – Lo spostamento e la raccolta</w:t>
-      </w:r>
-    </w:p>
-    <w:p>
-      <w:pPr>
-        <w:rPr>
-          <w:lang w:val="it-IT"/>
-        </w:rPr>
-      </w:pPr>
-      <w:r>
+        <w:t>MVP1 – Raccolta cibo e sopravvivenza base</w:t>
+      </w:r>
+    </w:p>
+    <w:p>
+      <w:pPr>
+        <w:rPr>
+          <w:lang w:val="it-IT"/>
+        </w:rPr>
+      </w:pPr>
+      <w:r>
+        <w:rPr>
+          <w:lang w:val="it-IT"/>
+        </w:rPr>
+        <w:t>Obiettivo generale</w:t>
+      </w:r>
+      <w:r>
+        <w:rPr>
+          <w:lang w:val="it-IT"/>
+        </w:rPr>
+        <w:br/>
+        <w:t>Il giocatore controlla un gruppo di raccoglitori, può spostarli su una mappa continua, raccogliere cibo vegetale, vedere le zone impoverirsi e rigenerarsi, e gestire le scorte che vengono consumate nel tempo. Il loop base è: esplorare, raccogliere, tornare al campo, sopravvivere.</w:t>
+      </w:r>
+    </w:p>
+    <w:p>
+      <w:pPr>
         <w:rPr>
           <w:b/>
           <w:bCs/>
-          <w:lang w:val="it-IT"/>
-        </w:rPr>
-        <w:t>Obiettivo:</w:t>
-      </w:r>
-      <w:r>
-        <w:rPr>
-          <w:lang w:val="it-IT"/>
-        </w:rPr>
-        <w:t> far muovere un gruppo su una mappa continua, fargli raccogliere una risorsa, tornare, vedere la risorsa accumularsi.</w:t>
+        </w:rPr>
+      </w:pPr>
+      <w:r>
+        <w:rPr>
+          <w:b/>
+          <w:bCs/>
+        </w:rPr>
+        <w:t>Batch 1 – Setup Phaser funzionante</w:t>
       </w:r>
     </w:p>
     <w:p>
       <w:pPr>
         <w:numPr>
           <w:ilvl w:val="0"/>
-          <w:numId w:val="9"/>
+          <w:numId w:val="23"/>
         </w:numPr>
         <w:rPr>
           <w:lang w:val="it-IT"/>
@@ -672,25 +686,31 @@
         <w:rPr>
           <w:lang w:val="it-IT"/>
         </w:rPr>
-        <w:t>Mappa 2D generata staticamente (foresta, campo base).</w:t>
+        <w:t>Installazione di Phaser 3 via CDN.</w:t>
       </w:r>
     </w:p>
     <w:p>
       <w:pPr>
         <w:numPr>
           <w:ilvl w:val="0"/>
-          <w:numId w:val="9"/>
+          <w:numId w:val="23"/>
         </w:numPr>
-      </w:pPr>
-      <w:r>
-        <w:t>Un "pop" di 10 raccoglitori.</w:t>
+        <w:rPr>
+          <w:lang w:val="it-IT"/>
+        </w:rPr>
+      </w:pPr>
+      <w:r>
+        <w:rPr>
+          <w:lang w:val="it-IT"/>
+        </w:rPr>
+        <w:t>Struttura base di index.html, main.js, style.css.</w:t>
       </w:r>
     </w:p>
     <w:p>
       <w:pPr>
         <w:numPr>
           <w:ilvl w:val="0"/>
-          <w:numId w:val="9"/>
+          <w:numId w:val="23"/>
         </w:numPr>
         <w:rPr>
           <w:lang w:val="it-IT"/>
@@ -700,14 +720,14 @@
         <w:rPr>
           <w:lang w:val="it-IT"/>
         </w:rPr>
-        <w:t>Click sulla foresta → il gruppo si muove (velocità costante, linea retta o A* semplice).</w:t>
+        <w:t>Canvas visualizzato correttamente nel browser.</w:t>
       </w:r>
     </w:p>
     <w:p>
       <w:pPr>
         <w:numPr>
           <w:ilvl w:val="0"/>
-          <w:numId w:val="9"/>
+          <w:numId w:val="23"/>
         </w:numPr>
         <w:rPr>
           <w:lang w:val="it-IT"/>
@@ -717,14 +737,31 @@
         <w:rPr>
           <w:lang w:val="it-IT"/>
         </w:rPr>
-        <w:t>Arrivato, dopo X secondi raccoglie legna.</w:t>
+        <w:t>Nessuna meccanica di gioco, solo infrastruttura tecnica.</w:t>
+      </w:r>
+    </w:p>
+    <w:p>
+      <w:pPr>
+        <w:rPr>
+          <w:b/>
+          <w:bCs/>
+          <w:lang w:val="it-IT"/>
+        </w:rPr>
+      </w:pPr>
+      <w:r>
+        <w:rPr>
+          <w:b/>
+          <w:bCs/>
+          <w:lang w:val="it-IT"/>
+        </w:rPr>
+        <w:t>Batch 2 – Griglia spaziale e mappa con zone di cibo</w:t>
       </w:r>
     </w:p>
     <w:p>
       <w:pPr>
         <w:numPr>
           <w:ilvl w:val="0"/>
-          <w:numId w:val="9"/>
+          <w:numId w:val="24"/>
         </w:numPr>
         <w:rPr>
           <w:lang w:val="it-IT"/>
@@ -734,36 +771,100 @@
         <w:rPr>
           <w:lang w:val="it-IT"/>
         </w:rPr>
-        <w:t>Click sul campo base → torna e scarica.</w:t>
+        <w:t>Implementazione della griglia spaziale nascosta (world.js).</w:t>
       </w:r>
     </w:p>
     <w:p>
       <w:pPr>
         <w:numPr>
           <w:ilvl w:val="0"/>
-          <w:numId w:val="9"/>
+          <w:numId w:val="24"/>
         </w:numPr>
-      </w:pPr>
-      <w:r>
-        <w:t>Contatore legna che sale.</w:t>
+        <w:rPr>
+          <w:lang w:val="it-IT"/>
+        </w:rPr>
+      </w:pPr>
+      <w:r>
+        <w:rPr>
+          <w:lang w:val="it-IT"/>
+        </w:rPr>
+        <w:t>Layer forageDensity con distribuzione non uniforme:</w:t>
+      </w:r>
+    </w:p>
+    <w:p>
+      <w:pPr>
+        <w:numPr>
+          <w:ilvl w:val="1"/>
+          <w:numId w:val="24"/>
+        </w:numPr>
+        <w:rPr>
+          <w:lang w:val="it-IT"/>
+        </w:rPr>
+      </w:pPr>
+      <w:r>
+        <w:rPr>
+          <w:lang w:val="it-IT"/>
+        </w:rPr>
+        <w:lastRenderedPageBreak/>
+        <w:t>Zone ad alta densità (macchie di bacche) rappresentate visivamente con colori più intensi.</w:t>
+      </w:r>
+    </w:p>
+    <w:p>
+      <w:pPr>
+        <w:numPr>
+          <w:ilvl w:val="1"/>
+          <w:numId w:val="24"/>
+        </w:numPr>
+        <w:rPr>
+          <w:lang w:val="it-IT"/>
+        </w:rPr>
+      </w:pPr>
+      <w:r>
+        <w:rPr>
+          <w:lang w:val="it-IT"/>
+        </w:rPr>
+        <w:t>Zone a bassa densità con colori tenui.</w:t>
+      </w:r>
+    </w:p>
+    <w:p>
+      <w:pPr>
+        <w:numPr>
+          <w:ilvl w:val="1"/>
+          <w:numId w:val="24"/>
+        </w:numPr>
+        <w:rPr>
+          <w:lang w:val="it-IT"/>
+        </w:rPr>
+      </w:pPr>
+      <w:r>
+        <w:rPr>
+          <w:lang w:val="it-IT"/>
+        </w:rPr>
+        <w:t>Zone a densità zero senza colore.</w:t>
       </w:r>
     </w:p>
     <w:p>
       <w:pPr>
         <w:numPr>
           <w:ilvl w:val="0"/>
-          <w:numId w:val="9"/>
+          <w:numId w:val="24"/>
         </w:numPr>
-      </w:pPr>
-      <w:r>
-        <w:t>Pausa/play funzionante.</w:t>
+        <w:rPr>
+          <w:lang w:val="it-IT"/>
+        </w:rPr>
+      </w:pPr>
+      <w:r>
+        <w:rPr>
+          <w:lang w:val="it-IT"/>
+        </w:rPr>
+        <w:t>Visualizzazione di debug: ogni cella della griglia è colorata in base alla densità, così il giocatore può vedere dove il cibo è più abbondante.</w:t>
       </w:r>
     </w:p>
     <w:p>
       <w:pPr>
         <w:numPr>
           <w:ilvl w:val="0"/>
-          <w:numId w:val="9"/>
+          <w:numId w:val="24"/>
         </w:numPr>
         <w:rPr>
           <w:lang w:val="it-IT"/>
@@ -773,7 +874,7 @@
         <w:rPr>
           <w:lang w:val="it-IT"/>
         </w:rPr>
-        <w:t>Nessun consumo cibo, nessuna riproduzione, nessun errore di posizione.</w:t>
+        <w:t>Meccanica: il mondo contiene risorse diffuse; il giocatore distingue a colpo d'occhio le aree più ricche e decide dove mandare i raccoglitori.</w:t>
       </w:r>
     </w:p>
     <w:p>
@@ -788,7 +889,1039 @@
           <w:b/>
           <w:bCs/>
         </w:rPr>
-        <w:t>MVP1.5 – UI e feedback visivo</w:t>
+        <w:t>Batch 3 – Pop e movimento</w:t>
+      </w:r>
+    </w:p>
+    <w:p>
+      <w:pPr>
+        <w:numPr>
+          <w:ilvl w:val="0"/>
+          <w:numId w:val="25"/>
+        </w:numPr>
+        <w:rPr>
+          <w:lang w:val="it-IT"/>
+        </w:rPr>
+      </w:pPr>
+      <w:r>
+        <w:rPr>
+          <w:lang w:val="it-IT"/>
+        </w:rPr>
+        <w:t>Definizione della classe base per entità mobili e della classe Pop (units.js).</w:t>
+      </w:r>
+    </w:p>
+    <w:p>
+      <w:pPr>
+        <w:numPr>
+          <w:ilvl w:val="0"/>
+          <w:numId w:val="25"/>
+        </w:numPr>
+        <w:rPr>
+          <w:lang w:val="it-IT"/>
+        </w:rPr>
+      </w:pPr>
+      <w:r>
+        <w:rPr>
+          <w:lang w:val="it-IT"/>
+        </w:rPr>
+        <w:t>Un pop (gruppo di raccoglitori) appare sulla mappa.</w:t>
+      </w:r>
+    </w:p>
+    <w:p>
+      <w:pPr>
+        <w:numPr>
+          <w:ilvl w:val="0"/>
+          <w:numId w:val="25"/>
+        </w:numPr>
+        <w:rPr>
+          <w:lang w:val="it-IT"/>
+        </w:rPr>
+      </w:pPr>
+      <w:r>
+        <w:rPr>
+          <w:lang w:val="it-IT"/>
+        </w:rPr>
+        <w:t>Click su un punto qualsiasi della mappa: il pop si muove in modo continuo, senza scatti, verso quella posizione.</w:t>
+      </w:r>
+    </w:p>
+    <w:p>
+      <w:pPr>
+        <w:numPr>
+          <w:ilvl w:val="0"/>
+          <w:numId w:val="25"/>
+        </w:numPr>
+      </w:pPr>
+      <w:r>
+        <w:rPr>
+          <w:lang w:val="it-IT"/>
+        </w:rPr>
+        <w:t xml:space="preserve">Meccanica: interazione diretta con il mondo. Non esistono griglie visibili che vincolano il movimento. </w:t>
+      </w:r>
+      <w:r>
+        <w:t>Il giocatore sposta fisicamente la sua gente.</w:t>
+      </w:r>
+    </w:p>
+    <w:p>
+      <w:pPr>
+        <w:rPr>
+          <w:b/>
+          <w:bCs/>
+          <w:lang w:val="it-IT"/>
+        </w:rPr>
+      </w:pPr>
+      <w:r>
+        <w:rPr>
+          <w:b/>
+          <w:bCs/>
+          <w:lang w:val="it-IT"/>
+        </w:rPr>
+        <w:t>Batch 4 – Raccolta cibo e riduzione della densità</w:t>
+      </w:r>
+    </w:p>
+    <w:p>
+      <w:pPr>
+        <w:numPr>
+          <w:ilvl w:val="0"/>
+          <w:numId w:val="26"/>
+        </w:numPr>
+        <w:rPr>
+          <w:lang w:val="it-IT"/>
+        </w:rPr>
+      </w:pPr>
+      <w:r>
+        <w:rPr>
+          <w:lang w:val="it-IT"/>
+        </w:rPr>
+        <w:t>Quando il pop arriva su una cella con forageDensity maggiore di zero, inizia automaticamente a raccogliere cibo.</w:t>
+      </w:r>
+    </w:p>
+    <w:p>
+      <w:pPr>
+        <w:numPr>
+          <w:ilvl w:val="0"/>
+          <w:numId w:val="26"/>
+        </w:numPr>
+        <w:rPr>
+          <w:lang w:val="it-IT"/>
+        </w:rPr>
+      </w:pPr>
+      <w:r>
+        <w:rPr>
+          <w:lang w:val="it-IT"/>
+        </w:rPr>
+        <w:t>La quantità di cibo raccolta per secondo è proporzionale alla densità locale: zone ricche rendono di più, zone povere di meno.</w:t>
+      </w:r>
+    </w:p>
+    <w:p>
+      <w:pPr>
+        <w:numPr>
+          <w:ilvl w:val="0"/>
+          <w:numId w:val="26"/>
+        </w:numPr>
+        <w:rPr>
+          <w:lang w:val="it-IT"/>
+        </w:rPr>
+      </w:pPr>
+      <w:r>
+        <w:rPr>
+          <w:lang w:val="it-IT"/>
+        </w:rPr>
+        <w:t>La funzione modifyDensity riduce la densità della cella e di quelle vicine (raggio configurabile), simulando un prelievo localizzato.</w:t>
+      </w:r>
+    </w:p>
+    <w:p>
+      <w:pPr>
+        <w:numPr>
+          <w:ilvl w:val="0"/>
+          <w:numId w:val="26"/>
+        </w:numPr>
+        <w:rPr>
+          <w:lang w:val="it-IT"/>
+        </w:rPr>
+      </w:pPr>
+      <w:r>
+        <w:rPr>
+          <w:lang w:val="it-IT"/>
+        </w:rPr>
+        <w:t>Se la densità arriva a zero, quella zona è temporaneamente esaurita e non produce più cibo.</w:t>
+      </w:r>
+    </w:p>
+    <w:p>
+      <w:pPr>
+        <w:numPr>
+          <w:ilvl w:val="0"/>
+          <w:numId w:val="26"/>
+        </w:numPr>
+        <w:rPr>
+          <w:lang w:val="it-IT"/>
+        </w:rPr>
+      </w:pPr>
+      <w:r>
+        <w:rPr>
+          <w:lang w:val="it-IT"/>
+        </w:rPr>
+        <w:t>Meccanica: il giocatore vede le zone impoverirsi dopo la raccolta. Deve decidere se insistere su una zona ricca rischiando di esaurirla, o spostarsi altrove.</w:t>
+      </w:r>
+    </w:p>
+    <w:p>
+      <w:pPr>
+        <w:rPr>
+          <w:b/>
+          <w:bCs/>
+          <w:lang w:val="it-IT"/>
+        </w:rPr>
+      </w:pPr>
+      <w:r>
+        <w:rPr>
+          <w:b/>
+          <w:bCs/>
+          <w:lang w:val="it-IT"/>
+        </w:rPr>
+        <w:t>Batch 5 – Rientro al campo, scorta e consumo</w:t>
+      </w:r>
+    </w:p>
+    <w:p>
+      <w:pPr>
+        <w:numPr>
+          <w:ilvl w:val="0"/>
+          <w:numId w:val="27"/>
+        </w:numPr>
+        <w:rPr>
+          <w:lang w:val="it-IT"/>
+        </w:rPr>
+      </w:pPr>
+      <w:r>
+        <w:rPr>
+          <w:lang w:val="it-IT"/>
+        </w:rPr>
+        <w:t>Definizione di un punto base (accampamento) sulla mappa.</w:t>
+      </w:r>
+    </w:p>
+    <w:p>
+      <w:pPr>
+        <w:numPr>
+          <w:ilvl w:val="0"/>
+          <w:numId w:val="27"/>
+        </w:numPr>
+        <w:rPr>
+          <w:lang w:val="it-IT"/>
+        </w:rPr>
+      </w:pPr>
+      <w:r>
+        <w:rPr>
+          <w:lang w:val="it-IT"/>
+        </w:rPr>
+        <w:t>Il giocatore può cliccare sull'accampamento per ordinare al pop di tornare e scaricare il cibo raccolto.</w:t>
+      </w:r>
+    </w:p>
+    <w:p>
+      <w:pPr>
+        <w:numPr>
+          <w:ilvl w:val="0"/>
+          <w:numId w:val="27"/>
+        </w:numPr>
+        <w:rPr>
+          <w:lang w:val="it-IT"/>
+        </w:rPr>
+      </w:pPr>
+      <w:r>
+        <w:rPr>
+          <w:lang w:val="it-IT"/>
+        </w:rPr>
+        <w:t>Un contatore globale mostra le scorte di cibo della tribù.</w:t>
+      </w:r>
+    </w:p>
+    <w:p>
+      <w:pPr>
+        <w:numPr>
+          <w:ilvl w:val="0"/>
+          <w:numId w:val="27"/>
+        </w:numPr>
+        <w:rPr>
+          <w:lang w:val="it-IT"/>
+        </w:rPr>
+      </w:pPr>
+      <w:r>
+        <w:rPr>
+          <w:lang w:val="it-IT"/>
+        </w:rPr>
+        <w:lastRenderedPageBreak/>
+        <w:t>Introduzione del consumo: ogni giorno di gioco (intervallo configurabile) una quantità di cibo viene sottratta dalle scorte in base al numero di pop presenti.</w:t>
+      </w:r>
+    </w:p>
+    <w:p>
+      <w:pPr>
+        <w:numPr>
+          <w:ilvl w:val="0"/>
+          <w:numId w:val="27"/>
+        </w:numPr>
+        <w:rPr>
+          <w:lang w:val="it-IT"/>
+        </w:rPr>
+      </w:pPr>
+      <w:r>
+        <w:rPr>
+          <w:lang w:val="it-IT"/>
+        </w:rPr>
+        <w:t>Se le scorte arrivano a zero, per ora viene mostrato un avviso; in futuro comporterà la morte dei pop.</w:t>
+      </w:r>
+    </w:p>
+    <w:p>
+      <w:pPr>
+        <w:numPr>
+          <w:ilvl w:val="0"/>
+          <w:numId w:val="27"/>
+        </w:numPr>
+        <w:rPr>
+          <w:lang w:val="it-IT"/>
+        </w:rPr>
+      </w:pPr>
+      <w:r>
+        <w:rPr>
+          <w:lang w:val="it-IT"/>
+        </w:rPr>
+        <w:t>Meccanica: il giocatore deve bilanciare la raccolta con il consumo costante. Non basta accumulare, bisogna mantenere un flusso positivo. Il ritorno al campo diventa una decisione strategica: tornare troppo presto spreca tempo di viaggio, tornare troppo tardi rischia di far esaurire le scorte.</w:t>
+      </w:r>
+    </w:p>
+    <w:p>
+      <w:pPr>
+        <w:rPr>
+          <w:b/>
+          <w:bCs/>
+          <w:lang w:val="it-IT"/>
+        </w:rPr>
+      </w:pPr>
+      <w:r>
+        <w:rPr>
+          <w:b/>
+          <w:bCs/>
+          <w:lang w:val="it-IT"/>
+        </w:rPr>
+        <w:t>Batch 6 – Controlli del tempo (pausa, play, velocità)</w:t>
+      </w:r>
+    </w:p>
+    <w:p>
+      <w:pPr>
+        <w:numPr>
+          <w:ilvl w:val="0"/>
+          <w:numId w:val="28"/>
+        </w:numPr>
+        <w:rPr>
+          <w:lang w:val="it-IT"/>
+        </w:rPr>
+      </w:pPr>
+      <w:r>
+        <w:rPr>
+          <w:lang w:val="it-IT"/>
+        </w:rPr>
+        <w:t>Implementazione del TimeManager (time.js).</w:t>
+      </w:r>
+    </w:p>
+    <w:p>
+      <w:pPr>
+        <w:numPr>
+          <w:ilvl w:val="0"/>
+          <w:numId w:val="28"/>
+        </w:numPr>
+        <w:rPr>
+          <w:lang w:val="it-IT"/>
+        </w:rPr>
+      </w:pPr>
+      <w:r>
+        <w:rPr>
+          <w:lang w:val="it-IT"/>
+        </w:rPr>
+        <w:t>Tre velocità di simulazione: 1x (normale), 2x (accelerata), 0x (pausa).</w:t>
+      </w:r>
+    </w:p>
+    <w:p>
+      <w:pPr>
+        <w:numPr>
+          <w:ilvl w:val="0"/>
+          <w:numId w:val="28"/>
+        </w:numPr>
+        <w:rPr>
+          <w:lang w:val="it-IT"/>
+        </w:rPr>
+      </w:pPr>
+      <w:r>
+        <w:rPr>
+          <w:lang w:val="it-IT"/>
+        </w:rPr>
+        <w:t>Interfaccia minima: pulsanti o tasti per cambiare velocità.</w:t>
+      </w:r>
+    </w:p>
+    <w:p>
+      <w:pPr>
+        <w:numPr>
+          <w:ilvl w:val="0"/>
+          <w:numId w:val="28"/>
+        </w:numPr>
+        <w:rPr>
+          <w:lang w:val="it-IT"/>
+        </w:rPr>
+      </w:pPr>
+      <w:r>
+        <w:rPr>
+          <w:lang w:val="it-IT"/>
+        </w:rPr>
+        <w:t>La raccolta, il movimento e il consumo dipendono dal tempo di gioco effettivo, non dal framerate.</w:t>
+      </w:r>
+    </w:p>
+    <w:p>
+      <w:pPr>
+        <w:numPr>
+          <w:ilvl w:val="0"/>
+          <w:numId w:val="28"/>
+        </w:numPr>
+        <w:rPr>
+          <w:lang w:val="it-IT"/>
+        </w:rPr>
+      </w:pPr>
+      <w:r>
+        <w:rPr>
+          <w:lang w:val="it-IT"/>
+        </w:rPr>
+        <w:t>Meccanica: il giocatore può mettere in pausa per pianificare con calma, o accelerare quando non ci sono decisioni urgenti. Questo è il primo passo verso il pilastro "tempo reale con controllo del ritmo".</w:t>
+      </w:r>
+    </w:p>
+    <w:p>
+      <w:pPr>
+        <w:rPr>
+          <w:b/>
+          <w:bCs/>
+        </w:rPr>
+      </w:pPr>
+      <w:r>
+        <w:rPr>
+          <w:b/>
+          <w:bCs/>
+        </w:rPr>
+        <w:t>Batch 7 – Rigenerazione base del cibo</w:t>
+      </w:r>
+    </w:p>
+    <w:p>
+      <w:pPr>
+        <w:numPr>
+          <w:ilvl w:val="0"/>
+          <w:numId w:val="29"/>
+        </w:numPr>
+        <w:rPr>
+          <w:lang w:val="it-IT"/>
+        </w:rPr>
+      </w:pPr>
+      <w:r>
+        <w:rPr>
+          <w:lang w:val="it-IT"/>
+        </w:rPr>
+        <w:t>Le celle con forageDensity si rigenerano lentamente nel tempo (es. una piccola frazione al giorno).</w:t>
+      </w:r>
+    </w:p>
+    <w:p>
+      <w:pPr>
+        <w:numPr>
+          <w:ilvl w:val="0"/>
+          <w:numId w:val="29"/>
+        </w:numPr>
+        <w:rPr>
+          <w:lang w:val="it-IT"/>
+        </w:rPr>
+      </w:pPr>
+      <w:r>
+        <w:rPr>
+          <w:lang w:val="it-IT"/>
+        </w:rPr>
+        <w:t>La rigenerazione è più rapida in celle con densità bassa, per simulare la ricrescita naturale.</w:t>
+      </w:r>
+    </w:p>
+    <w:p>
+      <w:pPr>
+        <w:numPr>
+          <w:ilvl w:val="0"/>
+          <w:numId w:val="29"/>
+        </w:numPr>
+        <w:rPr>
+          <w:lang w:val="it-IT"/>
+        </w:rPr>
+      </w:pPr>
+      <w:r>
+        <w:rPr>
+          <w:lang w:val="it-IT"/>
+        </w:rPr>
+        <w:t>Una zona completamente esaurita (densità zero) impiega più tempo a iniziare a rigenerare.</w:t>
+      </w:r>
+    </w:p>
+    <w:p>
+      <w:pPr>
+        <w:numPr>
+          <w:ilvl w:val="0"/>
+          <w:numId w:val="29"/>
+        </w:numPr>
+        <w:rPr>
+          <w:lang w:val="it-IT"/>
+        </w:rPr>
+      </w:pPr>
+      <w:r>
+        <w:rPr>
+          <w:lang w:val="it-IT"/>
+        </w:rPr>
+        <w:t>Meccanica: il giocatore non può esaurire una zona per sempre, ma deve ruotare le aree di raccolta per non restare senza cibo. Questo introduce una prima forma di gestione sostenibile delle risorse.</w:t>
+      </w:r>
+    </w:p>
+    <w:p>
+      <w:pPr>
+        <w:rPr>
+          <w:b/>
+          <w:bCs/>
+          <w:lang w:val="it-IT"/>
+        </w:rPr>
+      </w:pPr>
+      <w:r>
+        <w:rPr>
+          <w:b/>
+          <w:bCs/>
+          <w:lang w:val="it-IT"/>
+        </w:rPr>
+        <w:t>Dopo il Batch 7</w:t>
+      </w:r>
+      <w:r>
+        <w:rPr>
+          <w:b/>
+          <w:bCs/>
+          <w:lang w:val="it-IT"/>
+        </w:rPr>
+        <w:br/>
+        <w:t>Al termine di MVP1 avremo un loop di sopravvivenza funzionante:</w:t>
+      </w:r>
+    </w:p>
+    <w:p>
+      <w:pPr>
+        <w:numPr>
+          <w:ilvl w:val="0"/>
+          <w:numId w:val="30"/>
+        </w:numPr>
+        <w:rPr>
+          <w:lang w:val="it-IT"/>
+        </w:rPr>
+      </w:pPr>
+      <w:r>
+        <w:rPr>
+          <w:lang w:val="it-IT"/>
+        </w:rPr>
+        <w:t>Il giocatore sposta i raccoglitori sulla mappa.</w:t>
+      </w:r>
+    </w:p>
+    <w:p>
+      <w:pPr>
+        <w:numPr>
+          <w:ilvl w:val="0"/>
+          <w:numId w:val="30"/>
+        </w:numPr>
+        <w:rPr>
+          <w:lang w:val="it-IT"/>
+        </w:rPr>
+      </w:pPr>
+      <w:r>
+        <w:rPr>
+          <w:lang w:val="it-IT"/>
+        </w:rPr>
+        <w:t>Raccoglie cibo in zone a densità variabile.</w:t>
+      </w:r>
+    </w:p>
+    <w:p>
+      <w:pPr>
+        <w:numPr>
+          <w:ilvl w:val="0"/>
+          <w:numId w:val="30"/>
+        </w:numPr>
+        <w:rPr>
+          <w:lang w:val="it-IT"/>
+        </w:rPr>
+      </w:pPr>
+      <w:r>
+        <w:rPr>
+          <w:lang w:val="it-IT"/>
+        </w:rPr>
+        <w:t>Le zone si impoveriscono e si rigenerano.</w:t>
+      </w:r>
+    </w:p>
+    <w:p>
+      <w:pPr>
+        <w:numPr>
+          <w:ilvl w:val="0"/>
+          <w:numId w:val="30"/>
+        </w:numPr>
+        <w:rPr>
+          <w:lang w:val="it-IT"/>
+        </w:rPr>
+      </w:pPr>
+      <w:r>
+        <w:rPr>
+          <w:lang w:val="it-IT"/>
+        </w:rPr>
+        <w:t>Le scorte vengono consumate nel tempo.</w:t>
+      </w:r>
+    </w:p>
+    <w:p>
+      <w:pPr>
+        <w:numPr>
+          <w:ilvl w:val="0"/>
+          <w:numId w:val="30"/>
+        </w:numPr>
+        <w:rPr>
+          <w:lang w:val="it-IT"/>
+        </w:rPr>
+      </w:pPr>
+      <w:r>
+        <w:rPr>
+          <w:lang w:val="it-IT"/>
+        </w:rPr>
+        <w:t>Il tempo può essere controllato con pausa, play e velocità.</w:t>
+      </w:r>
+    </w:p>
+    <w:p>
+      <w:pPr>
+        <w:rPr>
+          <w:lang w:val="it-IT"/>
+        </w:rPr>
+      </w:pPr>
+      <w:r>
+        <w:rPr>
+          <w:b/>
+          <w:bCs/>
+          <w:lang w:val="it-IT"/>
+        </w:rPr>
+        <w:lastRenderedPageBreak/>
+        <w:t>MVP2 – Diversificazione delle fonti di cibo (caccia e pesca)</w:t>
+      </w:r>
+    </w:p>
+    <w:p>
+      <w:pPr>
+        <w:rPr>
+          <w:lang w:val="it-IT"/>
+        </w:rPr>
+      </w:pPr>
+      <w:r>
+        <w:rPr>
+          <w:lang w:val="it-IT"/>
+        </w:rPr>
+        <w:t>MVP2 introduce i branchi mobili (grandi animali) e la pesca in acque interne. Il giocatore impara a diversificare le fonti di cibo oltre alla raccolta vegetale. La caccia richiede movimento attivo (inseguire il branco), mentre la pesca è stanziale ma limitata alle celle d'acqua.</w:t>
+      </w:r>
+    </w:p>
+    <w:p>
+      <w:r>
+        <w:t>Nuova definizione:</w:t>
+      </w:r>
+    </w:p>
+    <w:p>
+      <w:pPr>
+        <w:numPr>
+          <w:ilvl w:val="0"/>
+          <w:numId w:val="31"/>
+        </w:numPr>
+        <w:rPr>
+          <w:lang w:val="it-IT"/>
+        </w:rPr>
+      </w:pPr>
+      <w:r>
+        <w:rPr>
+          <w:lang w:val="it-IT"/>
+        </w:rPr>
+        <w:t>Branchi di grandi animali appaiono sulla mappa come entità mobili. Ogni branco ha una specie, un numero di capi, un habitat preferito e un tasso di riproduzione.</w:t>
+      </w:r>
+    </w:p>
+    <w:p>
+      <w:pPr>
+        <w:numPr>
+          <w:ilvl w:val="0"/>
+          <w:numId w:val="31"/>
+        </w:numPr>
+        <w:rPr>
+          <w:lang w:val="it-IT"/>
+        </w:rPr>
+      </w:pPr>
+      <w:r>
+        <w:rPr>
+          <w:lang w:val="it-IT"/>
+        </w:rPr>
+        <w:t>Il giocatore può assegnare un pop alla caccia: deve avvicinarsi al branco, e ogni ciclo di caccia riduce i capi e produce carne e pelli. Se il branco scende sotto una soglia, si estingue localmente.</w:t>
+      </w:r>
+    </w:p>
+    <w:p>
+      <w:pPr>
+        <w:numPr>
+          <w:ilvl w:val="0"/>
+          <w:numId w:val="31"/>
+        </w:numPr>
+        <w:rPr>
+          <w:lang w:val="it-IT"/>
+        </w:rPr>
+      </w:pPr>
+      <w:r>
+        <w:rPr>
+          <w:lang w:val="it-IT"/>
+        </w:rPr>
+        <w:t>Nelle celle che intersecano fiumi o laghi, il layer fishDensity permette la pesca. Funziona come la raccolta vegetale (riduce densità, si rigenera), ma solo in acqua.</w:t>
+      </w:r>
+    </w:p>
+    <w:p>
+      <w:pPr>
+        <w:numPr>
+          <w:ilvl w:val="0"/>
+          <w:numId w:val="31"/>
+        </w:numPr>
+        <w:rPr>
+          <w:lang w:val="it-IT"/>
+        </w:rPr>
+      </w:pPr>
+      <w:r>
+        <w:rPr>
+          <w:lang w:val="it-IT"/>
+        </w:rPr>
+        <w:t>L'interfaccia mostra le nuove risorse (carne, pesce) accanto al cibo vegetale. Per ora tutte valgono come "cibo", ma vengono registrate separatamente per usi futuri.</w:t>
+      </w:r>
+    </w:p>
+    <w:p>
+      <w:pPr>
+        <w:numPr>
+          <w:ilvl w:val="0"/>
+          <w:numId w:val="31"/>
+        </w:numPr>
+        <w:rPr>
+          <w:lang w:val="it-IT"/>
+        </w:rPr>
+      </w:pPr>
+      <w:r>
+        <w:rPr>
+          <w:lang w:val="it-IT"/>
+        </w:rPr>
+        <w:t>Meccanica: la caccia è più redditizia ma richiede inseguimento e può esaurire i branchi. La pesca è stabile ma limitata geograficamente. Il giocatore deve decidere come allocare i pop tra raccolta, caccia e pesca.</w:t>
+      </w:r>
+    </w:p>
+    <w:p>
+      <w:pPr>
+        <w:rPr>
+          <w:lang w:val="it-IT"/>
+        </w:rPr>
+      </w:pPr>
+      <w:r>
+        <w:rPr>
+          <w:b/>
+          <w:bCs/>
+          <w:lang w:val="it-IT"/>
+        </w:rPr>
+        <w:t xml:space="preserve">MVP3 – Raccolta legna, lavorazione e </w:t>
+      </w:r>
+      <w:r>
+        <w:rPr>
+          <w:b/>
+          <w:bCs/>
+          <w:lang w:val="it-IT"/>
+        </w:rPr>
+        <w:t>strumenti</w:t>
+      </w:r>
+    </w:p>
+    <w:p>
+      <w:pPr>
+        <w:rPr>
+          <w:lang w:val="it-IT"/>
+        </w:rPr>
+      </w:pPr>
+      <w:r>
+        <w:rPr>
+          <w:lang w:val="it-IT"/>
+        </w:rPr>
+        <w:t xml:space="preserve">MVP3 introduce il layer forestDensity e la raccolta di legna. Poi la lavorazione (legna → </w:t>
+      </w:r>
+      <w:r>
+        <w:rPr>
+          <w:lang w:val="it-IT"/>
+        </w:rPr>
+        <w:t>tool</w:t>
+      </w:r>
+      <w:r>
+        <w:rPr>
+          <w:lang w:val="it-IT"/>
+        </w:rPr>
+        <w:t xml:space="preserve">) </w:t>
+      </w:r>
+      <w:r>
+        <w:rPr>
+          <w:lang w:val="it-IT"/>
+        </w:rPr>
+        <w:t>per migliorare la caccia e la raccolta di cibo in generale</w:t>
+      </w:r>
+      <w:r>
+        <w:rPr>
+          <w:lang w:val="it-IT"/>
+        </w:rPr>
+        <w:t xml:space="preserve">. L'ordine logico è: risorsa grezza, lavorazione, </w:t>
+      </w:r>
+      <w:r>
+        <w:rPr>
+          <w:lang w:val="it-IT"/>
+        </w:rPr>
+        <w:t>tool</w:t>
+      </w:r>
+      <w:r>
+        <w:rPr>
+          <w:lang w:val="it-IT"/>
+        </w:rPr>
+        <w:t>.</w:t>
+      </w:r>
+    </w:p>
+    <w:p>
+      <w:pPr>
+        <w:rPr>
+          <w:lang w:val="it-IT"/>
+        </w:rPr>
+      </w:pPr>
+      <w:r>
+        <w:rPr>
+          <w:lang w:val="it-IT"/>
+        </w:rPr>
+        <w:t>DA RICORDARE A DEEPSEEK: controllare e confermare che gli strumenti in legna vennero prima di quelli in pietra.</w:t>
+      </w:r>
+    </w:p>
+    <w:p>
+      <w:pPr>
+        <w:rPr>
+          <w:lang w:val="it-IT"/>
+        </w:rPr>
+      </w:pPr>
+      <w:r>
+        <w:rPr>
+          <w:lang w:val="it-IT"/>
+        </w:rPr>
+        <w:t>Nuova definizione:</w:t>
+      </w:r>
+    </w:p>
+    <w:p>
+      <w:pPr>
+        <w:numPr>
+          <w:ilvl w:val="0"/>
+          <w:numId w:val="32"/>
+        </w:numPr>
+        <w:rPr>
+          <w:lang w:val="it-IT"/>
+        </w:rPr>
+      </w:pPr>
+      <w:r>
+        <w:rPr>
+          <w:lang w:val="it-IT"/>
+        </w:rPr>
+        <w:t>Attivazione del layer forestDensity sulla griglia. Le foreste sono visivamente distinguibili (verde scuro). La raccolta di legna riduce la densità localmente, come per il forage.</w:t>
+      </w:r>
+    </w:p>
+    <w:p>
+      <w:pPr>
+        <w:numPr>
+          <w:ilvl w:val="0"/>
+          <w:numId w:val="32"/>
+        </w:numPr>
+        <w:rPr>
+          <w:lang w:val="it-IT"/>
+        </w:rPr>
+      </w:pPr>
+      <w:r>
+        <w:rPr>
+          <w:lang w:val="it-IT"/>
+        </w:rPr>
+        <w:t>Il giocatore può assegnare pop alla raccolta di legna. La legna grezza viene trasportata all'accampamento.</w:t>
+      </w:r>
+    </w:p>
+    <w:p>
+      <w:pPr>
+        <w:numPr>
+          <w:ilvl w:val="0"/>
+          <w:numId w:val="32"/>
+        </w:numPr>
+        <w:rPr>
+          <w:lang w:val="it-IT"/>
+        </w:rPr>
+      </w:pPr>
+      <w:r>
+        <w:rPr>
+          <w:lang w:val="it-IT"/>
+        </w:rPr>
+        <w:t xml:space="preserve">Introduzione della lavorazione: la legna grezza può essere trasformata in </w:t>
+      </w:r>
+      <w:r>
+        <w:rPr>
+          <w:lang w:val="it-IT"/>
+        </w:rPr>
+        <w:t>tool</w:t>
+      </w:r>
+      <w:r>
+        <w:rPr>
+          <w:lang w:val="it-IT"/>
+        </w:rPr>
+        <w:t xml:space="preserve"> (azione "lavora legna" al campo). </w:t>
+      </w:r>
+    </w:p>
+    <w:p>
+      <w:pPr>
+        <w:numPr>
+          <w:ilvl w:val="0"/>
+          <w:numId w:val="32"/>
+        </w:numPr>
+        <w:rPr>
+          <w:lang w:val="it-IT"/>
+        </w:rPr>
+      </w:pPr>
+      <w:r>
+        <w:rPr>
+          <w:lang w:val="it-IT"/>
+        </w:rPr>
+        <w:t xml:space="preserve">Costruzione </w:t>
+      </w:r>
+      <w:r>
+        <w:rPr>
+          <w:lang w:val="it-IT"/>
+        </w:rPr>
+        <w:t>dei tool</w:t>
+      </w:r>
+      <w:r>
+        <w:rPr>
+          <w:lang w:val="it-IT"/>
+        </w:rPr>
+        <w:t xml:space="preserve">: consuma </w:t>
+      </w:r>
+      <w:r>
+        <w:rPr>
+          <w:lang w:val="it-IT"/>
+        </w:rPr>
+        <w:t>legna</w:t>
+      </w:r>
+      <w:r>
+        <w:rPr>
+          <w:lang w:val="it-IT"/>
+        </w:rPr>
+        <w:t xml:space="preserve">. </w:t>
+      </w:r>
+      <w:r>
+        <w:rPr>
+          <w:lang w:val="it-IT"/>
+        </w:rPr>
+        <w:t>I tool possono essere armi per la caccia, la pesca o bastoni/ceste per migliorare la raccolta delle bacche</w:t>
+      </w:r>
+    </w:p>
+    <w:p>
+      <w:pPr>
+        <w:numPr>
+          <w:ilvl w:val="0"/>
+          <w:numId w:val="32"/>
+        </w:numPr>
+        <w:rPr>
+          <w:lang w:val="it-IT"/>
+        </w:rPr>
+      </w:pPr>
+      <w:r>
+        <w:rPr>
+          <w:lang w:val="it-IT"/>
+        </w:rPr>
+        <w:lastRenderedPageBreak/>
+        <w:t>Meccanica: la legna diventa la prima risorsa non commestibile. La lavorazione introduce il concetto di catena produttiva. Si gettano le basi per la specializzazione dei pop (raccoglitori, taglialegna, artigiani).</w:t>
+      </w:r>
+    </w:p>
+    <w:p>
+      <w:pPr>
+        <w:rPr>
+          <w:lang w:val="it-IT"/>
+        </w:rPr>
+      </w:pPr>
+      <w:r>
+        <w:rPr>
+          <w:b/>
+          <w:bCs/>
+          <w:lang w:val="it-IT"/>
+        </w:rPr>
+        <w:t>MVP4 – Informazione imperfetta e report</w:t>
+      </w:r>
+    </w:p>
+    <w:p>
+      <w:pPr>
+        <w:rPr>
+          <w:lang w:val="it-IT"/>
+        </w:rPr>
+      </w:pPr>
+      <w:r>
+        <w:rPr>
+          <w:lang w:val="it-IT"/>
+        </w:rPr>
+        <w:t>Nessuna modifica necessaria. Le meccaniche di visibilità (certo, proiettato, da report) e di stima delle scorte sono indipendenti dal tipo di risorsa. Quando le implementeremo, applicheremo l'incertezza a tutte le risorse (cibo vegetale, carne, pesce, legna, assi).</w:t>
+      </w:r>
+    </w:p>
+    <w:p>
+      <w:r>
+        <w:t>Testo attuale confermato:</w:t>
+      </w:r>
+    </w:p>
+    <w:p>
+      <w:pPr>
+        <w:numPr>
+          <w:ilvl w:val="0"/>
+          <w:numId w:val="33"/>
+        </w:numPr>
+        <w:rPr>
+          <w:lang w:val="it-IT"/>
+        </w:rPr>
+      </w:pPr>
+      <w:r>
+        <w:rPr>
+          <w:lang w:val="it-IT"/>
+        </w:rPr>
+        <w:t>Il campo base ha una "riserva di cibo" che non conosci esattamente: vedi una stima arrotondata.</w:t>
+      </w:r>
+    </w:p>
+    <w:p>
+      <w:pPr>
+        <w:numPr>
+          <w:ilvl w:val="0"/>
+          <w:numId w:val="33"/>
+        </w:numPr>
+        <w:rPr>
+          <w:lang w:val="it-IT"/>
+        </w:rPr>
+      </w:pPr>
+      <w:r>
+        <w:rPr>
+          <w:lang w:val="it-IT"/>
+        </w:rPr>
+        <w:t>Per sapere quanta legna hai realmente, devi inviare qualcuno a controllare o aspettare il report di chi torna.</w:t>
+      </w:r>
+    </w:p>
+    <w:p>
+      <w:pPr>
+        <w:numPr>
+          <w:ilvl w:val="0"/>
+          <w:numId w:val="33"/>
+        </w:numPr>
+        <w:rPr>
+          <w:lang w:val="it-IT"/>
+        </w:rPr>
+      </w:pPr>
+      <w:r>
+        <w:rPr>
+          <w:lang w:val="it-IT"/>
+        </w:rPr>
+        <w:t>Raggio visivo del giocatore: dove hai uomini, vedi; il resto è buio o sfocato.</w:t>
+      </w:r>
+    </w:p>
+    <w:p>
+      <w:pPr>
+        <w:numPr>
+          <w:ilvl w:val="0"/>
+          <w:numId w:val="33"/>
+        </w:numPr>
+        <w:rPr>
+          <w:lang w:val="it-IT"/>
+        </w:rPr>
+      </w:pPr>
+      <w:r>
+        <w:rPr>
+          <w:lang w:val="it-IT"/>
+        </w:rPr>
+        <w:t>I report possono essere ritardati o imprecisi in base alla distanza.</w:t>
       </w:r>
     </w:p>
     <w:p>
@@ -805,7 +1938,6 @@
         <w:rPr>
           <w:lang w:val="it-IT"/>
         </w:rPr>
-        <w:lastRenderedPageBreak/>
         <w:t>Barra del tempo (velocità 1x, 2x, pausa).</w:t>
       </w:r>
     </w:p>
@@ -891,23 +2023,134 @@
     <w:p>
       <w:pPr>
         <w:rPr>
+          <w:lang w:val="it-IT"/>
+        </w:rPr>
+      </w:pPr>
+      <w:r>
+        <w:rPr>
           <w:b/>
           <w:bCs/>
-        </w:rPr>
-      </w:pPr>
-      <w:r>
+          <w:lang w:val="it-IT"/>
+        </w:rPr>
+        <w:t>MVP5 – Seconda tribù e territorio</w:t>
+      </w:r>
+    </w:p>
+    <w:p>
+      <w:pPr>
+        <w:rPr>
+          <w:lang w:val="it-IT"/>
+        </w:rPr>
+      </w:pPr>
+      <w:r>
+        <w:rPr>
+          <w:lang w:val="it-IT"/>
+        </w:rPr>
+        <w:t>Nessuna modifica necessaria. La competizione per le risorse funziona con qualsiasi tipo di layer o branco.</w:t>
+      </w:r>
+    </w:p>
+    <w:p>
+      <w:r>
+        <w:t>Testo attuale confermato:</w:t>
+      </w:r>
+    </w:p>
+    <w:p>
+      <w:pPr>
+        <w:numPr>
+          <w:ilvl w:val="0"/>
+          <w:numId w:val="34"/>
+        </w:numPr>
+        <w:rPr>
+          <w:lang w:val="it-IT"/>
+        </w:rPr>
+      </w:pPr>
+      <w:r>
+        <w:rPr>
+          <w:lang w:val="it-IT"/>
+        </w:rPr>
+        <w:t>Una seconda tribù vicina condivide la stessa foresta e le stesse zone di cibo.</w:t>
+      </w:r>
+    </w:p>
+    <w:p>
+      <w:pPr>
+        <w:numPr>
+          <w:ilvl w:val="0"/>
+          <w:numId w:val="34"/>
+        </w:numPr>
+        <w:rPr>
+          <w:lang w:val="it-IT"/>
+        </w:rPr>
+      </w:pPr>
+      <w:r>
+        <w:rPr>
+          <w:lang w:val="it-IT"/>
+        </w:rPr>
+        <w:t>Se entrambe raccolgono o cacciano, le risorse si esauriscono prima.</w:t>
+      </w:r>
+    </w:p>
+    <w:p>
+      <w:pPr>
+        <w:numPr>
+          <w:ilvl w:val="0"/>
+          <w:numId w:val="34"/>
+        </w:numPr>
+        <w:rPr>
+          <w:lang w:val="it-IT"/>
+        </w:rPr>
+      </w:pPr>
+      <w:r>
+        <w:rPr>
+          <w:lang w:val="it-IT"/>
+        </w:rPr>
+        <w:t>Possibile scontro se i gruppi si incrociano (combattimento basilare).</w:t>
+      </w:r>
+    </w:p>
+    <w:p>
+      <w:pPr>
+        <w:numPr>
+          <w:ilvl w:val="0"/>
+          <w:numId w:val="34"/>
+        </w:numPr>
+        <w:rPr>
+          <w:lang w:val="it-IT"/>
+        </w:rPr>
+      </w:pPr>
+      <w:r>
+        <w:rPr>
+          <w:lang w:val="it-IT"/>
+        </w:rPr>
+        <w:t>Inizio del concetto di "territorio d'uso": la risorsa è di chi la sta usando.</w:t>
+      </w:r>
+    </w:p>
+    <w:p>
+      <w:pPr>
+        <w:rPr>
+          <w:lang w:val="it-IT"/>
+        </w:rPr>
+      </w:pPr>
+    </w:p>
+    <w:p>
+      <w:pPr>
         <w:rPr>
           <w:b/>
           <w:bCs/>
-        </w:rPr>
-        <w:t>MVP2 – Consumo e sopravvivenza</w:t>
-      </w:r>
-    </w:p>
-    <w:p>
-      <w:pPr>
+          <w:lang w:val="it-IT"/>
+        </w:rPr>
+      </w:pPr>
+      <w:r>
+        <w:rPr>
+          <w:b/>
+          <w:bCs/>
+          <w:lang w:val="it-IT"/>
+        </w:rPr>
+        <w:t>CONCETTI DA RECUPERARE POI:</w:t>
+      </w:r>
+    </w:p>
+    <w:p>
+      <w:pPr>
+        <w:pStyle w:val="ListParagraph"/>
         <w:numPr>
           <w:ilvl w:val="0"/>
-          <w:numId w:val="11"/>
+          <w:numId w:val="35"/>
         </w:numPr>
         <w:rPr>
           <w:lang w:val="it-IT"/>
@@ -917,362 +2160,28 @@
         <w:rPr>
           <w:lang w:val="it-IT"/>
         </w:rPr>
-        <w:t>Il pop consuma cibo ogni giorno.</w:t>
-      </w:r>
-    </w:p>
-    <w:p>
-      <w:pPr>
-        <w:numPr>
-          <w:ilvl w:val="0"/>
-          <w:numId w:val="11"/>
-        </w:numPr>
-        <w:rPr>
-          <w:lang w:val="it-IT"/>
-        </w:rPr>
-      </w:pPr>
-      <w:r>
-        <w:rPr>
-          <w:lang w:val="it-IT"/>
-        </w:rPr>
-        <w:t>Si può assegnare un gruppo a cacciare (raccoglie cibo).</w:t>
-      </w:r>
-    </w:p>
-    <w:p>
-      <w:pPr>
-        <w:numPr>
-          <w:ilvl w:val="0"/>
-          <w:numId w:val="11"/>
-        </w:numPr>
-        <w:rPr>
-          <w:lang w:val="it-IT"/>
-        </w:rPr>
-      </w:pPr>
-      <w:r>
-        <w:rPr>
-          <w:lang w:val="it-IT"/>
-        </w:rPr>
-        <w:t>Se il cibo finisce, il pop muore.</w:t>
-      </w:r>
-    </w:p>
-    <w:p>
-      <w:pPr>
-        <w:numPr>
-          <w:ilvl w:val="0"/>
-          <w:numId w:val="11"/>
-        </w:numPr>
-        <w:rPr>
-          <w:lang w:val="it-IT"/>
-        </w:rPr>
-      </w:pPr>
-      <w:r>
-        <w:rPr>
-          <w:lang w:val="it-IT"/>
-        </w:rPr>
-        <w:t>La foresta ha una "salute" che cala se tagliata troppo intensamente.</w:t>
-      </w:r>
-    </w:p>
-    <w:p>
-      <w:pPr>
-        <w:numPr>
-          <w:ilvl w:val="0"/>
-          <w:numId w:val="11"/>
-        </w:numPr>
-        <w:rPr>
-          <w:lang w:val="it-IT"/>
-        </w:rPr>
-      </w:pPr>
-      <w:r>
-        <w:rPr>
-          <w:lang w:val="it-IT"/>
-        </w:rPr>
-        <w:t>Il giocatore deve bilanciare cacciatori e taglialegna.</w:t>
-      </w:r>
+        <w:t>Deterioramento risorse</w:t>
+      </w:r>
+    </w:p>
+    <w:p>
+      <w:pPr>
+        <w:rPr>
+          <w:lang w:val="it-IT"/>
+        </w:rPr>
+      </w:pPr>
     </w:p>
     <w:p>
       <w:pPr>
         <w:rPr>
           <w:b/>
           <w:bCs/>
-        </w:rPr>
-      </w:pPr>
-      <w:commentRangeStart w:id="0"/>
+          <w:lang w:val="it-IT"/>
+        </w:rPr>
+      </w:pPr>
       <w:r>
         <w:rPr>
           <w:b/>
           <w:bCs/>
-        </w:rPr>
-        <w:t>MVP3 – Lavorazione e magazzino</w:t>
-      </w:r>
-    </w:p>
-    <w:p>
-      <w:pPr>
-        <w:numPr>
-          <w:ilvl w:val="0"/>
-          <w:numId w:val="12"/>
-        </w:numPr>
-        <w:rPr>
-          <w:lang w:val="it-IT"/>
-        </w:rPr>
-      </w:pPr>
-      <w:r>
-        <w:rPr>
-          <w:lang w:val="it-IT"/>
-        </w:rPr>
-        <w:t>La legna grezza va portata all'accampamento e può essere trasformata in assi (azione "lavora legna").</w:t>
-      </w:r>
-    </w:p>
-    <w:p>
-      <w:pPr>
-        <w:numPr>
-          <w:ilvl w:val="0"/>
-          <w:numId w:val="12"/>
-        </w:numPr>
-        <w:rPr>
-          <w:lang w:val="it-IT"/>
-        </w:rPr>
-      </w:pPr>
-      <w:r>
-        <w:rPr>
-          <w:lang w:val="it-IT"/>
-        </w:rPr>
-        <w:t>Le assi servono per costruire un magazzino (amplia lo stoccaggio).</w:t>
-      </w:r>
-    </w:p>
-    <w:p>
-      <w:pPr>
-        <w:numPr>
-          <w:ilvl w:val="0"/>
-          <w:numId w:val="12"/>
-        </w:numPr>
-        <w:rPr>
-          <w:lang w:val="it-IT"/>
-        </w:rPr>
-      </w:pPr>
-      <w:r>
-        <w:rPr>
-          <w:lang w:val="it-IT"/>
-        </w:rPr>
-        <w:t>Il cibo in eccesso può deteriorarsi se non immagazzinato correttamente.</w:t>
-      </w:r>
-    </w:p>
-    <w:p>
-      <w:pPr>
-        <w:numPr>
-          <w:ilvl w:val="0"/>
-          <w:numId w:val="12"/>
-        </w:numPr>
-        <w:rPr>
-          <w:lang w:val="it-IT"/>
-        </w:rPr>
-      </w:pPr>
-      <w:r>
-        <w:rPr>
-          <w:lang w:val="it-IT"/>
-        </w:rPr>
-        <w:t>Introduzione di una prima forma di tecnologia organica: dopo X cicli di taglio, sblocco "ascia migliore" (bonus raccolta).</w:t>
-      </w:r>
-      <w:commentRangeEnd w:id="0"/>
-      <w:r>
-        <w:rPr>
-          <w:rStyle w:val="CommentReference"/>
-          <w:sz w:val="24"/>
-          <w:szCs w:val="24"/>
-          <w:lang w:val="it-IT"/>
-        </w:rPr>
-        <w:commentReference w:id="0"/>
-      </w:r>
-    </w:p>
-    <w:p>
-      <w:pPr>
-        <w:rPr>
-          <w:b/>
-          <w:bCs/>
-        </w:rPr>
-      </w:pPr>
-      <w:r>
-        <w:rPr>
-          <w:b/>
-          <w:bCs/>
-        </w:rPr>
-        <w:t>MVP4 – Informazione imperfetta e report</w:t>
-      </w:r>
-    </w:p>
-    <w:p>
-      <w:pPr>
-        <w:numPr>
-          <w:ilvl w:val="0"/>
-          <w:numId w:val="13"/>
-        </w:numPr>
-        <w:rPr>
-          <w:lang w:val="it-IT"/>
-        </w:rPr>
-      </w:pPr>
-      <w:r>
-        <w:rPr>
-          <w:lang w:val="it-IT"/>
-        </w:rPr>
-        <w:t>Il campo base ha una "riserva di cibo" che non conosci esattamente: vedi una stima arrotondata.</w:t>
-      </w:r>
-    </w:p>
-    <w:p>
-      <w:pPr>
-        <w:numPr>
-          <w:ilvl w:val="0"/>
-          <w:numId w:val="13"/>
-        </w:numPr>
-        <w:rPr>
-          <w:lang w:val="it-IT"/>
-        </w:rPr>
-      </w:pPr>
-      <w:r>
-        <w:rPr>
-          <w:lang w:val="it-IT"/>
-        </w:rPr>
-        <w:t>Per sapere quanta legna hai realmente, devi inviare qualcuno a controllare o aspettare il report di chi torna.</w:t>
-      </w:r>
-    </w:p>
-    <w:p>
-      <w:pPr>
-        <w:numPr>
-          <w:ilvl w:val="0"/>
-          <w:numId w:val="13"/>
-        </w:numPr>
-        <w:rPr>
-          <w:lang w:val="it-IT"/>
-        </w:rPr>
-      </w:pPr>
-      <w:r>
-        <w:rPr>
-          <w:lang w:val="it-IT"/>
-        </w:rPr>
-        <w:t xml:space="preserve">Raggio visivo del giocatore: dove </w:t>
-      </w:r>
-      <w:r>
-        <w:rPr>
-          <w:lang w:val="it-IT"/>
-        </w:rPr>
-        <w:t>sei</w:t>
-      </w:r>
-      <w:r>
-        <w:rPr>
-          <w:lang w:val="it-IT"/>
-        </w:rPr>
-        <w:t>, vedi; il resto è buio o sfocato.</w:t>
-      </w:r>
-    </w:p>
-    <w:p>
-      <w:pPr>
-        <w:numPr>
-          <w:ilvl w:val="0"/>
-          <w:numId w:val="13"/>
-        </w:numPr>
-        <w:rPr>
-          <w:lang w:val="it-IT"/>
-        </w:rPr>
-      </w:pPr>
-      <w:r>
-        <w:rPr>
-          <w:lang w:val="it-IT"/>
-        </w:rPr>
-        <w:t>I report possono essere ritardati o imprecisi in base alla distanza.</w:t>
-      </w:r>
-    </w:p>
-    <w:p>
-      <w:pPr>
-        <w:rPr>
-          <w:b/>
-          <w:bCs/>
-        </w:rPr>
-      </w:pPr>
-      <w:r>
-        <w:rPr>
-          <w:b/>
-          <w:bCs/>
-        </w:rPr>
-        <w:t>MVP5 – Seconda tribù e territorio</w:t>
-      </w:r>
-    </w:p>
-    <w:p>
-      <w:pPr>
-        <w:numPr>
-          <w:ilvl w:val="0"/>
-          <w:numId w:val="14"/>
-        </w:numPr>
-        <w:rPr>
-          <w:lang w:val="it-IT"/>
-        </w:rPr>
-      </w:pPr>
-      <w:r>
-        <w:rPr>
-          <w:lang w:val="it-IT"/>
-        </w:rPr>
-        <w:t>Una seconda tribù vicina condivide la stessa foresta.</w:t>
-      </w:r>
-    </w:p>
-    <w:p>
-      <w:pPr>
-        <w:numPr>
-          <w:ilvl w:val="0"/>
-          <w:numId w:val="14"/>
-        </w:numPr>
-        <w:rPr>
-          <w:lang w:val="it-IT"/>
-        </w:rPr>
-      </w:pPr>
-      <w:r>
-        <w:rPr>
-          <w:lang w:val="it-IT"/>
-        </w:rPr>
-        <w:t>Se entrambe tagliano, la foresta si esaurisce prima.</w:t>
-      </w:r>
-    </w:p>
-    <w:p>
-      <w:pPr>
-        <w:numPr>
-          <w:ilvl w:val="0"/>
-          <w:numId w:val="14"/>
-        </w:numPr>
-        <w:rPr>
-          <w:lang w:val="it-IT"/>
-        </w:rPr>
-      </w:pPr>
-      <w:r>
-        <w:rPr>
-          <w:lang w:val="it-IT"/>
-        </w:rPr>
-        <w:t>Possibile scontro se i gruppi si incrociano (combattimento basilare).</w:t>
-      </w:r>
-    </w:p>
-    <w:p>
-      <w:pPr>
-        <w:numPr>
-          <w:ilvl w:val="0"/>
-          <w:numId w:val="14"/>
-        </w:numPr>
-        <w:rPr>
-          <w:lang w:val="it-IT"/>
-        </w:rPr>
-      </w:pPr>
-      <w:r>
-        <w:rPr>
-          <w:lang w:val="it-IT"/>
-        </w:rPr>
-        <w:lastRenderedPageBreak/>
-        <w:t>Inizio del concetto di "territorio d'uso": la foresta è di chi la sta usando.</w:t>
-      </w:r>
-    </w:p>
-    <w:p>
-      <w:pPr>
-        <w:rPr>
-          <w:b/>
-          <w:bCs/>
-          <w:lang w:val="it-IT"/>
-        </w:rPr>
-      </w:pPr>
-      <w:r>
-        <w:rPr>
-          <w:b/>
-          <w:bCs/>
           <w:lang w:val="it-IT"/>
         </w:rPr>
         <w:t>Oltre MVP5</w:t>
@@ -1289,6 +2198,19 @@
           <w:lang w:val="it-IT"/>
         </w:rPr>
         <w:t>Le iterazioni successive del prototipo seguiranno la progressione storica (Era 1: stanzialità, agricoltura, prime strutture; Era 2: metalli, scrittura, amministrazione; ecc.), sbloccando funzionalità corrispondenti man mano che le fondamenta tecniche lo permettono. La priorità sarà sempre validare il loop di base prima di aggiungere complessità.</w:t>
+      </w:r>
+    </w:p>
+    <w:p>
+      <w:pPr>
+        <w:rPr>
+          <w:lang w:val="it-IT"/>
+        </w:rPr>
+      </w:pPr>
+      <w:r>
+        <w:rPr>
+          <w:lang w:val="it-IT"/>
+        </w:rPr>
+        <w:t>Prima però procederemo a raffinare il loop cacciatore/raccoglitore con lo sviluppo tecnologico della pietra, dei primi edifici e delle prime strutture sociali e progressi culturali.</w:t>
       </w:r>
     </w:p>
     <w:p>
@@ -1321,57 +2243,6 @@
 </w:document>
 </file>
 
-<file path=word/comments.xml><?xml version="1.0" encoding="utf-8"?>
-<w:comments xmlns:wpc="http://schemas.microsoft.com/office/word/2010/wordprocessingCanvas" xmlns:cx="http://schemas.microsoft.com/office/drawing/2014/chartex" xmlns:cx1="http://schemas.microsoft.com/office/drawing/2015/9/8/chartex" xmlns:cx2="http://schemas.microsoft.com/office/drawing/2015/10/21/chartex" xmlns:cx3="http://schemas.microsoft.com/office/drawing/2016/5/9/chartex" xmlns:cx4="http://schemas.microsoft.com/office/drawing/2016/5/10/chartex" xmlns:cx5="http://schemas.microsoft.com/office/drawing/2016/5/11/chartex" xmlns:cx6="http://schemas.microsoft.com/office/drawing/2016/5/12/chartex" xmlns:cx7="http://schemas.microsoft.com/office/drawing/2016/5/13/chartex" xmlns:cx8="http://schemas.microsoft.com/office/drawing/2016/5/14/chartex" xmlns:mc="http://schemas.openxmlformats.org/markup-compatibility/2006" xmlns:aink="http://schemas.microsoft.com/office/drawing/2016/ink" xmlns:am3d="http://schemas.microsoft.com/office/drawing/2017/model3d" xmlns:o="urn:schemas-microsoft-com:office:office" xmlns:oel="http://schemas.microsoft.com/office/2019/extlst" xmlns:r="http://schemas.openxmlformats.org/officeDocument/2006/relationships" xmlns:m="http://schemas.openxmlformats.org/officeDocument/2006/math" xmlns:v="urn:schemas-microsoft-com:vml" xmlns:wp14="http://schemas.microsoft.com/office/word/2010/wordprocessingDrawing" xmlns:wp="http://schemas.openxmlformats.org/drawingml/2006/wordprocessingDrawing" xmlns:w10="urn:schemas-microsoft-com:office:word" xmlns:w="http://schemas.openxmlformats.org/wordprocessingml/2006/main" xmlns:w14="http://schemas.microsoft.com/office/word/2010/wordml" xmlns:w15="http://schemas.microsoft.com/office/word/2012/wordml" xmlns:w16cex="http://schemas.microsoft.com/office/word/2018/wordml/cex" xmlns:w16cid="http://schemas.microsoft.com/office/word/2016/wordml/cid" xmlns:w16="http://schemas.microsoft.com/office/word/2018/wordml" xmlns:w16du="http://schemas.microsoft.com/office/word/2023/wordml/word16du" xmlns:w16sdtdh="http://schemas.microsoft.com/office/word/2020/wordml/sdtdatahash" xmlns:w16sdtfl="http://schemas.microsoft.com/office/word/2024/wordml/sdtformatlock" xmlns:w16se="http://schemas.microsoft.com/office/word/2015/wordml/symex" xmlns:wpg="http://schemas.microsoft.com/office/word/2010/wordprocessingGroup" xmlns:wpi="http://schemas.microsoft.com/office/word/2010/wordprocessingInk" xmlns:wne="http://schemas.microsoft.com/office/word/2006/wordml" xmlns:wps="http://schemas.microsoft.com/office/word/2010/wordprocessingShape" mc:Ignorable="w14 w15 w16se w16cid w16 w16cex w16sdtdh w16sdtfl w16du wp14">
-  <w:comment w:id="0" w:author="Davide Salvucci" w:date="2026-07-04T16:48:00Z" w:initials="DS">
-    <w:p>
-      <w:pPr>
-        <w:pStyle w:val="CommentText"/>
-        <w:rPr>
-          <w:lang w:val="it-IT"/>
-        </w:rPr>
-      </w:pPr>
-      <w:r>
-        <w:rPr>
-          <w:rStyle w:val="CommentReference"/>
-        </w:rPr>
-        <w:annotationRef/>
-      </w:r>
-      <w:r>
-        <w:rPr>
-          <w:lang w:val="it-IT"/>
-        </w:rPr>
-        <w:t>Pensare a un altro utilizzo p</w:t>
-      </w:r>
-      <w:r>
-        <w:rPr>
-          <w:lang w:val="it-IT"/>
-        </w:rPr>
-        <w:t>er il secondo materiale, più coerente con una tribù nomade</w:t>
-      </w:r>
-    </w:p>
-  </w:comment>
-</w:comments>
-</file>
-
-<file path=word/commentsExtended.xml><?xml version="1.0" encoding="utf-8"?>
-<w15:commentsEx xmlns:wpc="http://schemas.microsoft.com/office/word/2010/wordprocessingCanvas" xmlns:cx="http://schemas.microsoft.com/office/drawing/2014/chartex" xmlns:cx1="http://schemas.microsoft.com/office/drawing/2015/9/8/chartex" xmlns:cx2="http://schemas.microsoft.com/office/drawing/2015/10/21/chartex" xmlns:cx3="http://schemas.microsoft.com/office/drawing/2016/5/9/chartex" xmlns:cx4="http://schemas.microsoft.com/office/drawing/2016/5/10/chartex" xmlns:cx5="http://schemas.microsoft.com/office/drawing/2016/5/11/chartex" xmlns:cx6="http://schemas.microsoft.com/office/drawing/2016/5/12/chartex" xmlns:cx7="http://schemas.microsoft.com/office/drawing/2016/5/13/chartex" xmlns:cx8="http://schemas.microsoft.com/office/drawing/2016/5/14/chartex" xmlns:mc="http://schemas.openxmlformats.org/markup-compatibility/2006" xmlns:aink="http://schemas.microsoft.com/office/drawing/2016/ink" xmlns:am3d="http://schemas.microsoft.com/office/drawing/2017/model3d" xmlns:o="urn:schemas-microsoft-com:office:office" xmlns:oel="http://schemas.microsoft.com/office/2019/extlst" xmlns:r="http://schemas.openxmlformats.org/officeDocument/2006/relationships" xmlns:m="http://schemas.openxmlformats.org/officeDocument/2006/math" xmlns:v="urn:schemas-microsoft-com:vml" xmlns:wp14="http://schemas.microsoft.com/office/word/2010/wordprocessingDrawing" xmlns:wp="http://schemas.openxmlformats.org/drawingml/2006/wordprocessingDrawing" xmlns:w10="urn:schemas-microsoft-com:office:word" xmlns:w="http://schemas.openxmlformats.org/wordprocessingml/2006/main" xmlns:w14="http://schemas.microsoft.com/office/word/2010/wordml" xmlns:w15="http://schemas.microsoft.com/office/word/2012/wordml" xmlns:w16cex="http://schemas.microsoft.com/office/word/2018/wordml/cex" xmlns:w16cid="http://schemas.microsoft.com/office/word/2016/wordml/cid" xmlns:w16="http://schemas.microsoft.com/office/word/2018/wordml" xmlns:w16du="http://schemas.microsoft.com/office/word/2023/wordml/word16du" xmlns:w16sdtdh="http://schemas.microsoft.com/office/word/2020/wordml/sdtdatahash" xmlns:w16sdtfl="http://schemas.microsoft.com/office/word/2024/wordml/sdtformatlock" xmlns:w16se="http://schemas.microsoft.com/office/word/2015/wordml/symex" xmlns:wpg="http://schemas.microsoft.com/office/word/2010/wordprocessingGroup" xmlns:wpi="http://schemas.microsoft.com/office/word/2010/wordprocessingInk" xmlns:wne="http://schemas.microsoft.com/office/word/2006/wordml" xmlns:wps="http://schemas.microsoft.com/office/word/2010/wordprocessingShape" mc:Ignorable="w14 w15 w16se w16cid w16 w16cex w16sdtdh w16sdtfl w16du wp14">
-  <w15:commentEx w15:paraId="2867176A" w15:done="0"/>
-</w15:commentsEx>
-</file>
-
-<file path=word/commentsExtensible.xml><?xml version="1.0" encoding="utf-8"?>
-<w16cex:commentsExtensible xmlns:wpc="http://schemas.microsoft.com/office/word/2010/wordprocessingCanvas" xmlns:cx="http://schemas.microsoft.com/office/drawing/2014/chartex" xmlns:cx1="http://schemas.microsoft.com/office/drawing/2015/9/8/chartex" xmlns:cx2="http://schemas.microsoft.com/office/drawing/2015/10/21/chartex" xmlns:cx3="http://schemas.microsoft.com/office/drawing/2016/5/9/chartex" xmlns:cx4="http://schemas.microsoft.com/office/drawing/2016/5/10/chartex" xmlns:cx5="http://schemas.microsoft.com/office/drawing/2016/5/11/chartex" xmlns:cx6="http://schemas.microsoft.com/office/drawing/2016/5/12/chartex" xmlns:cx7="http://schemas.microsoft.com/office/drawing/2016/5/13/chartex" xmlns:cx8="http://schemas.microsoft.com/office/drawing/2016/5/14/chartex" xmlns:cr="http://schemas.microsoft.com/office/comments/2020/reactions" xmlns:mc="http://schemas.openxmlformats.org/markup-compatibility/2006" xmlns:aink="http://schemas.microsoft.com/office/drawing/2016/ink" xmlns:am3d="http://schemas.microsoft.com/office/drawing/2017/model3d" xmlns:o="urn:schemas-microsoft-com:office:office" xmlns:oel="http://schemas.microsoft.com/office/2019/extlst" xmlns:r="http://schemas.openxmlformats.org/officeDocument/2006/relationships" xmlns:m="http://schemas.openxmlformats.org/officeDocument/2006/math" xmlns:v="urn:schemas-microsoft-com:vml" xmlns:wp14="http://schemas.microsoft.com/office/word/2010/wordprocessingDrawing" xmlns:wp="http://schemas.openxmlformats.org/drawingml/2006/wordprocessingDrawing" xmlns:w10="urn:schemas-microsoft-com:office:word" xmlns:w="http://schemas.openxmlformats.org/wordprocessingml/2006/main" xmlns:w14="http://schemas.microsoft.com/office/word/2010/wordml" xmlns:w15="http://schemas.microsoft.com/office/word/2012/wordml" xmlns:w16cex="http://schemas.microsoft.com/office/word/2018/wordml/cex" xmlns:w16cid="http://schemas.microsoft.com/office/word/2016/wordml/cid" xmlns:w16="http://schemas.microsoft.com/office/word/2018/wordml" xmlns:w16du="http://schemas.microsoft.com/office/word/2023/wordml/word16du" xmlns:w16sdtdh="http://schemas.microsoft.com/office/word/2020/wordml/sdtdatahash" xmlns:w16sdtfl="http://schemas.microsoft.com/office/word/2024/wordml/sdtformatlock" xmlns:w16se="http://schemas.microsoft.com/office/word/2015/wordml/symex" xmlns:wpg="http://schemas.microsoft.com/office/word/2010/wordprocessingGroup" xmlns:wpi="http://schemas.microsoft.com/office/word/2010/wordprocessingInk" xmlns:wne="http://schemas.microsoft.com/office/word/2006/wordml" xmlns:wps="http://schemas.microsoft.com/office/word/2010/wordprocessingShape" mc:Ignorable="w14 w15 w16se w16cid w16 w16cex w16sdtdh w16sdtfl cr w16du wp14">
-  <w16cex:commentExtensible w16cex:durableId="7FA3D11E" w16cex:dateUtc="2026-07-04T14:48:00Z"/>
-</w16cex:commentsExtensible>
-</file>
-
-<file path=word/commentsIds.xml><?xml version="1.0" encoding="utf-8"?>
-<w16cid:commentsIds xmlns:wpc="http://schemas.microsoft.com/office/word/2010/wordprocessingCanvas" xmlns:cx="http://schemas.microsoft.com/office/drawing/2014/chartex" xmlns:cx1="http://schemas.microsoft.com/office/drawing/2015/9/8/chartex" xmlns:cx2="http://schemas.microsoft.com/office/drawing/2015/10/21/chartex" xmlns:cx3="http://schemas.microsoft.com/office/drawing/2016/5/9/chartex" xmlns:cx4="http://schemas.microsoft.com/office/drawing/2016/5/10/chartex" xmlns:cx5="http://schemas.microsoft.com/office/drawing/2016/5/11/chartex" xmlns:cx6="http://schemas.microsoft.com/office/drawing/2016/5/12/chartex" xmlns:cx7="http://schemas.microsoft.com/office/drawing/2016/5/13/chartex" xmlns:cx8="http://schemas.microsoft.com/office/drawing/2016/5/14/chartex" xmlns:mc="http://schemas.openxmlformats.org/markup-compatibility/2006" xmlns:aink="http://schemas.microsoft.com/office/drawing/2016/ink" xmlns:am3d="http://schemas.microsoft.com/office/drawing/2017/model3d" xmlns:o="urn:schemas-microsoft-com:office:office" xmlns:oel="http://schemas.microsoft.com/office/2019/extlst" xmlns:r="http://schemas.openxmlformats.org/officeDocument/2006/relationships" xmlns:m="http://schemas.openxmlformats.org/officeDocument/2006/math" xmlns:v="urn:schemas-microsoft-com:vml" xmlns:wp14="http://schemas.microsoft.com/office/word/2010/wordprocessingDrawing" xmlns:wp="http://schemas.openxmlformats.org/drawingml/2006/wordprocessingDrawing" xmlns:w10="urn:schemas-microsoft-com:office:word" xmlns:w="http://schemas.openxmlformats.org/wordprocessingml/2006/main" xmlns:w14="http://schemas.microsoft.com/office/word/2010/wordml" xmlns:w15="http://schemas.microsoft.com/office/word/2012/wordml" xmlns:w16cex="http://schemas.microsoft.com/office/word/2018/wordml/cex" xmlns:w16cid="http://schemas.microsoft.com/office/word/2016/wordml/cid" xmlns:w16="http://schemas.microsoft.com/office/word/2018/wordml" xmlns:w16du="http://schemas.microsoft.com/office/word/2023/wordml/word16du" xmlns:w16sdtdh="http://schemas.microsoft.com/office/word/2020/wordml/sdtdatahash" xmlns:w16sdtfl="http://schemas.microsoft.com/office/word/2024/wordml/sdtformatlock" xmlns:w16se="http://schemas.microsoft.com/office/word/2015/wordml/symex" xmlns:wpg="http://schemas.microsoft.com/office/word/2010/wordprocessingGroup" xmlns:wpi="http://schemas.microsoft.com/office/word/2010/wordprocessingInk" xmlns:wne="http://schemas.microsoft.com/office/word/2006/wordml" xmlns:wps="http://schemas.microsoft.com/office/word/2010/wordprocessingShape" mc:Ignorable="w14 w15 w16se w16cid w16 w16cex w16sdtdh w16sdtfl w16du wp14">
-  <w16cid:commentId w16cid:paraId="2867176A" w16cid:durableId="7FA3D11E"/>
-</w16cid:commentsIds>
-</file>
-
 <file path=word/numbering.xml><?xml version="1.0" encoding="utf-8"?>
 <w:numbering xmlns:wpc="http://schemas.microsoft.com/office/word/2010/wordprocessingCanvas" xmlns:cx="http://schemas.microsoft.com/office/drawing/2014/chartex" xmlns:cx1="http://schemas.microsoft.com/office/drawing/2015/9/8/chartex" xmlns:cx2="http://schemas.microsoft.com/office/drawing/2015/10/21/chartex" xmlns:cx3="http://schemas.microsoft.com/office/drawing/2016/5/9/chartex" xmlns:cx4="http://schemas.microsoft.com/office/drawing/2016/5/10/chartex" xmlns:cx5="http://schemas.microsoft.com/office/drawing/2016/5/11/chartex" xmlns:cx6="http://schemas.microsoft.com/office/drawing/2016/5/12/chartex" xmlns:cx7="http://schemas.microsoft.com/office/drawing/2016/5/13/chartex" xmlns:cx8="http://schemas.microsoft.com/office/drawing/2016/5/14/chartex" xmlns:mc="http://schemas.openxmlformats.org/markup-compatibility/2006" xmlns:aink="http://schemas.microsoft.com/office/drawing/2016/ink" xmlns:am3d="http://schemas.microsoft.com/office/drawing/2017/model3d" xmlns:o="urn:schemas-microsoft-com:office:office" xmlns:oel="http://schemas.microsoft.com/office/2019/extlst" xmlns:r="http://schemas.openxmlformats.org/officeDocument/2006/relationships" xmlns:m="http://schemas.openxmlformats.org/officeDocument/2006/math" xmlns:v="urn:schemas-microsoft-com:vml" xmlns:wp14="http://schemas.microsoft.com/office/word/2010/wordprocessingDrawing" xmlns:wp="http://schemas.openxmlformats.org/drawingml/2006/wordprocessingDrawing" xmlns:w10="urn:schemas-microsoft-com:office:word" xmlns:w="http://schemas.openxmlformats.org/wordprocessingml/2006/main" xmlns:w14="http://schemas.microsoft.com/office/word/2010/wordml" xmlns:w15="http://schemas.microsoft.com/office/word/2012/wordml" xmlns:w16cex="http://schemas.microsoft.com/office/word/2018/wordml/cex" xmlns:w16cid="http://schemas.microsoft.com/office/word/2016/wordml/cid" xmlns:w16="http://schemas.microsoft.com/office/word/2018/wordml" xmlns:w16du="http://schemas.microsoft.com/office/word/2023/wordml/word16du" xmlns:w16sdtdh="http://schemas.microsoft.com/office/word/2020/wordml/sdtdatahash" xmlns:w16sdtfl="http://schemas.microsoft.com/office/word/2024/wordml/sdtformatlock" xmlns:w16se="http://schemas.microsoft.com/office/word/2015/wordml/symex" xmlns:wpg="http://schemas.microsoft.com/office/word/2010/wordprocessingGroup" xmlns:wpi="http://schemas.microsoft.com/office/word/2010/wordprocessingInk" xmlns:wne="http://schemas.microsoft.com/office/word/2006/wordml" xmlns:wps="http://schemas.microsoft.com/office/word/2010/wordprocessingShape" mc:Ignorable="w14 w15 w16se w16cid w16 w16cex w16sdtdh w16sdtfl w16du wp14">
   <w:abstractNum w:abstractNumId="0" w15:restartNumberingAfterBreak="0">
@@ -1822,6 +2693,119 @@
     </w:lvl>
   </w:abstractNum>
   <w:abstractNum w:abstractNumId="3" w15:restartNumberingAfterBreak="0">
+    <w:nsid w:val="06121C3C"/>
+    <w:multiLevelType w:val="hybridMultilevel"/>
+    <w:tmpl w:val="C0F657EE"/>
+    <w:lvl w:ilvl="0" w:tplc="08090001">
+      <w:start w:val="1"/>
+      <w:numFmt w:val="bullet"/>
+      <w:lvlText w:val=""/>
+      <w:lvlJc w:val="left"/>
+      <w:pPr>
+        <w:ind w:left="720" w:hanging="360"/>
+      </w:pPr>
+      <w:rPr>
+        <w:rFonts w:ascii="Symbol" w:hAnsi="Symbol" w:hint="default"/>
+      </w:rPr>
+    </w:lvl>
+    <w:lvl w:ilvl="1" w:tplc="08090003" w:tentative="1">
+      <w:start w:val="1"/>
+      <w:numFmt w:val="bullet"/>
+      <w:lvlText w:val="o"/>
+      <w:lvlJc w:val="left"/>
+      <w:pPr>
+        <w:ind w:left="1440" w:hanging="360"/>
+      </w:pPr>
+      <w:rPr>
+        <w:rFonts w:ascii="Courier New" w:hAnsi="Courier New" w:cs="Courier New" w:hint="default"/>
+      </w:rPr>
+    </w:lvl>
+    <w:lvl w:ilvl="2" w:tplc="08090005" w:tentative="1">
+      <w:start w:val="1"/>
+      <w:numFmt w:val="bullet"/>
+      <w:lvlText w:val=""/>
+      <w:lvlJc w:val="left"/>
+      <w:pPr>
+        <w:ind w:left="2160" w:hanging="360"/>
+      </w:pPr>
+      <w:rPr>
+        <w:rFonts w:ascii="Wingdings" w:hAnsi="Wingdings" w:hint="default"/>
+      </w:rPr>
+    </w:lvl>
+    <w:lvl w:ilvl="3" w:tplc="08090001" w:tentative="1">
+      <w:start w:val="1"/>
+      <w:numFmt w:val="bullet"/>
+      <w:lvlText w:val=""/>
+      <w:lvlJc w:val="left"/>
+      <w:pPr>
+        <w:ind w:left="2880" w:hanging="360"/>
+      </w:pPr>
+      <w:rPr>
+        <w:rFonts w:ascii="Symbol" w:hAnsi="Symbol" w:hint="default"/>
+      </w:rPr>
+    </w:lvl>
+    <w:lvl w:ilvl="4" w:tplc="08090003" w:tentative="1">
+      <w:start w:val="1"/>
+      <w:numFmt w:val="bullet"/>
+      <w:lvlText w:val="o"/>
+      <w:lvlJc w:val="left"/>
+      <w:pPr>
+        <w:ind w:left="3600" w:hanging="360"/>
+      </w:pPr>
+      <w:rPr>
+        <w:rFonts w:ascii="Courier New" w:hAnsi="Courier New" w:cs="Courier New" w:hint="default"/>
+      </w:rPr>
+    </w:lvl>
+    <w:lvl w:ilvl="5" w:tplc="08090005" w:tentative="1">
+      <w:start w:val="1"/>
+      <w:numFmt w:val="bullet"/>
+      <w:lvlText w:val=""/>
+      <w:lvlJc w:val="left"/>
+      <w:pPr>
+        <w:ind w:left="4320" w:hanging="360"/>
+      </w:pPr>
+      <w:rPr>
+        <w:rFonts w:ascii="Wingdings" w:hAnsi="Wingdings" w:hint="default"/>
+      </w:rPr>
+    </w:lvl>
+    <w:lvl w:ilvl="6" w:tplc="08090001" w:tentative="1">
+      <w:start w:val="1"/>
+      <w:numFmt w:val="bullet"/>
+      <w:lvlText w:val=""/>
+      <w:lvlJc w:val="left"/>
+      <w:pPr>
+        <w:ind w:left="5040" w:hanging="360"/>
+      </w:pPr>
+      <w:rPr>
+        <w:rFonts w:ascii="Symbol" w:hAnsi="Symbol" w:hint="default"/>
+      </w:rPr>
+    </w:lvl>
+    <w:lvl w:ilvl="7" w:tplc="08090003" w:tentative="1">
+      <w:start w:val="1"/>
+      <w:numFmt w:val="bullet"/>
+      <w:lvlText w:val="o"/>
+      <w:lvlJc w:val="left"/>
+      <w:pPr>
+        <w:ind w:left="5760" w:hanging="360"/>
+      </w:pPr>
+      <w:rPr>
+        <w:rFonts w:ascii="Courier New" w:hAnsi="Courier New" w:cs="Courier New" w:hint="default"/>
+      </w:rPr>
+    </w:lvl>
+    <w:lvl w:ilvl="8" w:tplc="08090005" w:tentative="1">
+      <w:start w:val="1"/>
+      <w:numFmt w:val="bullet"/>
+      <w:lvlText w:val=""/>
+      <w:lvlJc w:val="left"/>
+      <w:pPr>
+        <w:ind w:left="6480" w:hanging="360"/>
+      </w:pPr>
+      <w:rPr>
+        <w:rFonts w:ascii="Wingdings" w:hAnsi="Wingdings" w:hint="default"/>
+      </w:rPr>
+    </w:lvl>
+  </w:abstractNum>
+  <w:abstractNum w:abstractNumId="4" w15:restartNumberingAfterBreak="0">
     <w:nsid w:val="09483044"/>
     <w:multiLevelType w:val="multilevel"/>
     <w:tmpl w:val="C576B672"/>
@@ -1934,7 +2918,7 @@
       </w:pPr>
     </w:lvl>
   </w:abstractNum>
-  <w:abstractNum w:abstractNumId="4" w15:restartNumberingAfterBreak="0">
+  <w:abstractNum w:abstractNumId="5" w15:restartNumberingAfterBreak="0">
     <w:nsid w:val="127B248F"/>
     <w:multiLevelType w:val="multilevel"/>
     <w:tmpl w:val="69F09910"/>
@@ -2047,7 +3031,7 @@
       </w:pPr>
     </w:lvl>
   </w:abstractNum>
-  <w:abstractNum w:abstractNumId="5" w15:restartNumberingAfterBreak="0">
+  <w:abstractNum w:abstractNumId="6" w15:restartNumberingAfterBreak="0">
     <w:nsid w:val="131A0DBD"/>
     <w:multiLevelType w:val="multilevel"/>
     <w:tmpl w:val="7668DF54"/>
@@ -2196,7 +3180,7 @@
       </w:rPr>
     </w:lvl>
   </w:abstractNum>
-  <w:abstractNum w:abstractNumId="6" w15:restartNumberingAfterBreak="0">
+  <w:abstractNum w:abstractNumId="7" w15:restartNumberingAfterBreak="0">
     <w:nsid w:val="15FE68FE"/>
     <w:multiLevelType w:val="multilevel"/>
     <w:tmpl w:val="65F83AEE"/>
@@ -2345,7 +3329,7 @@
       </w:rPr>
     </w:lvl>
   </w:abstractNum>
-  <w:abstractNum w:abstractNumId="7" w15:restartNumberingAfterBreak="0">
+  <w:abstractNum w:abstractNumId="8" w15:restartNumberingAfterBreak="0">
     <w:nsid w:val="17235FE1"/>
     <w:multiLevelType w:val="multilevel"/>
     <w:tmpl w:val="F34AE5A0"/>
@@ -2494,7 +3478,7 @@
       </w:rPr>
     </w:lvl>
   </w:abstractNum>
-  <w:abstractNum w:abstractNumId="8" w15:restartNumberingAfterBreak="0">
+  <w:abstractNum w:abstractNumId="9" w15:restartNumberingAfterBreak="0">
     <w:nsid w:val="1996508A"/>
     <w:multiLevelType w:val="multilevel"/>
     <w:tmpl w:val="F198151A"/>
@@ -2643,7 +3627,7 @@
       </w:rPr>
     </w:lvl>
   </w:abstractNum>
-  <w:abstractNum w:abstractNumId="9" w15:restartNumberingAfterBreak="0">
+  <w:abstractNum w:abstractNumId="10" w15:restartNumberingAfterBreak="0">
     <w:nsid w:val="1A7819A8"/>
     <w:multiLevelType w:val="multilevel"/>
     <w:tmpl w:val="10E466CE"/>
@@ -2792,7 +3776,603 @@
       </w:rPr>
     </w:lvl>
   </w:abstractNum>
-  <w:abstractNum w:abstractNumId="10" w15:restartNumberingAfterBreak="0">
+  <w:abstractNum w:abstractNumId="11" w15:restartNumberingAfterBreak="0">
+    <w:nsid w:val="1DE16D1E"/>
+    <w:multiLevelType w:val="multilevel"/>
+    <w:tmpl w:val="D0AA7ED4"/>
+    <w:lvl w:ilvl="0">
+      <w:start w:val="1"/>
+      <w:numFmt w:val="bullet"/>
+      <w:lvlText w:val=""/>
+      <w:lvlJc w:val="left"/>
+      <w:pPr>
+        <w:tabs>
+          <w:tab w:val="num" w:pos="720"/>
+        </w:tabs>
+        <w:ind w:left="720" w:hanging="360"/>
+      </w:pPr>
+      <w:rPr>
+        <w:rFonts w:ascii="Symbol" w:hAnsi="Symbol" w:hint="default"/>
+        <w:sz w:val="20"/>
+      </w:rPr>
+    </w:lvl>
+    <w:lvl w:ilvl="1" w:tentative="1">
+      <w:start w:val="1"/>
+      <w:numFmt w:val="bullet"/>
+      <w:lvlText w:val="o"/>
+      <w:lvlJc w:val="left"/>
+      <w:pPr>
+        <w:tabs>
+          <w:tab w:val="num" w:pos="1440"/>
+        </w:tabs>
+        <w:ind w:left="1440" w:hanging="360"/>
+      </w:pPr>
+      <w:rPr>
+        <w:rFonts w:ascii="Courier New" w:hAnsi="Courier New" w:hint="default"/>
+        <w:sz w:val="20"/>
+      </w:rPr>
+    </w:lvl>
+    <w:lvl w:ilvl="2" w:tentative="1">
+      <w:start w:val="1"/>
+      <w:numFmt w:val="bullet"/>
+      <w:lvlText w:val=""/>
+      <w:lvlJc w:val="left"/>
+      <w:pPr>
+        <w:tabs>
+          <w:tab w:val="num" w:pos="2160"/>
+        </w:tabs>
+        <w:ind w:left="2160" w:hanging="360"/>
+      </w:pPr>
+      <w:rPr>
+        <w:rFonts w:ascii="Wingdings" w:hAnsi="Wingdings" w:hint="default"/>
+        <w:sz w:val="20"/>
+      </w:rPr>
+    </w:lvl>
+    <w:lvl w:ilvl="3" w:tentative="1">
+      <w:start w:val="1"/>
+      <w:numFmt w:val="bullet"/>
+      <w:lvlText w:val=""/>
+      <w:lvlJc w:val="left"/>
+      <w:pPr>
+        <w:tabs>
+          <w:tab w:val="num" w:pos="2880"/>
+        </w:tabs>
+        <w:ind w:left="2880" w:hanging="360"/>
+      </w:pPr>
+      <w:rPr>
+        <w:rFonts w:ascii="Wingdings" w:hAnsi="Wingdings" w:hint="default"/>
+        <w:sz w:val="20"/>
+      </w:rPr>
+    </w:lvl>
+    <w:lvl w:ilvl="4" w:tentative="1">
+      <w:start w:val="1"/>
+      <w:numFmt w:val="bullet"/>
+      <w:lvlText w:val=""/>
+      <w:lvlJc w:val="left"/>
+      <w:pPr>
+        <w:tabs>
+          <w:tab w:val="num" w:pos="3600"/>
+        </w:tabs>
+        <w:ind w:left="3600" w:hanging="360"/>
+      </w:pPr>
+      <w:rPr>
+        <w:rFonts w:ascii="Wingdings" w:hAnsi="Wingdings" w:hint="default"/>
+        <w:sz w:val="20"/>
+      </w:rPr>
+    </w:lvl>
+    <w:lvl w:ilvl="5" w:tentative="1">
+      <w:start w:val="1"/>
+      <w:numFmt w:val="bullet"/>
+      <w:lvlText w:val=""/>
+      <w:lvlJc w:val="left"/>
+      <w:pPr>
+        <w:tabs>
+          <w:tab w:val="num" w:pos="4320"/>
+        </w:tabs>
+        <w:ind w:left="4320" w:hanging="360"/>
+      </w:pPr>
+      <w:rPr>
+        <w:rFonts w:ascii="Wingdings" w:hAnsi="Wingdings" w:hint="default"/>
+        <w:sz w:val="20"/>
+      </w:rPr>
+    </w:lvl>
+    <w:lvl w:ilvl="6" w:tentative="1">
+      <w:start w:val="1"/>
+      <w:numFmt w:val="bullet"/>
+      <w:lvlText w:val=""/>
+      <w:lvlJc w:val="left"/>
+      <w:pPr>
+        <w:tabs>
+          <w:tab w:val="num" w:pos="5040"/>
+        </w:tabs>
+        <w:ind w:left="5040" w:hanging="360"/>
+      </w:pPr>
+      <w:rPr>
+        <w:rFonts w:ascii="Wingdings" w:hAnsi="Wingdings" w:hint="default"/>
+        <w:sz w:val="20"/>
+      </w:rPr>
+    </w:lvl>
+    <w:lvl w:ilvl="7" w:tentative="1">
+      <w:start w:val="1"/>
+      <w:numFmt w:val="bullet"/>
+      <w:lvlText w:val=""/>
+      <w:lvlJc w:val="left"/>
+      <w:pPr>
+        <w:tabs>
+          <w:tab w:val="num" w:pos="5760"/>
+        </w:tabs>
+        <w:ind w:left="5760" w:hanging="360"/>
+      </w:pPr>
+      <w:rPr>
+        <w:rFonts w:ascii="Wingdings" w:hAnsi="Wingdings" w:hint="default"/>
+        <w:sz w:val="20"/>
+      </w:rPr>
+    </w:lvl>
+    <w:lvl w:ilvl="8" w:tentative="1">
+      <w:start w:val="1"/>
+      <w:numFmt w:val="bullet"/>
+      <w:lvlText w:val=""/>
+      <w:lvlJc w:val="left"/>
+      <w:pPr>
+        <w:tabs>
+          <w:tab w:val="num" w:pos="6480"/>
+        </w:tabs>
+        <w:ind w:left="6480" w:hanging="360"/>
+      </w:pPr>
+      <w:rPr>
+        <w:rFonts w:ascii="Wingdings" w:hAnsi="Wingdings" w:hint="default"/>
+        <w:sz w:val="20"/>
+      </w:rPr>
+    </w:lvl>
+  </w:abstractNum>
+  <w:abstractNum w:abstractNumId="12" w15:restartNumberingAfterBreak="0">
+    <w:nsid w:val="21DA54DB"/>
+    <w:multiLevelType w:val="multilevel"/>
+    <w:tmpl w:val="2FFAF406"/>
+    <w:lvl w:ilvl="0">
+      <w:start w:val="1"/>
+      <w:numFmt w:val="bullet"/>
+      <w:lvlText w:val=""/>
+      <w:lvlJc w:val="left"/>
+      <w:pPr>
+        <w:tabs>
+          <w:tab w:val="num" w:pos="720"/>
+        </w:tabs>
+        <w:ind w:left="720" w:hanging="360"/>
+      </w:pPr>
+      <w:rPr>
+        <w:rFonts w:ascii="Symbol" w:hAnsi="Symbol" w:hint="default"/>
+        <w:sz w:val="20"/>
+      </w:rPr>
+    </w:lvl>
+    <w:lvl w:ilvl="1" w:tentative="1">
+      <w:start w:val="1"/>
+      <w:numFmt w:val="bullet"/>
+      <w:lvlText w:val="o"/>
+      <w:lvlJc w:val="left"/>
+      <w:pPr>
+        <w:tabs>
+          <w:tab w:val="num" w:pos="1440"/>
+        </w:tabs>
+        <w:ind w:left="1440" w:hanging="360"/>
+      </w:pPr>
+      <w:rPr>
+        <w:rFonts w:ascii="Courier New" w:hAnsi="Courier New" w:hint="default"/>
+        <w:sz w:val="20"/>
+      </w:rPr>
+    </w:lvl>
+    <w:lvl w:ilvl="2" w:tentative="1">
+      <w:start w:val="1"/>
+      <w:numFmt w:val="bullet"/>
+      <w:lvlText w:val=""/>
+      <w:lvlJc w:val="left"/>
+      <w:pPr>
+        <w:tabs>
+          <w:tab w:val="num" w:pos="2160"/>
+        </w:tabs>
+        <w:ind w:left="2160" w:hanging="360"/>
+      </w:pPr>
+      <w:rPr>
+        <w:rFonts w:ascii="Wingdings" w:hAnsi="Wingdings" w:hint="default"/>
+        <w:sz w:val="20"/>
+      </w:rPr>
+    </w:lvl>
+    <w:lvl w:ilvl="3" w:tentative="1">
+      <w:start w:val="1"/>
+      <w:numFmt w:val="bullet"/>
+      <w:lvlText w:val=""/>
+      <w:lvlJc w:val="left"/>
+      <w:pPr>
+        <w:tabs>
+          <w:tab w:val="num" w:pos="2880"/>
+        </w:tabs>
+        <w:ind w:left="2880" w:hanging="360"/>
+      </w:pPr>
+      <w:rPr>
+        <w:rFonts w:ascii="Wingdings" w:hAnsi="Wingdings" w:hint="default"/>
+        <w:sz w:val="20"/>
+      </w:rPr>
+    </w:lvl>
+    <w:lvl w:ilvl="4" w:tentative="1">
+      <w:start w:val="1"/>
+      <w:numFmt w:val="bullet"/>
+      <w:lvlText w:val=""/>
+      <w:lvlJc w:val="left"/>
+      <w:pPr>
+        <w:tabs>
+          <w:tab w:val="num" w:pos="3600"/>
+        </w:tabs>
+        <w:ind w:left="3600" w:hanging="360"/>
+      </w:pPr>
+      <w:rPr>
+        <w:rFonts w:ascii="Wingdings" w:hAnsi="Wingdings" w:hint="default"/>
+        <w:sz w:val="20"/>
+      </w:rPr>
+    </w:lvl>
+    <w:lvl w:ilvl="5" w:tentative="1">
+      <w:start w:val="1"/>
+      <w:numFmt w:val="bullet"/>
+      <w:lvlText w:val=""/>
+      <w:lvlJc w:val="left"/>
+      <w:pPr>
+        <w:tabs>
+          <w:tab w:val="num" w:pos="4320"/>
+        </w:tabs>
+        <w:ind w:left="4320" w:hanging="360"/>
+      </w:pPr>
+      <w:rPr>
+        <w:rFonts w:ascii="Wingdings" w:hAnsi="Wingdings" w:hint="default"/>
+        <w:sz w:val="20"/>
+      </w:rPr>
+    </w:lvl>
+    <w:lvl w:ilvl="6" w:tentative="1">
+      <w:start w:val="1"/>
+      <w:numFmt w:val="bullet"/>
+      <w:lvlText w:val=""/>
+      <w:lvlJc w:val="left"/>
+      <w:pPr>
+        <w:tabs>
+          <w:tab w:val="num" w:pos="5040"/>
+        </w:tabs>
+        <w:ind w:left="5040" w:hanging="360"/>
+      </w:pPr>
+      <w:rPr>
+        <w:rFonts w:ascii="Wingdings" w:hAnsi="Wingdings" w:hint="default"/>
+        <w:sz w:val="20"/>
+      </w:rPr>
+    </w:lvl>
+    <w:lvl w:ilvl="7" w:tentative="1">
+      <w:start w:val="1"/>
+      <w:numFmt w:val="bullet"/>
+      <w:lvlText w:val=""/>
+      <w:lvlJc w:val="left"/>
+      <w:pPr>
+        <w:tabs>
+          <w:tab w:val="num" w:pos="5760"/>
+        </w:tabs>
+        <w:ind w:left="5760" w:hanging="360"/>
+      </w:pPr>
+      <w:rPr>
+        <w:rFonts w:ascii="Wingdings" w:hAnsi="Wingdings" w:hint="default"/>
+        <w:sz w:val="20"/>
+      </w:rPr>
+    </w:lvl>
+    <w:lvl w:ilvl="8" w:tentative="1">
+      <w:start w:val="1"/>
+      <w:numFmt w:val="bullet"/>
+      <w:lvlText w:val=""/>
+      <w:lvlJc w:val="left"/>
+      <w:pPr>
+        <w:tabs>
+          <w:tab w:val="num" w:pos="6480"/>
+        </w:tabs>
+        <w:ind w:left="6480" w:hanging="360"/>
+      </w:pPr>
+      <w:rPr>
+        <w:rFonts w:ascii="Wingdings" w:hAnsi="Wingdings" w:hint="default"/>
+        <w:sz w:val="20"/>
+      </w:rPr>
+    </w:lvl>
+  </w:abstractNum>
+  <w:abstractNum w:abstractNumId="13" w15:restartNumberingAfterBreak="0">
+    <w:nsid w:val="25322051"/>
+    <w:multiLevelType w:val="multilevel"/>
+    <w:tmpl w:val="E05A99D0"/>
+    <w:lvl w:ilvl="0">
+      <w:start w:val="1"/>
+      <w:numFmt w:val="bullet"/>
+      <w:lvlText w:val=""/>
+      <w:lvlJc w:val="left"/>
+      <w:pPr>
+        <w:tabs>
+          <w:tab w:val="num" w:pos="720"/>
+        </w:tabs>
+        <w:ind w:left="720" w:hanging="360"/>
+      </w:pPr>
+      <w:rPr>
+        <w:rFonts w:ascii="Symbol" w:hAnsi="Symbol" w:hint="default"/>
+        <w:sz w:val="20"/>
+      </w:rPr>
+    </w:lvl>
+    <w:lvl w:ilvl="1" w:tentative="1">
+      <w:start w:val="1"/>
+      <w:numFmt w:val="bullet"/>
+      <w:lvlText w:val="o"/>
+      <w:lvlJc w:val="left"/>
+      <w:pPr>
+        <w:tabs>
+          <w:tab w:val="num" w:pos="1440"/>
+        </w:tabs>
+        <w:ind w:left="1440" w:hanging="360"/>
+      </w:pPr>
+      <w:rPr>
+        <w:rFonts w:ascii="Courier New" w:hAnsi="Courier New" w:hint="default"/>
+        <w:sz w:val="20"/>
+      </w:rPr>
+    </w:lvl>
+    <w:lvl w:ilvl="2" w:tentative="1">
+      <w:start w:val="1"/>
+      <w:numFmt w:val="bullet"/>
+      <w:lvlText w:val=""/>
+      <w:lvlJc w:val="left"/>
+      <w:pPr>
+        <w:tabs>
+          <w:tab w:val="num" w:pos="2160"/>
+        </w:tabs>
+        <w:ind w:left="2160" w:hanging="360"/>
+      </w:pPr>
+      <w:rPr>
+        <w:rFonts w:ascii="Wingdings" w:hAnsi="Wingdings" w:hint="default"/>
+        <w:sz w:val="20"/>
+      </w:rPr>
+    </w:lvl>
+    <w:lvl w:ilvl="3" w:tentative="1">
+      <w:start w:val="1"/>
+      <w:numFmt w:val="bullet"/>
+      <w:lvlText w:val=""/>
+      <w:lvlJc w:val="left"/>
+      <w:pPr>
+        <w:tabs>
+          <w:tab w:val="num" w:pos="2880"/>
+        </w:tabs>
+        <w:ind w:left="2880" w:hanging="360"/>
+      </w:pPr>
+      <w:rPr>
+        <w:rFonts w:ascii="Wingdings" w:hAnsi="Wingdings" w:hint="default"/>
+        <w:sz w:val="20"/>
+      </w:rPr>
+    </w:lvl>
+    <w:lvl w:ilvl="4" w:tentative="1">
+      <w:start w:val="1"/>
+      <w:numFmt w:val="bullet"/>
+      <w:lvlText w:val=""/>
+      <w:lvlJc w:val="left"/>
+      <w:pPr>
+        <w:tabs>
+          <w:tab w:val="num" w:pos="3600"/>
+        </w:tabs>
+        <w:ind w:left="3600" w:hanging="360"/>
+      </w:pPr>
+      <w:rPr>
+        <w:rFonts w:ascii="Wingdings" w:hAnsi="Wingdings" w:hint="default"/>
+        <w:sz w:val="20"/>
+      </w:rPr>
+    </w:lvl>
+    <w:lvl w:ilvl="5" w:tentative="1">
+      <w:start w:val="1"/>
+      <w:numFmt w:val="bullet"/>
+      <w:lvlText w:val=""/>
+      <w:lvlJc w:val="left"/>
+      <w:pPr>
+        <w:tabs>
+          <w:tab w:val="num" w:pos="4320"/>
+        </w:tabs>
+        <w:ind w:left="4320" w:hanging="360"/>
+      </w:pPr>
+      <w:rPr>
+        <w:rFonts w:ascii="Wingdings" w:hAnsi="Wingdings" w:hint="default"/>
+        <w:sz w:val="20"/>
+      </w:rPr>
+    </w:lvl>
+    <w:lvl w:ilvl="6" w:tentative="1">
+      <w:start w:val="1"/>
+      <w:numFmt w:val="bullet"/>
+      <w:lvlText w:val=""/>
+      <w:lvlJc w:val="left"/>
+      <w:pPr>
+        <w:tabs>
+          <w:tab w:val="num" w:pos="5040"/>
+        </w:tabs>
+        <w:ind w:left="5040" w:hanging="360"/>
+      </w:pPr>
+      <w:rPr>
+        <w:rFonts w:ascii="Wingdings" w:hAnsi="Wingdings" w:hint="default"/>
+        <w:sz w:val="20"/>
+      </w:rPr>
+    </w:lvl>
+    <w:lvl w:ilvl="7" w:tentative="1">
+      <w:start w:val="1"/>
+      <w:numFmt w:val="bullet"/>
+      <w:lvlText w:val=""/>
+      <w:lvlJc w:val="left"/>
+      <w:pPr>
+        <w:tabs>
+          <w:tab w:val="num" w:pos="5760"/>
+        </w:tabs>
+        <w:ind w:left="5760" w:hanging="360"/>
+      </w:pPr>
+      <w:rPr>
+        <w:rFonts w:ascii="Wingdings" w:hAnsi="Wingdings" w:hint="default"/>
+        <w:sz w:val="20"/>
+      </w:rPr>
+    </w:lvl>
+    <w:lvl w:ilvl="8" w:tentative="1">
+      <w:start w:val="1"/>
+      <w:numFmt w:val="bullet"/>
+      <w:lvlText w:val=""/>
+      <w:lvlJc w:val="left"/>
+      <w:pPr>
+        <w:tabs>
+          <w:tab w:val="num" w:pos="6480"/>
+        </w:tabs>
+        <w:ind w:left="6480" w:hanging="360"/>
+      </w:pPr>
+      <w:rPr>
+        <w:rFonts w:ascii="Wingdings" w:hAnsi="Wingdings" w:hint="default"/>
+        <w:sz w:val="20"/>
+      </w:rPr>
+    </w:lvl>
+  </w:abstractNum>
+  <w:abstractNum w:abstractNumId="14" w15:restartNumberingAfterBreak="0">
+    <w:nsid w:val="2CA60B07"/>
+    <w:multiLevelType w:val="multilevel"/>
+    <w:tmpl w:val="85FA6EEA"/>
+    <w:lvl w:ilvl="0">
+      <w:start w:val="1"/>
+      <w:numFmt w:val="bullet"/>
+      <w:lvlText w:val=""/>
+      <w:lvlJc w:val="left"/>
+      <w:pPr>
+        <w:tabs>
+          <w:tab w:val="num" w:pos="720"/>
+        </w:tabs>
+        <w:ind w:left="720" w:hanging="360"/>
+      </w:pPr>
+      <w:rPr>
+        <w:rFonts w:ascii="Symbol" w:hAnsi="Symbol" w:hint="default"/>
+        <w:sz w:val="20"/>
+      </w:rPr>
+    </w:lvl>
+    <w:lvl w:ilvl="1" w:tentative="1">
+      <w:start w:val="1"/>
+      <w:numFmt w:val="bullet"/>
+      <w:lvlText w:val="o"/>
+      <w:lvlJc w:val="left"/>
+      <w:pPr>
+        <w:tabs>
+          <w:tab w:val="num" w:pos="1440"/>
+        </w:tabs>
+        <w:ind w:left="1440" w:hanging="360"/>
+      </w:pPr>
+      <w:rPr>
+        <w:rFonts w:ascii="Courier New" w:hAnsi="Courier New" w:hint="default"/>
+        <w:sz w:val="20"/>
+      </w:rPr>
+    </w:lvl>
+    <w:lvl w:ilvl="2" w:tentative="1">
+      <w:start w:val="1"/>
+      <w:numFmt w:val="bullet"/>
+      <w:lvlText w:val=""/>
+      <w:lvlJc w:val="left"/>
+      <w:pPr>
+        <w:tabs>
+          <w:tab w:val="num" w:pos="2160"/>
+        </w:tabs>
+        <w:ind w:left="2160" w:hanging="360"/>
+      </w:pPr>
+      <w:rPr>
+        <w:rFonts w:ascii="Wingdings" w:hAnsi="Wingdings" w:hint="default"/>
+        <w:sz w:val="20"/>
+      </w:rPr>
+    </w:lvl>
+    <w:lvl w:ilvl="3" w:tentative="1">
+      <w:start w:val="1"/>
+      <w:numFmt w:val="bullet"/>
+      <w:lvlText w:val=""/>
+      <w:lvlJc w:val="left"/>
+      <w:pPr>
+        <w:tabs>
+          <w:tab w:val="num" w:pos="2880"/>
+        </w:tabs>
+        <w:ind w:left="2880" w:hanging="360"/>
+      </w:pPr>
+      <w:rPr>
+        <w:rFonts w:ascii="Wingdings" w:hAnsi="Wingdings" w:hint="default"/>
+        <w:sz w:val="20"/>
+      </w:rPr>
+    </w:lvl>
+    <w:lvl w:ilvl="4" w:tentative="1">
+      <w:start w:val="1"/>
+      <w:numFmt w:val="bullet"/>
+      <w:lvlText w:val=""/>
+      <w:lvlJc w:val="left"/>
+      <w:pPr>
+        <w:tabs>
+          <w:tab w:val="num" w:pos="3600"/>
+        </w:tabs>
+        <w:ind w:left="3600" w:hanging="360"/>
+      </w:pPr>
+      <w:rPr>
+        <w:rFonts w:ascii="Wingdings" w:hAnsi="Wingdings" w:hint="default"/>
+        <w:sz w:val="20"/>
+      </w:rPr>
+    </w:lvl>
+    <w:lvl w:ilvl="5" w:tentative="1">
+      <w:start w:val="1"/>
+      <w:numFmt w:val="bullet"/>
+      <w:lvlText w:val=""/>
+      <w:lvlJc w:val="left"/>
+      <w:pPr>
+        <w:tabs>
+          <w:tab w:val="num" w:pos="4320"/>
+        </w:tabs>
+        <w:ind w:left="4320" w:hanging="360"/>
+      </w:pPr>
+      <w:rPr>
+        <w:rFonts w:ascii="Wingdings" w:hAnsi="Wingdings" w:hint="default"/>
+        <w:sz w:val="20"/>
+      </w:rPr>
+    </w:lvl>
+    <w:lvl w:ilvl="6" w:tentative="1">
+      <w:start w:val="1"/>
+      <w:numFmt w:val="bullet"/>
+      <w:lvlText w:val=""/>
+      <w:lvlJc w:val="left"/>
+      <w:pPr>
+        <w:tabs>
+          <w:tab w:val="num" w:pos="5040"/>
+        </w:tabs>
+        <w:ind w:left="5040" w:hanging="360"/>
+      </w:pPr>
+      <w:rPr>
+        <w:rFonts w:ascii="Wingdings" w:hAnsi="Wingdings" w:hint="default"/>
+        <w:sz w:val="20"/>
+      </w:rPr>
+    </w:lvl>
+    <w:lvl w:ilvl="7" w:tentative="1">
+      <w:start w:val="1"/>
+      <w:numFmt w:val="bullet"/>
+      <w:lvlText w:val=""/>
+      <w:lvlJc w:val="left"/>
+      <w:pPr>
+        <w:tabs>
+          <w:tab w:val="num" w:pos="5760"/>
+        </w:tabs>
+        <w:ind w:left="5760" w:hanging="360"/>
+      </w:pPr>
+      <w:rPr>
+        <w:rFonts w:ascii="Wingdings" w:hAnsi="Wingdings" w:hint="default"/>
+        <w:sz w:val="20"/>
+      </w:rPr>
+    </w:lvl>
+    <w:lvl w:ilvl="8" w:tentative="1">
+      <w:start w:val="1"/>
+      <w:numFmt w:val="bullet"/>
+      <w:lvlText w:val=""/>
+      <w:lvlJc w:val="left"/>
+      <w:pPr>
+        <w:tabs>
+          <w:tab w:val="num" w:pos="6480"/>
+        </w:tabs>
+        <w:ind w:left="6480" w:hanging="360"/>
+      </w:pPr>
+      <w:rPr>
+        <w:rFonts w:ascii="Wingdings" w:hAnsi="Wingdings" w:hint="default"/>
+        <w:sz w:val="20"/>
+      </w:rPr>
+    </w:lvl>
+  </w:abstractNum>
+  <w:abstractNum w:abstractNumId="15" w15:restartNumberingAfterBreak="0">
     <w:nsid w:val="2DF54639"/>
     <w:multiLevelType w:val="multilevel"/>
     <w:tmpl w:val="51F6A5B8"/>
@@ -2941,7 +4521,7 @@
       </w:rPr>
     </w:lvl>
   </w:abstractNum>
-  <w:abstractNum w:abstractNumId="11" w15:restartNumberingAfterBreak="0">
+  <w:abstractNum w:abstractNumId="16" w15:restartNumberingAfterBreak="0">
     <w:nsid w:val="31640CA4"/>
     <w:multiLevelType w:val="multilevel"/>
     <w:tmpl w:val="6806343C"/>
@@ -3058,7 +4638,156 @@
       </w:pPr>
     </w:lvl>
   </w:abstractNum>
-  <w:abstractNum w:abstractNumId="12" w15:restartNumberingAfterBreak="0">
+  <w:abstractNum w:abstractNumId="17" w15:restartNumberingAfterBreak="0">
+    <w:nsid w:val="398F5129"/>
+    <w:multiLevelType w:val="multilevel"/>
+    <w:tmpl w:val="A322F550"/>
+    <w:lvl w:ilvl="0">
+      <w:start w:val="1"/>
+      <w:numFmt w:val="bullet"/>
+      <w:lvlText w:val=""/>
+      <w:lvlJc w:val="left"/>
+      <w:pPr>
+        <w:tabs>
+          <w:tab w:val="num" w:pos="720"/>
+        </w:tabs>
+        <w:ind w:left="720" w:hanging="360"/>
+      </w:pPr>
+      <w:rPr>
+        <w:rFonts w:ascii="Symbol" w:hAnsi="Symbol" w:hint="default"/>
+        <w:sz w:val="20"/>
+      </w:rPr>
+    </w:lvl>
+    <w:lvl w:ilvl="1" w:tentative="1">
+      <w:start w:val="1"/>
+      <w:numFmt w:val="bullet"/>
+      <w:lvlText w:val="o"/>
+      <w:lvlJc w:val="left"/>
+      <w:pPr>
+        <w:tabs>
+          <w:tab w:val="num" w:pos="1440"/>
+        </w:tabs>
+        <w:ind w:left="1440" w:hanging="360"/>
+      </w:pPr>
+      <w:rPr>
+        <w:rFonts w:ascii="Courier New" w:hAnsi="Courier New" w:hint="default"/>
+        <w:sz w:val="20"/>
+      </w:rPr>
+    </w:lvl>
+    <w:lvl w:ilvl="2" w:tentative="1">
+      <w:start w:val="1"/>
+      <w:numFmt w:val="bullet"/>
+      <w:lvlText w:val=""/>
+      <w:lvlJc w:val="left"/>
+      <w:pPr>
+        <w:tabs>
+          <w:tab w:val="num" w:pos="2160"/>
+        </w:tabs>
+        <w:ind w:left="2160" w:hanging="360"/>
+      </w:pPr>
+      <w:rPr>
+        <w:rFonts w:ascii="Wingdings" w:hAnsi="Wingdings" w:hint="default"/>
+        <w:sz w:val="20"/>
+      </w:rPr>
+    </w:lvl>
+    <w:lvl w:ilvl="3" w:tentative="1">
+      <w:start w:val="1"/>
+      <w:numFmt w:val="bullet"/>
+      <w:lvlText w:val=""/>
+      <w:lvlJc w:val="left"/>
+      <w:pPr>
+        <w:tabs>
+          <w:tab w:val="num" w:pos="2880"/>
+        </w:tabs>
+        <w:ind w:left="2880" w:hanging="360"/>
+      </w:pPr>
+      <w:rPr>
+        <w:rFonts w:ascii="Wingdings" w:hAnsi="Wingdings" w:hint="default"/>
+        <w:sz w:val="20"/>
+      </w:rPr>
+    </w:lvl>
+    <w:lvl w:ilvl="4" w:tentative="1">
+      <w:start w:val="1"/>
+      <w:numFmt w:val="bullet"/>
+      <w:lvlText w:val=""/>
+      <w:lvlJc w:val="left"/>
+      <w:pPr>
+        <w:tabs>
+          <w:tab w:val="num" w:pos="3600"/>
+        </w:tabs>
+        <w:ind w:left="3600" w:hanging="360"/>
+      </w:pPr>
+      <w:rPr>
+        <w:rFonts w:ascii="Wingdings" w:hAnsi="Wingdings" w:hint="default"/>
+        <w:sz w:val="20"/>
+      </w:rPr>
+    </w:lvl>
+    <w:lvl w:ilvl="5" w:tentative="1">
+      <w:start w:val="1"/>
+      <w:numFmt w:val="bullet"/>
+      <w:lvlText w:val=""/>
+      <w:lvlJc w:val="left"/>
+      <w:pPr>
+        <w:tabs>
+          <w:tab w:val="num" w:pos="4320"/>
+        </w:tabs>
+        <w:ind w:left="4320" w:hanging="360"/>
+      </w:pPr>
+      <w:rPr>
+        <w:rFonts w:ascii="Wingdings" w:hAnsi="Wingdings" w:hint="default"/>
+        <w:sz w:val="20"/>
+      </w:rPr>
+    </w:lvl>
+    <w:lvl w:ilvl="6" w:tentative="1">
+      <w:start w:val="1"/>
+      <w:numFmt w:val="bullet"/>
+      <w:lvlText w:val=""/>
+      <w:lvlJc w:val="left"/>
+      <w:pPr>
+        <w:tabs>
+          <w:tab w:val="num" w:pos="5040"/>
+        </w:tabs>
+        <w:ind w:left="5040" w:hanging="360"/>
+      </w:pPr>
+      <w:rPr>
+        <w:rFonts w:ascii="Wingdings" w:hAnsi="Wingdings" w:hint="default"/>
+        <w:sz w:val="20"/>
+      </w:rPr>
+    </w:lvl>
+    <w:lvl w:ilvl="7" w:tentative="1">
+      <w:start w:val="1"/>
+      <w:numFmt w:val="bullet"/>
+      <w:lvlText w:val=""/>
+      <w:lvlJc w:val="left"/>
+      <w:pPr>
+        <w:tabs>
+          <w:tab w:val="num" w:pos="5760"/>
+        </w:tabs>
+        <w:ind w:left="5760" w:hanging="360"/>
+      </w:pPr>
+      <w:rPr>
+        <w:rFonts w:ascii="Wingdings" w:hAnsi="Wingdings" w:hint="default"/>
+        <w:sz w:val="20"/>
+      </w:rPr>
+    </w:lvl>
+    <w:lvl w:ilvl="8" w:tentative="1">
+      <w:start w:val="1"/>
+      <w:numFmt w:val="bullet"/>
+      <w:lvlText w:val=""/>
+      <w:lvlJc w:val="left"/>
+      <w:pPr>
+        <w:tabs>
+          <w:tab w:val="num" w:pos="6480"/>
+        </w:tabs>
+        <w:ind w:left="6480" w:hanging="360"/>
+      </w:pPr>
+      <w:rPr>
+        <w:rFonts w:ascii="Wingdings" w:hAnsi="Wingdings" w:hint="default"/>
+        <w:sz w:val="20"/>
+      </w:rPr>
+    </w:lvl>
+  </w:abstractNum>
+  <w:abstractNum w:abstractNumId="18" w15:restartNumberingAfterBreak="0">
     <w:nsid w:val="3CAC5FF4"/>
     <w:multiLevelType w:val="multilevel"/>
     <w:tmpl w:val="BFBC23AA"/>
@@ -3207,7 +4936,305 @@
       </w:rPr>
     </w:lvl>
   </w:abstractNum>
-  <w:abstractNum w:abstractNumId="13" w15:restartNumberingAfterBreak="0">
+  <w:abstractNum w:abstractNumId="19" w15:restartNumberingAfterBreak="0">
+    <w:nsid w:val="4BE4348C"/>
+    <w:multiLevelType w:val="multilevel"/>
+    <w:tmpl w:val="1A58024C"/>
+    <w:lvl w:ilvl="0">
+      <w:start w:val="1"/>
+      <w:numFmt w:val="bullet"/>
+      <w:lvlText w:val=""/>
+      <w:lvlJc w:val="left"/>
+      <w:pPr>
+        <w:tabs>
+          <w:tab w:val="num" w:pos="720"/>
+        </w:tabs>
+        <w:ind w:left="720" w:hanging="360"/>
+      </w:pPr>
+      <w:rPr>
+        <w:rFonts w:ascii="Symbol" w:hAnsi="Symbol" w:hint="default"/>
+        <w:sz w:val="20"/>
+      </w:rPr>
+    </w:lvl>
+    <w:lvl w:ilvl="1" w:tentative="1">
+      <w:start w:val="1"/>
+      <w:numFmt w:val="bullet"/>
+      <w:lvlText w:val="o"/>
+      <w:lvlJc w:val="left"/>
+      <w:pPr>
+        <w:tabs>
+          <w:tab w:val="num" w:pos="1440"/>
+        </w:tabs>
+        <w:ind w:left="1440" w:hanging="360"/>
+      </w:pPr>
+      <w:rPr>
+        <w:rFonts w:ascii="Courier New" w:hAnsi="Courier New" w:hint="default"/>
+        <w:sz w:val="20"/>
+      </w:rPr>
+    </w:lvl>
+    <w:lvl w:ilvl="2" w:tentative="1">
+      <w:start w:val="1"/>
+      <w:numFmt w:val="bullet"/>
+      <w:lvlText w:val=""/>
+      <w:lvlJc w:val="left"/>
+      <w:pPr>
+        <w:tabs>
+          <w:tab w:val="num" w:pos="2160"/>
+        </w:tabs>
+        <w:ind w:left="2160" w:hanging="360"/>
+      </w:pPr>
+      <w:rPr>
+        <w:rFonts w:ascii="Wingdings" w:hAnsi="Wingdings" w:hint="default"/>
+        <w:sz w:val="20"/>
+      </w:rPr>
+    </w:lvl>
+    <w:lvl w:ilvl="3" w:tentative="1">
+      <w:start w:val="1"/>
+      <w:numFmt w:val="bullet"/>
+      <w:lvlText w:val=""/>
+      <w:lvlJc w:val="left"/>
+      <w:pPr>
+        <w:tabs>
+          <w:tab w:val="num" w:pos="2880"/>
+        </w:tabs>
+        <w:ind w:left="2880" w:hanging="360"/>
+      </w:pPr>
+      <w:rPr>
+        <w:rFonts w:ascii="Wingdings" w:hAnsi="Wingdings" w:hint="default"/>
+        <w:sz w:val="20"/>
+      </w:rPr>
+    </w:lvl>
+    <w:lvl w:ilvl="4" w:tentative="1">
+      <w:start w:val="1"/>
+      <w:numFmt w:val="bullet"/>
+      <w:lvlText w:val=""/>
+      <w:lvlJc w:val="left"/>
+      <w:pPr>
+        <w:tabs>
+          <w:tab w:val="num" w:pos="3600"/>
+        </w:tabs>
+        <w:ind w:left="3600" w:hanging="360"/>
+      </w:pPr>
+      <w:rPr>
+        <w:rFonts w:ascii="Wingdings" w:hAnsi="Wingdings" w:hint="default"/>
+        <w:sz w:val="20"/>
+      </w:rPr>
+    </w:lvl>
+    <w:lvl w:ilvl="5" w:tentative="1">
+      <w:start w:val="1"/>
+      <w:numFmt w:val="bullet"/>
+      <w:lvlText w:val=""/>
+      <w:lvlJc w:val="left"/>
+      <w:pPr>
+        <w:tabs>
+          <w:tab w:val="num" w:pos="4320"/>
+        </w:tabs>
+        <w:ind w:left="4320" w:hanging="360"/>
+      </w:pPr>
+      <w:rPr>
+        <w:rFonts w:ascii="Wingdings" w:hAnsi="Wingdings" w:hint="default"/>
+        <w:sz w:val="20"/>
+      </w:rPr>
+    </w:lvl>
+    <w:lvl w:ilvl="6" w:tentative="1">
+      <w:start w:val="1"/>
+      <w:numFmt w:val="bullet"/>
+      <w:lvlText w:val=""/>
+      <w:lvlJc w:val="left"/>
+      <w:pPr>
+        <w:tabs>
+          <w:tab w:val="num" w:pos="5040"/>
+        </w:tabs>
+        <w:ind w:left="5040" w:hanging="360"/>
+      </w:pPr>
+      <w:rPr>
+        <w:rFonts w:ascii="Wingdings" w:hAnsi="Wingdings" w:hint="default"/>
+        <w:sz w:val="20"/>
+      </w:rPr>
+    </w:lvl>
+    <w:lvl w:ilvl="7" w:tentative="1">
+      <w:start w:val="1"/>
+      <w:numFmt w:val="bullet"/>
+      <w:lvlText w:val=""/>
+      <w:lvlJc w:val="left"/>
+      <w:pPr>
+        <w:tabs>
+          <w:tab w:val="num" w:pos="5760"/>
+        </w:tabs>
+        <w:ind w:left="5760" w:hanging="360"/>
+      </w:pPr>
+      <w:rPr>
+        <w:rFonts w:ascii="Wingdings" w:hAnsi="Wingdings" w:hint="default"/>
+        <w:sz w:val="20"/>
+      </w:rPr>
+    </w:lvl>
+    <w:lvl w:ilvl="8" w:tentative="1">
+      <w:start w:val="1"/>
+      <w:numFmt w:val="bullet"/>
+      <w:lvlText w:val=""/>
+      <w:lvlJc w:val="left"/>
+      <w:pPr>
+        <w:tabs>
+          <w:tab w:val="num" w:pos="6480"/>
+        </w:tabs>
+        <w:ind w:left="6480" w:hanging="360"/>
+      </w:pPr>
+      <w:rPr>
+        <w:rFonts w:ascii="Wingdings" w:hAnsi="Wingdings" w:hint="default"/>
+        <w:sz w:val="20"/>
+      </w:rPr>
+    </w:lvl>
+  </w:abstractNum>
+  <w:abstractNum w:abstractNumId="20" w15:restartNumberingAfterBreak="0">
+    <w:nsid w:val="4C046A48"/>
+    <w:multiLevelType w:val="multilevel"/>
+    <w:tmpl w:val="2340BCD6"/>
+    <w:lvl w:ilvl="0">
+      <w:start w:val="1"/>
+      <w:numFmt w:val="bullet"/>
+      <w:lvlText w:val=""/>
+      <w:lvlJc w:val="left"/>
+      <w:pPr>
+        <w:tabs>
+          <w:tab w:val="num" w:pos="720"/>
+        </w:tabs>
+        <w:ind w:left="720" w:hanging="360"/>
+      </w:pPr>
+      <w:rPr>
+        <w:rFonts w:ascii="Symbol" w:hAnsi="Symbol" w:hint="default"/>
+        <w:sz w:val="20"/>
+      </w:rPr>
+    </w:lvl>
+    <w:lvl w:ilvl="1" w:tentative="1">
+      <w:start w:val="1"/>
+      <w:numFmt w:val="bullet"/>
+      <w:lvlText w:val="o"/>
+      <w:lvlJc w:val="left"/>
+      <w:pPr>
+        <w:tabs>
+          <w:tab w:val="num" w:pos="1440"/>
+        </w:tabs>
+        <w:ind w:left="1440" w:hanging="360"/>
+      </w:pPr>
+      <w:rPr>
+        <w:rFonts w:ascii="Courier New" w:hAnsi="Courier New" w:hint="default"/>
+        <w:sz w:val="20"/>
+      </w:rPr>
+    </w:lvl>
+    <w:lvl w:ilvl="2" w:tentative="1">
+      <w:start w:val="1"/>
+      <w:numFmt w:val="bullet"/>
+      <w:lvlText w:val=""/>
+      <w:lvlJc w:val="left"/>
+      <w:pPr>
+        <w:tabs>
+          <w:tab w:val="num" w:pos="2160"/>
+        </w:tabs>
+        <w:ind w:left="2160" w:hanging="360"/>
+      </w:pPr>
+      <w:rPr>
+        <w:rFonts w:ascii="Wingdings" w:hAnsi="Wingdings" w:hint="default"/>
+        <w:sz w:val="20"/>
+      </w:rPr>
+    </w:lvl>
+    <w:lvl w:ilvl="3" w:tentative="1">
+      <w:start w:val="1"/>
+      <w:numFmt w:val="bullet"/>
+      <w:lvlText w:val=""/>
+      <w:lvlJc w:val="left"/>
+      <w:pPr>
+        <w:tabs>
+          <w:tab w:val="num" w:pos="2880"/>
+        </w:tabs>
+        <w:ind w:left="2880" w:hanging="360"/>
+      </w:pPr>
+      <w:rPr>
+        <w:rFonts w:ascii="Wingdings" w:hAnsi="Wingdings" w:hint="default"/>
+        <w:sz w:val="20"/>
+      </w:rPr>
+    </w:lvl>
+    <w:lvl w:ilvl="4" w:tentative="1">
+      <w:start w:val="1"/>
+      <w:numFmt w:val="bullet"/>
+      <w:lvlText w:val=""/>
+      <w:lvlJc w:val="left"/>
+      <w:pPr>
+        <w:tabs>
+          <w:tab w:val="num" w:pos="3600"/>
+        </w:tabs>
+        <w:ind w:left="3600" w:hanging="360"/>
+      </w:pPr>
+      <w:rPr>
+        <w:rFonts w:ascii="Wingdings" w:hAnsi="Wingdings" w:hint="default"/>
+        <w:sz w:val="20"/>
+      </w:rPr>
+    </w:lvl>
+    <w:lvl w:ilvl="5" w:tentative="1">
+      <w:start w:val="1"/>
+      <w:numFmt w:val="bullet"/>
+      <w:lvlText w:val=""/>
+      <w:lvlJc w:val="left"/>
+      <w:pPr>
+        <w:tabs>
+          <w:tab w:val="num" w:pos="4320"/>
+        </w:tabs>
+        <w:ind w:left="4320" w:hanging="360"/>
+      </w:pPr>
+      <w:rPr>
+        <w:rFonts w:ascii="Wingdings" w:hAnsi="Wingdings" w:hint="default"/>
+        <w:sz w:val="20"/>
+      </w:rPr>
+    </w:lvl>
+    <w:lvl w:ilvl="6" w:tentative="1">
+      <w:start w:val="1"/>
+      <w:numFmt w:val="bullet"/>
+      <w:lvlText w:val=""/>
+      <w:lvlJc w:val="left"/>
+      <w:pPr>
+        <w:tabs>
+          <w:tab w:val="num" w:pos="5040"/>
+        </w:tabs>
+        <w:ind w:left="5040" w:hanging="360"/>
+      </w:pPr>
+      <w:rPr>
+        <w:rFonts w:ascii="Wingdings" w:hAnsi="Wingdings" w:hint="default"/>
+        <w:sz w:val="20"/>
+      </w:rPr>
+    </w:lvl>
+    <w:lvl w:ilvl="7" w:tentative="1">
+      <w:start w:val="1"/>
+      <w:numFmt w:val="bullet"/>
+      <w:lvlText w:val=""/>
+      <w:lvlJc w:val="left"/>
+      <w:pPr>
+        <w:tabs>
+          <w:tab w:val="num" w:pos="5760"/>
+        </w:tabs>
+        <w:ind w:left="5760" w:hanging="360"/>
+      </w:pPr>
+      <w:rPr>
+        <w:rFonts w:ascii="Wingdings" w:hAnsi="Wingdings" w:hint="default"/>
+        <w:sz w:val="20"/>
+      </w:rPr>
+    </w:lvl>
+    <w:lvl w:ilvl="8" w:tentative="1">
+      <w:start w:val="1"/>
+      <w:numFmt w:val="bullet"/>
+      <w:lvlText w:val=""/>
+      <w:lvlJc w:val="left"/>
+      <w:pPr>
+        <w:tabs>
+          <w:tab w:val="num" w:pos="6480"/>
+        </w:tabs>
+        <w:ind w:left="6480" w:hanging="360"/>
+      </w:pPr>
+      <w:rPr>
+        <w:rFonts w:ascii="Wingdings" w:hAnsi="Wingdings" w:hint="default"/>
+        <w:sz w:val="20"/>
+      </w:rPr>
+    </w:lvl>
+  </w:abstractNum>
+  <w:abstractNum w:abstractNumId="21" w15:restartNumberingAfterBreak="0">
     <w:nsid w:val="4D186818"/>
     <w:multiLevelType w:val="multilevel"/>
     <w:tmpl w:val="6A7EED2E"/>
@@ -3356,7 +5383,7 @@
       </w:rPr>
     </w:lvl>
   </w:abstractNum>
-  <w:abstractNum w:abstractNumId="14" w15:restartNumberingAfterBreak="0">
+  <w:abstractNum w:abstractNumId="22" w15:restartNumberingAfterBreak="0">
     <w:nsid w:val="4D7C5B44"/>
     <w:multiLevelType w:val="multilevel"/>
     <w:tmpl w:val="0DFE325A"/>
@@ -3505,7 +5532,7 @@
       </w:rPr>
     </w:lvl>
   </w:abstractNum>
-  <w:abstractNum w:abstractNumId="15" w15:restartNumberingAfterBreak="0">
+  <w:abstractNum w:abstractNumId="23" w15:restartNumberingAfterBreak="0">
     <w:nsid w:val="4E5C6A14"/>
     <w:multiLevelType w:val="multilevel"/>
     <w:tmpl w:val="A24A7FAC"/>
@@ -3654,7 +5681,7 @@
       </w:rPr>
     </w:lvl>
   </w:abstractNum>
-  <w:abstractNum w:abstractNumId="16" w15:restartNumberingAfterBreak="0">
+  <w:abstractNum w:abstractNumId="24" w15:restartNumberingAfterBreak="0">
     <w:nsid w:val="538273CB"/>
     <w:multiLevelType w:val="multilevel"/>
     <w:tmpl w:val="0C66EB3A"/>
@@ -3803,7 +5830,305 @@
       </w:rPr>
     </w:lvl>
   </w:abstractNum>
-  <w:abstractNum w:abstractNumId="17" w15:restartNumberingAfterBreak="0">
+  <w:abstractNum w:abstractNumId="25" w15:restartNumberingAfterBreak="0">
+    <w:nsid w:val="5AAF3F94"/>
+    <w:multiLevelType w:val="multilevel"/>
+    <w:tmpl w:val="A9F486C6"/>
+    <w:lvl w:ilvl="0">
+      <w:start w:val="1"/>
+      <w:numFmt w:val="bullet"/>
+      <w:lvlText w:val=""/>
+      <w:lvlJc w:val="left"/>
+      <w:pPr>
+        <w:tabs>
+          <w:tab w:val="num" w:pos="720"/>
+        </w:tabs>
+        <w:ind w:left="720" w:hanging="360"/>
+      </w:pPr>
+      <w:rPr>
+        <w:rFonts w:ascii="Symbol" w:hAnsi="Symbol" w:hint="default"/>
+        <w:sz w:val="20"/>
+      </w:rPr>
+    </w:lvl>
+    <w:lvl w:ilvl="1" w:tentative="1">
+      <w:start w:val="1"/>
+      <w:numFmt w:val="bullet"/>
+      <w:lvlText w:val="o"/>
+      <w:lvlJc w:val="left"/>
+      <w:pPr>
+        <w:tabs>
+          <w:tab w:val="num" w:pos="1440"/>
+        </w:tabs>
+        <w:ind w:left="1440" w:hanging="360"/>
+      </w:pPr>
+      <w:rPr>
+        <w:rFonts w:ascii="Courier New" w:hAnsi="Courier New" w:hint="default"/>
+        <w:sz w:val="20"/>
+      </w:rPr>
+    </w:lvl>
+    <w:lvl w:ilvl="2" w:tentative="1">
+      <w:start w:val="1"/>
+      <w:numFmt w:val="bullet"/>
+      <w:lvlText w:val=""/>
+      <w:lvlJc w:val="left"/>
+      <w:pPr>
+        <w:tabs>
+          <w:tab w:val="num" w:pos="2160"/>
+        </w:tabs>
+        <w:ind w:left="2160" w:hanging="360"/>
+      </w:pPr>
+      <w:rPr>
+        <w:rFonts w:ascii="Wingdings" w:hAnsi="Wingdings" w:hint="default"/>
+        <w:sz w:val="20"/>
+      </w:rPr>
+    </w:lvl>
+    <w:lvl w:ilvl="3" w:tentative="1">
+      <w:start w:val="1"/>
+      <w:numFmt w:val="bullet"/>
+      <w:lvlText w:val=""/>
+      <w:lvlJc w:val="left"/>
+      <w:pPr>
+        <w:tabs>
+          <w:tab w:val="num" w:pos="2880"/>
+        </w:tabs>
+        <w:ind w:left="2880" w:hanging="360"/>
+      </w:pPr>
+      <w:rPr>
+        <w:rFonts w:ascii="Wingdings" w:hAnsi="Wingdings" w:hint="default"/>
+        <w:sz w:val="20"/>
+      </w:rPr>
+    </w:lvl>
+    <w:lvl w:ilvl="4" w:tentative="1">
+      <w:start w:val="1"/>
+      <w:numFmt w:val="bullet"/>
+      <w:lvlText w:val=""/>
+      <w:lvlJc w:val="left"/>
+      <w:pPr>
+        <w:tabs>
+          <w:tab w:val="num" w:pos="3600"/>
+        </w:tabs>
+        <w:ind w:left="3600" w:hanging="360"/>
+      </w:pPr>
+      <w:rPr>
+        <w:rFonts w:ascii="Wingdings" w:hAnsi="Wingdings" w:hint="default"/>
+        <w:sz w:val="20"/>
+      </w:rPr>
+    </w:lvl>
+    <w:lvl w:ilvl="5" w:tentative="1">
+      <w:start w:val="1"/>
+      <w:numFmt w:val="bullet"/>
+      <w:lvlText w:val=""/>
+      <w:lvlJc w:val="left"/>
+      <w:pPr>
+        <w:tabs>
+          <w:tab w:val="num" w:pos="4320"/>
+        </w:tabs>
+        <w:ind w:left="4320" w:hanging="360"/>
+      </w:pPr>
+      <w:rPr>
+        <w:rFonts w:ascii="Wingdings" w:hAnsi="Wingdings" w:hint="default"/>
+        <w:sz w:val="20"/>
+      </w:rPr>
+    </w:lvl>
+    <w:lvl w:ilvl="6" w:tentative="1">
+      <w:start w:val="1"/>
+      <w:numFmt w:val="bullet"/>
+      <w:lvlText w:val=""/>
+      <w:lvlJc w:val="left"/>
+      <w:pPr>
+        <w:tabs>
+          <w:tab w:val="num" w:pos="5040"/>
+        </w:tabs>
+        <w:ind w:left="5040" w:hanging="360"/>
+      </w:pPr>
+      <w:rPr>
+        <w:rFonts w:ascii="Wingdings" w:hAnsi="Wingdings" w:hint="default"/>
+        <w:sz w:val="20"/>
+      </w:rPr>
+    </w:lvl>
+    <w:lvl w:ilvl="7" w:tentative="1">
+      <w:start w:val="1"/>
+      <w:numFmt w:val="bullet"/>
+      <w:lvlText w:val=""/>
+      <w:lvlJc w:val="left"/>
+      <w:pPr>
+        <w:tabs>
+          <w:tab w:val="num" w:pos="5760"/>
+        </w:tabs>
+        <w:ind w:left="5760" w:hanging="360"/>
+      </w:pPr>
+      <w:rPr>
+        <w:rFonts w:ascii="Wingdings" w:hAnsi="Wingdings" w:hint="default"/>
+        <w:sz w:val="20"/>
+      </w:rPr>
+    </w:lvl>
+    <w:lvl w:ilvl="8" w:tentative="1">
+      <w:start w:val="1"/>
+      <w:numFmt w:val="bullet"/>
+      <w:lvlText w:val=""/>
+      <w:lvlJc w:val="left"/>
+      <w:pPr>
+        <w:tabs>
+          <w:tab w:val="num" w:pos="6480"/>
+        </w:tabs>
+        <w:ind w:left="6480" w:hanging="360"/>
+      </w:pPr>
+      <w:rPr>
+        <w:rFonts w:ascii="Wingdings" w:hAnsi="Wingdings" w:hint="default"/>
+        <w:sz w:val="20"/>
+      </w:rPr>
+    </w:lvl>
+  </w:abstractNum>
+  <w:abstractNum w:abstractNumId="26" w15:restartNumberingAfterBreak="0">
+    <w:nsid w:val="60BB2048"/>
+    <w:multiLevelType w:val="multilevel"/>
+    <w:tmpl w:val="3DAC4EA6"/>
+    <w:lvl w:ilvl="0">
+      <w:start w:val="1"/>
+      <w:numFmt w:val="bullet"/>
+      <w:lvlText w:val=""/>
+      <w:lvlJc w:val="left"/>
+      <w:pPr>
+        <w:tabs>
+          <w:tab w:val="num" w:pos="720"/>
+        </w:tabs>
+        <w:ind w:left="720" w:hanging="360"/>
+      </w:pPr>
+      <w:rPr>
+        <w:rFonts w:ascii="Symbol" w:hAnsi="Symbol" w:hint="default"/>
+        <w:sz w:val="20"/>
+      </w:rPr>
+    </w:lvl>
+    <w:lvl w:ilvl="1" w:tentative="1">
+      <w:start w:val="1"/>
+      <w:numFmt w:val="bullet"/>
+      <w:lvlText w:val="o"/>
+      <w:lvlJc w:val="left"/>
+      <w:pPr>
+        <w:tabs>
+          <w:tab w:val="num" w:pos="1440"/>
+        </w:tabs>
+        <w:ind w:left="1440" w:hanging="360"/>
+      </w:pPr>
+      <w:rPr>
+        <w:rFonts w:ascii="Courier New" w:hAnsi="Courier New" w:hint="default"/>
+        <w:sz w:val="20"/>
+      </w:rPr>
+    </w:lvl>
+    <w:lvl w:ilvl="2" w:tentative="1">
+      <w:start w:val="1"/>
+      <w:numFmt w:val="bullet"/>
+      <w:lvlText w:val=""/>
+      <w:lvlJc w:val="left"/>
+      <w:pPr>
+        <w:tabs>
+          <w:tab w:val="num" w:pos="2160"/>
+        </w:tabs>
+        <w:ind w:left="2160" w:hanging="360"/>
+      </w:pPr>
+      <w:rPr>
+        <w:rFonts w:ascii="Wingdings" w:hAnsi="Wingdings" w:hint="default"/>
+        <w:sz w:val="20"/>
+      </w:rPr>
+    </w:lvl>
+    <w:lvl w:ilvl="3" w:tentative="1">
+      <w:start w:val="1"/>
+      <w:numFmt w:val="bullet"/>
+      <w:lvlText w:val=""/>
+      <w:lvlJc w:val="left"/>
+      <w:pPr>
+        <w:tabs>
+          <w:tab w:val="num" w:pos="2880"/>
+        </w:tabs>
+        <w:ind w:left="2880" w:hanging="360"/>
+      </w:pPr>
+      <w:rPr>
+        <w:rFonts w:ascii="Wingdings" w:hAnsi="Wingdings" w:hint="default"/>
+        <w:sz w:val="20"/>
+      </w:rPr>
+    </w:lvl>
+    <w:lvl w:ilvl="4" w:tentative="1">
+      <w:start w:val="1"/>
+      <w:numFmt w:val="bullet"/>
+      <w:lvlText w:val=""/>
+      <w:lvlJc w:val="left"/>
+      <w:pPr>
+        <w:tabs>
+          <w:tab w:val="num" w:pos="3600"/>
+        </w:tabs>
+        <w:ind w:left="3600" w:hanging="360"/>
+      </w:pPr>
+      <w:rPr>
+        <w:rFonts w:ascii="Wingdings" w:hAnsi="Wingdings" w:hint="default"/>
+        <w:sz w:val="20"/>
+      </w:rPr>
+    </w:lvl>
+    <w:lvl w:ilvl="5" w:tentative="1">
+      <w:start w:val="1"/>
+      <w:numFmt w:val="bullet"/>
+      <w:lvlText w:val=""/>
+      <w:lvlJc w:val="left"/>
+      <w:pPr>
+        <w:tabs>
+          <w:tab w:val="num" w:pos="4320"/>
+        </w:tabs>
+        <w:ind w:left="4320" w:hanging="360"/>
+      </w:pPr>
+      <w:rPr>
+        <w:rFonts w:ascii="Wingdings" w:hAnsi="Wingdings" w:hint="default"/>
+        <w:sz w:val="20"/>
+      </w:rPr>
+    </w:lvl>
+    <w:lvl w:ilvl="6" w:tentative="1">
+      <w:start w:val="1"/>
+      <w:numFmt w:val="bullet"/>
+      <w:lvlText w:val=""/>
+      <w:lvlJc w:val="left"/>
+      <w:pPr>
+        <w:tabs>
+          <w:tab w:val="num" w:pos="5040"/>
+        </w:tabs>
+        <w:ind w:left="5040" w:hanging="360"/>
+      </w:pPr>
+      <w:rPr>
+        <w:rFonts w:ascii="Wingdings" w:hAnsi="Wingdings" w:hint="default"/>
+        <w:sz w:val="20"/>
+      </w:rPr>
+    </w:lvl>
+    <w:lvl w:ilvl="7" w:tentative="1">
+      <w:start w:val="1"/>
+      <w:numFmt w:val="bullet"/>
+      <w:lvlText w:val=""/>
+      <w:lvlJc w:val="left"/>
+      <w:pPr>
+        <w:tabs>
+          <w:tab w:val="num" w:pos="5760"/>
+        </w:tabs>
+        <w:ind w:left="5760" w:hanging="360"/>
+      </w:pPr>
+      <w:rPr>
+        <w:rFonts w:ascii="Wingdings" w:hAnsi="Wingdings" w:hint="default"/>
+        <w:sz w:val="20"/>
+      </w:rPr>
+    </w:lvl>
+    <w:lvl w:ilvl="8" w:tentative="1">
+      <w:start w:val="1"/>
+      <w:numFmt w:val="bullet"/>
+      <w:lvlText w:val=""/>
+      <w:lvlJc w:val="left"/>
+      <w:pPr>
+        <w:tabs>
+          <w:tab w:val="num" w:pos="6480"/>
+        </w:tabs>
+        <w:ind w:left="6480" w:hanging="360"/>
+      </w:pPr>
+      <w:rPr>
+        <w:rFonts w:ascii="Wingdings" w:hAnsi="Wingdings" w:hint="default"/>
+        <w:sz w:val="20"/>
+      </w:rPr>
+    </w:lvl>
+  </w:abstractNum>
+  <w:abstractNum w:abstractNumId="27" w15:restartNumberingAfterBreak="0">
     <w:nsid w:val="62A77596"/>
     <w:multiLevelType w:val="multilevel"/>
     <w:tmpl w:val="A1F830BA"/>
@@ -3952,7 +6277,305 @@
       </w:rPr>
     </w:lvl>
   </w:abstractNum>
-  <w:abstractNum w:abstractNumId="18" w15:restartNumberingAfterBreak="0">
+  <w:abstractNum w:abstractNumId="28" w15:restartNumberingAfterBreak="0">
+    <w:nsid w:val="64206F26"/>
+    <w:multiLevelType w:val="multilevel"/>
+    <w:tmpl w:val="84B80140"/>
+    <w:lvl w:ilvl="0">
+      <w:start w:val="1"/>
+      <w:numFmt w:val="bullet"/>
+      <w:lvlText w:val=""/>
+      <w:lvlJc w:val="left"/>
+      <w:pPr>
+        <w:tabs>
+          <w:tab w:val="num" w:pos="720"/>
+        </w:tabs>
+        <w:ind w:left="720" w:hanging="360"/>
+      </w:pPr>
+      <w:rPr>
+        <w:rFonts w:ascii="Symbol" w:hAnsi="Symbol" w:hint="default"/>
+        <w:sz w:val="20"/>
+      </w:rPr>
+    </w:lvl>
+    <w:lvl w:ilvl="1" w:tentative="1">
+      <w:start w:val="1"/>
+      <w:numFmt w:val="bullet"/>
+      <w:lvlText w:val="o"/>
+      <w:lvlJc w:val="left"/>
+      <w:pPr>
+        <w:tabs>
+          <w:tab w:val="num" w:pos="1440"/>
+        </w:tabs>
+        <w:ind w:left="1440" w:hanging="360"/>
+      </w:pPr>
+      <w:rPr>
+        <w:rFonts w:ascii="Courier New" w:hAnsi="Courier New" w:hint="default"/>
+        <w:sz w:val="20"/>
+      </w:rPr>
+    </w:lvl>
+    <w:lvl w:ilvl="2" w:tentative="1">
+      <w:start w:val="1"/>
+      <w:numFmt w:val="bullet"/>
+      <w:lvlText w:val=""/>
+      <w:lvlJc w:val="left"/>
+      <w:pPr>
+        <w:tabs>
+          <w:tab w:val="num" w:pos="2160"/>
+        </w:tabs>
+        <w:ind w:left="2160" w:hanging="360"/>
+      </w:pPr>
+      <w:rPr>
+        <w:rFonts w:ascii="Wingdings" w:hAnsi="Wingdings" w:hint="default"/>
+        <w:sz w:val="20"/>
+      </w:rPr>
+    </w:lvl>
+    <w:lvl w:ilvl="3" w:tentative="1">
+      <w:start w:val="1"/>
+      <w:numFmt w:val="bullet"/>
+      <w:lvlText w:val=""/>
+      <w:lvlJc w:val="left"/>
+      <w:pPr>
+        <w:tabs>
+          <w:tab w:val="num" w:pos="2880"/>
+        </w:tabs>
+        <w:ind w:left="2880" w:hanging="360"/>
+      </w:pPr>
+      <w:rPr>
+        <w:rFonts w:ascii="Wingdings" w:hAnsi="Wingdings" w:hint="default"/>
+        <w:sz w:val="20"/>
+      </w:rPr>
+    </w:lvl>
+    <w:lvl w:ilvl="4" w:tentative="1">
+      <w:start w:val="1"/>
+      <w:numFmt w:val="bullet"/>
+      <w:lvlText w:val=""/>
+      <w:lvlJc w:val="left"/>
+      <w:pPr>
+        <w:tabs>
+          <w:tab w:val="num" w:pos="3600"/>
+        </w:tabs>
+        <w:ind w:left="3600" w:hanging="360"/>
+      </w:pPr>
+      <w:rPr>
+        <w:rFonts w:ascii="Wingdings" w:hAnsi="Wingdings" w:hint="default"/>
+        <w:sz w:val="20"/>
+      </w:rPr>
+    </w:lvl>
+    <w:lvl w:ilvl="5" w:tentative="1">
+      <w:start w:val="1"/>
+      <w:numFmt w:val="bullet"/>
+      <w:lvlText w:val=""/>
+      <w:lvlJc w:val="left"/>
+      <w:pPr>
+        <w:tabs>
+          <w:tab w:val="num" w:pos="4320"/>
+        </w:tabs>
+        <w:ind w:left="4320" w:hanging="360"/>
+      </w:pPr>
+      <w:rPr>
+        <w:rFonts w:ascii="Wingdings" w:hAnsi="Wingdings" w:hint="default"/>
+        <w:sz w:val="20"/>
+      </w:rPr>
+    </w:lvl>
+    <w:lvl w:ilvl="6" w:tentative="1">
+      <w:start w:val="1"/>
+      <w:numFmt w:val="bullet"/>
+      <w:lvlText w:val=""/>
+      <w:lvlJc w:val="left"/>
+      <w:pPr>
+        <w:tabs>
+          <w:tab w:val="num" w:pos="5040"/>
+        </w:tabs>
+        <w:ind w:left="5040" w:hanging="360"/>
+      </w:pPr>
+      <w:rPr>
+        <w:rFonts w:ascii="Wingdings" w:hAnsi="Wingdings" w:hint="default"/>
+        <w:sz w:val="20"/>
+      </w:rPr>
+    </w:lvl>
+    <w:lvl w:ilvl="7" w:tentative="1">
+      <w:start w:val="1"/>
+      <w:numFmt w:val="bullet"/>
+      <w:lvlText w:val=""/>
+      <w:lvlJc w:val="left"/>
+      <w:pPr>
+        <w:tabs>
+          <w:tab w:val="num" w:pos="5760"/>
+        </w:tabs>
+        <w:ind w:left="5760" w:hanging="360"/>
+      </w:pPr>
+      <w:rPr>
+        <w:rFonts w:ascii="Wingdings" w:hAnsi="Wingdings" w:hint="default"/>
+        <w:sz w:val="20"/>
+      </w:rPr>
+    </w:lvl>
+    <w:lvl w:ilvl="8" w:tentative="1">
+      <w:start w:val="1"/>
+      <w:numFmt w:val="bullet"/>
+      <w:lvlText w:val=""/>
+      <w:lvlJc w:val="left"/>
+      <w:pPr>
+        <w:tabs>
+          <w:tab w:val="num" w:pos="6480"/>
+        </w:tabs>
+        <w:ind w:left="6480" w:hanging="360"/>
+      </w:pPr>
+      <w:rPr>
+        <w:rFonts w:ascii="Wingdings" w:hAnsi="Wingdings" w:hint="default"/>
+        <w:sz w:val="20"/>
+      </w:rPr>
+    </w:lvl>
+  </w:abstractNum>
+  <w:abstractNum w:abstractNumId="29" w15:restartNumberingAfterBreak="0">
+    <w:nsid w:val="66825D90"/>
+    <w:multiLevelType w:val="multilevel"/>
+    <w:tmpl w:val="5E8C9D9E"/>
+    <w:lvl w:ilvl="0">
+      <w:start w:val="1"/>
+      <w:numFmt w:val="bullet"/>
+      <w:lvlText w:val=""/>
+      <w:lvlJc w:val="left"/>
+      <w:pPr>
+        <w:tabs>
+          <w:tab w:val="num" w:pos="720"/>
+        </w:tabs>
+        <w:ind w:left="720" w:hanging="360"/>
+      </w:pPr>
+      <w:rPr>
+        <w:rFonts w:ascii="Symbol" w:hAnsi="Symbol" w:hint="default"/>
+        <w:sz w:val="20"/>
+      </w:rPr>
+    </w:lvl>
+    <w:lvl w:ilvl="1" w:tentative="1">
+      <w:start w:val="1"/>
+      <w:numFmt w:val="bullet"/>
+      <w:lvlText w:val="o"/>
+      <w:lvlJc w:val="left"/>
+      <w:pPr>
+        <w:tabs>
+          <w:tab w:val="num" w:pos="1440"/>
+        </w:tabs>
+        <w:ind w:left="1440" w:hanging="360"/>
+      </w:pPr>
+      <w:rPr>
+        <w:rFonts w:ascii="Courier New" w:hAnsi="Courier New" w:hint="default"/>
+        <w:sz w:val="20"/>
+      </w:rPr>
+    </w:lvl>
+    <w:lvl w:ilvl="2" w:tentative="1">
+      <w:start w:val="1"/>
+      <w:numFmt w:val="bullet"/>
+      <w:lvlText w:val=""/>
+      <w:lvlJc w:val="left"/>
+      <w:pPr>
+        <w:tabs>
+          <w:tab w:val="num" w:pos="2160"/>
+        </w:tabs>
+        <w:ind w:left="2160" w:hanging="360"/>
+      </w:pPr>
+      <w:rPr>
+        <w:rFonts w:ascii="Wingdings" w:hAnsi="Wingdings" w:hint="default"/>
+        <w:sz w:val="20"/>
+      </w:rPr>
+    </w:lvl>
+    <w:lvl w:ilvl="3" w:tentative="1">
+      <w:start w:val="1"/>
+      <w:numFmt w:val="bullet"/>
+      <w:lvlText w:val=""/>
+      <w:lvlJc w:val="left"/>
+      <w:pPr>
+        <w:tabs>
+          <w:tab w:val="num" w:pos="2880"/>
+        </w:tabs>
+        <w:ind w:left="2880" w:hanging="360"/>
+      </w:pPr>
+      <w:rPr>
+        <w:rFonts w:ascii="Wingdings" w:hAnsi="Wingdings" w:hint="default"/>
+        <w:sz w:val="20"/>
+      </w:rPr>
+    </w:lvl>
+    <w:lvl w:ilvl="4" w:tentative="1">
+      <w:start w:val="1"/>
+      <w:numFmt w:val="bullet"/>
+      <w:lvlText w:val=""/>
+      <w:lvlJc w:val="left"/>
+      <w:pPr>
+        <w:tabs>
+          <w:tab w:val="num" w:pos="3600"/>
+        </w:tabs>
+        <w:ind w:left="3600" w:hanging="360"/>
+      </w:pPr>
+      <w:rPr>
+        <w:rFonts w:ascii="Wingdings" w:hAnsi="Wingdings" w:hint="default"/>
+        <w:sz w:val="20"/>
+      </w:rPr>
+    </w:lvl>
+    <w:lvl w:ilvl="5" w:tentative="1">
+      <w:start w:val="1"/>
+      <w:numFmt w:val="bullet"/>
+      <w:lvlText w:val=""/>
+      <w:lvlJc w:val="left"/>
+      <w:pPr>
+        <w:tabs>
+          <w:tab w:val="num" w:pos="4320"/>
+        </w:tabs>
+        <w:ind w:left="4320" w:hanging="360"/>
+      </w:pPr>
+      <w:rPr>
+        <w:rFonts w:ascii="Wingdings" w:hAnsi="Wingdings" w:hint="default"/>
+        <w:sz w:val="20"/>
+      </w:rPr>
+    </w:lvl>
+    <w:lvl w:ilvl="6" w:tentative="1">
+      <w:start w:val="1"/>
+      <w:numFmt w:val="bullet"/>
+      <w:lvlText w:val=""/>
+      <w:lvlJc w:val="left"/>
+      <w:pPr>
+        <w:tabs>
+          <w:tab w:val="num" w:pos="5040"/>
+        </w:tabs>
+        <w:ind w:left="5040" w:hanging="360"/>
+      </w:pPr>
+      <w:rPr>
+        <w:rFonts w:ascii="Wingdings" w:hAnsi="Wingdings" w:hint="default"/>
+        <w:sz w:val="20"/>
+      </w:rPr>
+    </w:lvl>
+    <w:lvl w:ilvl="7" w:tentative="1">
+      <w:start w:val="1"/>
+      <w:numFmt w:val="bullet"/>
+      <w:lvlText w:val=""/>
+      <w:lvlJc w:val="left"/>
+      <w:pPr>
+        <w:tabs>
+          <w:tab w:val="num" w:pos="5760"/>
+        </w:tabs>
+        <w:ind w:left="5760" w:hanging="360"/>
+      </w:pPr>
+      <w:rPr>
+        <w:rFonts w:ascii="Wingdings" w:hAnsi="Wingdings" w:hint="default"/>
+        <w:sz w:val="20"/>
+      </w:rPr>
+    </w:lvl>
+    <w:lvl w:ilvl="8" w:tentative="1">
+      <w:start w:val="1"/>
+      <w:numFmt w:val="bullet"/>
+      <w:lvlText w:val=""/>
+      <w:lvlJc w:val="left"/>
+      <w:pPr>
+        <w:tabs>
+          <w:tab w:val="num" w:pos="6480"/>
+        </w:tabs>
+        <w:ind w:left="6480" w:hanging="360"/>
+      </w:pPr>
+      <w:rPr>
+        <w:rFonts w:ascii="Wingdings" w:hAnsi="Wingdings" w:hint="default"/>
+        <w:sz w:val="20"/>
+      </w:rPr>
+    </w:lvl>
+  </w:abstractNum>
+  <w:abstractNum w:abstractNumId="30" w15:restartNumberingAfterBreak="0">
     <w:nsid w:val="675155B1"/>
     <w:multiLevelType w:val="multilevel"/>
     <w:tmpl w:val="76A07240"/>
@@ -4101,7 +6724,7 @@
       </w:rPr>
     </w:lvl>
   </w:abstractNum>
-  <w:abstractNum w:abstractNumId="19" w15:restartNumberingAfterBreak="0">
+  <w:abstractNum w:abstractNumId="31" w15:restartNumberingAfterBreak="0">
     <w:nsid w:val="6A7F58A7"/>
     <w:multiLevelType w:val="multilevel"/>
     <w:tmpl w:val="7A101704"/>
@@ -4250,7 +6873,7 @@
       </w:rPr>
     </w:lvl>
   </w:abstractNum>
-  <w:abstractNum w:abstractNumId="20" w15:restartNumberingAfterBreak="0">
+  <w:abstractNum w:abstractNumId="32" w15:restartNumberingAfterBreak="0">
     <w:nsid w:val="6C152091"/>
     <w:multiLevelType w:val="multilevel"/>
     <w:tmpl w:val="1692526E"/>
@@ -4399,7 +7022,7 @@
       </w:rPr>
     </w:lvl>
   </w:abstractNum>
-  <w:abstractNum w:abstractNumId="21" w15:restartNumberingAfterBreak="0">
+  <w:abstractNum w:abstractNumId="33" w15:restartNumberingAfterBreak="0">
     <w:nsid w:val="74F83019"/>
     <w:multiLevelType w:val="multilevel"/>
     <w:tmpl w:val="EF12228E"/>
@@ -4548,81 +7171,261 @@
       </w:rPr>
     </w:lvl>
   </w:abstractNum>
+  <w:abstractNum w:abstractNumId="34" w15:restartNumberingAfterBreak="0">
+    <w:nsid w:val="7D8650C9"/>
+    <w:multiLevelType w:val="multilevel"/>
+    <w:tmpl w:val="F45C2820"/>
+    <w:lvl w:ilvl="0">
+      <w:start w:val="1"/>
+      <w:numFmt w:val="bullet"/>
+      <w:lvlText w:val=""/>
+      <w:lvlJc w:val="left"/>
+      <w:pPr>
+        <w:tabs>
+          <w:tab w:val="num" w:pos="720"/>
+        </w:tabs>
+        <w:ind w:left="720" w:hanging="360"/>
+      </w:pPr>
+      <w:rPr>
+        <w:rFonts w:ascii="Symbol" w:hAnsi="Symbol" w:hint="default"/>
+        <w:sz w:val="20"/>
+      </w:rPr>
+    </w:lvl>
+    <w:lvl w:ilvl="1">
+      <w:start w:val="1"/>
+      <w:numFmt w:val="bullet"/>
+      <w:lvlText w:val="o"/>
+      <w:lvlJc w:val="left"/>
+      <w:pPr>
+        <w:tabs>
+          <w:tab w:val="num" w:pos="1440"/>
+        </w:tabs>
+        <w:ind w:left="1440" w:hanging="360"/>
+      </w:pPr>
+      <w:rPr>
+        <w:rFonts w:ascii="Courier New" w:hAnsi="Courier New" w:hint="default"/>
+        <w:sz w:val="20"/>
+      </w:rPr>
+    </w:lvl>
+    <w:lvl w:ilvl="2" w:tentative="1">
+      <w:start w:val="1"/>
+      <w:numFmt w:val="bullet"/>
+      <w:lvlText w:val=""/>
+      <w:lvlJc w:val="left"/>
+      <w:pPr>
+        <w:tabs>
+          <w:tab w:val="num" w:pos="2160"/>
+        </w:tabs>
+        <w:ind w:left="2160" w:hanging="360"/>
+      </w:pPr>
+      <w:rPr>
+        <w:rFonts w:ascii="Wingdings" w:hAnsi="Wingdings" w:hint="default"/>
+        <w:sz w:val="20"/>
+      </w:rPr>
+    </w:lvl>
+    <w:lvl w:ilvl="3" w:tentative="1">
+      <w:start w:val="1"/>
+      <w:numFmt w:val="bullet"/>
+      <w:lvlText w:val=""/>
+      <w:lvlJc w:val="left"/>
+      <w:pPr>
+        <w:tabs>
+          <w:tab w:val="num" w:pos="2880"/>
+        </w:tabs>
+        <w:ind w:left="2880" w:hanging="360"/>
+      </w:pPr>
+      <w:rPr>
+        <w:rFonts w:ascii="Wingdings" w:hAnsi="Wingdings" w:hint="default"/>
+        <w:sz w:val="20"/>
+      </w:rPr>
+    </w:lvl>
+    <w:lvl w:ilvl="4" w:tentative="1">
+      <w:start w:val="1"/>
+      <w:numFmt w:val="bullet"/>
+      <w:lvlText w:val=""/>
+      <w:lvlJc w:val="left"/>
+      <w:pPr>
+        <w:tabs>
+          <w:tab w:val="num" w:pos="3600"/>
+        </w:tabs>
+        <w:ind w:left="3600" w:hanging="360"/>
+      </w:pPr>
+      <w:rPr>
+        <w:rFonts w:ascii="Wingdings" w:hAnsi="Wingdings" w:hint="default"/>
+        <w:sz w:val="20"/>
+      </w:rPr>
+    </w:lvl>
+    <w:lvl w:ilvl="5" w:tentative="1">
+      <w:start w:val="1"/>
+      <w:numFmt w:val="bullet"/>
+      <w:lvlText w:val=""/>
+      <w:lvlJc w:val="left"/>
+      <w:pPr>
+        <w:tabs>
+          <w:tab w:val="num" w:pos="4320"/>
+        </w:tabs>
+        <w:ind w:left="4320" w:hanging="360"/>
+      </w:pPr>
+      <w:rPr>
+        <w:rFonts w:ascii="Wingdings" w:hAnsi="Wingdings" w:hint="default"/>
+        <w:sz w:val="20"/>
+      </w:rPr>
+    </w:lvl>
+    <w:lvl w:ilvl="6" w:tentative="1">
+      <w:start w:val="1"/>
+      <w:numFmt w:val="bullet"/>
+      <w:lvlText w:val=""/>
+      <w:lvlJc w:val="left"/>
+      <w:pPr>
+        <w:tabs>
+          <w:tab w:val="num" w:pos="5040"/>
+        </w:tabs>
+        <w:ind w:left="5040" w:hanging="360"/>
+      </w:pPr>
+      <w:rPr>
+        <w:rFonts w:ascii="Wingdings" w:hAnsi="Wingdings" w:hint="default"/>
+        <w:sz w:val="20"/>
+      </w:rPr>
+    </w:lvl>
+    <w:lvl w:ilvl="7" w:tentative="1">
+      <w:start w:val="1"/>
+      <w:numFmt w:val="bullet"/>
+      <w:lvlText w:val=""/>
+      <w:lvlJc w:val="left"/>
+      <w:pPr>
+        <w:tabs>
+          <w:tab w:val="num" w:pos="5760"/>
+        </w:tabs>
+        <w:ind w:left="5760" w:hanging="360"/>
+      </w:pPr>
+      <w:rPr>
+        <w:rFonts w:ascii="Wingdings" w:hAnsi="Wingdings" w:hint="default"/>
+        <w:sz w:val="20"/>
+      </w:rPr>
+    </w:lvl>
+    <w:lvl w:ilvl="8" w:tentative="1">
+      <w:start w:val="1"/>
+      <w:numFmt w:val="bullet"/>
+      <w:lvlText w:val=""/>
+      <w:lvlJc w:val="left"/>
+      <w:pPr>
+        <w:tabs>
+          <w:tab w:val="num" w:pos="6480"/>
+        </w:tabs>
+        <w:ind w:left="6480" w:hanging="360"/>
+      </w:pPr>
+      <w:rPr>
+        <w:rFonts w:ascii="Wingdings" w:hAnsi="Wingdings" w:hint="default"/>
+        <w:sz w:val="20"/>
+      </w:rPr>
+    </w:lvl>
+  </w:abstractNum>
   <w:num w:numId="1" w16cid:durableId="1403871745">
-    <w:abstractNumId w:val="3"/>
+    <w:abstractNumId w:val="4"/>
   </w:num>
   <w:num w:numId="2" w16cid:durableId="1175145623">
-    <w:abstractNumId w:val="4"/>
+    <w:abstractNumId w:val="5"/>
   </w:num>
   <w:num w:numId="3" w16cid:durableId="214586865">
-    <w:abstractNumId w:val="5"/>
+    <w:abstractNumId w:val="6"/>
   </w:num>
   <w:num w:numId="4" w16cid:durableId="1604999293">
-    <w:abstractNumId w:val="13"/>
+    <w:abstractNumId w:val="21"/>
   </w:num>
   <w:num w:numId="5" w16cid:durableId="2005010433">
-    <w:abstractNumId w:val="21"/>
+    <w:abstractNumId w:val="33"/>
   </w:num>
   <w:num w:numId="6" w16cid:durableId="2015913491">
-    <w:abstractNumId w:val="7"/>
+    <w:abstractNumId w:val="8"/>
   </w:num>
   <w:num w:numId="7" w16cid:durableId="2005282243">
-    <w:abstractNumId w:val="10"/>
+    <w:abstractNumId w:val="15"/>
   </w:num>
   <w:num w:numId="8" w16cid:durableId="1782459442">
-    <w:abstractNumId w:val="16"/>
+    <w:abstractNumId w:val="24"/>
   </w:num>
   <w:num w:numId="9" w16cid:durableId="29652177">
     <w:abstractNumId w:val="2"/>
   </w:num>
   <w:num w:numId="10" w16cid:durableId="5983952">
-    <w:abstractNumId w:val="14"/>
+    <w:abstractNumId w:val="22"/>
   </w:num>
   <w:num w:numId="11" w16cid:durableId="1385524487">
-    <w:abstractNumId w:val="12"/>
+    <w:abstractNumId w:val="18"/>
   </w:num>
   <w:num w:numId="12" w16cid:durableId="881791777">
-    <w:abstractNumId w:val="19"/>
+    <w:abstractNumId w:val="31"/>
   </w:num>
   <w:num w:numId="13" w16cid:durableId="616062957">
-    <w:abstractNumId w:val="9"/>
+    <w:abstractNumId w:val="10"/>
   </w:num>
   <w:num w:numId="14" w16cid:durableId="1599679862">
-    <w:abstractNumId w:val="17"/>
+    <w:abstractNumId w:val="27"/>
   </w:num>
   <w:num w:numId="15" w16cid:durableId="1203782223">
-    <w:abstractNumId w:val="18"/>
+    <w:abstractNumId w:val="30"/>
   </w:num>
   <w:num w:numId="16" w16cid:durableId="1910339401">
-    <w:abstractNumId w:val="8"/>
+    <w:abstractNumId w:val="9"/>
   </w:num>
   <w:num w:numId="17" w16cid:durableId="79716557">
     <w:abstractNumId w:val="0"/>
   </w:num>
   <w:num w:numId="18" w16cid:durableId="1340543577">
-    <w:abstractNumId w:val="20"/>
+    <w:abstractNumId w:val="32"/>
   </w:num>
   <w:num w:numId="19" w16cid:durableId="1861702556">
     <w:abstractNumId w:val="1"/>
   </w:num>
   <w:num w:numId="20" w16cid:durableId="913048856">
-    <w:abstractNumId w:val="15"/>
+    <w:abstractNumId w:val="23"/>
   </w:num>
   <w:num w:numId="21" w16cid:durableId="613368900">
-    <w:abstractNumId w:val="6"/>
+    <w:abstractNumId w:val="7"/>
   </w:num>
   <w:num w:numId="22" w16cid:durableId="760225088">
+    <w:abstractNumId w:val="16"/>
+  </w:num>
+  <w:num w:numId="23" w16cid:durableId="747772899">
+    <w:abstractNumId w:val="28"/>
+  </w:num>
+  <w:num w:numId="24" w16cid:durableId="1330063747">
+    <w:abstractNumId w:val="34"/>
+  </w:num>
+  <w:num w:numId="25" w16cid:durableId="1728644347">
+    <w:abstractNumId w:val="20"/>
+  </w:num>
+  <w:num w:numId="26" w16cid:durableId="721557330">
+    <w:abstractNumId w:val="19"/>
+  </w:num>
+  <w:num w:numId="27" w16cid:durableId="1611934106">
+    <w:abstractNumId w:val="25"/>
+  </w:num>
+  <w:num w:numId="28" w16cid:durableId="1091008212">
+    <w:abstractNumId w:val="17"/>
+  </w:num>
+  <w:num w:numId="29" w16cid:durableId="372000044">
+    <w:abstractNumId w:val="29"/>
+  </w:num>
+  <w:num w:numId="30" w16cid:durableId="1429884695">
+    <w:abstractNumId w:val="26"/>
+  </w:num>
+  <w:num w:numId="31" w16cid:durableId="112595949">
     <w:abstractNumId w:val="11"/>
   </w:num>
+  <w:num w:numId="32" w16cid:durableId="386999035">
+    <w:abstractNumId w:val="12"/>
+  </w:num>
+  <w:num w:numId="33" w16cid:durableId="954100688">
+    <w:abstractNumId w:val="14"/>
+  </w:num>
+  <w:num w:numId="34" w16cid:durableId="462774312">
+    <w:abstractNumId w:val="13"/>
+  </w:num>
+  <w:num w:numId="35" w16cid:durableId="1988198018">
+    <w:abstractNumId w:val="3"/>
+  </w:num>
 </w:numbering>
-</file>
-
-<file path=word/people.xml><?xml version="1.0" encoding="utf-8"?>
-<w15:people xmlns:wpc="http://schemas.microsoft.com/office/word/2010/wordprocessingCanvas" xmlns:cx="http://schemas.microsoft.com/office/drawing/2014/chartex" xmlns:cx1="http://schemas.microsoft.com/office/drawing/2015/9/8/chartex" xmlns:cx2="http://schemas.microsoft.com/office/drawing/2015/10/21/chartex" xmlns:cx3="http://schemas.microsoft.com/office/drawing/2016/5/9/chartex" xmlns:cx4="http://schemas.microsoft.com/office/drawing/2016/5/10/chartex" xmlns:cx5="http://schemas.microsoft.com/office/drawing/2016/5/11/chartex" xmlns:cx6="http://schemas.microsoft.com/office/drawing/2016/5/12/chartex" xmlns:cx7="http://schemas.microsoft.com/office/drawing/2016/5/13/chartex" xmlns:cx8="http://schemas.microsoft.com/office/drawing/2016/5/14/chartex" xmlns:mc="http://schemas.openxmlformats.org/markup-compatibility/2006" xmlns:aink="http://schemas.microsoft.com/office/drawing/2016/ink" xmlns:am3d="http://schemas.microsoft.com/office/drawing/2017/model3d" xmlns:o="urn:schemas-microsoft-com:office:office" xmlns:oel="http://schemas.microsoft.com/office/2019/extlst" xmlns:r="http://schemas.openxmlformats.org/officeDocument/2006/relationships" xmlns:m="http://schemas.openxmlformats.org/officeDocument/2006/math" xmlns:v="urn:schemas-microsoft-com:vml" xmlns:wp14="http://schemas.microsoft.com/office/word/2010/wordprocessingDrawing" xmlns:wp="http://schemas.openxmlformats.org/drawingml/2006/wordprocessingDrawing" xmlns:w10="urn:schemas-microsoft-com:office:word" xmlns:w="http://schemas.openxmlformats.org/wordprocessingml/2006/main" xmlns:w14="http://schemas.microsoft.com/office/word/2010/wordml" xmlns:w15="http://schemas.microsoft.com/office/word/2012/wordml" xmlns:w16cex="http://schemas.microsoft.com/office/word/2018/wordml/cex" xmlns:w16cid="http://schemas.microsoft.com/office/word/2016/wordml/cid" xmlns:w16="http://schemas.microsoft.com/office/word/2018/wordml" xmlns:w16du="http://schemas.microsoft.com/office/word/2023/wordml/word16du" xmlns:w16sdtdh="http://schemas.microsoft.com/office/word/2020/wordml/sdtdatahash" xmlns:w16sdtfl="http://schemas.microsoft.com/office/word/2024/wordml/sdtformatlock" xmlns:w16se="http://schemas.microsoft.com/office/word/2015/wordml/symex" xmlns:wpg="http://schemas.microsoft.com/office/word/2010/wordprocessingGroup" xmlns:wpi="http://schemas.microsoft.com/office/word/2010/wordprocessingInk" xmlns:wne="http://schemas.microsoft.com/office/word/2006/wordml" xmlns:wps="http://schemas.microsoft.com/office/word/2010/wordprocessingShape" mc:Ignorable="w14 w15 w16se w16cid w16 w16cex w16sdtdh w16sdtfl w16du wp14">
-  <w15:person w15:author="Davide Salvucci">
-    <w15:presenceInfo w15:providerId="Windows Live" w15:userId="f1f4923e458099f2"/>
-  </w15:person>
-</w15:people>
 </file>
 
 <file path=word/styles.xml><?xml version="1.0" encoding="utf-8"?>
@@ -5227,7 +8030,6 @@
   <w:style w:type="character" w:default="1" w:styleId="DefaultParagraphFont">
     <w:name w:val="Default Paragraph Font"/>
     <w:uiPriority w:val="1"/>
-    <w:semiHidden/>
     <w:unhideWhenUsed/>
   </w:style>
   <w:style w:type="table" w:default="1" w:styleId="TableNormal">

</xml_diff>

<commit_message>
0.0.2 - MVP1 - Batch 2: Spatial grid with forage density and debug visualization
- Implemented spatial grid (64px cells, 20x12) in world.js.
- Added createGrid, initializeForageDensity with procedural patches.
- Added debug rendering in main.js with 7-color density scale (dark green to red).
- Added click-to-inspect: tooltip and console log for cell coordinates and forage density.
- Updated TECHNICAL.md:
  - Section 5.3: workflow rule to always check GitHub files before proposing changes.
  - Section 5.8: explicit user confirmation required before commit.
- Updated Prototip 1
 - Added some notes for future implementations to evaluate at the end of MVP1
</commit_message>
<xml_diff>
--- a/Docs/Prototipo 1.docx
+++ b/Docs/Prototipo 1.docx
@@ -163,7 +163,23 @@
         <w:t xml:space="preserve"> – ciò che sai dipende da chi te lo dice. </w:t>
       </w:r>
       <w:r>
-        <w:t>Le certezze sono poche.</w:t>
+        <w:t xml:space="preserve">Le </w:t>
+      </w:r>
+      <w:proofErr w:type="spellStart"/>
+      <w:r>
+        <w:t>certezze</w:t>
+      </w:r>
+      <w:proofErr w:type="spellEnd"/>
+      <w:r>
+        <w:t xml:space="preserve"> </w:t>
+      </w:r>
+      <w:proofErr w:type="spellStart"/>
+      <w:r>
+        <w:t>sono</w:t>
+      </w:r>
+      <w:proofErr w:type="spellEnd"/>
+      <w:r>
+        <w:t xml:space="preserve"> poche.</w:t>
       </w:r>
     </w:p>
     <w:p>
@@ -197,8 +213,17 @@
           <w:b/>
           <w:bCs/>
         </w:rPr>
-        <w:t>Game Loop minimo</w:t>
-      </w:r>
+        <w:t xml:space="preserve">Game Loop </w:t>
+      </w:r>
+      <w:proofErr w:type="spellStart"/>
+      <w:r>
+        <w:rPr>
+          <w:b/>
+          <w:bCs/>
+        </w:rPr>
+        <w:t>minimo</w:t>
+      </w:r>
+      <w:proofErr w:type="spellEnd"/>
     </w:p>
     <w:p>
       <w:pPr>
@@ -369,13 +394,31 @@
       </w:r>
     </w:p>
     <w:p>
+      <w:proofErr w:type="spellStart"/>
       <w:r>
         <w:rPr>
           <w:b/>
           <w:bCs/>
         </w:rPr>
-        <w:t>Confini del prototipo</w:t>
-      </w:r>
+        <w:t>Confini</w:t>
+      </w:r>
+      <w:proofErr w:type="spellEnd"/>
+      <w:r>
+        <w:rPr>
+          <w:b/>
+          <w:bCs/>
+        </w:rPr>
+        <w:t xml:space="preserve"> del </w:t>
+      </w:r>
+      <w:proofErr w:type="spellStart"/>
+      <w:r>
+        <w:rPr>
+          <w:b/>
+          <w:bCs/>
+        </w:rPr>
+        <w:t>prototipo</w:t>
+      </w:r>
+      <w:proofErr w:type="spellEnd"/>
     </w:p>
     <w:p>
       <w:pPr>
@@ -454,7 +497,15 @@
       </w:pPr>
       <w:r>
         <w:lastRenderedPageBreak/>
-        <w:t>Pausa/play/accelerazione.</w:t>
+        <w:t>Pausa/play/</w:t>
+      </w:r>
+      <w:proofErr w:type="spellStart"/>
+      <w:r>
+        <w:t>accelerazione</w:t>
+      </w:r>
+      <w:proofErr w:type="spellEnd"/>
+      <w:r>
+        <w:t>.</w:t>
       </w:r>
     </w:p>
     <w:p>
@@ -471,7 +522,21 @@
         <w:rPr>
           <w:lang w:val="it-IT"/>
         </w:rPr>
-        <w:t>Movimento con pathfinding base (verso il click).</w:t>
+        <w:t xml:space="preserve">Movimento con </w:t>
+      </w:r>
+      <w:proofErr w:type="spellStart"/>
+      <w:r>
+        <w:rPr>
+          <w:lang w:val="it-IT"/>
+        </w:rPr>
+        <w:t>pathfinding</w:t>
+      </w:r>
+      <w:proofErr w:type="spellEnd"/>
+      <w:r>
+        <w:rPr>
+          <w:lang w:val="it-IT"/>
+        </w:rPr>
+        <w:t xml:space="preserve"> base (verso il click).</w:t>
       </w:r>
     </w:p>
     <w:p>
@@ -510,7 +575,21 @@
           <w:lang w:val="it-IT"/>
         </w:rPr>
         <w:br/>
-        <w:t>HTML5, CSS, JavaScript con libreria Phaser 3 (rendering 2D, input, gestione scene).</w:t>
+        <w:t xml:space="preserve">HTML5, CSS, JavaScript con libreria </w:t>
+      </w:r>
+      <w:proofErr w:type="spellStart"/>
+      <w:r>
+        <w:rPr>
+          <w:lang w:val="it-IT"/>
+        </w:rPr>
+        <w:t>Phaser</w:t>
+      </w:r>
+      <w:proofErr w:type="spellEnd"/>
+      <w:r>
+        <w:rPr>
+          <w:lang w:val="it-IT"/>
+        </w:rPr>
+        <w:t xml:space="preserve"> 3 (rendering 2D, input, gestione scene).</w:t>
       </w:r>
     </w:p>
     <w:p>
@@ -538,11 +617,19 @@
           <w:lang w:val="it-IT"/>
         </w:rPr>
       </w:pPr>
-      <w:r>
-        <w:rPr>
-          <w:lang w:val="it-IT"/>
-        </w:rPr>
-        <w:t>Crusader Kings 3 (dinastia, informazione imperfetta, tempo reale con pausa)</w:t>
+      <w:proofErr w:type="spellStart"/>
+      <w:r>
+        <w:rPr>
+          <w:lang w:val="it-IT"/>
+        </w:rPr>
+        <w:t>Crusader</w:t>
+      </w:r>
+      <w:proofErr w:type="spellEnd"/>
+      <w:r>
+        <w:rPr>
+          <w:lang w:val="it-IT"/>
+        </w:rPr>
+        <w:t xml:space="preserve"> Kings 3 (dinastia, informazione imperfetta, tempo reale con pausa)</w:t>
       </w:r>
     </w:p>
     <w:p>
@@ -553,7 +640,23 @@
         </w:numPr>
       </w:pPr>
       <w:r>
-        <w:t>Victoria 3 / Stellaris (pop system, risorse logistiche)</w:t>
+        <w:t xml:space="preserve">Victoria 3 / Stellaris (pop system, </w:t>
+      </w:r>
+      <w:proofErr w:type="spellStart"/>
+      <w:r>
+        <w:t>risorse</w:t>
+      </w:r>
+      <w:proofErr w:type="spellEnd"/>
+      <w:r>
+        <w:t xml:space="preserve"> </w:t>
+      </w:r>
+      <w:proofErr w:type="spellStart"/>
+      <w:r>
+        <w:t>logistiche</w:t>
+      </w:r>
+      <w:proofErr w:type="spellEnd"/>
+      <w:r>
+        <w:t>)</w:t>
       </w:r>
     </w:p>
     <w:p>
@@ -564,7 +667,39 @@
         </w:numPr>
       </w:pPr>
       <w:r>
-        <w:t>Banished / Dawn of Man (sopravvivenza tribale, risorse tangibili)</w:t>
+        <w:t>Banished / Dawn of Man (</w:t>
+      </w:r>
+      <w:proofErr w:type="spellStart"/>
+      <w:r>
+        <w:t>sopravvivenza</w:t>
+      </w:r>
+      <w:proofErr w:type="spellEnd"/>
+      <w:r>
+        <w:t xml:space="preserve"> </w:t>
+      </w:r>
+      <w:proofErr w:type="spellStart"/>
+      <w:r>
+        <w:t>tribale</w:t>
+      </w:r>
+      <w:proofErr w:type="spellEnd"/>
+      <w:r>
+        <w:t xml:space="preserve">, </w:t>
+      </w:r>
+      <w:proofErr w:type="spellStart"/>
+      <w:r>
+        <w:t>risorse</w:t>
+      </w:r>
+      <w:proofErr w:type="spellEnd"/>
+      <w:r>
+        <w:t xml:space="preserve"> </w:t>
+      </w:r>
+      <w:proofErr w:type="spellStart"/>
+      <w:r>
+        <w:t>tangibili</w:t>
+      </w:r>
+      <w:proofErr w:type="spellEnd"/>
+      <w:r>
+        <w:t>)</w:t>
       </w:r>
     </w:p>
     <w:p>
@@ -577,11 +712,19 @@
           <w:lang w:val="it-IT"/>
         </w:rPr>
       </w:pPr>
-      <w:r>
-        <w:rPr>
-          <w:lang w:val="it-IT"/>
-        </w:rPr>
-        <w:t>King's Orders (report e comunicazione)</w:t>
+      <w:proofErr w:type="spellStart"/>
+      <w:r>
+        <w:rPr>
+          <w:lang w:val="it-IT"/>
+        </w:rPr>
+        <w:t>King's</w:t>
+      </w:r>
+      <w:proofErr w:type="spellEnd"/>
+      <w:r>
+        <w:rPr>
+          <w:lang w:val="it-IT"/>
+        </w:rPr>
+        <w:t xml:space="preserve"> Orders (report e comunicazione)</w:t>
       </w:r>
     </w:p>
     <w:p>
@@ -669,8 +812,17 @@
           <w:b/>
           <w:bCs/>
         </w:rPr>
-        <w:t>Batch 1 – Setup Phaser funzionante</w:t>
-      </w:r>
+        <w:t xml:space="preserve">Batch 1 – Setup Phaser </w:t>
+      </w:r>
+      <w:proofErr w:type="spellStart"/>
+      <w:r>
+        <w:rPr>
+          <w:b/>
+          <w:bCs/>
+        </w:rPr>
+        <w:t>funzionante</w:t>
+      </w:r>
+      <w:proofErr w:type="spellEnd"/>
     </w:p>
     <w:p>
       <w:pPr>
@@ -686,7 +838,21 @@
         <w:rPr>
           <w:lang w:val="it-IT"/>
         </w:rPr>
-        <w:t>Installazione di Phaser 3 via CDN.</w:t>
+        <w:t xml:space="preserve">Installazione di </w:t>
+      </w:r>
+      <w:proofErr w:type="spellStart"/>
+      <w:r>
+        <w:rPr>
+          <w:lang w:val="it-IT"/>
+        </w:rPr>
+        <w:t>Phaser</w:t>
+      </w:r>
+      <w:proofErr w:type="spellEnd"/>
+      <w:r>
+        <w:rPr>
+          <w:lang w:val="it-IT"/>
+        </w:rPr>
+        <w:t xml:space="preserve"> 3 via CDN.</w:t>
       </w:r>
     </w:p>
     <w:p>
@@ -788,7 +954,21 @@
         <w:rPr>
           <w:lang w:val="it-IT"/>
         </w:rPr>
-        <w:t>Layer forageDensity con distribuzione non uniforme:</w:t>
+        <w:t xml:space="preserve">Layer </w:t>
+      </w:r>
+      <w:proofErr w:type="spellStart"/>
+      <w:r>
+        <w:rPr>
+          <w:lang w:val="it-IT"/>
+        </w:rPr>
+        <w:t>forageDensity</w:t>
+      </w:r>
+      <w:proofErr w:type="spellEnd"/>
+      <w:r>
+        <w:rPr>
+          <w:lang w:val="it-IT"/>
+        </w:rPr>
+        <w:t xml:space="preserve"> con distribuzione non uniforme:</w:t>
       </w:r>
     </w:p>
     <w:p>
@@ -879,6 +1059,148 @@
     </w:p>
     <w:p>
       <w:pPr>
+        <w:numPr>
+          <w:ilvl w:val="0"/>
+          <w:numId w:val="24"/>
+        </w:numPr>
+        <w:rPr>
+          <w:lang w:val="it-IT"/>
+        </w:rPr>
+      </w:pPr>
+      <w:r>
+        <w:rPr>
+          <w:lang w:val="it-IT"/>
+        </w:rPr>
+        <w:t>La densità di cibo è visualizzata con una scala a 7 colori, con intervalli precisi e non sovrapposti:</w:t>
+      </w:r>
+    </w:p>
+    <w:p>
+      <w:pPr>
+        <w:numPr>
+          <w:ilvl w:val="1"/>
+          <w:numId w:val="24"/>
+        </w:numPr>
+        <w:rPr>
+          <w:lang w:val="it-IT"/>
+        </w:rPr>
+      </w:pPr>
+      <w:r>
+        <w:rPr>
+          <w:lang w:val="it-IT"/>
+        </w:rPr>
+        <w:t>0.90-1.00: verde scuro</w:t>
+      </w:r>
+    </w:p>
+    <w:p>
+      <w:pPr>
+        <w:pStyle w:val="ListParagraph"/>
+        <w:numPr>
+          <w:ilvl w:val="1"/>
+          <w:numId w:val="24"/>
+        </w:numPr>
+        <w:rPr>
+          <w:lang w:val="it-IT"/>
+        </w:rPr>
+      </w:pPr>
+      <w:r>
+        <w:rPr>
+          <w:lang w:val="it-IT"/>
+        </w:rPr>
+        <w:t>0.75-0.89: verde medio</w:t>
+      </w:r>
+    </w:p>
+    <w:p>
+      <w:pPr>
+        <w:pStyle w:val="ListParagraph"/>
+        <w:numPr>
+          <w:ilvl w:val="1"/>
+          <w:numId w:val="24"/>
+        </w:numPr>
+        <w:rPr>
+          <w:lang w:val="it-IT"/>
+        </w:rPr>
+      </w:pPr>
+      <w:r>
+        <w:rPr>
+          <w:lang w:val="it-IT"/>
+        </w:rPr>
+        <w:t>0.50-0.74: verde chiaro</w:t>
+      </w:r>
+    </w:p>
+    <w:p>
+      <w:pPr>
+        <w:pStyle w:val="ListParagraph"/>
+        <w:numPr>
+          <w:ilvl w:val="1"/>
+          <w:numId w:val="24"/>
+        </w:numPr>
+        <w:rPr>
+          <w:lang w:val="it-IT"/>
+        </w:rPr>
+      </w:pPr>
+      <w:r>
+        <w:rPr>
+          <w:lang w:val="it-IT"/>
+        </w:rPr>
+        <w:t>0.25-0.49: giallo</w:t>
+      </w:r>
+    </w:p>
+    <w:p>
+      <w:pPr>
+        <w:pStyle w:val="ListParagraph"/>
+        <w:numPr>
+          <w:ilvl w:val="1"/>
+          <w:numId w:val="24"/>
+        </w:numPr>
+        <w:rPr>
+          <w:lang w:val="it-IT"/>
+        </w:rPr>
+      </w:pPr>
+      <w:r>
+        <w:rPr>
+          <w:lang w:val="it-IT"/>
+        </w:rPr>
+        <w:t>0.05-0.24: arancione</w:t>
+      </w:r>
+    </w:p>
+    <w:p>
+      <w:pPr>
+        <w:pStyle w:val="ListParagraph"/>
+        <w:numPr>
+          <w:ilvl w:val="1"/>
+          <w:numId w:val="24"/>
+        </w:numPr>
+        <w:rPr>
+          <w:lang w:val="it-IT"/>
+        </w:rPr>
+      </w:pPr>
+      <w:r>
+        <w:rPr>
+          <w:lang w:val="it-IT"/>
+        </w:rPr>
+        <w:t>0.01-0.04: rosso</w:t>
+      </w:r>
+    </w:p>
+    <w:p>
+      <w:pPr>
+        <w:pStyle w:val="ListParagraph"/>
+        <w:numPr>
+          <w:ilvl w:val="1"/>
+          <w:numId w:val="24"/>
+        </w:numPr>
+        <w:rPr>
+          <w:lang w:val="it-IT"/>
+        </w:rPr>
+      </w:pPr>
+      <w:r>
+        <w:rPr>
+          <w:lang w:val="it-IT"/>
+        </w:rPr>
+        <w:t>0.00: nessun colore (sfondo)</w:t>
+      </w:r>
+    </w:p>
+    <w:p>
+      <w:pPr>
         <w:rPr>
           <w:b/>
           <w:bCs/>
@@ -889,8 +1211,17 @@
           <w:b/>
           <w:bCs/>
         </w:rPr>
-        <w:t>Batch 3 – Pop e movimento</w:t>
-      </w:r>
+        <w:t xml:space="preserve">Batch 3 – Pop e </w:t>
+      </w:r>
+      <w:proofErr w:type="spellStart"/>
+      <w:r>
+        <w:rPr>
+          <w:b/>
+          <w:bCs/>
+        </w:rPr>
+        <w:t>movimento</w:t>
+      </w:r>
+      <w:proofErr w:type="spellEnd"/>
     </w:p>
     <w:p>
       <w:pPr>
@@ -957,7 +1288,47 @@
         <w:t xml:space="preserve">Meccanica: interazione diretta con il mondo. Non esistono griglie visibili che vincolano il movimento. </w:t>
       </w:r>
       <w:r>
-        <w:t>Il giocatore sposta fisicamente la sua gente.</w:t>
+        <w:t xml:space="preserve">Il </w:t>
+      </w:r>
+      <w:proofErr w:type="spellStart"/>
+      <w:r>
+        <w:t>giocatore</w:t>
+      </w:r>
+      <w:proofErr w:type="spellEnd"/>
+      <w:r>
+        <w:t xml:space="preserve"> </w:t>
+      </w:r>
+      <w:proofErr w:type="spellStart"/>
+      <w:r>
+        <w:t>sposta</w:t>
+      </w:r>
+      <w:proofErr w:type="spellEnd"/>
+      <w:r>
+        <w:t xml:space="preserve"> </w:t>
+      </w:r>
+      <w:proofErr w:type="spellStart"/>
+      <w:r>
+        <w:t>fisicamente</w:t>
+      </w:r>
+      <w:proofErr w:type="spellEnd"/>
+      <w:r>
+        <w:t xml:space="preserve"> la </w:t>
+      </w:r>
+      <w:proofErr w:type="spellStart"/>
+      <w:r>
+        <w:t>sua</w:t>
+      </w:r>
+      <w:proofErr w:type="spellEnd"/>
+      <w:r>
+        <w:t xml:space="preserve"> </w:t>
+      </w:r>
+      <w:proofErr w:type="spellStart"/>
+      <w:r>
+        <w:t>gente</w:t>
+      </w:r>
+      <w:proofErr w:type="spellEnd"/>
+      <w:r>
+        <w:t>.</w:t>
       </w:r>
     </w:p>
     <w:p>
@@ -991,7 +1362,21 @@
         <w:rPr>
           <w:lang w:val="it-IT"/>
         </w:rPr>
-        <w:t>Quando il pop arriva su una cella con forageDensity maggiore di zero, inizia automaticamente a raccogliere cibo.</w:t>
+        <w:t xml:space="preserve">Quando il pop arriva su una cella con </w:t>
+      </w:r>
+      <w:proofErr w:type="spellStart"/>
+      <w:r>
+        <w:rPr>
+          <w:lang w:val="it-IT"/>
+        </w:rPr>
+        <w:t>forageDensity</w:t>
+      </w:r>
+      <w:proofErr w:type="spellEnd"/>
+      <w:r>
+        <w:rPr>
+          <w:lang w:val="it-IT"/>
+        </w:rPr>
+        <w:t xml:space="preserve"> maggiore di zero, inizia automaticamente a raccogliere cibo.</w:t>
       </w:r>
     </w:p>
     <w:p>
@@ -1025,7 +1410,21 @@
         <w:rPr>
           <w:lang w:val="it-IT"/>
         </w:rPr>
-        <w:t>La funzione modifyDensity riduce la densità della cella e di quelle vicine (raggio configurabile), simulando un prelievo localizzato.</w:t>
+        <w:t xml:space="preserve">La funzione </w:t>
+      </w:r>
+      <w:proofErr w:type="spellStart"/>
+      <w:r>
+        <w:rPr>
+          <w:lang w:val="it-IT"/>
+        </w:rPr>
+        <w:t>modifyDensity</w:t>
+      </w:r>
+      <w:proofErr w:type="spellEnd"/>
+      <w:r>
+        <w:rPr>
+          <w:lang w:val="it-IT"/>
+        </w:rPr>
+        <w:t xml:space="preserve"> riduce la densità della cella e di quelle vicine (raggio configurabile), simulando un prelievo localizzato.</w:t>
       </w:r>
     </w:p>
     <w:p>
@@ -1059,6 +1458,7 @@
         <w:rPr>
           <w:lang w:val="it-IT"/>
         </w:rPr>
+        <w:lastRenderedPageBreak/>
         <w:t>Meccanica: il giocatore vede le zone impoverirsi dopo la raccolta. Deve decidere se insistere su una zona ricca rischiando di esaurirla, o spostarsi altrove.</w:t>
       </w:r>
     </w:p>
@@ -1144,7 +1544,6 @@
         <w:rPr>
           <w:lang w:val="it-IT"/>
         </w:rPr>
-        <w:lastRenderedPageBreak/>
         <w:t>Introduzione del consumo: ogni giorno di gioco (intervallo configurabile) una quantità di cibo viene sottratta dalle scorte in base al numero di pop presenti.</w:t>
       </w:r>
     </w:p>
@@ -1213,7 +1612,21 @@
         <w:rPr>
           <w:lang w:val="it-IT"/>
         </w:rPr>
-        <w:t>Implementazione del TimeManager (time.js).</w:t>
+        <w:t xml:space="preserve">Implementazione del </w:t>
+      </w:r>
+      <w:proofErr w:type="spellStart"/>
+      <w:r>
+        <w:rPr>
+          <w:lang w:val="it-IT"/>
+        </w:rPr>
+        <w:t>TimeManager</w:t>
+      </w:r>
+      <w:proofErr w:type="spellEnd"/>
+      <w:r>
+        <w:rPr>
+          <w:lang w:val="it-IT"/>
+        </w:rPr>
+        <w:t xml:space="preserve"> (time.js).</w:t>
       </w:r>
     </w:p>
     <w:p>
@@ -1264,7 +1677,21 @@
         <w:rPr>
           <w:lang w:val="it-IT"/>
         </w:rPr>
-        <w:t>La raccolta, il movimento e il consumo dipendono dal tempo di gioco effettivo, non dal framerate.</w:t>
+        <w:t xml:space="preserve">La raccolta, il movimento e il consumo dipendono dal tempo di gioco effettivo, non dal </w:t>
+      </w:r>
+      <w:proofErr w:type="spellStart"/>
+      <w:r>
+        <w:rPr>
+          <w:lang w:val="it-IT"/>
+        </w:rPr>
+        <w:t>framerate</w:t>
+      </w:r>
+      <w:proofErr w:type="spellEnd"/>
+      <w:r>
+        <w:rPr>
+          <w:lang w:val="it-IT"/>
+        </w:rPr>
+        <w:t>.</w:t>
       </w:r>
     </w:p>
     <w:p>
@@ -1296,8 +1723,33 @@
           <w:b/>
           <w:bCs/>
         </w:rPr>
-        <w:t>Batch 7 – Rigenerazione base del cibo</w:t>
-      </w:r>
+        <w:t xml:space="preserve">Batch 7 – </w:t>
+      </w:r>
+      <w:proofErr w:type="spellStart"/>
+      <w:r>
+        <w:rPr>
+          <w:b/>
+          <w:bCs/>
+        </w:rPr>
+        <w:t>Rigenerazione</w:t>
+      </w:r>
+      <w:proofErr w:type="spellEnd"/>
+      <w:r>
+        <w:rPr>
+          <w:b/>
+          <w:bCs/>
+        </w:rPr>
+        <w:t xml:space="preserve"> base del </w:t>
+      </w:r>
+      <w:proofErr w:type="spellStart"/>
+      <w:r>
+        <w:rPr>
+          <w:b/>
+          <w:bCs/>
+        </w:rPr>
+        <w:t>cibo</w:t>
+      </w:r>
+      <w:proofErr w:type="spellEnd"/>
     </w:p>
     <w:p>
       <w:pPr>
@@ -1313,7 +1765,21 @@
         <w:rPr>
           <w:lang w:val="it-IT"/>
         </w:rPr>
-        <w:t>Le celle con forageDensity si rigenerano lentamente nel tempo (es. una piccola frazione al giorno).</w:t>
+        <w:t xml:space="preserve">Le celle con </w:t>
+      </w:r>
+      <w:proofErr w:type="spellStart"/>
+      <w:r>
+        <w:rPr>
+          <w:lang w:val="it-IT"/>
+        </w:rPr>
+        <w:t>forageDensity</w:t>
+      </w:r>
+      <w:proofErr w:type="spellEnd"/>
+      <w:r>
+        <w:rPr>
+          <w:lang w:val="it-IT"/>
+        </w:rPr>
+        <w:t xml:space="preserve"> si rigenerano lentamente nel tempo (es. una piccola frazione al giorno).</w:t>
       </w:r>
     </w:p>
     <w:p>
@@ -1381,6 +1847,7 @@
           <w:bCs/>
           <w:lang w:val="it-IT"/>
         </w:rPr>
+        <w:lastRenderedPageBreak/>
         <w:t>Dopo il Batch 7</w:t>
       </w:r>
       <w:r>
@@ -1481,16 +1948,115 @@
     <w:p>
       <w:pPr>
         <w:rPr>
-          <w:lang w:val="it-IT"/>
-        </w:rPr>
-      </w:pPr>
-      <w:r>
-        <w:rPr>
           <w:b/>
           <w:bCs/>
           <w:lang w:val="it-IT"/>
         </w:rPr>
-        <w:lastRenderedPageBreak/>
+      </w:pPr>
+      <w:r>
+        <w:rPr>
+          <w:b/>
+          <w:bCs/>
+          <w:lang w:val="it-IT"/>
+        </w:rPr>
+        <w:t>NOTE FINE MVP1</w:t>
+      </w:r>
+    </w:p>
+    <w:p>
+      <w:pPr>
+        <w:pStyle w:val="ListParagraph"/>
+        <w:numPr>
+          <w:ilvl w:val="0"/>
+          <w:numId w:val="36"/>
+        </w:numPr>
+        <w:rPr>
+          <w:b/>
+          <w:bCs/>
+          <w:lang w:val="it-IT"/>
+        </w:rPr>
+      </w:pPr>
+      <w:r>
+        <w:rPr>
+          <w:lang w:val="it-IT"/>
+        </w:rPr>
+        <w:t xml:space="preserve">Tool per disegnare la mappa (apporre foreste, pesci, </w:t>
+      </w:r>
+      <w:proofErr w:type="spellStart"/>
+      <w:r>
+        <w:rPr>
+          <w:lang w:val="it-IT"/>
+        </w:rPr>
+        <w:t>gathering</w:t>
+      </w:r>
+      <w:proofErr w:type="spellEnd"/>
+      <w:r>
+        <w:rPr>
+          <w:lang w:val="it-IT"/>
+        </w:rPr>
+        <w:t xml:space="preserve"> food ecc. con dei pennelli) [è forse troppo presto]</w:t>
+      </w:r>
+    </w:p>
+    <w:p>
+      <w:pPr>
+        <w:pStyle w:val="ListParagraph"/>
+        <w:numPr>
+          <w:ilvl w:val="0"/>
+          <w:numId w:val="36"/>
+        </w:numPr>
+        <w:rPr>
+          <w:b/>
+          <w:bCs/>
+          <w:lang w:val="it-IT"/>
+        </w:rPr>
+      </w:pPr>
+      <w:r>
+        <w:rPr>
+          <w:lang w:val="it-IT"/>
+        </w:rPr>
+        <w:t>Creazione di algoritmo per creazione foreste e cibo in base a tipologia terreno delle celle [anche questo forse da vedere più avanti]</w:t>
+      </w:r>
+    </w:p>
+    <w:p>
+      <w:pPr>
+        <w:pStyle w:val="ListParagraph"/>
+        <w:numPr>
+          <w:ilvl w:val="0"/>
+          <w:numId w:val="36"/>
+        </w:numPr>
+        <w:rPr>
+          <w:b/>
+          <w:bCs/>
+          <w:lang w:val="it-IT"/>
+        </w:rPr>
+      </w:pPr>
+      <w:r>
+        <w:rPr>
+          <w:lang w:val="it-IT"/>
+        </w:rPr>
+        <w:t>Non abbiamo minimamente lavorato sulla tipologia del terreno (montagna, acqua, acqua profonda, collina, pianura) e le caratteristiche di esso (foresta, erba ecc.). Questo perché sulla base del tipo di terreno poi dipende il cibo (la pesca è solo nelle acque, le aree di pianura con erba vicino ai fiumi hanno più cibo ecc.). Da forse vedere subito dopo MVP1?</w:t>
+      </w:r>
+    </w:p>
+    <w:p>
+      <w:pPr>
+        <w:rPr>
+          <w:b/>
+          <w:bCs/>
+          <w:lang w:val="it-IT"/>
+        </w:rPr>
+      </w:pPr>
+    </w:p>
+    <w:p>
+      <w:pPr>
+        <w:rPr>
+          <w:lang w:val="it-IT"/>
+        </w:rPr>
+      </w:pPr>
+      <w:r>
+        <w:rPr>
+          <w:b/>
+          <w:bCs/>
+          <w:lang w:val="it-IT"/>
+        </w:rPr>
         <w:t>MVP2 – Diversificazione delle fonti di cibo (caccia e pesca)</w:t>
       </w:r>
     </w:p>
@@ -1509,7 +2075,15 @@
     </w:p>
     <w:p>
       <w:r>
-        <w:t>Nuova definizione:</w:t>
+        <w:t xml:space="preserve">Nuova </w:t>
+      </w:r>
+      <w:proofErr w:type="spellStart"/>
+      <w:r>
+        <w:t>definizione</w:t>
+      </w:r>
+      <w:proofErr w:type="spellEnd"/>
+      <w:r>
+        <w:t>:</w:t>
       </w:r>
     </w:p>
     <w:p>
@@ -1560,7 +2134,35 @@
         <w:rPr>
           <w:lang w:val="it-IT"/>
         </w:rPr>
-        <w:t>Nelle celle che intersecano fiumi o laghi, il layer fishDensity permette la pesca. Funziona come la raccolta vegetale (riduce densità, si rigenera), ma solo in acqua.</w:t>
+        <w:t xml:space="preserve">Nelle celle che intersecano fiumi o laghi, il </w:t>
+      </w:r>
+      <w:proofErr w:type="spellStart"/>
+      <w:r>
+        <w:rPr>
+          <w:lang w:val="it-IT"/>
+        </w:rPr>
+        <w:t>layer</w:t>
+      </w:r>
+      <w:proofErr w:type="spellEnd"/>
+      <w:r>
+        <w:rPr>
+          <w:lang w:val="it-IT"/>
+        </w:rPr>
+        <w:t xml:space="preserve"> </w:t>
+      </w:r>
+      <w:proofErr w:type="spellStart"/>
+      <w:r>
+        <w:rPr>
+          <w:lang w:val="it-IT"/>
+        </w:rPr>
+        <w:t>fishDensity</w:t>
+      </w:r>
+      <w:proofErr w:type="spellEnd"/>
+      <w:r>
+        <w:rPr>
+          <w:lang w:val="it-IT"/>
+        </w:rPr>
+        <w:t xml:space="preserve"> permette la pesca. Funziona come la raccolta vegetale (riduce densità, si rigenera), ma solo in acqua.</w:t>
       </w:r>
     </w:p>
     <w:p>
@@ -1609,6 +2211,7 @@
           <w:bCs/>
           <w:lang w:val="it-IT"/>
         </w:rPr>
+        <w:lastRenderedPageBreak/>
         <w:t xml:space="preserve">MVP3 – Raccolta legna, lavorazione e </w:t>
       </w:r>
       <w:r>
@@ -1630,7 +2233,35 @@
         <w:rPr>
           <w:lang w:val="it-IT"/>
         </w:rPr>
-        <w:t xml:space="preserve">MVP3 introduce il layer forestDensity e la raccolta di legna. Poi la lavorazione (legna → </w:t>
+        <w:t xml:space="preserve">MVP3 introduce il </w:t>
+      </w:r>
+      <w:proofErr w:type="spellStart"/>
+      <w:r>
+        <w:rPr>
+          <w:lang w:val="it-IT"/>
+        </w:rPr>
+        <w:t>layer</w:t>
+      </w:r>
+      <w:proofErr w:type="spellEnd"/>
+      <w:r>
+        <w:rPr>
+          <w:lang w:val="it-IT"/>
+        </w:rPr>
+        <w:t xml:space="preserve"> </w:t>
+      </w:r>
+      <w:proofErr w:type="spellStart"/>
+      <w:r>
+        <w:rPr>
+          <w:lang w:val="it-IT"/>
+        </w:rPr>
+        <w:t>forestDensity</w:t>
+      </w:r>
+      <w:proofErr w:type="spellEnd"/>
+      <w:r>
+        <w:rPr>
+          <w:lang w:val="it-IT"/>
+        </w:rPr>
+        <w:t xml:space="preserve"> e la raccolta di legna. Poi la lavorazione (legna → </w:t>
       </w:r>
       <w:r>
         <w:rPr>
@@ -1709,7 +2340,49 @@
         <w:rPr>
           <w:lang w:val="it-IT"/>
         </w:rPr>
-        <w:t>Attivazione del layer forestDensity sulla griglia. Le foreste sono visivamente distinguibili (verde scuro). La raccolta di legna riduce la densità localmente, come per il forage.</w:t>
+        <w:t xml:space="preserve">Attivazione del </w:t>
+      </w:r>
+      <w:proofErr w:type="spellStart"/>
+      <w:r>
+        <w:rPr>
+          <w:lang w:val="it-IT"/>
+        </w:rPr>
+        <w:t>layer</w:t>
+      </w:r>
+      <w:proofErr w:type="spellEnd"/>
+      <w:r>
+        <w:rPr>
+          <w:lang w:val="it-IT"/>
+        </w:rPr>
+        <w:t xml:space="preserve"> </w:t>
+      </w:r>
+      <w:proofErr w:type="spellStart"/>
+      <w:r>
+        <w:rPr>
+          <w:lang w:val="it-IT"/>
+        </w:rPr>
+        <w:t>forestDensity</w:t>
+      </w:r>
+      <w:proofErr w:type="spellEnd"/>
+      <w:r>
+        <w:rPr>
+          <w:lang w:val="it-IT"/>
+        </w:rPr>
+        <w:t xml:space="preserve"> sulla griglia. Le foreste sono visivamente distinguibili (verde scuro). La raccolta di legna riduce la densità localmente, come per il </w:t>
+      </w:r>
+      <w:proofErr w:type="spellStart"/>
+      <w:r>
+        <w:rPr>
+          <w:lang w:val="it-IT"/>
+        </w:rPr>
+        <w:t>forage</w:t>
+      </w:r>
+      <w:proofErr w:type="spellEnd"/>
+      <w:r>
+        <w:rPr>
+          <w:lang w:val="it-IT"/>
+        </w:rPr>
+        <w:t>.</w:t>
       </w:r>
     </w:p>
     <w:p>
@@ -1819,7 +2492,6 @@
         <w:rPr>
           <w:lang w:val="it-IT"/>
         </w:rPr>
-        <w:lastRenderedPageBreak/>
         <w:t>Meccanica: la legna diventa la prima risorsa non commestibile. La lavorazione introduce il concetto di catena produttiva. Si gettano le basi per la specializzazione dei pop (raccoglitori, taglialegna, artigiani).</w:t>
       </w:r>
     </w:p>
@@ -1853,7 +2525,23 @@
     </w:p>
     <w:p>
       <w:r>
-        <w:t>Testo attuale confermato:</w:t>
+        <w:t xml:space="preserve">Testo </w:t>
+      </w:r>
+      <w:proofErr w:type="spellStart"/>
+      <w:r>
+        <w:t>attuale</w:t>
+      </w:r>
+      <w:proofErr w:type="spellEnd"/>
+      <w:r>
+        <w:t xml:space="preserve"> </w:t>
+      </w:r>
+      <w:proofErr w:type="spellStart"/>
+      <w:r>
+        <w:t>confermato</w:t>
+      </w:r>
+      <w:proofErr w:type="spellEnd"/>
+      <w:r>
+        <w:t>:</w:t>
       </w:r>
     </w:p>
     <w:p>
@@ -1948,8 +2636,21 @@
           <w:numId w:val="10"/>
         </w:numPr>
       </w:pPr>
-      <w:r>
-        <w:t>Indicatore di posizione:</w:t>
+      <w:proofErr w:type="spellStart"/>
+      <w:r>
+        <w:t>Indicatore</w:t>
+      </w:r>
+      <w:proofErr w:type="spellEnd"/>
+      <w:r>
+        <w:t xml:space="preserve"> di </w:t>
+      </w:r>
+      <w:proofErr w:type="spellStart"/>
+      <w:r>
+        <w:t>posizione</w:t>
+      </w:r>
+      <w:proofErr w:type="spellEnd"/>
+      <w:r>
+        <w:t>:</w:t>
       </w:r>
     </w:p>
     <w:p>
@@ -2000,6 +2701,7 @@
         <w:rPr>
           <w:lang w:val="it-IT"/>
         </w:rPr>
+        <w:lastRenderedPageBreak/>
         <w:t>Da report (lampeggiante o con indicatore "R") quando arriva un messaggio.</w:t>
       </w:r>
     </w:p>
@@ -2013,11 +2715,19 @@
           <w:lang w:val="it-IT"/>
         </w:rPr>
       </w:pPr>
-      <w:r>
-        <w:rPr>
-          <w:lang w:val="it-IT"/>
-        </w:rPr>
-        <w:t>Tooltip base per risorse e pop.</w:t>
+      <w:proofErr w:type="spellStart"/>
+      <w:r>
+        <w:rPr>
+          <w:lang w:val="it-IT"/>
+        </w:rPr>
+        <w:t>Tooltip</w:t>
+      </w:r>
+      <w:proofErr w:type="spellEnd"/>
+      <w:r>
+        <w:rPr>
+          <w:lang w:val="it-IT"/>
+        </w:rPr>
+        <w:t xml:space="preserve"> base per risorse e pop.</w:t>
       </w:r>
     </w:p>
     <w:p>
@@ -2045,12 +2755,42 @@
         <w:rPr>
           <w:lang w:val="it-IT"/>
         </w:rPr>
-        <w:t>Nessuna modifica necessaria. La competizione per le risorse funziona con qualsiasi tipo di layer o branco.</w:t>
-      </w:r>
-    </w:p>
-    <w:p>
-      <w:r>
-        <w:t>Testo attuale confermato:</w:t>
+        <w:t xml:space="preserve">Nessuna modifica necessaria. La competizione per le risorse funziona con qualsiasi tipo di </w:t>
+      </w:r>
+      <w:proofErr w:type="spellStart"/>
+      <w:r>
+        <w:rPr>
+          <w:lang w:val="it-IT"/>
+        </w:rPr>
+        <w:t>layer</w:t>
+      </w:r>
+      <w:proofErr w:type="spellEnd"/>
+      <w:r>
+        <w:rPr>
+          <w:lang w:val="it-IT"/>
+        </w:rPr>
+        <w:t xml:space="preserve"> o branco.</w:t>
+      </w:r>
+    </w:p>
+    <w:p>
+      <w:r>
+        <w:t xml:space="preserve">Testo </w:t>
+      </w:r>
+      <w:proofErr w:type="spellStart"/>
+      <w:r>
+        <w:t>attuale</w:t>
+      </w:r>
+      <w:proofErr w:type="spellEnd"/>
+      <w:r>
+        <w:t xml:space="preserve"> </w:t>
+      </w:r>
+      <w:proofErr w:type="spellStart"/>
+      <w:r>
+        <w:t>confermato</w:t>
+      </w:r>
+      <w:proofErr w:type="spellEnd"/>
+      <w:r>
+        <w:t>:</w:t>
       </w:r>
     </w:p>
     <w:p>
@@ -2919,6 +3659,118 @@
     </w:lvl>
   </w:abstractNum>
   <w:abstractNum w:abstractNumId="5" w15:restartNumberingAfterBreak="0">
+    <w:nsid w:val="0A1C7A37"/>
+    <w:multiLevelType w:val="hybridMultilevel"/>
+    <w:tmpl w:val="B51A131A"/>
+    <w:lvl w:ilvl="0" w:tplc="FAA67352">
+      <w:numFmt w:val="bullet"/>
+      <w:lvlText w:val="-"/>
+      <w:lvlJc w:val="left"/>
+      <w:pPr>
+        <w:ind w:left="720" w:hanging="360"/>
+      </w:pPr>
+      <w:rPr>
+        <w:rFonts w:ascii="Calibri" w:eastAsiaTheme="minorHAnsi" w:hAnsi="Calibri" w:cs="Calibri" w:hint="default"/>
+      </w:rPr>
+    </w:lvl>
+    <w:lvl w:ilvl="1" w:tplc="08090003" w:tentative="1">
+      <w:start w:val="1"/>
+      <w:numFmt w:val="bullet"/>
+      <w:lvlText w:val="o"/>
+      <w:lvlJc w:val="left"/>
+      <w:pPr>
+        <w:ind w:left="1440" w:hanging="360"/>
+      </w:pPr>
+      <w:rPr>
+        <w:rFonts w:ascii="Courier New" w:hAnsi="Courier New" w:cs="Courier New" w:hint="default"/>
+      </w:rPr>
+    </w:lvl>
+    <w:lvl w:ilvl="2" w:tplc="08090005" w:tentative="1">
+      <w:start w:val="1"/>
+      <w:numFmt w:val="bullet"/>
+      <w:lvlText w:val=""/>
+      <w:lvlJc w:val="left"/>
+      <w:pPr>
+        <w:ind w:left="2160" w:hanging="360"/>
+      </w:pPr>
+      <w:rPr>
+        <w:rFonts w:ascii="Wingdings" w:hAnsi="Wingdings" w:hint="default"/>
+      </w:rPr>
+    </w:lvl>
+    <w:lvl w:ilvl="3" w:tplc="08090001" w:tentative="1">
+      <w:start w:val="1"/>
+      <w:numFmt w:val="bullet"/>
+      <w:lvlText w:val=""/>
+      <w:lvlJc w:val="left"/>
+      <w:pPr>
+        <w:ind w:left="2880" w:hanging="360"/>
+      </w:pPr>
+      <w:rPr>
+        <w:rFonts w:ascii="Symbol" w:hAnsi="Symbol" w:hint="default"/>
+      </w:rPr>
+    </w:lvl>
+    <w:lvl w:ilvl="4" w:tplc="08090003" w:tentative="1">
+      <w:start w:val="1"/>
+      <w:numFmt w:val="bullet"/>
+      <w:lvlText w:val="o"/>
+      <w:lvlJc w:val="left"/>
+      <w:pPr>
+        <w:ind w:left="3600" w:hanging="360"/>
+      </w:pPr>
+      <w:rPr>
+        <w:rFonts w:ascii="Courier New" w:hAnsi="Courier New" w:cs="Courier New" w:hint="default"/>
+      </w:rPr>
+    </w:lvl>
+    <w:lvl w:ilvl="5" w:tplc="08090005" w:tentative="1">
+      <w:start w:val="1"/>
+      <w:numFmt w:val="bullet"/>
+      <w:lvlText w:val=""/>
+      <w:lvlJc w:val="left"/>
+      <w:pPr>
+        <w:ind w:left="4320" w:hanging="360"/>
+      </w:pPr>
+      <w:rPr>
+        <w:rFonts w:ascii="Wingdings" w:hAnsi="Wingdings" w:hint="default"/>
+      </w:rPr>
+    </w:lvl>
+    <w:lvl w:ilvl="6" w:tplc="08090001" w:tentative="1">
+      <w:start w:val="1"/>
+      <w:numFmt w:val="bullet"/>
+      <w:lvlText w:val=""/>
+      <w:lvlJc w:val="left"/>
+      <w:pPr>
+        <w:ind w:left="5040" w:hanging="360"/>
+      </w:pPr>
+      <w:rPr>
+        <w:rFonts w:ascii="Symbol" w:hAnsi="Symbol" w:hint="default"/>
+      </w:rPr>
+    </w:lvl>
+    <w:lvl w:ilvl="7" w:tplc="08090003" w:tentative="1">
+      <w:start w:val="1"/>
+      <w:numFmt w:val="bullet"/>
+      <w:lvlText w:val="o"/>
+      <w:lvlJc w:val="left"/>
+      <w:pPr>
+        <w:ind w:left="5760" w:hanging="360"/>
+      </w:pPr>
+      <w:rPr>
+        <w:rFonts w:ascii="Courier New" w:hAnsi="Courier New" w:cs="Courier New" w:hint="default"/>
+      </w:rPr>
+    </w:lvl>
+    <w:lvl w:ilvl="8" w:tplc="08090005" w:tentative="1">
+      <w:start w:val="1"/>
+      <w:numFmt w:val="bullet"/>
+      <w:lvlText w:val=""/>
+      <w:lvlJc w:val="left"/>
+      <w:pPr>
+        <w:ind w:left="6480" w:hanging="360"/>
+      </w:pPr>
+      <w:rPr>
+        <w:rFonts w:ascii="Wingdings" w:hAnsi="Wingdings" w:hint="default"/>
+      </w:rPr>
+    </w:lvl>
+  </w:abstractNum>
+  <w:abstractNum w:abstractNumId="6" w15:restartNumberingAfterBreak="0">
     <w:nsid w:val="127B248F"/>
     <w:multiLevelType w:val="multilevel"/>
     <w:tmpl w:val="69F09910"/>
@@ -3031,7 +3883,7 @@
       </w:pPr>
     </w:lvl>
   </w:abstractNum>
-  <w:abstractNum w:abstractNumId="6" w15:restartNumberingAfterBreak="0">
+  <w:abstractNum w:abstractNumId="7" w15:restartNumberingAfterBreak="0">
     <w:nsid w:val="131A0DBD"/>
     <w:multiLevelType w:val="multilevel"/>
     <w:tmpl w:val="7668DF54"/>
@@ -3180,7 +4032,7 @@
       </w:rPr>
     </w:lvl>
   </w:abstractNum>
-  <w:abstractNum w:abstractNumId="7" w15:restartNumberingAfterBreak="0">
+  <w:abstractNum w:abstractNumId="8" w15:restartNumberingAfterBreak="0">
     <w:nsid w:val="15FE68FE"/>
     <w:multiLevelType w:val="multilevel"/>
     <w:tmpl w:val="65F83AEE"/>
@@ -3329,7 +4181,7 @@
       </w:rPr>
     </w:lvl>
   </w:abstractNum>
-  <w:abstractNum w:abstractNumId="8" w15:restartNumberingAfterBreak="0">
+  <w:abstractNum w:abstractNumId="9" w15:restartNumberingAfterBreak="0">
     <w:nsid w:val="17235FE1"/>
     <w:multiLevelType w:val="multilevel"/>
     <w:tmpl w:val="F34AE5A0"/>
@@ -3478,7 +4330,7 @@
       </w:rPr>
     </w:lvl>
   </w:abstractNum>
-  <w:abstractNum w:abstractNumId="9" w15:restartNumberingAfterBreak="0">
+  <w:abstractNum w:abstractNumId="10" w15:restartNumberingAfterBreak="0">
     <w:nsid w:val="1996508A"/>
     <w:multiLevelType w:val="multilevel"/>
     <w:tmpl w:val="F198151A"/>
@@ -3627,7 +4479,7 @@
       </w:rPr>
     </w:lvl>
   </w:abstractNum>
-  <w:abstractNum w:abstractNumId="10" w15:restartNumberingAfterBreak="0">
+  <w:abstractNum w:abstractNumId="11" w15:restartNumberingAfterBreak="0">
     <w:nsid w:val="1A7819A8"/>
     <w:multiLevelType w:val="multilevel"/>
     <w:tmpl w:val="10E466CE"/>
@@ -3776,7 +4628,7 @@
       </w:rPr>
     </w:lvl>
   </w:abstractNum>
-  <w:abstractNum w:abstractNumId="11" w15:restartNumberingAfterBreak="0">
+  <w:abstractNum w:abstractNumId="12" w15:restartNumberingAfterBreak="0">
     <w:nsid w:val="1DE16D1E"/>
     <w:multiLevelType w:val="multilevel"/>
     <w:tmpl w:val="D0AA7ED4"/>
@@ -3925,7 +4777,7 @@
       </w:rPr>
     </w:lvl>
   </w:abstractNum>
-  <w:abstractNum w:abstractNumId="12" w15:restartNumberingAfterBreak="0">
+  <w:abstractNum w:abstractNumId="13" w15:restartNumberingAfterBreak="0">
     <w:nsid w:val="21DA54DB"/>
     <w:multiLevelType w:val="multilevel"/>
     <w:tmpl w:val="2FFAF406"/>
@@ -4074,7 +4926,7 @@
       </w:rPr>
     </w:lvl>
   </w:abstractNum>
-  <w:abstractNum w:abstractNumId="13" w15:restartNumberingAfterBreak="0">
+  <w:abstractNum w:abstractNumId="14" w15:restartNumberingAfterBreak="0">
     <w:nsid w:val="25322051"/>
     <w:multiLevelType w:val="multilevel"/>
     <w:tmpl w:val="E05A99D0"/>
@@ -4223,7 +5075,7 @@
       </w:rPr>
     </w:lvl>
   </w:abstractNum>
-  <w:abstractNum w:abstractNumId="14" w15:restartNumberingAfterBreak="0">
+  <w:abstractNum w:abstractNumId="15" w15:restartNumberingAfterBreak="0">
     <w:nsid w:val="2CA60B07"/>
     <w:multiLevelType w:val="multilevel"/>
     <w:tmpl w:val="85FA6EEA"/>
@@ -4372,7 +5224,7 @@
       </w:rPr>
     </w:lvl>
   </w:abstractNum>
-  <w:abstractNum w:abstractNumId="15" w15:restartNumberingAfterBreak="0">
+  <w:abstractNum w:abstractNumId="16" w15:restartNumberingAfterBreak="0">
     <w:nsid w:val="2DF54639"/>
     <w:multiLevelType w:val="multilevel"/>
     <w:tmpl w:val="51F6A5B8"/>
@@ -4521,7 +5373,7 @@
       </w:rPr>
     </w:lvl>
   </w:abstractNum>
-  <w:abstractNum w:abstractNumId="16" w15:restartNumberingAfterBreak="0">
+  <w:abstractNum w:abstractNumId="17" w15:restartNumberingAfterBreak="0">
     <w:nsid w:val="31640CA4"/>
     <w:multiLevelType w:val="multilevel"/>
     <w:tmpl w:val="6806343C"/>
@@ -4638,7 +5490,7 @@
       </w:pPr>
     </w:lvl>
   </w:abstractNum>
-  <w:abstractNum w:abstractNumId="17" w15:restartNumberingAfterBreak="0">
+  <w:abstractNum w:abstractNumId="18" w15:restartNumberingAfterBreak="0">
     <w:nsid w:val="398F5129"/>
     <w:multiLevelType w:val="multilevel"/>
     <w:tmpl w:val="A322F550"/>
@@ -4787,7 +5639,7 @@
       </w:rPr>
     </w:lvl>
   </w:abstractNum>
-  <w:abstractNum w:abstractNumId="18" w15:restartNumberingAfterBreak="0">
+  <w:abstractNum w:abstractNumId="19" w15:restartNumberingAfterBreak="0">
     <w:nsid w:val="3CAC5FF4"/>
     <w:multiLevelType w:val="multilevel"/>
     <w:tmpl w:val="BFBC23AA"/>
@@ -4936,7 +5788,7 @@
       </w:rPr>
     </w:lvl>
   </w:abstractNum>
-  <w:abstractNum w:abstractNumId="19" w15:restartNumberingAfterBreak="0">
+  <w:abstractNum w:abstractNumId="20" w15:restartNumberingAfterBreak="0">
     <w:nsid w:val="4BE4348C"/>
     <w:multiLevelType w:val="multilevel"/>
     <w:tmpl w:val="1A58024C"/>
@@ -5085,7 +5937,7 @@
       </w:rPr>
     </w:lvl>
   </w:abstractNum>
-  <w:abstractNum w:abstractNumId="20" w15:restartNumberingAfterBreak="0">
+  <w:abstractNum w:abstractNumId="21" w15:restartNumberingAfterBreak="0">
     <w:nsid w:val="4C046A48"/>
     <w:multiLevelType w:val="multilevel"/>
     <w:tmpl w:val="2340BCD6"/>
@@ -5234,7 +6086,7 @@
       </w:rPr>
     </w:lvl>
   </w:abstractNum>
-  <w:abstractNum w:abstractNumId="21" w15:restartNumberingAfterBreak="0">
+  <w:abstractNum w:abstractNumId="22" w15:restartNumberingAfterBreak="0">
     <w:nsid w:val="4D186818"/>
     <w:multiLevelType w:val="multilevel"/>
     <w:tmpl w:val="6A7EED2E"/>
@@ -5383,7 +6235,7 @@
       </w:rPr>
     </w:lvl>
   </w:abstractNum>
-  <w:abstractNum w:abstractNumId="22" w15:restartNumberingAfterBreak="0">
+  <w:abstractNum w:abstractNumId="23" w15:restartNumberingAfterBreak="0">
     <w:nsid w:val="4D7C5B44"/>
     <w:multiLevelType w:val="multilevel"/>
     <w:tmpl w:val="0DFE325A"/>
@@ -5532,7 +6384,7 @@
       </w:rPr>
     </w:lvl>
   </w:abstractNum>
-  <w:abstractNum w:abstractNumId="23" w15:restartNumberingAfterBreak="0">
+  <w:abstractNum w:abstractNumId="24" w15:restartNumberingAfterBreak="0">
     <w:nsid w:val="4E5C6A14"/>
     <w:multiLevelType w:val="multilevel"/>
     <w:tmpl w:val="A24A7FAC"/>
@@ -5681,7 +6533,7 @@
       </w:rPr>
     </w:lvl>
   </w:abstractNum>
-  <w:abstractNum w:abstractNumId="24" w15:restartNumberingAfterBreak="0">
+  <w:abstractNum w:abstractNumId="25" w15:restartNumberingAfterBreak="0">
     <w:nsid w:val="538273CB"/>
     <w:multiLevelType w:val="multilevel"/>
     <w:tmpl w:val="0C66EB3A"/>
@@ -5830,7 +6682,7 @@
       </w:rPr>
     </w:lvl>
   </w:abstractNum>
-  <w:abstractNum w:abstractNumId="25" w15:restartNumberingAfterBreak="0">
+  <w:abstractNum w:abstractNumId="26" w15:restartNumberingAfterBreak="0">
     <w:nsid w:val="5AAF3F94"/>
     <w:multiLevelType w:val="multilevel"/>
     <w:tmpl w:val="A9F486C6"/>
@@ -5979,7 +6831,7 @@
       </w:rPr>
     </w:lvl>
   </w:abstractNum>
-  <w:abstractNum w:abstractNumId="26" w15:restartNumberingAfterBreak="0">
+  <w:abstractNum w:abstractNumId="27" w15:restartNumberingAfterBreak="0">
     <w:nsid w:val="60BB2048"/>
     <w:multiLevelType w:val="multilevel"/>
     <w:tmpl w:val="3DAC4EA6"/>
@@ -6128,7 +6980,7 @@
       </w:rPr>
     </w:lvl>
   </w:abstractNum>
-  <w:abstractNum w:abstractNumId="27" w15:restartNumberingAfterBreak="0">
+  <w:abstractNum w:abstractNumId="28" w15:restartNumberingAfterBreak="0">
     <w:nsid w:val="62A77596"/>
     <w:multiLevelType w:val="multilevel"/>
     <w:tmpl w:val="A1F830BA"/>
@@ -6277,7 +7129,7 @@
       </w:rPr>
     </w:lvl>
   </w:abstractNum>
-  <w:abstractNum w:abstractNumId="28" w15:restartNumberingAfterBreak="0">
+  <w:abstractNum w:abstractNumId="29" w15:restartNumberingAfterBreak="0">
     <w:nsid w:val="64206F26"/>
     <w:multiLevelType w:val="multilevel"/>
     <w:tmpl w:val="84B80140"/>
@@ -6426,7 +7278,7 @@
       </w:rPr>
     </w:lvl>
   </w:abstractNum>
-  <w:abstractNum w:abstractNumId="29" w15:restartNumberingAfterBreak="0">
+  <w:abstractNum w:abstractNumId="30" w15:restartNumberingAfterBreak="0">
     <w:nsid w:val="66825D90"/>
     <w:multiLevelType w:val="multilevel"/>
     <w:tmpl w:val="5E8C9D9E"/>
@@ -6575,7 +7427,7 @@
       </w:rPr>
     </w:lvl>
   </w:abstractNum>
-  <w:abstractNum w:abstractNumId="30" w15:restartNumberingAfterBreak="0">
+  <w:abstractNum w:abstractNumId="31" w15:restartNumberingAfterBreak="0">
     <w:nsid w:val="675155B1"/>
     <w:multiLevelType w:val="multilevel"/>
     <w:tmpl w:val="76A07240"/>
@@ -6724,7 +7576,7 @@
       </w:rPr>
     </w:lvl>
   </w:abstractNum>
-  <w:abstractNum w:abstractNumId="31" w15:restartNumberingAfterBreak="0">
+  <w:abstractNum w:abstractNumId="32" w15:restartNumberingAfterBreak="0">
     <w:nsid w:val="6A7F58A7"/>
     <w:multiLevelType w:val="multilevel"/>
     <w:tmpl w:val="7A101704"/>
@@ -6873,7 +7725,7 @@
       </w:rPr>
     </w:lvl>
   </w:abstractNum>
-  <w:abstractNum w:abstractNumId="32" w15:restartNumberingAfterBreak="0">
+  <w:abstractNum w:abstractNumId="33" w15:restartNumberingAfterBreak="0">
     <w:nsid w:val="6C152091"/>
     <w:multiLevelType w:val="multilevel"/>
     <w:tmpl w:val="1692526E"/>
@@ -7022,7 +7874,7 @@
       </w:rPr>
     </w:lvl>
   </w:abstractNum>
-  <w:abstractNum w:abstractNumId="33" w15:restartNumberingAfterBreak="0">
+  <w:abstractNum w:abstractNumId="34" w15:restartNumberingAfterBreak="0">
     <w:nsid w:val="74F83019"/>
     <w:multiLevelType w:val="multilevel"/>
     <w:tmpl w:val="EF12228E"/>
@@ -7171,10 +8023,10 @@
       </w:rPr>
     </w:lvl>
   </w:abstractNum>
-  <w:abstractNum w:abstractNumId="34" w15:restartNumberingAfterBreak="0">
+  <w:abstractNum w:abstractNumId="35" w15:restartNumberingAfterBreak="0">
     <w:nsid w:val="7D8650C9"/>
     <w:multiLevelType w:val="multilevel"/>
-    <w:tmpl w:val="F45C2820"/>
+    <w:tmpl w:val="3FDC4EFE"/>
     <w:lvl w:ilvl="0">
       <w:start w:val="1"/>
       <w:numFmt w:val="bullet"/>
@@ -7207,20 +8059,15 @@
         <w:sz w:val="20"/>
       </w:rPr>
     </w:lvl>
-    <w:lvl w:ilvl="2" w:tentative="1">
-      <w:start w:val="1"/>
-      <w:numFmt w:val="bullet"/>
-      <w:lvlText w:val=""/>
-      <w:lvlJc w:val="left"/>
-      <w:pPr>
-        <w:tabs>
-          <w:tab w:val="num" w:pos="2160"/>
-        </w:tabs>
+    <w:lvl w:ilvl="2">
+      <w:numFmt w:val="bullet"/>
+      <w:lvlText w:val="-"/>
+      <w:lvlJc w:val="left"/>
+      <w:pPr>
         <w:ind w:left="2160" w:hanging="360"/>
       </w:pPr>
       <w:rPr>
-        <w:rFonts w:ascii="Wingdings" w:hAnsi="Wingdings" w:hint="default"/>
-        <w:sz w:val="20"/>
+        <w:rFonts w:ascii="Calibri" w:eastAsiaTheme="minorHAnsi" w:hAnsi="Calibri" w:cs="Calibri" w:hint="default"/>
       </w:rPr>
     </w:lvl>
     <w:lvl w:ilvl="3" w:tentative="1">
@@ -7324,106 +8171,109 @@
     <w:abstractNumId w:val="4"/>
   </w:num>
   <w:num w:numId="2" w16cid:durableId="1175145623">
-    <w:abstractNumId w:val="5"/>
+    <w:abstractNumId w:val="6"/>
   </w:num>
   <w:num w:numId="3" w16cid:durableId="214586865">
-    <w:abstractNumId w:val="6"/>
+    <w:abstractNumId w:val="7"/>
   </w:num>
   <w:num w:numId="4" w16cid:durableId="1604999293">
-    <w:abstractNumId w:val="21"/>
+    <w:abstractNumId w:val="22"/>
   </w:num>
   <w:num w:numId="5" w16cid:durableId="2005010433">
-    <w:abstractNumId w:val="33"/>
+    <w:abstractNumId w:val="34"/>
   </w:num>
   <w:num w:numId="6" w16cid:durableId="2015913491">
-    <w:abstractNumId w:val="8"/>
+    <w:abstractNumId w:val="9"/>
   </w:num>
   <w:num w:numId="7" w16cid:durableId="2005282243">
-    <w:abstractNumId w:val="15"/>
+    <w:abstractNumId w:val="16"/>
   </w:num>
   <w:num w:numId="8" w16cid:durableId="1782459442">
-    <w:abstractNumId w:val="24"/>
+    <w:abstractNumId w:val="25"/>
   </w:num>
   <w:num w:numId="9" w16cid:durableId="29652177">
     <w:abstractNumId w:val="2"/>
   </w:num>
   <w:num w:numId="10" w16cid:durableId="5983952">
-    <w:abstractNumId w:val="22"/>
+    <w:abstractNumId w:val="23"/>
   </w:num>
   <w:num w:numId="11" w16cid:durableId="1385524487">
-    <w:abstractNumId w:val="18"/>
+    <w:abstractNumId w:val="19"/>
   </w:num>
   <w:num w:numId="12" w16cid:durableId="881791777">
+    <w:abstractNumId w:val="32"/>
+  </w:num>
+  <w:num w:numId="13" w16cid:durableId="616062957">
+    <w:abstractNumId w:val="11"/>
+  </w:num>
+  <w:num w:numId="14" w16cid:durableId="1599679862">
+    <w:abstractNumId w:val="28"/>
+  </w:num>
+  <w:num w:numId="15" w16cid:durableId="1203782223">
     <w:abstractNumId w:val="31"/>
   </w:num>
-  <w:num w:numId="13" w16cid:durableId="616062957">
+  <w:num w:numId="16" w16cid:durableId="1910339401">
     <w:abstractNumId w:val="10"/>
-  </w:num>
-  <w:num w:numId="14" w16cid:durableId="1599679862">
-    <w:abstractNumId w:val="27"/>
-  </w:num>
-  <w:num w:numId="15" w16cid:durableId="1203782223">
-    <w:abstractNumId w:val="30"/>
-  </w:num>
-  <w:num w:numId="16" w16cid:durableId="1910339401">
-    <w:abstractNumId w:val="9"/>
   </w:num>
   <w:num w:numId="17" w16cid:durableId="79716557">
     <w:abstractNumId w:val="0"/>
   </w:num>
   <w:num w:numId="18" w16cid:durableId="1340543577">
-    <w:abstractNumId w:val="32"/>
+    <w:abstractNumId w:val="33"/>
   </w:num>
   <w:num w:numId="19" w16cid:durableId="1861702556">
     <w:abstractNumId w:val="1"/>
   </w:num>
   <w:num w:numId="20" w16cid:durableId="913048856">
-    <w:abstractNumId w:val="23"/>
+    <w:abstractNumId w:val="24"/>
   </w:num>
   <w:num w:numId="21" w16cid:durableId="613368900">
-    <w:abstractNumId w:val="7"/>
+    <w:abstractNumId w:val="8"/>
   </w:num>
   <w:num w:numId="22" w16cid:durableId="760225088">
-    <w:abstractNumId w:val="16"/>
+    <w:abstractNumId w:val="17"/>
   </w:num>
   <w:num w:numId="23" w16cid:durableId="747772899">
-    <w:abstractNumId w:val="28"/>
+    <w:abstractNumId w:val="29"/>
   </w:num>
   <w:num w:numId="24" w16cid:durableId="1330063747">
-    <w:abstractNumId w:val="34"/>
+    <w:abstractNumId w:val="35"/>
   </w:num>
   <w:num w:numId="25" w16cid:durableId="1728644347">
+    <w:abstractNumId w:val="21"/>
+  </w:num>
+  <w:num w:numId="26" w16cid:durableId="721557330">
     <w:abstractNumId w:val="20"/>
   </w:num>
-  <w:num w:numId="26" w16cid:durableId="721557330">
-    <w:abstractNumId w:val="19"/>
-  </w:num>
   <w:num w:numId="27" w16cid:durableId="1611934106">
-    <w:abstractNumId w:val="25"/>
+    <w:abstractNumId w:val="26"/>
   </w:num>
   <w:num w:numId="28" w16cid:durableId="1091008212">
-    <w:abstractNumId w:val="17"/>
+    <w:abstractNumId w:val="18"/>
   </w:num>
   <w:num w:numId="29" w16cid:durableId="372000044">
-    <w:abstractNumId w:val="29"/>
+    <w:abstractNumId w:val="30"/>
   </w:num>
   <w:num w:numId="30" w16cid:durableId="1429884695">
-    <w:abstractNumId w:val="26"/>
+    <w:abstractNumId w:val="27"/>
   </w:num>
   <w:num w:numId="31" w16cid:durableId="112595949">
-    <w:abstractNumId w:val="11"/>
+    <w:abstractNumId w:val="12"/>
   </w:num>
   <w:num w:numId="32" w16cid:durableId="386999035">
-    <w:abstractNumId w:val="12"/>
+    <w:abstractNumId w:val="13"/>
   </w:num>
   <w:num w:numId="33" w16cid:durableId="954100688">
-    <w:abstractNumId w:val="14"/>
+    <w:abstractNumId w:val="15"/>
   </w:num>
   <w:num w:numId="34" w16cid:durableId="462774312">
-    <w:abstractNumId w:val="13"/>
+    <w:abstractNumId w:val="14"/>
   </w:num>
   <w:num w:numId="35" w16cid:durableId="1988198018">
     <w:abstractNumId w:val="3"/>
+  </w:num>
+  <w:num w:numId="36" w16cid:durableId="1029141334">
+    <w:abstractNumId w:val="5"/>
   </w:num>
 </w:numbering>
 </file>
@@ -8030,6 +8880,7 @@
   <w:style w:type="character" w:default="1" w:styleId="DefaultParagraphFont">
     <w:name w:val="Default Paragraph Font"/>
     <w:uiPriority w:val="1"/>
+    <w:semiHidden/>
     <w:unhideWhenUsed/>
   </w:style>
   <w:style w:type="table" w:default="1" w:styleId="TableNormal">

</xml_diff>

<commit_message>
0.0.3 - MVP1 -  Batch 3: Pop movement, camp placeholder, and RTS controls
- Added Pop class (units.js) with delta-time movement and state machine.
- Added visual camp placeholder at (100,100) with 'CAMP' label.
- Implemented RTS-style controls: left-click selects pop, right-click moves.
- Selected pop shows yellow ring; destination marker with line.
- Shift+left-click inspects cell forage density (debug).
- Disabled browser context menu on canvas.
- Updated TECHNICAL.md: delta-time rule (5.5), code explanation requirement (5.6.4).
</commit_message>
<xml_diff>
--- a/Docs/Prototipo 1.docx
+++ b/Docs/Prototipo 1.docx
@@ -1510,7 +1510,7 @@
         <w:rPr>
           <w:lang w:val="it-IT"/>
         </w:rPr>
-        <w:t>Il giocatore può cliccare sull'accampamento per ordinare al pop di tornare e scaricare il cibo raccolto.</w:t>
+        <w:t>Il giocatore può selezionare il numero di abitanti (in base a quelli disponibili nell’accampamento) da mandare a raccogliere una specifica risorsa</w:t>
       </w:r>
     </w:p>
     <w:p>
@@ -1527,7 +1527,13 @@
         <w:rPr>
           <w:lang w:val="it-IT"/>
         </w:rPr>
-        <w:t>Un contatore globale mostra le scorte di cibo della tribù.</w:t>
+        <w:t>Il giocatore può cliccare sull'accampamento per ordinare al pop di tornare e scaricare il cibo raccolto.</w:t>
+      </w:r>
+      <w:r>
+        <w:rPr>
+          <w:lang w:val="it-IT"/>
+        </w:rPr>
+        <w:t xml:space="preserve"> Tendenzialmente però i pop fanno avanti e indietro in automatico</w:t>
       </w:r>
     </w:p>
     <w:p>
@@ -1544,7 +1550,7 @@
         <w:rPr>
           <w:lang w:val="it-IT"/>
         </w:rPr>
-        <w:t>Introduzione del consumo: ogni giorno di gioco (intervallo configurabile) una quantità di cibo viene sottratta dalle scorte in base al numero di pop presenti.</w:t>
+        <w:t>Un contatore globale mostra le scorte di cibo della tribù.</w:t>
       </w:r>
     </w:p>
     <w:p>
@@ -1561,7 +1567,7 @@
         <w:rPr>
           <w:lang w:val="it-IT"/>
         </w:rPr>
-        <w:t>Se le scorte arrivano a zero, per ora viene mostrato un avviso; in futuro comporterà la morte dei pop.</w:t>
+        <w:t>Introduzione del consumo: ogni giorno di gioco (intervallo configurabile) una quantità di cibo viene sottratta dalle scorte in base al numero di pop presenti.</w:t>
       </w:r>
     </w:p>
     <w:p>
@@ -1578,6 +1584,23 @@
         <w:rPr>
           <w:lang w:val="it-IT"/>
         </w:rPr>
+        <w:t>Se le scorte arrivano a zero, per ora viene mostrato un avviso; in futuro comporterà la morte dei pop.</w:t>
+      </w:r>
+    </w:p>
+    <w:p>
+      <w:pPr>
+        <w:numPr>
+          <w:ilvl w:val="0"/>
+          <w:numId w:val="27"/>
+        </w:numPr>
+        <w:rPr>
+          <w:lang w:val="it-IT"/>
+        </w:rPr>
+      </w:pPr>
+      <w:r>
+        <w:rPr>
+          <w:lang w:val="it-IT"/>
+        </w:rPr>
         <w:t>Meccanica: il giocatore deve bilanciare la raccolta con il consumo costante. Non basta accumulare, bisogna mantenere un flusso positivo. Il ritorno al campo diventa una decisione strategica: tornare troppo presto spreca tempo di viaggio, tornare troppo tardi rischia di far esaurire le scorte.</w:t>
       </w:r>
     </w:p>
@@ -1830,6 +1853,7 @@
         <w:rPr>
           <w:lang w:val="it-IT"/>
         </w:rPr>
+        <w:lastRenderedPageBreak/>
         <w:t>Meccanica: il giocatore non può esaurire una zona per sempre, ma deve ruotare le aree di raccolta per non restare senza cibo. Questo introduce una prima forma di gestione sostenibile delle risorse.</w:t>
       </w:r>
     </w:p>
@@ -1847,7 +1871,6 @@
           <w:bCs/>
           <w:lang w:val="it-IT"/>
         </w:rPr>
-        <w:lastRenderedPageBreak/>
         <w:t>Dopo il Batch 7</w:t>
       </w:r>
       <w:r>
@@ -2035,6 +2058,26 @@
         </w:rPr>
         <w:t>Non abbiamo minimamente lavorato sulla tipologia del terreno (montagna, acqua, acqua profonda, collina, pianura) e le caratteristiche di esso (foresta, erba ecc.). Questo perché sulla base del tipo di terreno poi dipende il cibo (la pesca è solo nelle acque, le aree di pianura con erba vicino ai fiumi hanno più cibo ecc.). Da forse vedere subito dopo MVP1?</w:t>
       </w:r>
+      <w:r>
+        <w:rPr>
+          <w:lang w:val="it-IT"/>
+        </w:rPr>
+        <w:t xml:space="preserve"> Implementiamo già diversi </w:t>
+      </w:r>
+      <w:proofErr w:type="spellStart"/>
+      <w:r>
+        <w:rPr>
+          <w:lang w:val="it-IT"/>
+        </w:rPr>
+        <w:t>layer</w:t>
+      </w:r>
+      <w:proofErr w:type="spellEnd"/>
+      <w:r>
+        <w:rPr>
+          <w:lang w:val="it-IT"/>
+        </w:rPr>
+        <w:t xml:space="preserve"> di visualizzazione (terreno, cibo, risorse varie ecc.)?</w:t>
+      </w:r>
     </w:p>
     <w:p>
       <w:pPr>
@@ -2179,6 +2222,7 @@
         <w:rPr>
           <w:lang w:val="it-IT"/>
         </w:rPr>
+        <w:lastRenderedPageBreak/>
         <w:t>L'interfaccia mostra le nuove risorse (carne, pesce) accanto al cibo vegetale. Per ora tutte valgono come "cibo", ma vengono registrate separatamente per usi futuri.</w:t>
       </w:r>
     </w:p>
@@ -2211,7 +2255,6 @@
           <w:bCs/>
           <w:lang w:val="it-IT"/>
         </w:rPr>
-        <w:lastRenderedPageBreak/>
         <w:t xml:space="preserve">MVP3 – Raccolta legna, lavorazione e </w:t>
       </w:r>
       <w:r>
@@ -2626,6 +2669,7 @@
         <w:rPr>
           <w:lang w:val="it-IT"/>
         </w:rPr>
+        <w:lastRenderedPageBreak/>
         <w:t>Barra del tempo (velocità 1x, 2x, pausa).</w:t>
       </w:r>
     </w:p>
@@ -2701,7 +2745,6 @@
         <w:rPr>
           <w:lang w:val="it-IT"/>
         </w:rPr>
-        <w:lastRenderedPageBreak/>
         <w:t>Da report (lampeggiante o con indicatore "R") quando arriva un messaggio.</w:t>
       </w:r>
     </w:p>

</xml_diff>

<commit_message>
0.0.5 - Camp, unified inventory, and autonomous expedition cycle
- Added Camp entity with food stock, unassigned population, and specialized Pops.
- Implemented autonomous expedition cycle: travel, gathering, return, rest, repeat.
- Unified inventory: provisions and food share max capacity (workers * 2).
- Added cell switching based on density/distance score (threshold 10%).
- Balanced gathering rate (0.5/worker/s) and density reduction (0.005/food).
- Added camp selection highlight and expedition info panel.
- Right-click on selected expedition now updates its target area.
- Press R to manually recall selected expedition.
- Updated TECHNICAL.md with detailed block explanation guideline.
</commit_message>
<xml_diff>
--- a/Docs/Prototipo 1.docx
+++ b/Docs/Prototipo 1.docx
@@ -1527,13 +1527,7 @@
         <w:rPr>
           <w:lang w:val="it-IT"/>
         </w:rPr>
-        <w:t>Il giocatore può cliccare sull'accampamento per ordinare al pop di tornare e scaricare il cibo raccolto.</w:t>
-      </w:r>
-      <w:r>
-        <w:rPr>
-          <w:lang w:val="it-IT"/>
-        </w:rPr>
-        <w:t xml:space="preserve"> Tendenzialmente però i pop fanno avanti e indietro in automatico</w:t>
+        <w:t>Un contatore globale mostra le scorte di cibo della tribù.</w:t>
       </w:r>
     </w:p>
     <w:p>
@@ -1550,7 +1544,63 @@
         <w:rPr>
           <w:lang w:val="it-IT"/>
         </w:rPr>
-        <w:t>Un contatore globale mostra le scorte di cibo della tribù.</w:t>
+        <w:t>Introduzione del consumo:</w:t>
+      </w:r>
+      <w:r>
+        <w:rPr>
+          <w:lang w:val="it-IT"/>
+        </w:rPr>
+        <w:t xml:space="preserve"> Ogni giorno di gioco, una quantità di cibo viene consumata dalle scorte in base alla popolazione totale (campo + spedizioni).</w:t>
+      </w:r>
+    </w:p>
+    <w:p>
+      <w:pPr>
+        <w:pStyle w:val="ListParagraph"/>
+        <w:numPr>
+          <w:ilvl w:val="0"/>
+          <w:numId w:val="24"/>
+        </w:numPr>
+        <w:rPr>
+          <w:lang w:val="it-IT" w:eastAsia="en-GB"/>
+        </w:rPr>
+      </w:pPr>
+      <w:r>
+        <w:rPr>
+          <w:lang w:val="it-IT" w:eastAsia="en-GB"/>
+        </w:rPr>
+        <w:t>Quando l'inventario è pieno o le provviste sono insufficienti per il ritorno, la spedizione torna automaticamente al campo, deposita il cibo nelle scorte globali, e i lavoratori rientrano nel Pop.</w:t>
+      </w:r>
+    </w:p>
+    <w:p>
+      <w:pPr>
+        <w:pStyle w:val="ListParagraph"/>
+        <w:numPr>
+          <w:ilvl w:val="0"/>
+          <w:numId w:val="24"/>
+        </w:numPr>
+        <w:rPr>
+          <w:lang w:val="it-IT" w:eastAsia="en-GB"/>
+        </w:rPr>
+      </w:pPr>
+      <w:r>
+        <w:rPr>
+          <w:lang w:val="it-IT" w:eastAsia="en-GB"/>
+        </w:rPr>
+        <w:t xml:space="preserve">Dopo un breve </w:t>
+      </w:r>
+      <w:proofErr w:type="spellStart"/>
+      <w:r>
+        <w:rPr>
+          <w:lang w:val="it-IT" w:eastAsia="en-GB"/>
+        </w:rPr>
+        <w:t>cooldown</w:t>
+      </w:r>
+      <w:proofErr w:type="spellEnd"/>
+      <w:r>
+        <w:rPr>
+          <w:lang w:val="it-IT" w:eastAsia="en-GB"/>
+        </w:rPr>
+        <w:t>, la spedizione riparte automaticamente verso la stessa area, se ci sono ancora lavoratori disponibili.</w:t>
       </w:r>
     </w:p>
     <w:p>
@@ -1567,7 +1617,7 @@
         <w:rPr>
           <w:lang w:val="it-IT"/>
         </w:rPr>
-        <w:t>Introduzione del consumo: ogni giorno di gioco (intervallo configurabile) una quantità di cibo viene sottratta dalle scorte in base al numero di pop presenti.</w:t>
+        <w:t>Se le scorte arrivano a zero, per ora viene mostrato un avviso; in futuro comporterà la morte dei pop.</w:t>
       </w:r>
     </w:p>
     <w:p>
@@ -1584,23 +1634,6 @@
         <w:rPr>
           <w:lang w:val="it-IT"/>
         </w:rPr>
-        <w:t>Se le scorte arrivano a zero, per ora viene mostrato un avviso; in futuro comporterà la morte dei pop.</w:t>
-      </w:r>
-    </w:p>
-    <w:p>
-      <w:pPr>
-        <w:numPr>
-          <w:ilvl w:val="0"/>
-          <w:numId w:val="27"/>
-        </w:numPr>
-        <w:rPr>
-          <w:lang w:val="it-IT"/>
-        </w:rPr>
-      </w:pPr>
-      <w:r>
-        <w:rPr>
-          <w:lang w:val="it-IT"/>
-        </w:rPr>
         <w:t>Meccanica: il giocatore deve bilanciare la raccolta con il consumo costante. Non basta accumulare, bisogna mantenere un flusso positivo. Il ritorno al campo diventa una decisione strategica: tornare troppo presto spreca tempo di viaggio, tornare troppo tardi rischia di far esaurire le scorte.</w:t>
       </w:r>
     </w:p>
@@ -1623,156 +1656,431 @@
     </w:p>
     <w:p>
       <w:pPr>
+        <w:pStyle w:val="ListParagraph"/>
         <w:numPr>
           <w:ilvl w:val="0"/>
-          <w:numId w:val="28"/>
-        </w:numPr>
-        <w:rPr>
-          <w:lang w:val="it-IT"/>
-        </w:rPr>
-      </w:pPr>
-      <w:r>
-        <w:rPr>
-          <w:lang w:val="it-IT"/>
+          <w:numId w:val="24"/>
+        </w:numPr>
+        <w:rPr>
+          <w:lang w:val="it-IT" w:eastAsia="en-GB"/>
+        </w:rPr>
+      </w:pPr>
+      <w:r>
+        <w:rPr>
+          <w:lang w:val="it-IT" w:eastAsia="en-GB"/>
         </w:rPr>
         <w:t xml:space="preserve">Implementazione del </w:t>
       </w:r>
       <w:proofErr w:type="spellStart"/>
       <w:r>
-        <w:rPr>
-          <w:lang w:val="it-IT"/>
-        </w:rPr>
-        <w:t>TimeManager</w:t>
-      </w:r>
-      <w:proofErr w:type="spellEnd"/>
-      <w:r>
-        <w:rPr>
-          <w:lang w:val="it-IT"/>
-        </w:rPr>
-        <w:t xml:space="preserve"> (time.js).</w:t>
-      </w:r>
-    </w:p>
-    <w:p>
-      <w:pPr>
-        <w:numPr>
-          <w:ilvl w:val="0"/>
-          <w:numId w:val="28"/>
-        </w:numPr>
-        <w:rPr>
-          <w:lang w:val="it-IT"/>
-        </w:rPr>
-      </w:pPr>
-      <w:r>
-        <w:rPr>
-          <w:lang w:val="it-IT"/>
-        </w:rPr>
-        <w:t>Tre velocità di simulazione: 1x (normale), 2x (accelerata), 0x (pausa).</w:t>
-      </w:r>
-    </w:p>
-    <w:p>
-      <w:pPr>
-        <w:numPr>
-          <w:ilvl w:val="0"/>
-          <w:numId w:val="28"/>
-        </w:numPr>
-        <w:rPr>
-          <w:lang w:val="it-IT"/>
-        </w:rPr>
-      </w:pPr>
-      <w:r>
-        <w:rPr>
-          <w:lang w:val="it-IT"/>
-        </w:rPr>
-        <w:t>Interfaccia minima: pulsanti o tasti per cambiare velocità.</w:t>
-      </w:r>
-    </w:p>
-    <w:p>
-      <w:pPr>
-        <w:numPr>
-          <w:ilvl w:val="0"/>
-          <w:numId w:val="28"/>
-        </w:numPr>
-        <w:rPr>
-          <w:lang w:val="it-IT"/>
-        </w:rPr>
-      </w:pPr>
-      <w:r>
-        <w:rPr>
-          <w:lang w:val="it-IT"/>
-        </w:rPr>
-        <w:t xml:space="preserve">La raccolta, il movimento e il consumo dipendono dal tempo di gioco effettivo, non dal </w:t>
-      </w:r>
-      <w:proofErr w:type="spellStart"/>
-      <w:r>
-        <w:rPr>
-          <w:lang w:val="it-IT"/>
-        </w:rPr>
-        <w:t>framerate</w:t>
-      </w:r>
-      <w:proofErr w:type="spellEnd"/>
-      <w:r>
-        <w:rPr>
-          <w:lang w:val="it-IT"/>
-        </w:rPr>
-        <w:t>.</w:t>
-      </w:r>
-    </w:p>
-    <w:p>
-      <w:pPr>
-        <w:numPr>
-          <w:ilvl w:val="0"/>
-          <w:numId w:val="28"/>
-        </w:numPr>
-        <w:rPr>
-          <w:lang w:val="it-IT"/>
-        </w:rPr>
-      </w:pPr>
-      <w:r>
-        <w:rPr>
-          <w:lang w:val="it-IT"/>
-        </w:rPr>
-        <w:t>Meccanica: il giocatore può mettere in pausa per pianificare con calma, o accelerare quando non ci sono decisioni urgenti. Questo è il primo passo verso il pilastro "tempo reale con controllo del ritmo".</w:t>
-      </w:r>
-    </w:p>
-    <w:p>
-      <w:pPr>
         <w:rPr>
           <w:b/>
           <w:bCs/>
+          <w:lang w:val="it-IT" w:eastAsia="en-GB"/>
+        </w:rPr>
+        <w:t>TimeManager</w:t>
+      </w:r>
+      <w:proofErr w:type="spellEnd"/>
+      <w:r>
+        <w:rPr>
+          <w:lang w:val="it-IT" w:eastAsia="en-GB"/>
+        </w:rPr>
+        <w:t xml:space="preserve"> (time.js): tre velocità di simulazione (1x, 2x, pausa). La raccolta, il movimento, il consumo e la rigenerazione dipendono dal tempo di gioco effettivo.</w:t>
+      </w:r>
+    </w:p>
+    <w:p>
+      <w:pPr>
+        <w:pStyle w:val="ListParagraph"/>
+        <w:numPr>
+          <w:ilvl w:val="0"/>
+          <w:numId w:val="24"/>
+        </w:numPr>
+        <w:rPr>
+          <w:lang w:val="it-IT" w:eastAsia="en-GB"/>
+        </w:rPr>
+      </w:pPr>
+      <w:r>
+        <w:rPr>
+          <w:lang w:val="it-IT" w:eastAsia="en-GB"/>
+        </w:rPr>
+        <w:t>Interfaccia minima per i controlli del tempo: pulsanti UI o tasti rapidi (es. spazio per pausa, +/- per velocità).</w:t>
+      </w:r>
+    </w:p>
+    <w:p>
+      <w:pPr>
+        <w:pStyle w:val="ListParagraph"/>
+        <w:numPr>
+          <w:ilvl w:val="0"/>
+          <w:numId w:val="24"/>
+        </w:numPr>
+        <w:rPr>
+          <w:lang w:val="it-IT" w:eastAsia="en-GB"/>
         </w:rPr>
       </w:pPr>
       <w:r>
         <w:rPr>
           <w:b/>
           <w:bCs/>
-        </w:rPr>
-        <w:t xml:space="preserve">Batch 7 – </w:t>
+          <w:lang w:val="it-IT" w:eastAsia="en-GB"/>
+        </w:rPr>
+        <w:t>Pannello di debug</w:t>
+      </w:r>
+      <w:r>
+        <w:rPr>
+          <w:lang w:val="it-IT" w:eastAsia="en-GB"/>
+        </w:rPr>
+        <w:t xml:space="preserve"> (rudimentale, via UI o console):</w:t>
+      </w:r>
+    </w:p>
+    <w:p>
+      <w:pPr>
+        <w:pStyle w:val="ListParagraph"/>
+        <w:numPr>
+          <w:ilvl w:val="1"/>
+          <w:numId w:val="24"/>
+        </w:numPr>
+        <w:rPr>
+          <w:lang w:val="it-IT" w:eastAsia="en-GB"/>
+        </w:rPr>
+      </w:pPr>
+      <w:r>
+        <w:rPr>
+          <w:lang w:val="it-IT" w:eastAsia="en-GB"/>
+        </w:rPr>
+        <w:t xml:space="preserve">Visualizzare e modificare in tempo reale le variabili chiave: tasso di consumo cibo, velocità raccolta, soglia di abbandono, </w:t>
       </w:r>
       <w:proofErr w:type="spellStart"/>
+      <w:r>
+        <w:rPr>
+          <w:lang w:val="it-IT" w:eastAsia="en-GB"/>
+        </w:rPr>
+        <w:t>cooldown</w:t>
+      </w:r>
+      <w:proofErr w:type="spellEnd"/>
+      <w:r>
+        <w:rPr>
+          <w:lang w:val="it-IT" w:eastAsia="en-GB"/>
+        </w:rPr>
+        <w:t xml:space="preserve"> riposo spedizioni, raggio di raccolta.</w:t>
+      </w:r>
+    </w:p>
+    <w:p>
+      <w:pPr>
+        <w:pStyle w:val="ListParagraph"/>
+        <w:numPr>
+          <w:ilvl w:val="1"/>
+          <w:numId w:val="24"/>
+        </w:numPr>
+        <w:rPr>
+          <w:lang w:val="it-IT" w:eastAsia="en-GB"/>
+        </w:rPr>
+      </w:pPr>
+      <w:r>
+        <w:rPr>
+          <w:lang w:val="it-IT" w:eastAsia="en-GB"/>
+        </w:rPr>
+        <w:t>Modificare anche le scorte di cibo e la popolazione per test rapidi.</w:t>
+      </w:r>
+    </w:p>
+    <w:p>
+      <w:pPr>
+        <w:pStyle w:val="ListParagraph"/>
+        <w:numPr>
+          <w:ilvl w:val="1"/>
+          <w:numId w:val="24"/>
+        </w:numPr>
+        <w:rPr>
+          <w:lang w:val="it-IT" w:eastAsia="en-GB"/>
+        </w:rPr>
+      </w:pPr>
+      <w:r>
+        <w:rPr>
+          <w:lang w:val="it-IT" w:eastAsia="en-GB"/>
+        </w:rPr>
+        <w:t>Rendere dinamiche queste variabili nel codice, in modo da poi andarle a cambiare solo in un punto</w:t>
+      </w:r>
+    </w:p>
+    <w:p>
+      <w:pPr>
+        <w:pStyle w:val="ListParagraph"/>
+        <w:numPr>
+          <w:ilvl w:val="0"/>
+          <w:numId w:val="24"/>
+        </w:numPr>
+        <w:rPr>
+          <w:lang w:val="it-IT" w:eastAsia="en-GB"/>
+        </w:rPr>
+      </w:pPr>
       <w:r>
         <w:rPr>
           <w:b/>
           <w:bCs/>
-        </w:rPr>
-        <w:t>Rigenerazione</w:t>
-      </w:r>
-      <w:proofErr w:type="spellEnd"/>
+          <w:lang w:val="it-IT" w:eastAsia="en-GB"/>
+        </w:rPr>
+        <w:t>Selezione e ispezione delle spedizioni:</w:t>
+      </w:r>
+    </w:p>
+    <w:p>
+      <w:pPr>
+        <w:pStyle w:val="ListParagraph"/>
+        <w:numPr>
+          <w:ilvl w:val="1"/>
+          <w:numId w:val="24"/>
+        </w:numPr>
+        <w:rPr>
+          <w:lang w:val="it-IT" w:eastAsia="en-GB"/>
+        </w:rPr>
+      </w:pPr>
+      <w:r>
+        <w:rPr>
+          <w:lang w:val="it-IT" w:eastAsia="en-GB"/>
+        </w:rPr>
+        <w:t>Click sinistro su una spedizione attiva (cerchio bianco sulla mappa) per selezionarla.</w:t>
+      </w:r>
+    </w:p>
+    <w:p>
+      <w:pPr>
+        <w:pStyle w:val="ListParagraph"/>
+        <w:numPr>
+          <w:ilvl w:val="1"/>
+          <w:numId w:val="24"/>
+        </w:numPr>
+        <w:rPr>
+          <w:lang w:val="it-IT" w:eastAsia="en-GB"/>
+        </w:rPr>
+      </w:pPr>
+      <w:r>
+        <w:rPr>
+          <w:lang w:val="it-IT" w:eastAsia="en-GB"/>
+        </w:rPr>
+        <w:t>Visualizzazione delle informazioni base: numero lavoratori, provviste, inventario, stato, area di raccolta.</w:t>
+      </w:r>
+    </w:p>
+    <w:p>
+      <w:pPr>
+        <w:pStyle w:val="ListParagraph"/>
+        <w:numPr>
+          <w:ilvl w:val="1"/>
+          <w:numId w:val="24"/>
+        </w:numPr>
+        <w:rPr>
+          <w:lang w:val="it-IT" w:eastAsia="en-GB"/>
+        </w:rPr>
+      </w:pPr>
+      <w:r>
+        <w:rPr>
+          <w:lang w:val="it-IT" w:eastAsia="en-GB"/>
+        </w:rPr>
+        <w:lastRenderedPageBreak/>
+        <w:t>L'area di raccolta assegnata</w:t>
+      </w:r>
+      <w:r>
+        <w:rPr>
+          <w:lang w:val="it-IT" w:eastAsia="en-GB"/>
+        </w:rPr>
+        <w:t xml:space="preserve"> e il percorso seguito</w:t>
+      </w:r>
+      <w:r>
+        <w:rPr>
+          <w:lang w:val="it-IT" w:eastAsia="en-GB"/>
+        </w:rPr>
+        <w:t xml:space="preserve"> </w:t>
+      </w:r>
+      <w:r>
+        <w:rPr>
+          <w:lang w:val="it-IT" w:eastAsia="en-GB"/>
+        </w:rPr>
+        <w:t>vengono</w:t>
+      </w:r>
+      <w:r>
+        <w:rPr>
+          <w:lang w:val="it-IT" w:eastAsia="en-GB"/>
+        </w:rPr>
+        <w:t xml:space="preserve"> evidenziat</w:t>
+      </w:r>
+      <w:r>
+        <w:rPr>
+          <w:lang w:val="it-IT" w:eastAsia="en-GB"/>
+        </w:rPr>
+        <w:t>i</w:t>
+      </w:r>
+      <w:r>
+        <w:rPr>
+          <w:lang w:val="it-IT" w:eastAsia="en-GB"/>
+        </w:rPr>
+        <w:t xml:space="preserve"> sulla mappa (es. cerchio tratteggiato).</w:t>
+      </w:r>
+    </w:p>
+    <w:p>
+      <w:pPr>
+        <w:pStyle w:val="ListParagraph"/>
+        <w:numPr>
+          <w:ilvl w:val="0"/>
+          <w:numId w:val="24"/>
+        </w:numPr>
+        <w:rPr>
+          <w:lang w:eastAsia="en-GB"/>
+        </w:rPr>
+      </w:pPr>
+      <w:proofErr w:type="spellStart"/>
       <w:r>
         <w:rPr>
           <w:b/>
           <w:bCs/>
-        </w:rPr>
-        <w:t xml:space="preserve"> base del </w:t>
-      </w:r>
-      <w:proofErr w:type="spellStart"/>
+          <w:lang w:eastAsia="en-GB"/>
+        </w:rPr>
+        <w:t>Cancellazione</w:t>
+      </w:r>
+      <w:proofErr w:type="spellEnd"/>
       <w:r>
         <w:rPr>
           <w:b/>
           <w:bCs/>
-        </w:rPr>
-        <w:t>cibo</w:t>
+          <w:lang w:eastAsia="en-GB"/>
+        </w:rPr>
+        <w:t xml:space="preserve"> di </w:t>
+      </w:r>
+      <w:proofErr w:type="spellStart"/>
+      <w:r>
+        <w:rPr>
+          <w:b/>
+          <w:bCs/>
+          <w:lang w:eastAsia="en-GB"/>
+        </w:rPr>
+        <w:t>una</w:t>
       </w:r>
       <w:proofErr w:type="spellEnd"/>
+      <w:r>
+        <w:rPr>
+          <w:b/>
+          <w:bCs/>
+          <w:lang w:eastAsia="en-GB"/>
+        </w:rPr>
+        <w:t xml:space="preserve"> </w:t>
+      </w:r>
+      <w:proofErr w:type="spellStart"/>
+      <w:r>
+        <w:rPr>
+          <w:b/>
+          <w:bCs/>
+          <w:lang w:eastAsia="en-GB"/>
+        </w:rPr>
+        <w:t>spedizione</w:t>
+      </w:r>
+      <w:proofErr w:type="spellEnd"/>
+      <w:r>
+        <w:rPr>
+          <w:b/>
+          <w:bCs/>
+          <w:lang w:eastAsia="en-GB"/>
+        </w:rPr>
+        <w:t>:</w:t>
+      </w:r>
+    </w:p>
+    <w:p>
+      <w:pPr>
+        <w:pStyle w:val="ListParagraph"/>
+        <w:numPr>
+          <w:ilvl w:val="1"/>
+          <w:numId w:val="24"/>
+        </w:numPr>
+        <w:rPr>
+          <w:lang w:val="it-IT" w:eastAsia="en-GB"/>
+        </w:rPr>
+      </w:pPr>
+      <w:r>
+        <w:rPr>
+          <w:lang w:val="it-IT" w:eastAsia="en-GB"/>
+        </w:rPr>
+        <w:t>Comando "cancella spedizione" (tasto o pulsante) quando una spedizione è selezionata.</w:t>
+      </w:r>
+    </w:p>
+    <w:p>
+      <w:pPr>
+        <w:pStyle w:val="ListParagraph"/>
+        <w:numPr>
+          <w:ilvl w:val="1"/>
+          <w:numId w:val="24"/>
+        </w:numPr>
+        <w:rPr>
+          <w:lang w:val="it-IT" w:eastAsia="en-GB"/>
+        </w:rPr>
+      </w:pPr>
+      <w:r>
+        <w:rPr>
+          <w:lang w:val="it-IT" w:eastAsia="en-GB"/>
+        </w:rPr>
+        <w:t>La spedizione interrompe la raccolta, torna immediatamente al campo, deposita il cibo già raccolto, e i lavoratori rientrano nel Pop.</w:t>
+      </w:r>
+    </w:p>
+    <w:p>
+      <w:pPr>
+        <w:pStyle w:val="ListParagraph"/>
+        <w:numPr>
+          <w:ilvl w:val="0"/>
+          <w:numId w:val="24"/>
+        </w:numPr>
+        <w:rPr>
+          <w:lang w:val="it-IT" w:eastAsia="en-GB"/>
+        </w:rPr>
+      </w:pPr>
+      <w:r>
+        <w:rPr>
+          <w:b/>
+          <w:bCs/>
+          <w:lang w:val="it-IT" w:eastAsia="en-GB"/>
+        </w:rPr>
+        <w:t>Ribilanciamento</w:t>
+      </w:r>
+      <w:r>
+        <w:rPr>
+          <w:lang w:val="it-IT" w:eastAsia="en-GB"/>
+        </w:rPr>
+        <w:t>: definire la durata di un giorno e settare tutti i consumi su consumo/giorno</w:t>
+      </w:r>
+    </w:p>
+    <w:p>
+      <w:pPr>
+        <w:pStyle w:val="ListParagraph"/>
+        <w:numPr>
+          <w:ilvl w:val="0"/>
+          <w:numId w:val="24"/>
+        </w:numPr>
+        <w:rPr>
+          <w:lang w:val="it-IT" w:eastAsia="en-GB"/>
+        </w:rPr>
+      </w:pPr>
+      <w:r>
+        <w:rPr>
+          <w:b/>
+          <w:bCs/>
+          <w:lang w:val="it-IT" w:eastAsia="en-GB"/>
+        </w:rPr>
+        <w:t>Meccanica:</w:t>
+      </w:r>
+      <w:r>
+        <w:rPr>
+          <w:lang w:val="it-IT" w:eastAsia="en-GB"/>
+        </w:rPr>
+        <w:t xml:space="preserve"> il giocatore può ora gestire attivamente le spedizioni e bilanciare i parametri di gioco per testare il loop di sopravvivenza in varie condizioni.</w:t>
+      </w:r>
+    </w:p>
+    <w:p>
+      <w:pPr>
+        <w:rPr>
+          <w:b/>
+          <w:bCs/>
+          <w:lang w:val="it-IT"/>
+        </w:rPr>
+      </w:pPr>
+      <w:r>
+        <w:rPr>
+          <w:b/>
+          <w:bCs/>
+          <w:lang w:val="it-IT"/>
+        </w:rPr>
+        <w:t>Batch 7 – Rigenerazione base del cibo</w:t>
+      </w:r>
     </w:p>
     <w:p>
       <w:pPr>
@@ -1819,7 +2127,7 @@
         <w:rPr>
           <w:lang w:val="it-IT"/>
         </w:rPr>
-        <w:t>La rigenerazione è più rapida in celle con densità bassa, per simulare la ricrescita naturale.</w:t>
+        <w:t>Una zona completamente esaurita (densità zero) impiega più tempo a iniziare a rigenerare.</w:t>
       </w:r>
     </w:p>
     <w:p>
@@ -1836,25 +2144,25 @@
         <w:rPr>
           <w:lang w:val="it-IT"/>
         </w:rPr>
-        <w:t>Una zona completamente esaurita (densità zero) impiega più tempo a iniziare a rigenerare.</w:t>
-      </w:r>
-    </w:p>
-    <w:p>
-      <w:pPr>
+        <w:t>Meccanica: il giocatore non può esaurire una zona per sempre, ma deve ruotare le aree di raccolta per non restare senza cibo. Questo introduce una prima forma di gestione sostenibile delle risorse.</w:t>
+      </w:r>
+    </w:p>
+    <w:p>
+      <w:pPr>
+        <w:pStyle w:val="ListParagraph"/>
         <w:numPr>
           <w:ilvl w:val="0"/>
           <w:numId w:val="29"/>
         </w:numPr>
         <w:rPr>
-          <w:lang w:val="it-IT"/>
-        </w:rPr>
-      </w:pPr>
-      <w:r>
-        <w:rPr>
-          <w:lang w:val="it-IT"/>
-        </w:rPr>
-        <w:lastRenderedPageBreak/>
-        <w:t>Meccanica: il giocatore non può esaurire una zona per sempre, ma deve ruotare le aree di raccolta per non restare senza cibo. Questo introduce una prima forma di gestione sostenibile delle risorse.</w:t>
+          <w:lang w:val="it-IT" w:eastAsia="en-GB"/>
+        </w:rPr>
+      </w:pPr>
+      <w:r>
+        <w:rPr>
+          <w:lang w:val="it-IT" w:eastAsia="en-GB"/>
+        </w:rPr>
+        <w:t>Nota: la rigenerazione qui implementata sarà una versione semplificata e temporanea. In futuro sarà legata alla tipologia di terreno e seguirà una curva di crescita più realistica (rigenerazione più rapida a densità più alte). I valori attuali andranno poi bilanciati tramite il pannello di debug (Batch 6).</w:t>
       </w:r>
     </w:p>
     <w:p>
@@ -1990,7 +2298,7 @@
         <w:pStyle w:val="ListParagraph"/>
         <w:numPr>
           <w:ilvl w:val="0"/>
-          <w:numId w:val="36"/>
+          <w:numId w:val="41"/>
         </w:numPr>
         <w:rPr>
           <w:b/>
@@ -2024,7 +2332,7 @@
         <w:pStyle w:val="ListParagraph"/>
         <w:numPr>
           <w:ilvl w:val="0"/>
-          <w:numId w:val="36"/>
+          <w:numId w:val="41"/>
         </w:numPr>
         <w:rPr>
           <w:b/>
@@ -2044,7 +2352,7 @@
         <w:pStyle w:val="ListParagraph"/>
         <w:numPr>
           <w:ilvl w:val="0"/>
-          <w:numId w:val="36"/>
+          <w:numId w:val="41"/>
         </w:numPr>
         <w:rPr>
           <w:b/>
@@ -2056,7 +2364,14 @@
         <w:rPr>
           <w:lang w:val="it-IT"/>
         </w:rPr>
-        <w:t>Non abbiamo minimamente lavorato sulla tipologia del terreno (montagna, acqua, acqua profonda, collina, pianura) e le caratteristiche di esso (foresta, erba ecc.). Questo perché sulla base del tipo di terreno poi dipende il cibo (la pesca è solo nelle acque, le aree di pianura con erba vicino ai fiumi hanno più cibo ecc.). Da forse vedere subito dopo MVP1?</w:t>
+        <w:t xml:space="preserve">Non abbiamo minimamente lavorato sulla tipologia del terreno (montagna, acqua, acqua profonda, collina, pianura) e le caratteristiche di esso (foresta, erba ecc.). Questo </w:t>
+      </w:r>
+      <w:r>
+        <w:rPr>
+          <w:lang w:val="it-IT"/>
+        </w:rPr>
+        <w:lastRenderedPageBreak/>
+        <w:t>perché sulla base del tipo di terreno poi dipende il cibo (la pesca è solo nelle acque, le aree di pianura con erba vicino ai fiumi hanno più cibo ecc.). Da forse vedere subito dopo MVP1?</w:t>
       </w:r>
       <w:r>
         <w:rPr>
@@ -2081,12 +2396,454 @@
     </w:p>
     <w:p>
       <w:pPr>
+        <w:pStyle w:val="ListParagraph"/>
+        <w:numPr>
+          <w:ilvl w:val="0"/>
+          <w:numId w:val="41"/>
+        </w:numPr>
+        <w:rPr>
+          <w:lang w:val="it-IT" w:eastAsia="en-GB"/>
+        </w:rPr>
+      </w:pPr>
+      <w:r>
+        <w:rPr>
+          <w:lang w:val="it-IT" w:eastAsia="en-GB"/>
+        </w:rPr>
+        <w:t>Spedizioni multi-pop con dinamiche di coesione interna (es. conflitti o collaborazioni tra individui di etnie/religioni diverse nello stesso gruppo).</w:t>
+      </w:r>
+    </w:p>
+    <w:p>
+      <w:pPr>
+        <w:pStyle w:val="ListParagraph"/>
+        <w:numPr>
+          <w:ilvl w:val="0"/>
+          <w:numId w:val="41"/>
+        </w:numPr>
+        <w:rPr>
+          <w:lang w:val="it-IT" w:eastAsia="en-GB"/>
+        </w:rPr>
+      </w:pPr>
+      <w:r>
+        <w:rPr>
+          <w:lang w:val="it-IT" w:eastAsia="en-GB"/>
+        </w:rPr>
+        <w:t>Campo base che si sposta fisicamente sulla mappa durante le migrazioni o il nomadismo, e conseguente aggiornamento del punto di ritorno per le spedizioni attive.</w:t>
+      </w:r>
+    </w:p>
+    <w:p>
+      <w:pPr>
+        <w:pStyle w:val="ListParagraph"/>
+        <w:numPr>
+          <w:ilvl w:val="0"/>
+          <w:numId w:val="41"/>
+        </w:numPr>
+        <w:rPr>
+          <w:lang w:val="it-IT" w:eastAsia="en-GB"/>
+        </w:rPr>
+      </w:pPr>
+      <w:r>
+        <w:rPr>
+          <w:lang w:val="it-IT" w:eastAsia="en-GB"/>
+        </w:rPr>
+        <w:t>Rotazione automatica delle aree di raccolta da parte delle spedizioni, per evitare l'impoverimento permanente di una singola zona (comportamento di raccolta più conservativo e sostenibile).</w:t>
+      </w:r>
+    </w:p>
+    <w:p>
+      <w:pPr>
+        <w:pStyle w:val="ListParagraph"/>
+        <w:numPr>
+          <w:ilvl w:val="0"/>
+          <w:numId w:val="41"/>
+        </w:numPr>
+        <w:rPr>
+          <w:lang w:val="it-IT" w:eastAsia="en-GB"/>
+        </w:rPr>
+      </w:pPr>
+      <w:r>
+        <w:rPr>
+          <w:lang w:val="it-IT" w:eastAsia="en-GB"/>
+        </w:rPr>
+        <w:t>Algoritmo di raccolta con priorità alle celle a media densità (es. 0.4-0.7) per massimizzare la rigenerazione complessiva dell'area.</w:t>
+      </w:r>
+    </w:p>
+    <w:p>
+      <w:pPr>
+        <w:pStyle w:val="ListParagraph"/>
+        <w:numPr>
+          <w:ilvl w:val="0"/>
+          <w:numId w:val="41"/>
+        </w:numPr>
+        <w:rPr>
+          <w:lang w:val="it-IT" w:eastAsia="en-GB"/>
+        </w:rPr>
+      </w:pPr>
+      <w:r>
+        <w:rPr>
+          <w:lang w:val="it-IT" w:eastAsia="en-GB"/>
+        </w:rPr>
+        <w:t>Rigenerazione e “fertilità” celle sulla base anche del terreno</w:t>
+      </w:r>
+    </w:p>
+    <w:p>
+      <w:pPr>
+        <w:pStyle w:val="ListParagraph"/>
+        <w:numPr>
+          <w:ilvl w:val="0"/>
+          <w:numId w:val="41"/>
+        </w:numPr>
+        <w:rPr>
+          <w:lang w:val="it-IT" w:eastAsia="en-GB"/>
+        </w:rPr>
+      </w:pPr>
+      <w:r>
+        <w:rPr>
+          <w:lang w:val="it-IT" w:eastAsia="en-GB"/>
+        </w:rPr>
+        <w:t xml:space="preserve">Meccaniche di frizione/resistenza al cambio di pop della popolazione (o che si evolve nel tempo e inizialmente la basiamo solo sul sesso, tipo uomini giovani infelice se assegnati a </w:t>
+      </w:r>
+      <w:proofErr w:type="spellStart"/>
+      <w:r>
+        <w:rPr>
+          <w:lang w:val="it-IT" w:eastAsia="en-GB"/>
+        </w:rPr>
+        <w:t>gathering</w:t>
+      </w:r>
+      <w:proofErr w:type="spellEnd"/>
+      <w:r>
+        <w:rPr>
+          <w:lang w:val="it-IT" w:eastAsia="en-GB"/>
+        </w:rPr>
+        <w:t xml:space="preserve"> perché disonorevole). Da capire come fare distinzione popolazione per sesso ma soprattutto per età senza dover monitorare ogni singolo abitante</w:t>
+      </w:r>
+    </w:p>
+    <w:p>
+      <w:pPr>
+        <w:pStyle w:val="ListParagraph"/>
+        <w:numPr>
+          <w:ilvl w:val="0"/>
+          <w:numId w:val="41"/>
+        </w:numPr>
+        <w:rPr>
+          <w:lang w:val="it-IT" w:eastAsia="en-GB"/>
+        </w:rPr>
+      </w:pPr>
+      <w:r>
+        <w:rPr>
+          <w:lang w:val="it-IT" w:eastAsia="en-GB"/>
+        </w:rPr>
+        <w:t>Icone diverse per tipologia di pop con di fianco barre informative (tipo provviste o che)</w:t>
+      </w:r>
+    </w:p>
+    <w:p>
+      <w:pPr>
+        <w:pStyle w:val="ListParagraph"/>
+        <w:numPr>
+          <w:ilvl w:val="0"/>
+          <w:numId w:val="41"/>
+        </w:numPr>
+        <w:rPr>
+          <w:lang w:val="it-IT" w:eastAsia="en-GB"/>
+        </w:rPr>
+      </w:pPr>
+      <w:r>
+        <w:rPr>
+          <w:lang w:val="it-IT" w:eastAsia="en-GB"/>
+        </w:rPr>
+        <w:t>Giocatore seleziona manualmente il numero di pop da mandare in spedizione (con anche tasti rapidi di scelta)</w:t>
+      </w:r>
+    </w:p>
+    <w:p>
+      <w:pPr>
+        <w:pStyle w:val="ListParagraph"/>
+        <w:numPr>
+          <w:ilvl w:val="0"/>
+          <w:numId w:val="41"/>
+        </w:numPr>
+        <w:rPr>
+          <w:lang w:val="it-IT" w:eastAsia="en-GB"/>
+        </w:rPr>
+      </w:pPr>
+      <w:r>
+        <w:rPr>
+          <w:lang w:val="it-IT" w:eastAsia="en-GB"/>
+        </w:rPr>
+        <w:t>Aggiungere crescita demografica: più cibo c’è, più la popolazione cresce. Se cibo scarseggia, aumenta il tasso di morte. Se spedizione finisce scorte, iniziano a morire o a consumare cibo raccolto</w:t>
+      </w:r>
+    </w:p>
+    <w:p>
+      <w:pPr>
+        <w:pStyle w:val="ListParagraph"/>
+        <w:numPr>
+          <w:ilvl w:val="0"/>
+          <w:numId w:val="41"/>
+        </w:numPr>
+        <w:rPr>
+          <w:lang w:val="it-IT" w:eastAsia="en-GB"/>
+        </w:rPr>
+      </w:pPr>
+      <w:r>
+        <w:rPr>
+          <w:lang w:val="it-IT" w:eastAsia="en-GB"/>
+        </w:rPr>
+        <w:t xml:space="preserve">Da ragionare: in che contesto siamo, quale è la narrativa? Che anno di partenza e con che tecnologie? In quanti anni arrivare a creare una città, in modo che il gioco non risulti troppo lento e noioso all’inizio (ma senza nemmeno fare come </w:t>
+      </w:r>
+      <w:proofErr w:type="spellStart"/>
+      <w:r>
+        <w:rPr>
+          <w:lang w:val="it-IT" w:eastAsia="en-GB"/>
+        </w:rPr>
+        <w:t>civilization</w:t>
+      </w:r>
+      <w:proofErr w:type="spellEnd"/>
+      <w:r>
+        <w:rPr>
+          <w:lang w:val="it-IT" w:eastAsia="en-GB"/>
+        </w:rPr>
+        <w:t xml:space="preserve"> che dura questa età come una roba da 10 minuti). Vogliamo fare che in realtà è un gruppo di superstiti che riparte e recupera le tecnologie già apprese? In che anni? Vogliamo fare un gioco diverso per era (quindi tipo qui con meccaniche più stilizzate) tipo come fa spore? Vogliamo andare sul lungo termine come </w:t>
+      </w:r>
+      <w:proofErr w:type="spellStart"/>
+      <w:r>
+        <w:rPr>
+          <w:lang w:val="it-IT" w:eastAsia="en-GB"/>
+        </w:rPr>
+        <w:t>civilization</w:t>
+      </w:r>
+      <w:proofErr w:type="spellEnd"/>
+      <w:r>
+        <w:rPr>
+          <w:lang w:val="it-IT" w:eastAsia="en-GB"/>
+        </w:rPr>
+        <w:t xml:space="preserve"> 4 </w:t>
+      </w:r>
+      <w:proofErr w:type="spellStart"/>
+      <w:r>
+        <w:rPr>
+          <w:lang w:val="it-IT" w:eastAsia="en-GB"/>
+        </w:rPr>
+        <w:t>cavemen</w:t>
+      </w:r>
+      <w:proofErr w:type="spellEnd"/>
+      <w:r>
+        <w:rPr>
+          <w:lang w:val="it-IT" w:eastAsia="en-GB"/>
+        </w:rPr>
+        <w:t xml:space="preserve"> to </w:t>
+      </w:r>
+      <w:proofErr w:type="spellStart"/>
+      <w:r>
+        <w:rPr>
+          <w:lang w:val="it-IT" w:eastAsia="en-GB"/>
+        </w:rPr>
+        <w:t>cosmos</w:t>
+      </w:r>
+      <w:proofErr w:type="spellEnd"/>
+      <w:r>
+        <w:rPr>
+          <w:lang w:val="it-IT" w:eastAsia="en-GB"/>
+        </w:rPr>
+        <w:t xml:space="preserve"> e quindi comunque rendere intriganti le meccaniche di sopravvivenza della tribù (e praticamente fare solo un gioco su questo, magari come primo titolo di una serie)</w:t>
+      </w:r>
+    </w:p>
+    <w:p>
+      <w:pPr>
+        <w:pStyle w:val="ListParagraph"/>
+        <w:numPr>
+          <w:ilvl w:val="0"/>
+          <w:numId w:val="41"/>
+        </w:numPr>
+        <w:rPr>
+          <w:lang w:val="it-IT" w:eastAsia="en-GB"/>
+        </w:rPr>
+      </w:pPr>
+      <w:r>
+        <w:rPr>
+          <w:lang w:val="it-IT" w:eastAsia="en-GB"/>
+        </w:rPr>
+        <w:t xml:space="preserve">Basare lo sviluppo su: tecnologie </w:t>
+      </w:r>
+      <w:proofErr w:type="spellStart"/>
+      <w:r>
+        <w:rPr>
+          <w:lang w:val="it-IT" w:eastAsia="en-GB"/>
+        </w:rPr>
+        <w:t>cavemen</w:t>
+      </w:r>
+      <w:proofErr w:type="spellEnd"/>
+      <w:r>
+        <w:rPr>
+          <w:lang w:val="it-IT" w:eastAsia="en-GB"/>
+        </w:rPr>
+        <w:t xml:space="preserve"> 2 to </w:t>
+      </w:r>
+      <w:proofErr w:type="spellStart"/>
+      <w:r>
+        <w:rPr>
+          <w:lang w:val="it-IT" w:eastAsia="en-GB"/>
+        </w:rPr>
+        <w:t>cosmos</w:t>
+      </w:r>
+      <w:proofErr w:type="spellEnd"/>
+      <w:r>
+        <w:rPr>
+          <w:lang w:val="it-IT" w:eastAsia="en-GB"/>
+        </w:rPr>
+        <w:t xml:space="preserve"> con edifici e unità e meccaniche intorno e link di timeline del progresso (wiki e altri link se funzionano)</w:t>
+      </w:r>
+    </w:p>
+    <w:p>
+      <w:pPr>
+        <w:rPr>
+          <w:lang w:val="it-IT"/>
+        </w:rPr>
+      </w:pPr>
+      <w:r>
         <w:rPr>
           <w:b/>
           <w:bCs/>
           <w:lang w:val="it-IT"/>
         </w:rPr>
-      </w:pPr>
+        <w:t>MVP2 – Diversificazione delle fonti di cibo (caccia e pesca)</w:t>
+      </w:r>
+    </w:p>
+    <w:p>
+      <w:pPr>
+        <w:rPr>
+          <w:lang w:val="it-IT"/>
+        </w:rPr>
+      </w:pPr>
+      <w:r>
+        <w:rPr>
+          <w:lang w:val="it-IT"/>
+        </w:rPr>
+        <w:t>MVP2 introduce i branchi mobili (grandi animali) e la pesca in acque interne. Il giocatore impara a diversificare le fonti di cibo oltre alla raccolta vegetale. La caccia richiede movimento attivo (inseguire il branco), mentre la pesca è stanziale ma limitata alle celle d'acqua.</w:t>
+      </w:r>
+    </w:p>
+    <w:p>
+      <w:r>
+        <w:lastRenderedPageBreak/>
+        <w:t xml:space="preserve">Nuova </w:t>
+      </w:r>
+      <w:proofErr w:type="spellStart"/>
+      <w:r>
+        <w:t>definizione</w:t>
+      </w:r>
+      <w:proofErr w:type="spellEnd"/>
+      <w:r>
+        <w:t>:</w:t>
+      </w:r>
+    </w:p>
+    <w:p>
+      <w:pPr>
+        <w:numPr>
+          <w:ilvl w:val="0"/>
+          <w:numId w:val="31"/>
+        </w:numPr>
+        <w:rPr>
+          <w:lang w:val="it-IT"/>
+        </w:rPr>
+      </w:pPr>
+      <w:r>
+        <w:rPr>
+          <w:lang w:val="it-IT"/>
+        </w:rPr>
+        <w:t>Branchi di grandi animali appaiono sulla mappa come entità mobili. Ogni branco ha una specie, un numero di capi, un habitat preferito e un tasso di riproduzione.</w:t>
+      </w:r>
+    </w:p>
+    <w:p>
+      <w:pPr>
+        <w:numPr>
+          <w:ilvl w:val="0"/>
+          <w:numId w:val="31"/>
+        </w:numPr>
+        <w:rPr>
+          <w:lang w:val="it-IT"/>
+        </w:rPr>
+      </w:pPr>
+      <w:r>
+        <w:rPr>
+          <w:lang w:val="it-IT"/>
+        </w:rPr>
+        <w:t>Il giocatore può assegnare un pop alla caccia: deve avvicinarsi al branco, e ogni ciclo di caccia riduce i capi e produce carne e pelli. Se il branco scende sotto una soglia, si estingue localmente.</w:t>
+      </w:r>
+    </w:p>
+    <w:p>
+      <w:pPr>
+        <w:numPr>
+          <w:ilvl w:val="0"/>
+          <w:numId w:val="31"/>
+        </w:numPr>
+        <w:rPr>
+          <w:lang w:val="it-IT"/>
+        </w:rPr>
+      </w:pPr>
+      <w:r>
+        <w:rPr>
+          <w:lang w:val="it-IT"/>
+        </w:rPr>
+        <w:t xml:space="preserve">Nelle celle che intersecano fiumi o laghi, il </w:t>
+      </w:r>
+      <w:proofErr w:type="spellStart"/>
+      <w:r>
+        <w:rPr>
+          <w:lang w:val="it-IT"/>
+        </w:rPr>
+        <w:t>layer</w:t>
+      </w:r>
+      <w:proofErr w:type="spellEnd"/>
+      <w:r>
+        <w:rPr>
+          <w:lang w:val="it-IT"/>
+        </w:rPr>
+        <w:t xml:space="preserve"> </w:t>
+      </w:r>
+      <w:proofErr w:type="spellStart"/>
+      <w:r>
+        <w:rPr>
+          <w:lang w:val="it-IT"/>
+        </w:rPr>
+        <w:t>fishDensity</w:t>
+      </w:r>
+      <w:proofErr w:type="spellEnd"/>
+      <w:r>
+        <w:rPr>
+          <w:lang w:val="it-IT"/>
+        </w:rPr>
+        <w:t xml:space="preserve"> permette la pesca. Funziona come la raccolta vegetale (riduce densità, si rigenera), ma solo in acqua.</w:t>
+      </w:r>
+    </w:p>
+    <w:p>
+      <w:pPr>
+        <w:numPr>
+          <w:ilvl w:val="0"/>
+          <w:numId w:val="31"/>
+        </w:numPr>
+        <w:rPr>
+          <w:lang w:val="it-IT"/>
+        </w:rPr>
+      </w:pPr>
+      <w:r>
+        <w:rPr>
+          <w:lang w:val="it-IT"/>
+        </w:rPr>
+        <w:t>L'interfaccia mostra le nuove risorse (carne, pesce) accanto al cibo vegetale. Per ora tutte valgono come "cibo", ma vengono registrate separatamente per usi futuri.</w:t>
+      </w:r>
+    </w:p>
+    <w:p>
+      <w:pPr>
+        <w:numPr>
+          <w:ilvl w:val="0"/>
+          <w:numId w:val="31"/>
+        </w:numPr>
+        <w:rPr>
+          <w:lang w:val="it-IT"/>
+        </w:rPr>
+      </w:pPr>
+      <w:r>
+        <w:rPr>
+          <w:lang w:val="it-IT"/>
+        </w:rPr>
+        <w:t>Meccanica: la caccia è più redditizia ma richiede inseguimento e può esaurire i branchi. La pesca è stabile ma limitata geograficamente. Il giocatore deve decidere come allocare i pop tra raccolta, caccia e pesca.</w:t>
+      </w:r>
     </w:p>
     <w:p>
       <w:pPr>
@@ -2100,442 +2857,522 @@
           <w:bCs/>
           <w:lang w:val="it-IT"/>
         </w:rPr>
-        <w:t>MVP2 – Diversificazione delle fonti di cibo (caccia e pesca)</w:t>
-      </w:r>
-    </w:p>
-    <w:p>
-      <w:pPr>
-        <w:rPr>
-          <w:lang w:val="it-IT"/>
-        </w:rPr>
-      </w:pPr>
-      <w:r>
-        <w:rPr>
-          <w:lang w:val="it-IT"/>
-        </w:rPr>
-        <w:t>MVP2 introduce i branchi mobili (grandi animali) e la pesca in acque interne. Il giocatore impara a diversificare le fonti di cibo oltre alla raccolta vegetale. La caccia richiede movimento attivo (inseguire il branco), mentre la pesca è stanziale ma limitata alle celle d'acqua.</w:t>
-      </w:r>
-    </w:p>
-    <w:p>
-      <w:r>
-        <w:t xml:space="preserve">Nuova </w:t>
-      </w:r>
-      <w:proofErr w:type="spellStart"/>
-      <w:r>
-        <w:t>definizione</w:t>
-      </w:r>
-      <w:proofErr w:type="spellEnd"/>
-      <w:r>
-        <w:t>:</w:t>
-      </w:r>
-    </w:p>
-    <w:p>
-      <w:pPr>
-        <w:numPr>
-          <w:ilvl w:val="0"/>
-          <w:numId w:val="31"/>
-        </w:numPr>
-        <w:rPr>
-          <w:lang w:val="it-IT"/>
-        </w:rPr>
-      </w:pPr>
-      <w:r>
-        <w:rPr>
-          <w:lang w:val="it-IT"/>
-        </w:rPr>
-        <w:t>Branchi di grandi animali appaiono sulla mappa come entità mobili. Ogni branco ha una specie, un numero di capi, un habitat preferito e un tasso di riproduzione.</w:t>
-      </w:r>
-    </w:p>
-    <w:p>
-      <w:pPr>
-        <w:numPr>
-          <w:ilvl w:val="0"/>
-          <w:numId w:val="31"/>
-        </w:numPr>
-        <w:rPr>
-          <w:lang w:val="it-IT"/>
-        </w:rPr>
-      </w:pPr>
-      <w:r>
-        <w:rPr>
-          <w:lang w:val="it-IT"/>
-        </w:rPr>
-        <w:t>Il giocatore può assegnare un pop alla caccia: deve avvicinarsi al branco, e ogni ciclo di caccia riduce i capi e produce carne e pelli. Se il branco scende sotto una soglia, si estingue localmente.</w:t>
-      </w:r>
-    </w:p>
-    <w:p>
-      <w:pPr>
-        <w:numPr>
-          <w:ilvl w:val="0"/>
-          <w:numId w:val="31"/>
-        </w:numPr>
-        <w:rPr>
-          <w:lang w:val="it-IT"/>
-        </w:rPr>
-      </w:pPr>
-      <w:r>
-        <w:rPr>
-          <w:lang w:val="it-IT"/>
-        </w:rPr>
-        <w:t xml:space="preserve">Nelle celle che intersecano fiumi o laghi, il </w:t>
-      </w:r>
-      <w:proofErr w:type="spellStart"/>
-      <w:r>
-        <w:rPr>
-          <w:lang w:val="it-IT"/>
-        </w:rPr>
-        <w:t>layer</w:t>
-      </w:r>
-      <w:proofErr w:type="spellEnd"/>
-      <w:r>
-        <w:rPr>
-          <w:lang w:val="it-IT"/>
-        </w:rPr>
-        <w:t xml:space="preserve"> </w:t>
-      </w:r>
-      <w:proofErr w:type="spellStart"/>
-      <w:r>
-        <w:rPr>
-          <w:lang w:val="it-IT"/>
-        </w:rPr>
-        <w:t>fishDensity</w:t>
-      </w:r>
-      <w:proofErr w:type="spellEnd"/>
-      <w:r>
-        <w:rPr>
-          <w:lang w:val="it-IT"/>
-        </w:rPr>
-        <w:t xml:space="preserve"> permette la pesca. Funziona come la raccolta vegetale (riduce densità, si rigenera), ma solo in acqua.</w:t>
-      </w:r>
-    </w:p>
-    <w:p>
-      <w:pPr>
-        <w:numPr>
-          <w:ilvl w:val="0"/>
-          <w:numId w:val="31"/>
-        </w:numPr>
-        <w:rPr>
-          <w:lang w:val="it-IT"/>
-        </w:rPr>
-      </w:pPr>
-      <w:r>
-        <w:rPr>
-          <w:lang w:val="it-IT"/>
-        </w:rPr>
-        <w:lastRenderedPageBreak/>
-        <w:t>L'interfaccia mostra le nuove risorse (carne, pesce) accanto al cibo vegetale. Per ora tutte valgono come "cibo", ma vengono registrate separatamente per usi futuri.</w:t>
-      </w:r>
-    </w:p>
-    <w:p>
-      <w:pPr>
-        <w:numPr>
-          <w:ilvl w:val="0"/>
-          <w:numId w:val="31"/>
-        </w:numPr>
-        <w:rPr>
-          <w:lang w:val="it-IT"/>
-        </w:rPr>
-      </w:pPr>
-      <w:r>
-        <w:rPr>
-          <w:lang w:val="it-IT"/>
-        </w:rPr>
-        <w:t>Meccanica: la caccia è più redditizia ma richiede inseguimento e può esaurire i branchi. La pesca è stabile ma limitata geograficamente. Il giocatore deve decidere come allocare i pop tra raccolta, caccia e pesca.</w:t>
-      </w:r>
-    </w:p>
-    <w:p>
-      <w:pPr>
-        <w:rPr>
-          <w:lang w:val="it-IT"/>
-        </w:rPr>
-      </w:pPr>
+        <w:t xml:space="preserve">MVP3 – Raccolta legna, lavorazione e </w:t>
+      </w:r>
       <w:r>
         <w:rPr>
           <w:b/>
           <w:bCs/>
           <w:lang w:val="it-IT"/>
         </w:rPr>
-        <w:t xml:space="preserve">MVP3 – Raccolta legna, lavorazione e </w:t>
-      </w:r>
+        <w:t>strumenti</w:t>
+      </w:r>
+    </w:p>
+    <w:p>
+      <w:pPr>
+        <w:rPr>
+          <w:lang w:val="it-IT"/>
+        </w:rPr>
+      </w:pPr>
+      <w:r>
+        <w:rPr>
+          <w:lang w:val="it-IT"/>
+        </w:rPr>
+        <w:t xml:space="preserve">MVP3 introduce il </w:t>
+      </w:r>
+      <w:proofErr w:type="spellStart"/>
+      <w:r>
+        <w:rPr>
+          <w:lang w:val="it-IT"/>
+        </w:rPr>
+        <w:t>layer</w:t>
+      </w:r>
+      <w:proofErr w:type="spellEnd"/>
+      <w:r>
+        <w:rPr>
+          <w:lang w:val="it-IT"/>
+        </w:rPr>
+        <w:t xml:space="preserve"> </w:t>
+      </w:r>
+      <w:proofErr w:type="spellStart"/>
+      <w:r>
+        <w:rPr>
+          <w:lang w:val="it-IT"/>
+        </w:rPr>
+        <w:t>forestDensity</w:t>
+      </w:r>
+      <w:proofErr w:type="spellEnd"/>
+      <w:r>
+        <w:rPr>
+          <w:lang w:val="it-IT"/>
+        </w:rPr>
+        <w:t xml:space="preserve"> e la raccolta di legna. Poi la lavorazione (legna → </w:t>
+      </w:r>
+      <w:r>
+        <w:rPr>
+          <w:lang w:val="it-IT"/>
+        </w:rPr>
+        <w:t>tool</w:t>
+      </w:r>
+      <w:r>
+        <w:rPr>
+          <w:lang w:val="it-IT"/>
+        </w:rPr>
+        <w:t xml:space="preserve">) </w:t>
+      </w:r>
+      <w:r>
+        <w:rPr>
+          <w:lang w:val="it-IT"/>
+        </w:rPr>
+        <w:t>per migliorare la caccia e la raccolta di cibo in generale</w:t>
+      </w:r>
+      <w:r>
+        <w:rPr>
+          <w:lang w:val="it-IT"/>
+        </w:rPr>
+        <w:t xml:space="preserve">. L'ordine logico è: risorsa grezza, lavorazione, </w:t>
+      </w:r>
+      <w:r>
+        <w:rPr>
+          <w:lang w:val="it-IT"/>
+        </w:rPr>
+        <w:t>tool</w:t>
+      </w:r>
+      <w:r>
+        <w:rPr>
+          <w:lang w:val="it-IT"/>
+        </w:rPr>
+        <w:t>.</w:t>
+      </w:r>
+    </w:p>
+    <w:p>
+      <w:pPr>
+        <w:rPr>
+          <w:lang w:val="it-IT"/>
+        </w:rPr>
+      </w:pPr>
+      <w:r>
+        <w:rPr>
+          <w:lang w:val="it-IT"/>
+        </w:rPr>
+        <w:t>DA RICORDARE A DEEPSEEK: controllare e confermare che gli strumenti in legna vennero prima di quelli in pietra.</w:t>
+      </w:r>
+    </w:p>
+    <w:p>
+      <w:pPr>
+        <w:rPr>
+          <w:lang w:val="it-IT"/>
+        </w:rPr>
+      </w:pPr>
+      <w:r>
+        <w:rPr>
+          <w:lang w:val="it-IT"/>
+        </w:rPr>
+        <w:t>Nuova definizione:</w:t>
+      </w:r>
+    </w:p>
+    <w:p>
+      <w:pPr>
+        <w:numPr>
+          <w:ilvl w:val="0"/>
+          <w:numId w:val="32"/>
+        </w:numPr>
+        <w:rPr>
+          <w:lang w:val="it-IT"/>
+        </w:rPr>
+      </w:pPr>
+      <w:r>
+        <w:rPr>
+          <w:lang w:val="it-IT"/>
+        </w:rPr>
+        <w:t xml:space="preserve">Attivazione del </w:t>
+      </w:r>
+      <w:proofErr w:type="spellStart"/>
+      <w:r>
+        <w:rPr>
+          <w:lang w:val="it-IT"/>
+        </w:rPr>
+        <w:t>layer</w:t>
+      </w:r>
+      <w:proofErr w:type="spellEnd"/>
+      <w:r>
+        <w:rPr>
+          <w:lang w:val="it-IT"/>
+        </w:rPr>
+        <w:t xml:space="preserve"> </w:t>
+      </w:r>
+      <w:proofErr w:type="spellStart"/>
+      <w:r>
+        <w:rPr>
+          <w:lang w:val="it-IT"/>
+        </w:rPr>
+        <w:t>forestDensity</w:t>
+      </w:r>
+      <w:proofErr w:type="spellEnd"/>
+      <w:r>
+        <w:rPr>
+          <w:lang w:val="it-IT"/>
+        </w:rPr>
+        <w:t xml:space="preserve"> sulla griglia. Le foreste sono visivamente distinguibili (verde scuro). La raccolta di legna riduce la densità localmente, come per il </w:t>
+      </w:r>
+      <w:proofErr w:type="spellStart"/>
+      <w:r>
+        <w:rPr>
+          <w:lang w:val="it-IT"/>
+        </w:rPr>
+        <w:t>forage</w:t>
+      </w:r>
+      <w:proofErr w:type="spellEnd"/>
+      <w:r>
+        <w:rPr>
+          <w:lang w:val="it-IT"/>
+        </w:rPr>
+        <w:t>.</w:t>
+      </w:r>
+    </w:p>
+    <w:p>
+      <w:pPr>
+        <w:numPr>
+          <w:ilvl w:val="0"/>
+          <w:numId w:val="32"/>
+        </w:numPr>
+        <w:rPr>
+          <w:lang w:val="it-IT"/>
+        </w:rPr>
+      </w:pPr>
+      <w:r>
+        <w:rPr>
+          <w:lang w:val="it-IT"/>
+        </w:rPr>
+        <w:t>Il giocatore può assegnare pop alla raccolta di legna. La legna grezza viene trasportata all'accampamento.</w:t>
+      </w:r>
+    </w:p>
+    <w:p>
+      <w:pPr>
+        <w:numPr>
+          <w:ilvl w:val="0"/>
+          <w:numId w:val="32"/>
+        </w:numPr>
+        <w:rPr>
+          <w:lang w:val="it-IT"/>
+        </w:rPr>
+      </w:pPr>
+      <w:r>
+        <w:rPr>
+          <w:lang w:val="it-IT"/>
+        </w:rPr>
+        <w:t xml:space="preserve">Introduzione della lavorazione: la legna grezza può essere trasformata in </w:t>
+      </w:r>
+      <w:r>
+        <w:rPr>
+          <w:lang w:val="it-IT"/>
+        </w:rPr>
+        <w:t>tool</w:t>
+      </w:r>
+      <w:r>
+        <w:rPr>
+          <w:lang w:val="it-IT"/>
+        </w:rPr>
+        <w:t xml:space="preserve"> (azione "lavora legna" al campo). </w:t>
+      </w:r>
+    </w:p>
+    <w:p>
+      <w:pPr>
+        <w:numPr>
+          <w:ilvl w:val="0"/>
+          <w:numId w:val="32"/>
+        </w:numPr>
+        <w:rPr>
+          <w:lang w:val="it-IT"/>
+        </w:rPr>
+      </w:pPr>
+      <w:r>
+        <w:rPr>
+          <w:lang w:val="it-IT"/>
+        </w:rPr>
+        <w:t xml:space="preserve">Costruzione </w:t>
+      </w:r>
+      <w:r>
+        <w:rPr>
+          <w:lang w:val="it-IT"/>
+        </w:rPr>
+        <w:t>dei tool</w:t>
+      </w:r>
+      <w:r>
+        <w:rPr>
+          <w:lang w:val="it-IT"/>
+        </w:rPr>
+        <w:t xml:space="preserve">: consuma </w:t>
+      </w:r>
+      <w:r>
+        <w:rPr>
+          <w:lang w:val="it-IT"/>
+        </w:rPr>
+        <w:t>legna</w:t>
+      </w:r>
+      <w:r>
+        <w:rPr>
+          <w:lang w:val="it-IT"/>
+        </w:rPr>
+        <w:t xml:space="preserve">. </w:t>
+      </w:r>
+      <w:r>
+        <w:rPr>
+          <w:lang w:val="it-IT"/>
+        </w:rPr>
+        <w:t>I tool possono essere armi per la caccia, la pesca o bastoni/ceste per migliorare la raccolta delle bacche</w:t>
+      </w:r>
+    </w:p>
+    <w:p>
+      <w:pPr>
+        <w:numPr>
+          <w:ilvl w:val="0"/>
+          <w:numId w:val="32"/>
+        </w:numPr>
+        <w:rPr>
+          <w:lang w:val="it-IT"/>
+        </w:rPr>
+      </w:pPr>
+      <w:r>
+        <w:rPr>
+          <w:lang w:val="it-IT"/>
+        </w:rPr>
+        <w:t>Meccanica: la legna diventa la prima risorsa non commestibile. La lavorazione introduce il concetto di catena produttiva. Si gettano le basi per la specializzazione dei pop (raccoglitori, taglialegna, artigiani).</w:t>
+      </w:r>
+    </w:p>
+    <w:p>
+      <w:pPr>
+        <w:rPr>
+          <w:lang w:val="it-IT"/>
+        </w:rPr>
+      </w:pPr>
       <w:r>
         <w:rPr>
           <w:b/>
           <w:bCs/>
           <w:lang w:val="it-IT"/>
         </w:rPr>
-        <w:t>strumenti</w:t>
-      </w:r>
-    </w:p>
-    <w:p>
-      <w:pPr>
-        <w:rPr>
-          <w:lang w:val="it-IT"/>
-        </w:rPr>
-      </w:pPr>
-      <w:r>
-        <w:rPr>
-          <w:lang w:val="it-IT"/>
-        </w:rPr>
-        <w:t xml:space="preserve">MVP3 introduce il </w:t>
+        <w:t>MVP4 – Informazione imperfetta e report</w:t>
+      </w:r>
+    </w:p>
+    <w:p>
+      <w:pPr>
+        <w:rPr>
+          <w:lang w:val="it-IT"/>
+        </w:rPr>
+      </w:pPr>
+      <w:r>
+        <w:rPr>
+          <w:lang w:val="it-IT"/>
+        </w:rPr>
+        <w:lastRenderedPageBreak/>
+        <w:t>Nessuna modifica necessaria. Le meccaniche di visibilità (certo, proiettato, da report) e di stima delle scorte sono indipendenti dal tipo di risorsa. Quando le implementeremo, applicheremo l'incertezza a tutte le risorse (cibo vegetale, carne, pesce, legna, assi).</w:t>
+      </w:r>
+    </w:p>
+    <w:p>
+      <w:r>
+        <w:t xml:space="preserve">Testo </w:t>
       </w:r>
       <w:proofErr w:type="spellStart"/>
       <w:r>
-        <w:rPr>
-          <w:lang w:val="it-IT"/>
-        </w:rPr>
-        <w:t>layer</w:t>
+        <w:t>attuale</w:t>
       </w:r>
       <w:proofErr w:type="spellEnd"/>
       <w:r>
-        <w:rPr>
-          <w:lang w:val="it-IT"/>
-        </w:rPr>
         <w:t xml:space="preserve"> </w:t>
       </w:r>
       <w:proofErr w:type="spellStart"/>
       <w:r>
-        <w:rPr>
-          <w:lang w:val="it-IT"/>
-        </w:rPr>
-        <w:t>forestDensity</w:t>
+        <w:t>confermato</w:t>
       </w:r>
       <w:proofErr w:type="spellEnd"/>
       <w:r>
-        <w:rPr>
-          <w:lang w:val="it-IT"/>
-        </w:rPr>
-        <w:t xml:space="preserve"> e la raccolta di legna. Poi la lavorazione (legna → </w:t>
-      </w:r>
-      <w:r>
-        <w:rPr>
-          <w:lang w:val="it-IT"/>
-        </w:rPr>
-        <w:t>tool</w:t>
-      </w:r>
-      <w:r>
-        <w:rPr>
-          <w:lang w:val="it-IT"/>
-        </w:rPr>
-        <w:t xml:space="preserve">) </w:t>
-      </w:r>
-      <w:r>
-        <w:rPr>
-          <w:lang w:val="it-IT"/>
-        </w:rPr>
-        <w:t>per migliorare la caccia e la raccolta di cibo in generale</w:t>
-      </w:r>
-      <w:r>
-        <w:rPr>
-          <w:lang w:val="it-IT"/>
-        </w:rPr>
-        <w:t xml:space="preserve">. L'ordine logico è: risorsa grezza, lavorazione, </w:t>
-      </w:r>
-      <w:r>
-        <w:rPr>
-          <w:lang w:val="it-IT"/>
-        </w:rPr>
-        <w:t>tool</w:t>
-      </w:r>
-      <w:r>
-        <w:rPr>
-          <w:lang w:val="it-IT"/>
-        </w:rPr>
-        <w:t>.</w:t>
-      </w:r>
-    </w:p>
-    <w:p>
-      <w:pPr>
-        <w:rPr>
-          <w:lang w:val="it-IT"/>
-        </w:rPr>
-      </w:pPr>
-      <w:r>
-        <w:rPr>
-          <w:lang w:val="it-IT"/>
-        </w:rPr>
-        <w:t>DA RICORDARE A DEEPSEEK: controllare e confermare che gli strumenti in legna vennero prima di quelli in pietra.</w:t>
-      </w:r>
-    </w:p>
-    <w:p>
-      <w:pPr>
-        <w:rPr>
-          <w:lang w:val="it-IT"/>
-        </w:rPr>
-      </w:pPr>
-      <w:r>
-        <w:rPr>
-          <w:lang w:val="it-IT"/>
-        </w:rPr>
-        <w:t>Nuova definizione:</w:t>
+        <w:t>:</w:t>
       </w:r>
     </w:p>
     <w:p>
       <w:pPr>
         <w:numPr>
           <w:ilvl w:val="0"/>
-          <w:numId w:val="32"/>
-        </w:numPr>
-        <w:rPr>
-          <w:lang w:val="it-IT"/>
-        </w:rPr>
-      </w:pPr>
-      <w:r>
-        <w:rPr>
-          <w:lang w:val="it-IT"/>
-        </w:rPr>
-        <w:t xml:space="preserve">Attivazione del </w:t>
-      </w:r>
+          <w:numId w:val="33"/>
+        </w:numPr>
+        <w:rPr>
+          <w:lang w:val="it-IT"/>
+        </w:rPr>
+      </w:pPr>
+      <w:r>
+        <w:rPr>
+          <w:lang w:val="it-IT"/>
+        </w:rPr>
+        <w:t>Il campo base ha una "riserva di cibo" che non conosci esattamente: vedi una stima arrotondata.</w:t>
+      </w:r>
+    </w:p>
+    <w:p>
+      <w:pPr>
+        <w:numPr>
+          <w:ilvl w:val="0"/>
+          <w:numId w:val="33"/>
+        </w:numPr>
+        <w:rPr>
+          <w:lang w:val="it-IT"/>
+        </w:rPr>
+      </w:pPr>
+      <w:r>
+        <w:rPr>
+          <w:lang w:val="it-IT"/>
+        </w:rPr>
+        <w:t>Per sapere quanta legna hai realmente, devi inviare qualcuno a controllare o aspettare il report di chi torna.</w:t>
+      </w:r>
+    </w:p>
+    <w:p>
+      <w:pPr>
+        <w:numPr>
+          <w:ilvl w:val="0"/>
+          <w:numId w:val="33"/>
+        </w:numPr>
+        <w:rPr>
+          <w:lang w:val="it-IT"/>
+        </w:rPr>
+      </w:pPr>
+      <w:r>
+        <w:rPr>
+          <w:lang w:val="it-IT"/>
+        </w:rPr>
+        <w:t>Raggio visivo del giocatore: dove hai uomini, vedi; il resto è buio o sfocato.</w:t>
+      </w:r>
+    </w:p>
+    <w:p>
+      <w:pPr>
+        <w:numPr>
+          <w:ilvl w:val="0"/>
+          <w:numId w:val="33"/>
+        </w:numPr>
+        <w:rPr>
+          <w:lang w:val="it-IT"/>
+        </w:rPr>
+      </w:pPr>
+      <w:r>
+        <w:rPr>
+          <w:lang w:val="it-IT"/>
+        </w:rPr>
+        <w:t>I report possono essere ritardati o imprecisi in base alla distanza.</w:t>
+      </w:r>
+    </w:p>
+    <w:p>
+      <w:pPr>
+        <w:numPr>
+          <w:ilvl w:val="0"/>
+          <w:numId w:val="10"/>
+        </w:numPr>
+        <w:rPr>
+          <w:lang w:val="it-IT"/>
+        </w:rPr>
+      </w:pPr>
+      <w:r>
+        <w:rPr>
+          <w:lang w:val="it-IT"/>
+        </w:rPr>
+        <w:t>Barra del tempo (velocità 1x, 2x, pausa).</w:t>
+      </w:r>
+    </w:p>
+    <w:p>
+      <w:pPr>
+        <w:numPr>
+          <w:ilvl w:val="0"/>
+          <w:numId w:val="10"/>
+        </w:numPr>
+      </w:pPr>
       <w:proofErr w:type="spellStart"/>
       <w:r>
-        <w:rPr>
-          <w:lang w:val="it-IT"/>
-        </w:rPr>
-        <w:t>layer</w:t>
+        <w:t>Indicatore</w:t>
       </w:r>
       <w:proofErr w:type="spellEnd"/>
       <w:r>
-        <w:rPr>
-          <w:lang w:val="it-IT"/>
-        </w:rPr>
-        <w:t xml:space="preserve"> </w:t>
+        <w:t xml:space="preserve"> di </w:t>
       </w:r>
       <w:proofErr w:type="spellStart"/>
       <w:r>
-        <w:rPr>
-          <w:lang w:val="it-IT"/>
-        </w:rPr>
-        <w:t>forestDensity</w:t>
+        <w:t>posizione</w:t>
       </w:r>
       <w:proofErr w:type="spellEnd"/>
       <w:r>
-        <w:rPr>
-          <w:lang w:val="it-IT"/>
-        </w:rPr>
-        <w:t xml:space="preserve"> sulla griglia. Le foreste sono visivamente distinguibili (verde scuro). La raccolta di legna riduce la densità localmente, come per il </w:t>
-      </w:r>
+        <w:t>:</w:t>
+      </w:r>
+    </w:p>
+    <w:p>
+      <w:pPr>
+        <w:numPr>
+          <w:ilvl w:val="1"/>
+          <w:numId w:val="10"/>
+        </w:numPr>
+        <w:rPr>
+          <w:lang w:val="it-IT"/>
+        </w:rPr>
+      </w:pPr>
+      <w:r>
+        <w:rPr>
+          <w:lang w:val="it-IT"/>
+        </w:rPr>
+        <w:t>Certa (colore pieno) se nel raggio visivo.</w:t>
+      </w:r>
+    </w:p>
+    <w:p>
+      <w:pPr>
+        <w:numPr>
+          <w:ilvl w:val="1"/>
+          <w:numId w:val="10"/>
+        </w:numPr>
+        <w:rPr>
+          <w:lang w:val="it-IT"/>
+        </w:rPr>
+      </w:pPr>
+      <w:r>
+        <w:rPr>
+          <w:lang w:val="it-IT"/>
+        </w:rPr>
+        <w:t>Proiettata (desaturata con interpolazione) se fuori dal raggio.</w:t>
+      </w:r>
+    </w:p>
+    <w:p>
+      <w:pPr>
+        <w:numPr>
+          <w:ilvl w:val="1"/>
+          <w:numId w:val="10"/>
+        </w:numPr>
+        <w:rPr>
+          <w:lang w:val="it-IT"/>
+        </w:rPr>
+      </w:pPr>
+      <w:r>
+        <w:rPr>
+          <w:lang w:val="it-IT"/>
+        </w:rPr>
+        <w:t>Da report (lampeggiante o con indicatore "R") quando arriva un messaggio.</w:t>
+      </w:r>
+    </w:p>
+    <w:p>
+      <w:pPr>
+        <w:numPr>
+          <w:ilvl w:val="0"/>
+          <w:numId w:val="10"/>
+        </w:numPr>
+        <w:rPr>
+          <w:lang w:val="it-IT"/>
+        </w:rPr>
+      </w:pPr>
       <w:proofErr w:type="spellStart"/>
       <w:r>
         <w:rPr>
           <w:lang w:val="it-IT"/>
         </w:rPr>
-        <w:t>forage</w:t>
+        <w:t>Tooltip</w:t>
       </w:r>
       <w:proofErr w:type="spellEnd"/>
       <w:r>
         <w:rPr>
           <w:lang w:val="it-IT"/>
         </w:rPr>
-        <w:t>.</w:t>
-      </w:r>
-    </w:p>
-    <w:p>
-      <w:pPr>
-        <w:numPr>
-          <w:ilvl w:val="0"/>
-          <w:numId w:val="32"/>
-        </w:numPr>
-        <w:rPr>
-          <w:lang w:val="it-IT"/>
-        </w:rPr>
-      </w:pPr>
-      <w:r>
-        <w:rPr>
-          <w:lang w:val="it-IT"/>
-        </w:rPr>
-        <w:t>Il giocatore può assegnare pop alla raccolta di legna. La legna grezza viene trasportata all'accampamento.</w:t>
-      </w:r>
-    </w:p>
-    <w:p>
-      <w:pPr>
-        <w:numPr>
-          <w:ilvl w:val="0"/>
-          <w:numId w:val="32"/>
-        </w:numPr>
-        <w:rPr>
-          <w:lang w:val="it-IT"/>
-        </w:rPr>
-      </w:pPr>
-      <w:r>
-        <w:rPr>
-          <w:lang w:val="it-IT"/>
-        </w:rPr>
-        <w:t xml:space="preserve">Introduzione della lavorazione: la legna grezza può essere trasformata in </w:t>
-      </w:r>
-      <w:r>
-        <w:rPr>
-          <w:lang w:val="it-IT"/>
-        </w:rPr>
-        <w:t>tool</w:t>
-      </w:r>
-      <w:r>
-        <w:rPr>
-          <w:lang w:val="it-IT"/>
-        </w:rPr>
-        <w:t xml:space="preserve"> (azione "lavora legna" al campo). </w:t>
-      </w:r>
-    </w:p>
-    <w:p>
-      <w:pPr>
-        <w:numPr>
-          <w:ilvl w:val="0"/>
-          <w:numId w:val="32"/>
-        </w:numPr>
-        <w:rPr>
-          <w:lang w:val="it-IT"/>
-        </w:rPr>
-      </w:pPr>
-      <w:r>
-        <w:rPr>
-          <w:lang w:val="it-IT"/>
-        </w:rPr>
-        <w:t xml:space="preserve">Costruzione </w:t>
-      </w:r>
-      <w:r>
-        <w:rPr>
-          <w:lang w:val="it-IT"/>
-        </w:rPr>
-        <w:t>dei tool</w:t>
-      </w:r>
-      <w:r>
-        <w:rPr>
-          <w:lang w:val="it-IT"/>
-        </w:rPr>
-        <w:t xml:space="preserve">: consuma </w:t>
-      </w:r>
-      <w:r>
-        <w:rPr>
-          <w:lang w:val="it-IT"/>
-        </w:rPr>
-        <w:t>legna</w:t>
-      </w:r>
-      <w:r>
-        <w:rPr>
-          <w:lang w:val="it-IT"/>
-        </w:rPr>
-        <w:t xml:space="preserve">. </w:t>
-      </w:r>
-      <w:r>
-        <w:rPr>
-          <w:lang w:val="it-IT"/>
-        </w:rPr>
-        <w:t>I tool possono essere armi per la caccia, la pesca o bastoni/ceste per migliorare la raccolta delle bacche</w:t>
-      </w:r>
-    </w:p>
-    <w:p>
-      <w:pPr>
-        <w:numPr>
-          <w:ilvl w:val="0"/>
-          <w:numId w:val="32"/>
-        </w:numPr>
-        <w:rPr>
-          <w:lang w:val="it-IT"/>
-        </w:rPr>
-      </w:pPr>
-      <w:r>
-        <w:rPr>
-          <w:lang w:val="it-IT"/>
-        </w:rPr>
-        <w:t>Meccanica: la legna diventa la prima risorsa non commestibile. La lavorazione introduce il concetto di catena produttiva. Si gettano le basi per la specializzazione dei pop (raccoglitori, taglialegna, artigiani).</w:t>
+        <w:t xml:space="preserve"> base per risorse e pop.</w:t>
       </w:r>
     </w:p>
     <w:p>
@@ -2550,20 +3387,34 @@
           <w:bCs/>
           <w:lang w:val="it-IT"/>
         </w:rPr>
-        <w:t>MVP4 – Informazione imperfetta e report</w:t>
-      </w:r>
-    </w:p>
-    <w:p>
-      <w:pPr>
-        <w:rPr>
-          <w:lang w:val="it-IT"/>
-        </w:rPr>
-      </w:pPr>
-      <w:r>
-        <w:rPr>
-          <w:lang w:val="it-IT"/>
-        </w:rPr>
-        <w:t>Nessuna modifica necessaria. Le meccaniche di visibilità (certo, proiettato, da report) e di stima delle scorte sono indipendenti dal tipo di risorsa. Quando le implementeremo, applicheremo l'incertezza a tutte le risorse (cibo vegetale, carne, pesce, legna, assi).</w:t>
+        <w:t>MVP5 – Seconda tribù e territorio</w:t>
+      </w:r>
+    </w:p>
+    <w:p>
+      <w:pPr>
+        <w:rPr>
+          <w:lang w:val="it-IT"/>
+        </w:rPr>
+      </w:pPr>
+      <w:r>
+        <w:rPr>
+          <w:lang w:val="it-IT"/>
+        </w:rPr>
+        <w:t xml:space="preserve">Nessuna modifica necessaria. La competizione per le risorse funziona con qualsiasi tipo di </w:t>
+      </w:r>
+      <w:proofErr w:type="spellStart"/>
+      <w:r>
+        <w:rPr>
+          <w:lang w:val="it-IT"/>
+        </w:rPr>
+        <w:t>layer</w:t>
+      </w:r>
+      <w:proofErr w:type="spellEnd"/>
+      <w:r>
+        <w:rPr>
+          <w:lang w:val="it-IT"/>
+        </w:rPr>
+        <w:t xml:space="preserve"> o branco.</w:t>
       </w:r>
     </w:p>
     <w:p>
@@ -2591,382 +3442,133 @@
       <w:pPr>
         <w:numPr>
           <w:ilvl w:val="0"/>
-          <w:numId w:val="33"/>
-        </w:numPr>
-        <w:rPr>
-          <w:lang w:val="it-IT"/>
-        </w:rPr>
-      </w:pPr>
-      <w:r>
-        <w:rPr>
-          <w:lang w:val="it-IT"/>
-        </w:rPr>
-        <w:t>Il campo base ha una "riserva di cibo" che non conosci esattamente: vedi una stima arrotondata.</w:t>
+          <w:numId w:val="34"/>
+        </w:numPr>
+        <w:rPr>
+          <w:lang w:val="it-IT"/>
+        </w:rPr>
+      </w:pPr>
+      <w:r>
+        <w:rPr>
+          <w:lang w:val="it-IT"/>
+        </w:rPr>
+        <w:t>Una seconda tribù vicina condivide la stessa foresta e le stesse zone di cibo.</w:t>
       </w:r>
     </w:p>
     <w:p>
       <w:pPr>
         <w:numPr>
           <w:ilvl w:val="0"/>
-          <w:numId w:val="33"/>
-        </w:numPr>
-        <w:rPr>
-          <w:lang w:val="it-IT"/>
-        </w:rPr>
-      </w:pPr>
-      <w:r>
-        <w:rPr>
-          <w:lang w:val="it-IT"/>
-        </w:rPr>
-        <w:t>Per sapere quanta legna hai realmente, devi inviare qualcuno a controllare o aspettare il report di chi torna.</w:t>
+          <w:numId w:val="34"/>
+        </w:numPr>
+        <w:rPr>
+          <w:lang w:val="it-IT"/>
+        </w:rPr>
+      </w:pPr>
+      <w:r>
+        <w:rPr>
+          <w:lang w:val="it-IT"/>
+        </w:rPr>
+        <w:t>Se entrambe raccolgono o cacciano, le risorse si esauriscono prima.</w:t>
       </w:r>
     </w:p>
     <w:p>
       <w:pPr>
         <w:numPr>
           <w:ilvl w:val="0"/>
-          <w:numId w:val="33"/>
-        </w:numPr>
-        <w:rPr>
-          <w:lang w:val="it-IT"/>
-        </w:rPr>
-      </w:pPr>
-      <w:r>
-        <w:rPr>
-          <w:lang w:val="it-IT"/>
-        </w:rPr>
-        <w:t>Raggio visivo del giocatore: dove hai uomini, vedi; il resto è buio o sfocato.</w:t>
+          <w:numId w:val="34"/>
+        </w:numPr>
+        <w:rPr>
+          <w:lang w:val="it-IT"/>
+        </w:rPr>
+      </w:pPr>
+      <w:r>
+        <w:rPr>
+          <w:lang w:val="it-IT"/>
+        </w:rPr>
+        <w:t>Possibile scontro se i gruppi si incrociano (combattimento basilare).</w:t>
       </w:r>
     </w:p>
     <w:p>
       <w:pPr>
         <w:numPr>
           <w:ilvl w:val="0"/>
-          <w:numId w:val="33"/>
-        </w:numPr>
-        <w:rPr>
-          <w:lang w:val="it-IT"/>
-        </w:rPr>
-      </w:pPr>
-      <w:r>
-        <w:rPr>
-          <w:lang w:val="it-IT"/>
-        </w:rPr>
-        <w:t>I report possono essere ritardati o imprecisi in base alla distanza.</w:t>
-      </w:r>
-    </w:p>
-    <w:p>
-      <w:pPr>
-        <w:numPr>
-          <w:ilvl w:val="0"/>
-          <w:numId w:val="10"/>
-        </w:numPr>
-        <w:rPr>
-          <w:lang w:val="it-IT"/>
-        </w:rPr>
-      </w:pPr>
-      <w:r>
-        <w:rPr>
-          <w:lang w:val="it-IT"/>
-        </w:rPr>
-        <w:lastRenderedPageBreak/>
-        <w:t>Barra del tempo (velocità 1x, 2x, pausa).</w:t>
-      </w:r>
-    </w:p>
-    <w:p>
-      <w:pPr>
-        <w:numPr>
-          <w:ilvl w:val="0"/>
-          <w:numId w:val="10"/>
-        </w:numPr>
-      </w:pPr>
-      <w:proofErr w:type="spellStart"/>
-      <w:r>
-        <w:t>Indicatore</w:t>
-      </w:r>
-      <w:proofErr w:type="spellEnd"/>
-      <w:r>
-        <w:t xml:space="preserve"> di </w:t>
-      </w:r>
-      <w:proofErr w:type="spellStart"/>
-      <w:r>
-        <w:t>posizione</w:t>
-      </w:r>
-      <w:proofErr w:type="spellEnd"/>
-      <w:r>
-        <w:t>:</w:t>
-      </w:r>
-    </w:p>
-    <w:p>
-      <w:pPr>
-        <w:numPr>
-          <w:ilvl w:val="1"/>
-          <w:numId w:val="10"/>
-        </w:numPr>
-        <w:rPr>
-          <w:lang w:val="it-IT"/>
-        </w:rPr>
-      </w:pPr>
-      <w:r>
-        <w:rPr>
-          <w:lang w:val="it-IT"/>
-        </w:rPr>
-        <w:t>Certa (colore pieno) se nel raggio visivo.</w:t>
-      </w:r>
-    </w:p>
-    <w:p>
-      <w:pPr>
-        <w:numPr>
-          <w:ilvl w:val="1"/>
-          <w:numId w:val="10"/>
-        </w:numPr>
-        <w:rPr>
-          <w:lang w:val="it-IT"/>
-        </w:rPr>
-      </w:pPr>
-      <w:r>
-        <w:rPr>
-          <w:lang w:val="it-IT"/>
-        </w:rPr>
-        <w:t>Proiettata (desaturata con interpolazione) se fuori dal raggio.</w:t>
-      </w:r>
-    </w:p>
-    <w:p>
-      <w:pPr>
-        <w:numPr>
-          <w:ilvl w:val="1"/>
-          <w:numId w:val="10"/>
-        </w:numPr>
-        <w:rPr>
-          <w:lang w:val="it-IT"/>
-        </w:rPr>
-      </w:pPr>
-      <w:r>
-        <w:rPr>
-          <w:lang w:val="it-IT"/>
-        </w:rPr>
-        <w:t>Da report (lampeggiante o con indicatore "R") quando arriva un messaggio.</w:t>
-      </w:r>
-    </w:p>
-    <w:p>
-      <w:pPr>
-        <w:numPr>
-          <w:ilvl w:val="0"/>
-          <w:numId w:val="10"/>
-        </w:numPr>
-        <w:rPr>
-          <w:lang w:val="it-IT"/>
-        </w:rPr>
-      </w:pPr>
-      <w:proofErr w:type="spellStart"/>
-      <w:r>
-        <w:rPr>
-          <w:lang w:val="it-IT"/>
-        </w:rPr>
-        <w:t>Tooltip</w:t>
-      </w:r>
-      <w:proofErr w:type="spellEnd"/>
-      <w:r>
-        <w:rPr>
-          <w:lang w:val="it-IT"/>
-        </w:rPr>
-        <w:t xml:space="preserve"> base per risorse e pop.</w:t>
-      </w:r>
-    </w:p>
-    <w:p>
-      <w:pPr>
-        <w:rPr>
-          <w:lang w:val="it-IT"/>
-        </w:rPr>
-      </w:pPr>
-      <w:r>
+          <w:numId w:val="34"/>
+        </w:numPr>
+        <w:rPr>
+          <w:lang w:val="it-IT"/>
+        </w:rPr>
+      </w:pPr>
+      <w:r>
+        <w:rPr>
+          <w:lang w:val="it-IT"/>
+        </w:rPr>
+        <w:t>Inizio del concetto di "territorio d'uso": la risorsa è di chi la sta usando.</w:t>
+      </w:r>
+    </w:p>
+    <w:p>
+      <w:pPr>
+        <w:rPr>
+          <w:lang w:val="it-IT"/>
+        </w:rPr>
+      </w:pPr>
+    </w:p>
+    <w:p>
+      <w:pPr>
         <w:rPr>
           <w:b/>
           <w:bCs/>
           <w:lang w:val="it-IT"/>
         </w:rPr>
-        <w:t>MVP5 – Seconda tribù e territorio</w:t>
-      </w:r>
-    </w:p>
-    <w:p>
-      <w:pPr>
-        <w:rPr>
-          <w:lang w:val="it-IT"/>
-        </w:rPr>
-      </w:pPr>
-      <w:r>
-        <w:rPr>
-          <w:lang w:val="it-IT"/>
-        </w:rPr>
-        <w:t xml:space="preserve">Nessuna modifica necessaria. La competizione per le risorse funziona con qualsiasi tipo di </w:t>
-      </w:r>
-      <w:proofErr w:type="spellStart"/>
-      <w:r>
-        <w:rPr>
-          <w:lang w:val="it-IT"/>
-        </w:rPr>
-        <w:t>layer</w:t>
-      </w:r>
-      <w:proofErr w:type="spellEnd"/>
-      <w:r>
-        <w:rPr>
-          <w:lang w:val="it-IT"/>
-        </w:rPr>
-        <w:t xml:space="preserve"> o branco.</w:t>
-      </w:r>
-    </w:p>
-    <w:p>
-      <w:r>
-        <w:t xml:space="preserve">Testo </w:t>
-      </w:r>
-      <w:proofErr w:type="spellStart"/>
-      <w:r>
-        <w:t>attuale</w:t>
-      </w:r>
-      <w:proofErr w:type="spellEnd"/>
-      <w:r>
-        <w:t xml:space="preserve"> </w:t>
-      </w:r>
-      <w:proofErr w:type="spellStart"/>
-      <w:r>
-        <w:t>confermato</w:t>
-      </w:r>
-      <w:proofErr w:type="spellEnd"/>
-      <w:r>
-        <w:t>:</w:t>
-      </w:r>
-    </w:p>
-    <w:p>
-      <w:pPr>
-        <w:numPr>
-          <w:ilvl w:val="0"/>
-          <w:numId w:val="34"/>
-        </w:numPr>
-        <w:rPr>
-          <w:lang w:val="it-IT"/>
-        </w:rPr>
-      </w:pPr>
-      <w:r>
-        <w:rPr>
-          <w:lang w:val="it-IT"/>
-        </w:rPr>
-        <w:t>Una seconda tribù vicina condivide la stessa foresta e le stesse zone di cibo.</w:t>
-      </w:r>
-    </w:p>
-    <w:p>
-      <w:pPr>
-        <w:numPr>
-          <w:ilvl w:val="0"/>
-          <w:numId w:val="34"/>
-        </w:numPr>
-        <w:rPr>
-          <w:lang w:val="it-IT"/>
-        </w:rPr>
-      </w:pPr>
-      <w:r>
-        <w:rPr>
-          <w:lang w:val="it-IT"/>
-        </w:rPr>
-        <w:t>Se entrambe raccolgono o cacciano, le risorse si esauriscono prima.</w:t>
-      </w:r>
-    </w:p>
-    <w:p>
-      <w:pPr>
-        <w:numPr>
-          <w:ilvl w:val="0"/>
-          <w:numId w:val="34"/>
-        </w:numPr>
-        <w:rPr>
-          <w:lang w:val="it-IT"/>
-        </w:rPr>
-      </w:pPr>
-      <w:r>
-        <w:rPr>
-          <w:lang w:val="it-IT"/>
-        </w:rPr>
-        <w:t>Possibile scontro se i gruppi si incrociano (combattimento basilare).</w:t>
-      </w:r>
-    </w:p>
-    <w:p>
-      <w:pPr>
-        <w:numPr>
-          <w:ilvl w:val="0"/>
-          <w:numId w:val="34"/>
-        </w:numPr>
-        <w:rPr>
-          <w:lang w:val="it-IT"/>
-        </w:rPr>
-      </w:pPr>
-      <w:r>
-        <w:rPr>
-          <w:lang w:val="it-IT"/>
-        </w:rPr>
-        <w:t>Inizio del concetto di "territorio d'uso": la risorsa è di chi la sta usando.</w:t>
-      </w:r>
-    </w:p>
-    <w:p>
-      <w:pPr>
-        <w:rPr>
-          <w:lang w:val="it-IT"/>
-        </w:rPr>
-      </w:pPr>
-    </w:p>
-    <w:p>
-      <w:pPr>
+      </w:pPr>
+      <w:r>
         <w:rPr>
           <w:b/>
           <w:bCs/>
           <w:lang w:val="it-IT"/>
         </w:rPr>
-      </w:pPr>
-      <w:r>
+        <w:t>CONCETTI DA RECUPERARE POI:</w:t>
+      </w:r>
+    </w:p>
+    <w:p>
+      <w:pPr>
+        <w:pStyle w:val="ListParagraph"/>
+        <w:numPr>
+          <w:ilvl w:val="0"/>
+          <w:numId w:val="35"/>
+        </w:numPr>
+        <w:rPr>
+          <w:lang w:val="it-IT"/>
+        </w:rPr>
+      </w:pPr>
+      <w:r>
+        <w:rPr>
+          <w:lang w:val="it-IT"/>
+        </w:rPr>
+        <w:t>Deterioramento risorse</w:t>
+      </w:r>
+    </w:p>
+    <w:p>
+      <w:pPr>
+        <w:rPr>
+          <w:lang w:val="it-IT"/>
+        </w:rPr>
+      </w:pPr>
+    </w:p>
+    <w:p>
+      <w:pPr>
         <w:rPr>
           <w:b/>
           <w:bCs/>
           <w:lang w:val="it-IT"/>
         </w:rPr>
-        <w:t>CONCETTI DA RECUPERARE POI:</w:t>
-      </w:r>
-    </w:p>
-    <w:p>
-      <w:pPr>
-        <w:pStyle w:val="ListParagraph"/>
-        <w:numPr>
-          <w:ilvl w:val="0"/>
-          <w:numId w:val="35"/>
-        </w:numPr>
-        <w:rPr>
-          <w:lang w:val="it-IT"/>
-        </w:rPr>
-      </w:pPr>
-      <w:r>
-        <w:rPr>
-          <w:lang w:val="it-IT"/>
-        </w:rPr>
-        <w:t>Deterioramento risorse</w:t>
-      </w:r>
-    </w:p>
-    <w:p>
-      <w:pPr>
-        <w:rPr>
-          <w:lang w:val="it-IT"/>
-        </w:rPr>
-      </w:pPr>
-    </w:p>
-    <w:p>
-      <w:pPr>
+      </w:pPr>
+      <w:r>
         <w:rPr>
           <w:b/>
           <w:bCs/>
           <w:lang w:val="it-IT"/>
         </w:rPr>
-      </w:pPr>
-      <w:r>
-        <w:rPr>
-          <w:b/>
-          <w:bCs/>
-          <w:lang w:val="it-IT"/>
-        </w:rPr>
         <w:t>Oltre MVP5</w:t>
       </w:r>
     </w:p>
@@ -2980,6 +3582,7 @@
         <w:rPr>
           <w:lang w:val="it-IT"/>
         </w:rPr>
+        <w:lastRenderedPageBreak/>
         <w:t>Le iterazioni successive del prototipo seguiranno la progressione storica (Era 1: stanzialità, agricoltura, prime strutture; Era 2: metalli, scrittura, amministrazione; ecc.), sbloccando funzionalità corrispondenti man mano che le fondamenta tecniche lo permettono. La priorità sarà sempre validare il loop di base prima di aggiungere complessità.</w:t>
       </w:r>
     </w:p>
@@ -3704,7 +4307,7 @@
   <w:abstractNum w:abstractNumId="5" w15:restartNumberingAfterBreak="0">
     <w:nsid w:val="0A1C7A37"/>
     <w:multiLevelType w:val="hybridMultilevel"/>
-    <w:tmpl w:val="B51A131A"/>
+    <w:tmpl w:val="91D624F2"/>
     <w:lvl w:ilvl="0" w:tplc="FAA67352">
       <w:numFmt w:val="bullet"/>
       <w:lvlText w:val="-"/>
@@ -3814,6 +4417,155 @@
     </w:lvl>
   </w:abstractNum>
   <w:abstractNum w:abstractNumId="6" w15:restartNumberingAfterBreak="0">
+    <w:nsid w:val="109C5F21"/>
+    <w:multiLevelType w:val="multilevel"/>
+    <w:tmpl w:val="A322F550"/>
+    <w:lvl w:ilvl="0">
+      <w:start w:val="1"/>
+      <w:numFmt w:val="bullet"/>
+      <w:lvlText w:val=""/>
+      <w:lvlJc w:val="left"/>
+      <w:pPr>
+        <w:tabs>
+          <w:tab w:val="num" w:pos="720"/>
+        </w:tabs>
+        <w:ind w:left="720" w:hanging="360"/>
+      </w:pPr>
+      <w:rPr>
+        <w:rFonts w:ascii="Symbol" w:hAnsi="Symbol" w:hint="default"/>
+        <w:sz w:val="20"/>
+      </w:rPr>
+    </w:lvl>
+    <w:lvl w:ilvl="1" w:tentative="1">
+      <w:start w:val="1"/>
+      <w:numFmt w:val="bullet"/>
+      <w:lvlText w:val="o"/>
+      <w:lvlJc w:val="left"/>
+      <w:pPr>
+        <w:tabs>
+          <w:tab w:val="num" w:pos="1440"/>
+        </w:tabs>
+        <w:ind w:left="1440" w:hanging="360"/>
+      </w:pPr>
+      <w:rPr>
+        <w:rFonts w:ascii="Courier New" w:hAnsi="Courier New" w:hint="default"/>
+        <w:sz w:val="20"/>
+      </w:rPr>
+    </w:lvl>
+    <w:lvl w:ilvl="2" w:tentative="1">
+      <w:start w:val="1"/>
+      <w:numFmt w:val="bullet"/>
+      <w:lvlText w:val=""/>
+      <w:lvlJc w:val="left"/>
+      <w:pPr>
+        <w:tabs>
+          <w:tab w:val="num" w:pos="2160"/>
+        </w:tabs>
+        <w:ind w:left="2160" w:hanging="360"/>
+      </w:pPr>
+      <w:rPr>
+        <w:rFonts w:ascii="Wingdings" w:hAnsi="Wingdings" w:hint="default"/>
+        <w:sz w:val="20"/>
+      </w:rPr>
+    </w:lvl>
+    <w:lvl w:ilvl="3" w:tentative="1">
+      <w:start w:val="1"/>
+      <w:numFmt w:val="bullet"/>
+      <w:lvlText w:val=""/>
+      <w:lvlJc w:val="left"/>
+      <w:pPr>
+        <w:tabs>
+          <w:tab w:val="num" w:pos="2880"/>
+        </w:tabs>
+        <w:ind w:left="2880" w:hanging="360"/>
+      </w:pPr>
+      <w:rPr>
+        <w:rFonts w:ascii="Wingdings" w:hAnsi="Wingdings" w:hint="default"/>
+        <w:sz w:val="20"/>
+      </w:rPr>
+    </w:lvl>
+    <w:lvl w:ilvl="4" w:tentative="1">
+      <w:start w:val="1"/>
+      <w:numFmt w:val="bullet"/>
+      <w:lvlText w:val=""/>
+      <w:lvlJc w:val="left"/>
+      <w:pPr>
+        <w:tabs>
+          <w:tab w:val="num" w:pos="3600"/>
+        </w:tabs>
+        <w:ind w:left="3600" w:hanging="360"/>
+      </w:pPr>
+      <w:rPr>
+        <w:rFonts w:ascii="Wingdings" w:hAnsi="Wingdings" w:hint="default"/>
+        <w:sz w:val="20"/>
+      </w:rPr>
+    </w:lvl>
+    <w:lvl w:ilvl="5" w:tentative="1">
+      <w:start w:val="1"/>
+      <w:numFmt w:val="bullet"/>
+      <w:lvlText w:val=""/>
+      <w:lvlJc w:val="left"/>
+      <w:pPr>
+        <w:tabs>
+          <w:tab w:val="num" w:pos="4320"/>
+        </w:tabs>
+        <w:ind w:left="4320" w:hanging="360"/>
+      </w:pPr>
+      <w:rPr>
+        <w:rFonts w:ascii="Wingdings" w:hAnsi="Wingdings" w:hint="default"/>
+        <w:sz w:val="20"/>
+      </w:rPr>
+    </w:lvl>
+    <w:lvl w:ilvl="6" w:tentative="1">
+      <w:start w:val="1"/>
+      <w:numFmt w:val="bullet"/>
+      <w:lvlText w:val=""/>
+      <w:lvlJc w:val="left"/>
+      <w:pPr>
+        <w:tabs>
+          <w:tab w:val="num" w:pos="5040"/>
+        </w:tabs>
+        <w:ind w:left="5040" w:hanging="360"/>
+      </w:pPr>
+      <w:rPr>
+        <w:rFonts w:ascii="Wingdings" w:hAnsi="Wingdings" w:hint="default"/>
+        <w:sz w:val="20"/>
+      </w:rPr>
+    </w:lvl>
+    <w:lvl w:ilvl="7" w:tentative="1">
+      <w:start w:val="1"/>
+      <w:numFmt w:val="bullet"/>
+      <w:lvlText w:val=""/>
+      <w:lvlJc w:val="left"/>
+      <w:pPr>
+        <w:tabs>
+          <w:tab w:val="num" w:pos="5760"/>
+        </w:tabs>
+        <w:ind w:left="5760" w:hanging="360"/>
+      </w:pPr>
+      <w:rPr>
+        <w:rFonts w:ascii="Wingdings" w:hAnsi="Wingdings" w:hint="default"/>
+        <w:sz w:val="20"/>
+      </w:rPr>
+    </w:lvl>
+    <w:lvl w:ilvl="8" w:tentative="1">
+      <w:start w:val="1"/>
+      <w:numFmt w:val="bullet"/>
+      <w:lvlText w:val=""/>
+      <w:lvlJc w:val="left"/>
+      <w:pPr>
+        <w:tabs>
+          <w:tab w:val="num" w:pos="6480"/>
+        </w:tabs>
+        <w:ind w:left="6480" w:hanging="360"/>
+      </w:pPr>
+      <w:rPr>
+        <w:rFonts w:ascii="Wingdings" w:hAnsi="Wingdings" w:hint="default"/>
+        <w:sz w:val="20"/>
+      </w:rPr>
+    </w:lvl>
+  </w:abstractNum>
+  <w:abstractNum w:abstractNumId="7" w15:restartNumberingAfterBreak="0">
     <w:nsid w:val="127B248F"/>
     <w:multiLevelType w:val="multilevel"/>
     <w:tmpl w:val="69F09910"/>
@@ -3926,7 +4678,7 @@
       </w:pPr>
     </w:lvl>
   </w:abstractNum>
-  <w:abstractNum w:abstractNumId="7" w15:restartNumberingAfterBreak="0">
+  <w:abstractNum w:abstractNumId="8" w15:restartNumberingAfterBreak="0">
     <w:nsid w:val="131A0DBD"/>
     <w:multiLevelType w:val="multilevel"/>
     <w:tmpl w:val="7668DF54"/>
@@ -4075,7 +4827,7 @@
       </w:rPr>
     </w:lvl>
   </w:abstractNum>
-  <w:abstractNum w:abstractNumId="8" w15:restartNumberingAfterBreak="0">
+  <w:abstractNum w:abstractNumId="9" w15:restartNumberingAfterBreak="0">
     <w:nsid w:val="15FE68FE"/>
     <w:multiLevelType w:val="multilevel"/>
     <w:tmpl w:val="65F83AEE"/>
@@ -4224,7 +4976,7 @@
       </w:rPr>
     </w:lvl>
   </w:abstractNum>
-  <w:abstractNum w:abstractNumId="9" w15:restartNumberingAfterBreak="0">
+  <w:abstractNum w:abstractNumId="10" w15:restartNumberingAfterBreak="0">
     <w:nsid w:val="17235FE1"/>
     <w:multiLevelType w:val="multilevel"/>
     <w:tmpl w:val="F34AE5A0"/>
@@ -4373,7 +5125,7 @@
       </w:rPr>
     </w:lvl>
   </w:abstractNum>
-  <w:abstractNum w:abstractNumId="10" w15:restartNumberingAfterBreak="0">
+  <w:abstractNum w:abstractNumId="11" w15:restartNumberingAfterBreak="0">
     <w:nsid w:val="1996508A"/>
     <w:multiLevelType w:val="multilevel"/>
     <w:tmpl w:val="F198151A"/>
@@ -4522,7 +5274,7 @@
       </w:rPr>
     </w:lvl>
   </w:abstractNum>
-  <w:abstractNum w:abstractNumId="11" w15:restartNumberingAfterBreak="0">
+  <w:abstractNum w:abstractNumId="12" w15:restartNumberingAfterBreak="0">
     <w:nsid w:val="1A7819A8"/>
     <w:multiLevelType w:val="multilevel"/>
     <w:tmpl w:val="10E466CE"/>
@@ -4671,7 +5423,7 @@
       </w:rPr>
     </w:lvl>
   </w:abstractNum>
-  <w:abstractNum w:abstractNumId="12" w15:restartNumberingAfterBreak="0">
+  <w:abstractNum w:abstractNumId="13" w15:restartNumberingAfterBreak="0">
     <w:nsid w:val="1DE16D1E"/>
     <w:multiLevelType w:val="multilevel"/>
     <w:tmpl w:val="D0AA7ED4"/>
@@ -4820,7 +5572,7 @@
       </w:rPr>
     </w:lvl>
   </w:abstractNum>
-  <w:abstractNum w:abstractNumId="13" w15:restartNumberingAfterBreak="0">
+  <w:abstractNum w:abstractNumId="14" w15:restartNumberingAfterBreak="0">
     <w:nsid w:val="21DA54DB"/>
     <w:multiLevelType w:val="multilevel"/>
     <w:tmpl w:val="2FFAF406"/>
@@ -4969,7 +5721,7 @@
       </w:rPr>
     </w:lvl>
   </w:abstractNum>
-  <w:abstractNum w:abstractNumId="14" w15:restartNumberingAfterBreak="0">
+  <w:abstractNum w:abstractNumId="15" w15:restartNumberingAfterBreak="0">
     <w:nsid w:val="25322051"/>
     <w:multiLevelType w:val="multilevel"/>
     <w:tmpl w:val="E05A99D0"/>
@@ -5118,7 +5870,156 @@
       </w:rPr>
     </w:lvl>
   </w:abstractNum>
-  <w:abstractNum w:abstractNumId="15" w15:restartNumberingAfterBreak="0">
+  <w:abstractNum w:abstractNumId="16" w15:restartNumberingAfterBreak="0">
+    <w:nsid w:val="28724FDF"/>
+    <w:multiLevelType w:val="multilevel"/>
+    <w:tmpl w:val="A322F550"/>
+    <w:lvl w:ilvl="0">
+      <w:start w:val="1"/>
+      <w:numFmt w:val="bullet"/>
+      <w:lvlText w:val=""/>
+      <w:lvlJc w:val="left"/>
+      <w:pPr>
+        <w:tabs>
+          <w:tab w:val="num" w:pos="720"/>
+        </w:tabs>
+        <w:ind w:left="720" w:hanging="360"/>
+      </w:pPr>
+      <w:rPr>
+        <w:rFonts w:ascii="Symbol" w:hAnsi="Symbol" w:hint="default"/>
+        <w:sz w:val="20"/>
+      </w:rPr>
+    </w:lvl>
+    <w:lvl w:ilvl="1" w:tentative="1">
+      <w:start w:val="1"/>
+      <w:numFmt w:val="bullet"/>
+      <w:lvlText w:val="o"/>
+      <w:lvlJc w:val="left"/>
+      <w:pPr>
+        <w:tabs>
+          <w:tab w:val="num" w:pos="1440"/>
+        </w:tabs>
+        <w:ind w:left="1440" w:hanging="360"/>
+      </w:pPr>
+      <w:rPr>
+        <w:rFonts w:ascii="Courier New" w:hAnsi="Courier New" w:hint="default"/>
+        <w:sz w:val="20"/>
+      </w:rPr>
+    </w:lvl>
+    <w:lvl w:ilvl="2" w:tentative="1">
+      <w:start w:val="1"/>
+      <w:numFmt w:val="bullet"/>
+      <w:lvlText w:val=""/>
+      <w:lvlJc w:val="left"/>
+      <w:pPr>
+        <w:tabs>
+          <w:tab w:val="num" w:pos="2160"/>
+        </w:tabs>
+        <w:ind w:left="2160" w:hanging="360"/>
+      </w:pPr>
+      <w:rPr>
+        <w:rFonts w:ascii="Wingdings" w:hAnsi="Wingdings" w:hint="default"/>
+        <w:sz w:val="20"/>
+      </w:rPr>
+    </w:lvl>
+    <w:lvl w:ilvl="3" w:tentative="1">
+      <w:start w:val="1"/>
+      <w:numFmt w:val="bullet"/>
+      <w:lvlText w:val=""/>
+      <w:lvlJc w:val="left"/>
+      <w:pPr>
+        <w:tabs>
+          <w:tab w:val="num" w:pos="2880"/>
+        </w:tabs>
+        <w:ind w:left="2880" w:hanging="360"/>
+      </w:pPr>
+      <w:rPr>
+        <w:rFonts w:ascii="Wingdings" w:hAnsi="Wingdings" w:hint="default"/>
+        <w:sz w:val="20"/>
+      </w:rPr>
+    </w:lvl>
+    <w:lvl w:ilvl="4" w:tentative="1">
+      <w:start w:val="1"/>
+      <w:numFmt w:val="bullet"/>
+      <w:lvlText w:val=""/>
+      <w:lvlJc w:val="left"/>
+      <w:pPr>
+        <w:tabs>
+          <w:tab w:val="num" w:pos="3600"/>
+        </w:tabs>
+        <w:ind w:left="3600" w:hanging="360"/>
+      </w:pPr>
+      <w:rPr>
+        <w:rFonts w:ascii="Wingdings" w:hAnsi="Wingdings" w:hint="default"/>
+        <w:sz w:val="20"/>
+      </w:rPr>
+    </w:lvl>
+    <w:lvl w:ilvl="5" w:tentative="1">
+      <w:start w:val="1"/>
+      <w:numFmt w:val="bullet"/>
+      <w:lvlText w:val=""/>
+      <w:lvlJc w:val="left"/>
+      <w:pPr>
+        <w:tabs>
+          <w:tab w:val="num" w:pos="4320"/>
+        </w:tabs>
+        <w:ind w:left="4320" w:hanging="360"/>
+      </w:pPr>
+      <w:rPr>
+        <w:rFonts w:ascii="Wingdings" w:hAnsi="Wingdings" w:hint="default"/>
+        <w:sz w:val="20"/>
+      </w:rPr>
+    </w:lvl>
+    <w:lvl w:ilvl="6" w:tentative="1">
+      <w:start w:val="1"/>
+      <w:numFmt w:val="bullet"/>
+      <w:lvlText w:val=""/>
+      <w:lvlJc w:val="left"/>
+      <w:pPr>
+        <w:tabs>
+          <w:tab w:val="num" w:pos="5040"/>
+        </w:tabs>
+        <w:ind w:left="5040" w:hanging="360"/>
+      </w:pPr>
+      <w:rPr>
+        <w:rFonts w:ascii="Wingdings" w:hAnsi="Wingdings" w:hint="default"/>
+        <w:sz w:val="20"/>
+      </w:rPr>
+    </w:lvl>
+    <w:lvl w:ilvl="7" w:tentative="1">
+      <w:start w:val="1"/>
+      <w:numFmt w:val="bullet"/>
+      <w:lvlText w:val=""/>
+      <w:lvlJc w:val="left"/>
+      <w:pPr>
+        <w:tabs>
+          <w:tab w:val="num" w:pos="5760"/>
+        </w:tabs>
+        <w:ind w:left="5760" w:hanging="360"/>
+      </w:pPr>
+      <w:rPr>
+        <w:rFonts w:ascii="Wingdings" w:hAnsi="Wingdings" w:hint="default"/>
+        <w:sz w:val="20"/>
+      </w:rPr>
+    </w:lvl>
+    <w:lvl w:ilvl="8" w:tentative="1">
+      <w:start w:val="1"/>
+      <w:numFmt w:val="bullet"/>
+      <w:lvlText w:val=""/>
+      <w:lvlJc w:val="left"/>
+      <w:pPr>
+        <w:tabs>
+          <w:tab w:val="num" w:pos="6480"/>
+        </w:tabs>
+        <w:ind w:left="6480" w:hanging="360"/>
+      </w:pPr>
+      <w:rPr>
+        <w:rFonts w:ascii="Wingdings" w:hAnsi="Wingdings" w:hint="default"/>
+        <w:sz w:val="20"/>
+      </w:rPr>
+    </w:lvl>
+  </w:abstractNum>
+  <w:abstractNum w:abstractNumId="17" w15:restartNumberingAfterBreak="0">
     <w:nsid w:val="2CA60B07"/>
     <w:multiLevelType w:val="multilevel"/>
     <w:tmpl w:val="85FA6EEA"/>
@@ -5267,7 +6168,7 @@
       </w:rPr>
     </w:lvl>
   </w:abstractNum>
-  <w:abstractNum w:abstractNumId="16" w15:restartNumberingAfterBreak="0">
+  <w:abstractNum w:abstractNumId="18" w15:restartNumberingAfterBreak="0">
     <w:nsid w:val="2DF54639"/>
     <w:multiLevelType w:val="multilevel"/>
     <w:tmpl w:val="51F6A5B8"/>
@@ -5416,7 +6317,7 @@
       </w:rPr>
     </w:lvl>
   </w:abstractNum>
-  <w:abstractNum w:abstractNumId="17" w15:restartNumberingAfterBreak="0">
+  <w:abstractNum w:abstractNumId="19" w15:restartNumberingAfterBreak="0">
     <w:nsid w:val="31640CA4"/>
     <w:multiLevelType w:val="multilevel"/>
     <w:tmpl w:val="6806343C"/>
@@ -5533,7 +6434,7 @@
       </w:pPr>
     </w:lvl>
   </w:abstractNum>
-  <w:abstractNum w:abstractNumId="18" w15:restartNumberingAfterBreak="0">
+  <w:abstractNum w:abstractNumId="20" w15:restartNumberingAfterBreak="0">
     <w:nsid w:val="398F5129"/>
     <w:multiLevelType w:val="multilevel"/>
     <w:tmpl w:val="A322F550"/>
@@ -5682,7 +6583,7 @@
       </w:rPr>
     </w:lvl>
   </w:abstractNum>
-  <w:abstractNum w:abstractNumId="19" w15:restartNumberingAfterBreak="0">
+  <w:abstractNum w:abstractNumId="21" w15:restartNumberingAfterBreak="0">
     <w:nsid w:val="3CAC5FF4"/>
     <w:multiLevelType w:val="multilevel"/>
     <w:tmpl w:val="BFBC23AA"/>
@@ -5831,7 +6732,93 @@
       </w:rPr>
     </w:lvl>
   </w:abstractNum>
-  <w:abstractNum w:abstractNumId="20" w15:restartNumberingAfterBreak="0">
+  <w:abstractNum w:abstractNumId="22" w15:restartNumberingAfterBreak="0">
+    <w:nsid w:val="44FB0F4F"/>
+    <w:multiLevelType w:val="hybridMultilevel"/>
+    <w:tmpl w:val="EAE60CA6"/>
+    <w:lvl w:ilvl="0" w:tplc="0809000F">
+      <w:start w:val="1"/>
+      <w:numFmt w:val="decimal"/>
+      <w:lvlText w:val="%1."/>
+      <w:lvlJc w:val="left"/>
+      <w:pPr>
+        <w:ind w:left="1080" w:hanging="360"/>
+      </w:pPr>
+    </w:lvl>
+    <w:lvl w:ilvl="1" w:tplc="08090019" w:tentative="1">
+      <w:start w:val="1"/>
+      <w:numFmt w:val="lowerLetter"/>
+      <w:lvlText w:val="%2."/>
+      <w:lvlJc w:val="left"/>
+      <w:pPr>
+        <w:ind w:left="1800" w:hanging="360"/>
+      </w:pPr>
+    </w:lvl>
+    <w:lvl w:ilvl="2" w:tplc="0809001B" w:tentative="1">
+      <w:start w:val="1"/>
+      <w:numFmt w:val="lowerRoman"/>
+      <w:lvlText w:val="%3."/>
+      <w:lvlJc w:val="right"/>
+      <w:pPr>
+        <w:ind w:left="2520" w:hanging="180"/>
+      </w:pPr>
+    </w:lvl>
+    <w:lvl w:ilvl="3" w:tplc="0809000F" w:tentative="1">
+      <w:start w:val="1"/>
+      <w:numFmt w:val="decimal"/>
+      <w:lvlText w:val="%4."/>
+      <w:lvlJc w:val="left"/>
+      <w:pPr>
+        <w:ind w:left="3240" w:hanging="360"/>
+      </w:pPr>
+    </w:lvl>
+    <w:lvl w:ilvl="4" w:tplc="08090019" w:tentative="1">
+      <w:start w:val="1"/>
+      <w:numFmt w:val="lowerLetter"/>
+      <w:lvlText w:val="%5."/>
+      <w:lvlJc w:val="left"/>
+      <w:pPr>
+        <w:ind w:left="3960" w:hanging="360"/>
+      </w:pPr>
+    </w:lvl>
+    <w:lvl w:ilvl="5" w:tplc="0809001B" w:tentative="1">
+      <w:start w:val="1"/>
+      <w:numFmt w:val="lowerRoman"/>
+      <w:lvlText w:val="%6."/>
+      <w:lvlJc w:val="right"/>
+      <w:pPr>
+        <w:ind w:left="4680" w:hanging="180"/>
+      </w:pPr>
+    </w:lvl>
+    <w:lvl w:ilvl="6" w:tplc="0809000F" w:tentative="1">
+      <w:start w:val="1"/>
+      <w:numFmt w:val="decimal"/>
+      <w:lvlText w:val="%7."/>
+      <w:lvlJc w:val="left"/>
+      <w:pPr>
+        <w:ind w:left="5400" w:hanging="360"/>
+      </w:pPr>
+    </w:lvl>
+    <w:lvl w:ilvl="7" w:tplc="08090019" w:tentative="1">
+      <w:start w:val="1"/>
+      <w:numFmt w:val="lowerLetter"/>
+      <w:lvlText w:val="%8."/>
+      <w:lvlJc w:val="left"/>
+      <w:pPr>
+        <w:ind w:left="6120" w:hanging="360"/>
+      </w:pPr>
+    </w:lvl>
+    <w:lvl w:ilvl="8" w:tplc="0809001B" w:tentative="1">
+      <w:start w:val="1"/>
+      <w:numFmt w:val="lowerRoman"/>
+      <w:lvlText w:val="%9."/>
+      <w:lvlJc w:val="right"/>
+      <w:pPr>
+        <w:ind w:left="6840" w:hanging="180"/>
+      </w:pPr>
+    </w:lvl>
+  </w:abstractNum>
+  <w:abstractNum w:abstractNumId="23" w15:restartNumberingAfterBreak="0">
     <w:nsid w:val="4BE4348C"/>
     <w:multiLevelType w:val="multilevel"/>
     <w:tmpl w:val="1A58024C"/>
@@ -5980,7 +6967,7 @@
       </w:rPr>
     </w:lvl>
   </w:abstractNum>
-  <w:abstractNum w:abstractNumId="21" w15:restartNumberingAfterBreak="0">
+  <w:abstractNum w:abstractNumId="24" w15:restartNumberingAfterBreak="0">
     <w:nsid w:val="4C046A48"/>
     <w:multiLevelType w:val="multilevel"/>
     <w:tmpl w:val="2340BCD6"/>
@@ -6129,7 +7116,7 @@
       </w:rPr>
     </w:lvl>
   </w:abstractNum>
-  <w:abstractNum w:abstractNumId="22" w15:restartNumberingAfterBreak="0">
+  <w:abstractNum w:abstractNumId="25" w15:restartNumberingAfterBreak="0">
     <w:nsid w:val="4D186818"/>
     <w:multiLevelType w:val="multilevel"/>
     <w:tmpl w:val="6A7EED2E"/>
@@ -6278,7 +7265,7 @@
       </w:rPr>
     </w:lvl>
   </w:abstractNum>
-  <w:abstractNum w:abstractNumId="23" w15:restartNumberingAfterBreak="0">
+  <w:abstractNum w:abstractNumId="26" w15:restartNumberingAfterBreak="0">
     <w:nsid w:val="4D7C5B44"/>
     <w:multiLevelType w:val="multilevel"/>
     <w:tmpl w:val="0DFE325A"/>
@@ -6427,7 +7414,7 @@
       </w:rPr>
     </w:lvl>
   </w:abstractNum>
-  <w:abstractNum w:abstractNumId="24" w15:restartNumberingAfterBreak="0">
+  <w:abstractNum w:abstractNumId="27" w15:restartNumberingAfterBreak="0">
     <w:nsid w:val="4E5C6A14"/>
     <w:multiLevelType w:val="multilevel"/>
     <w:tmpl w:val="A24A7FAC"/>
@@ -6576,7 +7563,7 @@
       </w:rPr>
     </w:lvl>
   </w:abstractNum>
-  <w:abstractNum w:abstractNumId="25" w15:restartNumberingAfterBreak="0">
+  <w:abstractNum w:abstractNumId="28" w15:restartNumberingAfterBreak="0">
     <w:nsid w:val="538273CB"/>
     <w:multiLevelType w:val="multilevel"/>
     <w:tmpl w:val="0C66EB3A"/>
@@ -6725,7 +7712,7 @@
       </w:rPr>
     </w:lvl>
   </w:abstractNum>
-  <w:abstractNum w:abstractNumId="26" w15:restartNumberingAfterBreak="0">
+  <w:abstractNum w:abstractNumId="29" w15:restartNumberingAfterBreak="0">
     <w:nsid w:val="5AAF3F94"/>
     <w:multiLevelType w:val="multilevel"/>
     <w:tmpl w:val="A9F486C6"/>
@@ -6874,7 +7861,7 @@
       </w:rPr>
     </w:lvl>
   </w:abstractNum>
-  <w:abstractNum w:abstractNumId="27" w15:restartNumberingAfterBreak="0">
+  <w:abstractNum w:abstractNumId="30" w15:restartNumberingAfterBreak="0">
     <w:nsid w:val="60BB2048"/>
     <w:multiLevelType w:val="multilevel"/>
     <w:tmpl w:val="3DAC4EA6"/>
@@ -7023,7 +8010,7 @@
       </w:rPr>
     </w:lvl>
   </w:abstractNum>
-  <w:abstractNum w:abstractNumId="28" w15:restartNumberingAfterBreak="0">
+  <w:abstractNum w:abstractNumId="31" w15:restartNumberingAfterBreak="0">
     <w:nsid w:val="62A77596"/>
     <w:multiLevelType w:val="multilevel"/>
     <w:tmpl w:val="A1F830BA"/>
@@ -7172,7 +8159,7 @@
       </w:rPr>
     </w:lvl>
   </w:abstractNum>
-  <w:abstractNum w:abstractNumId="29" w15:restartNumberingAfterBreak="0">
+  <w:abstractNum w:abstractNumId="32" w15:restartNumberingAfterBreak="0">
     <w:nsid w:val="64206F26"/>
     <w:multiLevelType w:val="multilevel"/>
     <w:tmpl w:val="84B80140"/>
@@ -7321,7 +8308,120 @@
       </w:rPr>
     </w:lvl>
   </w:abstractNum>
-  <w:abstractNum w:abstractNumId="30" w15:restartNumberingAfterBreak="0">
+  <w:abstractNum w:abstractNumId="33" w15:restartNumberingAfterBreak="0">
+    <w:nsid w:val="65B1153F"/>
+    <w:multiLevelType w:val="hybridMultilevel"/>
+    <w:tmpl w:val="B0ECFF54"/>
+    <w:lvl w:ilvl="0" w:tplc="08090001">
+      <w:start w:val="1"/>
+      <w:numFmt w:val="bullet"/>
+      <w:lvlText w:val=""/>
+      <w:lvlJc w:val="left"/>
+      <w:pPr>
+        <w:ind w:left="720" w:hanging="360"/>
+      </w:pPr>
+      <w:rPr>
+        <w:rFonts w:ascii="Symbol" w:hAnsi="Symbol" w:hint="default"/>
+      </w:rPr>
+    </w:lvl>
+    <w:lvl w:ilvl="1" w:tplc="08090003" w:tentative="1">
+      <w:start w:val="1"/>
+      <w:numFmt w:val="bullet"/>
+      <w:lvlText w:val="o"/>
+      <w:lvlJc w:val="left"/>
+      <w:pPr>
+        <w:ind w:left="1440" w:hanging="360"/>
+      </w:pPr>
+      <w:rPr>
+        <w:rFonts w:ascii="Courier New" w:hAnsi="Courier New" w:cs="Courier New" w:hint="default"/>
+      </w:rPr>
+    </w:lvl>
+    <w:lvl w:ilvl="2" w:tplc="08090005" w:tentative="1">
+      <w:start w:val="1"/>
+      <w:numFmt w:val="bullet"/>
+      <w:lvlText w:val=""/>
+      <w:lvlJc w:val="left"/>
+      <w:pPr>
+        <w:ind w:left="2160" w:hanging="360"/>
+      </w:pPr>
+      <w:rPr>
+        <w:rFonts w:ascii="Wingdings" w:hAnsi="Wingdings" w:hint="default"/>
+      </w:rPr>
+    </w:lvl>
+    <w:lvl w:ilvl="3" w:tplc="08090001" w:tentative="1">
+      <w:start w:val="1"/>
+      <w:numFmt w:val="bullet"/>
+      <w:lvlText w:val=""/>
+      <w:lvlJc w:val="left"/>
+      <w:pPr>
+        <w:ind w:left="2880" w:hanging="360"/>
+      </w:pPr>
+      <w:rPr>
+        <w:rFonts w:ascii="Symbol" w:hAnsi="Symbol" w:hint="default"/>
+      </w:rPr>
+    </w:lvl>
+    <w:lvl w:ilvl="4" w:tplc="08090003" w:tentative="1">
+      <w:start w:val="1"/>
+      <w:numFmt w:val="bullet"/>
+      <w:lvlText w:val="o"/>
+      <w:lvlJc w:val="left"/>
+      <w:pPr>
+        <w:ind w:left="3600" w:hanging="360"/>
+      </w:pPr>
+      <w:rPr>
+        <w:rFonts w:ascii="Courier New" w:hAnsi="Courier New" w:cs="Courier New" w:hint="default"/>
+      </w:rPr>
+    </w:lvl>
+    <w:lvl w:ilvl="5" w:tplc="08090005" w:tentative="1">
+      <w:start w:val="1"/>
+      <w:numFmt w:val="bullet"/>
+      <w:lvlText w:val=""/>
+      <w:lvlJc w:val="left"/>
+      <w:pPr>
+        <w:ind w:left="4320" w:hanging="360"/>
+      </w:pPr>
+      <w:rPr>
+        <w:rFonts w:ascii="Wingdings" w:hAnsi="Wingdings" w:hint="default"/>
+      </w:rPr>
+    </w:lvl>
+    <w:lvl w:ilvl="6" w:tplc="08090001" w:tentative="1">
+      <w:start w:val="1"/>
+      <w:numFmt w:val="bullet"/>
+      <w:lvlText w:val=""/>
+      <w:lvlJc w:val="left"/>
+      <w:pPr>
+        <w:ind w:left="5040" w:hanging="360"/>
+      </w:pPr>
+      <w:rPr>
+        <w:rFonts w:ascii="Symbol" w:hAnsi="Symbol" w:hint="default"/>
+      </w:rPr>
+    </w:lvl>
+    <w:lvl w:ilvl="7" w:tplc="08090003" w:tentative="1">
+      <w:start w:val="1"/>
+      <w:numFmt w:val="bullet"/>
+      <w:lvlText w:val="o"/>
+      <w:lvlJc w:val="left"/>
+      <w:pPr>
+        <w:ind w:left="5760" w:hanging="360"/>
+      </w:pPr>
+      <w:rPr>
+        <w:rFonts w:ascii="Courier New" w:hAnsi="Courier New" w:cs="Courier New" w:hint="default"/>
+      </w:rPr>
+    </w:lvl>
+    <w:lvl w:ilvl="8" w:tplc="08090005" w:tentative="1">
+      <w:start w:val="1"/>
+      <w:numFmt w:val="bullet"/>
+      <w:lvlText w:val=""/>
+      <w:lvlJc w:val="left"/>
+      <w:pPr>
+        <w:ind w:left="6480" w:hanging="360"/>
+      </w:pPr>
+      <w:rPr>
+        <w:rFonts w:ascii="Wingdings" w:hAnsi="Wingdings" w:hint="default"/>
+      </w:rPr>
+    </w:lvl>
+  </w:abstractNum>
+  <w:abstractNum w:abstractNumId="34" w15:restartNumberingAfterBreak="0">
     <w:nsid w:val="66825D90"/>
     <w:multiLevelType w:val="multilevel"/>
     <w:tmpl w:val="5E8C9D9E"/>
@@ -7470,7 +8570,7 @@
       </w:rPr>
     </w:lvl>
   </w:abstractNum>
-  <w:abstractNum w:abstractNumId="31" w15:restartNumberingAfterBreak="0">
+  <w:abstractNum w:abstractNumId="35" w15:restartNumberingAfterBreak="0">
     <w:nsid w:val="675155B1"/>
     <w:multiLevelType w:val="multilevel"/>
     <w:tmpl w:val="76A07240"/>
@@ -7619,7 +8719,7 @@
       </w:rPr>
     </w:lvl>
   </w:abstractNum>
-  <w:abstractNum w:abstractNumId="32" w15:restartNumberingAfterBreak="0">
+  <w:abstractNum w:abstractNumId="36" w15:restartNumberingAfterBreak="0">
     <w:nsid w:val="6A7F58A7"/>
     <w:multiLevelType w:val="multilevel"/>
     <w:tmpl w:val="7A101704"/>
@@ -7768,7 +8868,7 @@
       </w:rPr>
     </w:lvl>
   </w:abstractNum>
-  <w:abstractNum w:abstractNumId="33" w15:restartNumberingAfterBreak="0">
+  <w:abstractNum w:abstractNumId="37" w15:restartNumberingAfterBreak="0">
     <w:nsid w:val="6C152091"/>
     <w:multiLevelType w:val="multilevel"/>
     <w:tmpl w:val="1692526E"/>
@@ -7917,7 +9017,7 @@
       </w:rPr>
     </w:lvl>
   </w:abstractNum>
-  <w:abstractNum w:abstractNumId="34" w15:restartNumberingAfterBreak="0">
+  <w:abstractNum w:abstractNumId="38" w15:restartNumberingAfterBreak="0">
     <w:nsid w:val="74F83019"/>
     <w:multiLevelType w:val="multilevel"/>
     <w:tmpl w:val="EF12228E"/>
@@ -8066,7 +9166,120 @@
       </w:rPr>
     </w:lvl>
   </w:abstractNum>
-  <w:abstractNum w:abstractNumId="35" w15:restartNumberingAfterBreak="0">
+  <w:abstractNum w:abstractNumId="39" w15:restartNumberingAfterBreak="0">
+    <w:nsid w:val="7CE22FBB"/>
+    <w:multiLevelType w:val="hybridMultilevel"/>
+    <w:tmpl w:val="CAF2485C"/>
+    <w:lvl w:ilvl="0" w:tplc="08090001">
+      <w:start w:val="1"/>
+      <w:numFmt w:val="bullet"/>
+      <w:lvlText w:val=""/>
+      <w:lvlJc w:val="left"/>
+      <w:pPr>
+        <w:ind w:left="720" w:hanging="360"/>
+      </w:pPr>
+      <w:rPr>
+        <w:rFonts w:ascii="Symbol" w:hAnsi="Symbol" w:hint="default"/>
+      </w:rPr>
+    </w:lvl>
+    <w:lvl w:ilvl="1" w:tplc="08090003" w:tentative="1">
+      <w:start w:val="1"/>
+      <w:numFmt w:val="bullet"/>
+      <w:lvlText w:val="o"/>
+      <w:lvlJc w:val="left"/>
+      <w:pPr>
+        <w:ind w:left="1440" w:hanging="360"/>
+      </w:pPr>
+      <w:rPr>
+        <w:rFonts w:ascii="Courier New" w:hAnsi="Courier New" w:cs="Courier New" w:hint="default"/>
+      </w:rPr>
+    </w:lvl>
+    <w:lvl w:ilvl="2" w:tplc="08090005" w:tentative="1">
+      <w:start w:val="1"/>
+      <w:numFmt w:val="bullet"/>
+      <w:lvlText w:val=""/>
+      <w:lvlJc w:val="left"/>
+      <w:pPr>
+        <w:ind w:left="2160" w:hanging="360"/>
+      </w:pPr>
+      <w:rPr>
+        <w:rFonts w:ascii="Wingdings" w:hAnsi="Wingdings" w:hint="default"/>
+      </w:rPr>
+    </w:lvl>
+    <w:lvl w:ilvl="3" w:tplc="08090001" w:tentative="1">
+      <w:start w:val="1"/>
+      <w:numFmt w:val="bullet"/>
+      <w:lvlText w:val=""/>
+      <w:lvlJc w:val="left"/>
+      <w:pPr>
+        <w:ind w:left="2880" w:hanging="360"/>
+      </w:pPr>
+      <w:rPr>
+        <w:rFonts w:ascii="Symbol" w:hAnsi="Symbol" w:hint="default"/>
+      </w:rPr>
+    </w:lvl>
+    <w:lvl w:ilvl="4" w:tplc="08090003" w:tentative="1">
+      <w:start w:val="1"/>
+      <w:numFmt w:val="bullet"/>
+      <w:lvlText w:val="o"/>
+      <w:lvlJc w:val="left"/>
+      <w:pPr>
+        <w:ind w:left="3600" w:hanging="360"/>
+      </w:pPr>
+      <w:rPr>
+        <w:rFonts w:ascii="Courier New" w:hAnsi="Courier New" w:cs="Courier New" w:hint="default"/>
+      </w:rPr>
+    </w:lvl>
+    <w:lvl w:ilvl="5" w:tplc="08090005" w:tentative="1">
+      <w:start w:val="1"/>
+      <w:numFmt w:val="bullet"/>
+      <w:lvlText w:val=""/>
+      <w:lvlJc w:val="left"/>
+      <w:pPr>
+        <w:ind w:left="4320" w:hanging="360"/>
+      </w:pPr>
+      <w:rPr>
+        <w:rFonts w:ascii="Wingdings" w:hAnsi="Wingdings" w:hint="default"/>
+      </w:rPr>
+    </w:lvl>
+    <w:lvl w:ilvl="6" w:tplc="08090001" w:tentative="1">
+      <w:start w:val="1"/>
+      <w:numFmt w:val="bullet"/>
+      <w:lvlText w:val=""/>
+      <w:lvlJc w:val="left"/>
+      <w:pPr>
+        <w:ind w:left="5040" w:hanging="360"/>
+      </w:pPr>
+      <w:rPr>
+        <w:rFonts w:ascii="Symbol" w:hAnsi="Symbol" w:hint="default"/>
+      </w:rPr>
+    </w:lvl>
+    <w:lvl w:ilvl="7" w:tplc="08090003" w:tentative="1">
+      <w:start w:val="1"/>
+      <w:numFmt w:val="bullet"/>
+      <w:lvlText w:val="o"/>
+      <w:lvlJc w:val="left"/>
+      <w:pPr>
+        <w:ind w:left="5760" w:hanging="360"/>
+      </w:pPr>
+      <w:rPr>
+        <w:rFonts w:ascii="Courier New" w:hAnsi="Courier New" w:cs="Courier New" w:hint="default"/>
+      </w:rPr>
+    </w:lvl>
+    <w:lvl w:ilvl="8" w:tplc="08090005" w:tentative="1">
+      <w:start w:val="1"/>
+      <w:numFmt w:val="bullet"/>
+      <w:lvlText w:val=""/>
+      <w:lvlJc w:val="left"/>
+      <w:pPr>
+        <w:ind w:left="6480" w:hanging="360"/>
+      </w:pPr>
+      <w:rPr>
+        <w:rFonts w:ascii="Wingdings" w:hAnsi="Wingdings" w:hint="default"/>
+      </w:rPr>
+    </w:lvl>
+  </w:abstractNum>
+  <w:abstractNum w:abstractNumId="40" w15:restartNumberingAfterBreak="0">
     <w:nsid w:val="7D8650C9"/>
     <w:multiLevelType w:val="multilevel"/>
     <w:tmpl w:val="3FDC4EFE"/>
@@ -8214,109 +9427,124 @@
     <w:abstractNumId w:val="4"/>
   </w:num>
   <w:num w:numId="2" w16cid:durableId="1175145623">
-    <w:abstractNumId w:val="6"/>
+    <w:abstractNumId w:val="7"/>
   </w:num>
   <w:num w:numId="3" w16cid:durableId="214586865">
-    <w:abstractNumId w:val="7"/>
+    <w:abstractNumId w:val="8"/>
   </w:num>
   <w:num w:numId="4" w16cid:durableId="1604999293">
-    <w:abstractNumId w:val="22"/>
+    <w:abstractNumId w:val="25"/>
   </w:num>
   <w:num w:numId="5" w16cid:durableId="2005010433">
-    <w:abstractNumId w:val="34"/>
+    <w:abstractNumId w:val="38"/>
   </w:num>
   <w:num w:numId="6" w16cid:durableId="2015913491">
-    <w:abstractNumId w:val="9"/>
+    <w:abstractNumId w:val="10"/>
   </w:num>
   <w:num w:numId="7" w16cid:durableId="2005282243">
-    <w:abstractNumId w:val="16"/>
+    <w:abstractNumId w:val="18"/>
   </w:num>
   <w:num w:numId="8" w16cid:durableId="1782459442">
-    <w:abstractNumId w:val="25"/>
+    <w:abstractNumId w:val="28"/>
   </w:num>
   <w:num w:numId="9" w16cid:durableId="29652177">
     <w:abstractNumId w:val="2"/>
   </w:num>
   <w:num w:numId="10" w16cid:durableId="5983952">
-    <w:abstractNumId w:val="23"/>
+    <w:abstractNumId w:val="26"/>
   </w:num>
   <w:num w:numId="11" w16cid:durableId="1385524487">
-    <w:abstractNumId w:val="19"/>
+    <w:abstractNumId w:val="21"/>
   </w:num>
   <w:num w:numId="12" w16cid:durableId="881791777">
-    <w:abstractNumId w:val="32"/>
+    <w:abstractNumId w:val="36"/>
   </w:num>
   <w:num w:numId="13" w16cid:durableId="616062957">
-    <w:abstractNumId w:val="11"/>
+    <w:abstractNumId w:val="12"/>
   </w:num>
   <w:num w:numId="14" w16cid:durableId="1599679862">
-    <w:abstractNumId w:val="28"/>
+    <w:abstractNumId w:val="31"/>
   </w:num>
   <w:num w:numId="15" w16cid:durableId="1203782223">
-    <w:abstractNumId w:val="31"/>
+    <w:abstractNumId w:val="35"/>
   </w:num>
   <w:num w:numId="16" w16cid:durableId="1910339401">
-    <w:abstractNumId w:val="10"/>
+    <w:abstractNumId w:val="11"/>
   </w:num>
   <w:num w:numId="17" w16cid:durableId="79716557">
     <w:abstractNumId w:val="0"/>
   </w:num>
   <w:num w:numId="18" w16cid:durableId="1340543577">
-    <w:abstractNumId w:val="33"/>
+    <w:abstractNumId w:val="37"/>
   </w:num>
   <w:num w:numId="19" w16cid:durableId="1861702556">
     <w:abstractNumId w:val="1"/>
   </w:num>
   <w:num w:numId="20" w16cid:durableId="913048856">
+    <w:abstractNumId w:val="27"/>
+  </w:num>
+  <w:num w:numId="21" w16cid:durableId="613368900">
+    <w:abstractNumId w:val="9"/>
+  </w:num>
+  <w:num w:numId="22" w16cid:durableId="760225088">
+    <w:abstractNumId w:val="19"/>
+  </w:num>
+  <w:num w:numId="23" w16cid:durableId="747772899">
+    <w:abstractNumId w:val="32"/>
+  </w:num>
+  <w:num w:numId="24" w16cid:durableId="1330063747">
+    <w:abstractNumId w:val="40"/>
+  </w:num>
+  <w:num w:numId="25" w16cid:durableId="1728644347">
     <w:abstractNumId w:val="24"/>
   </w:num>
-  <w:num w:numId="21" w16cid:durableId="613368900">
-    <w:abstractNumId w:val="8"/>
+  <w:num w:numId="26" w16cid:durableId="721557330">
+    <w:abstractNumId w:val="23"/>
   </w:num>
-  <w:num w:numId="22" w16cid:durableId="760225088">
+  <w:num w:numId="27" w16cid:durableId="1611934106">
+    <w:abstractNumId w:val="29"/>
+  </w:num>
+  <w:num w:numId="28" w16cid:durableId="1091008212">
+    <w:abstractNumId w:val="20"/>
+  </w:num>
+  <w:num w:numId="29" w16cid:durableId="372000044">
+    <w:abstractNumId w:val="34"/>
+  </w:num>
+  <w:num w:numId="30" w16cid:durableId="1429884695">
+    <w:abstractNumId w:val="30"/>
+  </w:num>
+  <w:num w:numId="31" w16cid:durableId="112595949">
+    <w:abstractNumId w:val="13"/>
+  </w:num>
+  <w:num w:numId="32" w16cid:durableId="386999035">
+    <w:abstractNumId w:val="14"/>
+  </w:num>
+  <w:num w:numId="33" w16cid:durableId="954100688">
     <w:abstractNumId w:val="17"/>
   </w:num>
-  <w:num w:numId="23" w16cid:durableId="747772899">
-    <w:abstractNumId w:val="29"/>
-  </w:num>
-  <w:num w:numId="24" w16cid:durableId="1330063747">
-    <w:abstractNumId w:val="35"/>
-  </w:num>
-  <w:num w:numId="25" w16cid:durableId="1728644347">
-    <w:abstractNumId w:val="21"/>
-  </w:num>
-  <w:num w:numId="26" w16cid:durableId="721557330">
-    <w:abstractNumId w:val="20"/>
-  </w:num>
-  <w:num w:numId="27" w16cid:durableId="1611934106">
-    <w:abstractNumId w:val="26"/>
-  </w:num>
-  <w:num w:numId="28" w16cid:durableId="1091008212">
-    <w:abstractNumId w:val="18"/>
-  </w:num>
-  <w:num w:numId="29" w16cid:durableId="372000044">
-    <w:abstractNumId w:val="30"/>
-  </w:num>
-  <w:num w:numId="30" w16cid:durableId="1429884695">
-    <w:abstractNumId w:val="27"/>
-  </w:num>
-  <w:num w:numId="31" w16cid:durableId="112595949">
-    <w:abstractNumId w:val="12"/>
-  </w:num>
-  <w:num w:numId="32" w16cid:durableId="386999035">
-    <w:abstractNumId w:val="13"/>
-  </w:num>
-  <w:num w:numId="33" w16cid:durableId="954100688">
+  <w:num w:numId="34" w16cid:durableId="462774312">
     <w:abstractNumId w:val="15"/>
-  </w:num>
-  <w:num w:numId="34" w16cid:durableId="462774312">
-    <w:abstractNumId w:val="14"/>
   </w:num>
   <w:num w:numId="35" w16cid:durableId="1988198018">
     <w:abstractNumId w:val="3"/>
   </w:num>
   <w:num w:numId="36" w16cid:durableId="1029141334">
     <w:abstractNumId w:val="5"/>
+  </w:num>
+  <w:num w:numId="37" w16cid:durableId="1707215218">
+    <w:abstractNumId w:val="6"/>
+  </w:num>
+  <w:num w:numId="38" w16cid:durableId="1650018412">
+    <w:abstractNumId w:val="16"/>
+  </w:num>
+  <w:num w:numId="39" w16cid:durableId="2143185238">
+    <w:abstractNumId w:val="33"/>
+  </w:num>
+  <w:num w:numId="40" w16cid:durableId="241255988">
+    <w:abstractNumId w:val="39"/>
+  </w:num>
+  <w:num w:numId="41" w16cid:durableId="12919241">
+    <w:abstractNumId w:val="22"/>
   </w:num>
 </w:numbering>
 </file>
@@ -9304,6 +10532,55 @@
       <w:szCs w:val="20"/>
     </w:rPr>
   </w:style>
+  <w:style w:type="paragraph" w:styleId="HTMLPreformatted">
+    <w:name w:val="HTML Preformatted"/>
+    <w:basedOn w:val="Normal"/>
+    <w:link w:val="HTMLPreformattedChar"/>
+    <w:uiPriority w:val="99"/>
+    <w:semiHidden/>
+    <w:unhideWhenUsed/>
+    <w:rsid w:val="007B503F"/>
+    <w:pPr>
+      <w:spacing w:after="0" w:line="240" w:lineRule="auto"/>
+    </w:pPr>
+    <w:rPr>
+      <w:rFonts w:ascii="Consolas" w:hAnsi="Consolas"/>
+      <w:sz w:val="20"/>
+      <w:szCs w:val="20"/>
+    </w:rPr>
+  </w:style>
+  <w:style w:type="character" w:customStyle="1" w:styleId="HTMLPreformattedChar">
+    <w:name w:val="HTML Preformatted Char"/>
+    <w:basedOn w:val="DefaultParagraphFont"/>
+    <w:link w:val="HTMLPreformatted"/>
+    <w:uiPriority w:val="99"/>
+    <w:semiHidden/>
+    <w:rsid w:val="007B503F"/>
+    <w:rPr>
+      <w:rFonts w:ascii="Consolas" w:hAnsi="Consolas"/>
+      <w:sz w:val="20"/>
+      <w:szCs w:val="20"/>
+    </w:rPr>
+  </w:style>
+  <w:style w:type="character" w:customStyle="1" w:styleId="token">
+    <w:name w:val="token"/>
+    <w:basedOn w:val="DefaultParagraphFont"/>
+    <w:rsid w:val="007B503F"/>
+  </w:style>
+  <w:style w:type="paragraph" w:customStyle="1" w:styleId="ds-markdown-paragraph">
+    <w:name w:val="ds-markdown-paragraph"/>
+    <w:basedOn w:val="Normal"/>
+    <w:rsid w:val="007B503F"/>
+    <w:pPr>
+      <w:spacing w:before="100" w:beforeAutospacing="1" w:after="100" w:afterAutospacing="1" w:line="240" w:lineRule="auto"/>
+    </w:pPr>
+    <w:rPr>
+      <w:rFonts w:ascii="Times New Roman" w:eastAsia="Times New Roman" w:hAnsi="Times New Roman" w:cs="Times New Roman"/>
+      <w:kern w:val="0"/>
+      <w:lang w:eastAsia="en-GB"/>
+      <w14:ligatures w14:val="none"/>
+    </w:rPr>
+  </w:style>
 </w:styles>
 </file>
 

</xml_diff>

<commit_message>
0.0.6.3 - Batch 6.5: Expedition cancellation with C key (return then disband)
- Added C key listener to cancel selected expedition.
- Expedition is forced to return to camp and disbands on arrival.
- If already at camp, disbands immediately.
- Workers are returned to pop, food is deposited to camp stock.
- Added toBeDisbanded property to Expedition class.
- Disband logic in both early arrival and normal arrival paths.
</commit_message>
<xml_diff>
--- a/Docs/Prototipo 1.docx
+++ b/Docs/Prototipo 1.docx
@@ -1701,6 +1701,61 @@
     <w:p>
       <w:pPr>
         <w:rPr>
+          <w:lang w:val="it-IT" w:eastAsia="en-GB"/>
+        </w:rPr>
+      </w:pPr>
+      <w:r>
+        <w:rPr>
+          <w:lang w:val="it-IT" w:eastAsia="en-GB"/>
+        </w:rPr>
+        <w:t>FIX:</w:t>
+      </w:r>
+    </w:p>
+    <w:p>
+      <w:pPr>
+        <w:pStyle w:val="ListParagraph"/>
+        <w:numPr>
+          <w:ilvl w:val="2"/>
+          <w:numId w:val="24"/>
+        </w:numPr>
+        <w:rPr>
+          <w:lang w:val="it-IT" w:eastAsia="en-GB"/>
+        </w:rPr>
+      </w:pPr>
+      <w:r>
+        <w:rPr>
+          <w:lang w:val="it-IT" w:eastAsia="en-GB"/>
+        </w:rPr>
+        <w:t>Se io rimando una spedizione e ho gatherers disponibili, non prende quelli, ma ne crea di nuovi (se vi sono gathers disponibili, prendi prima quelli, questa stessa logica sarà applicata su tutti i tipi di spedizioni ma, in futuro, potremmo volere che il giocatore scelga da quale pool pescare i gahterers</w:t>
+      </w:r>
+    </w:p>
+    <w:p>
+      <w:pPr>
+        <w:pStyle w:val="ListParagraph"/>
+        <w:numPr>
+          <w:ilvl w:val="2"/>
+          <w:numId w:val="24"/>
+        </w:numPr>
+        <w:rPr>
+          <w:lang w:val="it-IT" w:eastAsia="en-GB"/>
+        </w:rPr>
+      </w:pPr>
+      <w:r>
+        <w:rPr>
+          <w:lang w:val="it-IT" w:eastAsia="en-GB"/>
+        </w:rPr>
+        <w:t>Spedizione va fuori dall’area</w:t>
+      </w:r>
+      <w:r>
+        <w:rPr>
+          <w:lang w:val="it-IT" w:eastAsia="en-GB"/>
+        </w:rPr>
+        <w:t xml:space="preserve"> (perché va su una casella sul bordo e da lì, nel suo raggio, vede un’altra casella migliore?)</w:t>
+      </w:r>
+    </w:p>
+    <w:p>
+      <w:pPr>
+        <w:rPr>
           <w:b/>
           <w:bCs/>
           <w:lang w:val="it-IT"/>
@@ -1909,6 +1964,7 @@
           <w:bCs/>
           <w:lang w:val="it-IT"/>
         </w:rPr>
+        <w:lastRenderedPageBreak/>
         <w:t>NOTE FINE MVP1</w:t>
       </w:r>
     </w:p>
@@ -1969,14 +2025,7 @@
         <w:rPr>
           <w:lang w:val="it-IT"/>
         </w:rPr>
-        <w:t xml:space="preserve">Non abbiamo minimamente lavorato sulla tipologia del terreno (montagna, acqua, acqua profonda, collina, pianura) e le caratteristiche di esso (foresta, erba ecc.). Questo </w:t>
-      </w:r>
-      <w:r>
-        <w:rPr>
-          <w:lang w:val="it-IT"/>
-        </w:rPr>
-        <w:lastRenderedPageBreak/>
-        <w:t>perché sulla base del tipo di terreno poi dipende il cibo (la pesca è solo nelle acque, le aree di pianura con erba vicino ai fiumi hanno più cibo ecc.). Da forse vedere subito dopo MVP1?</w:t>
+        <w:t>Non abbiamo minimamente lavorato sulla tipologia del terreno (montagna, acqua, acqua profonda, collina, pianura) e le caratteristiche di esso (foresta, erba ecc.). Questo perché sulla base del tipo di terreno poi dipende il cibo (la pesca è solo nelle acque, le aree di pianura con erba vicino ai fiumi hanno più cibo ecc.). Da forse vedere subito dopo MVP1?</w:t>
       </w:r>
       <w:r>
         <w:rPr>
@@ -2180,6 +2229,7 @@
         <w:rPr>
           <w:lang w:val="it-IT" w:eastAsia="en-GB"/>
         </w:rPr>
+        <w:lastRenderedPageBreak/>
         <w:t>Ragionare sull’acqua</w:t>
       </w:r>
     </w:p>
@@ -2231,7 +2281,6 @@
     </w:p>
     <w:p>
       <w:r>
-        <w:lastRenderedPageBreak/>
         <w:t>Nuova definizione:</w:t>
       </w:r>
     </w:p>
@@ -2495,6 +2544,7 @@
         <w:rPr>
           <w:lang w:val="it-IT"/>
         </w:rPr>
+        <w:lastRenderedPageBreak/>
         <w:t xml:space="preserve">Costruzione </w:t>
       </w:r>
       <w:r>
@@ -2570,7 +2620,6 @@
         <w:rPr>
           <w:lang w:val="it-IT"/>
         </w:rPr>
-        <w:lastRenderedPageBreak/>
         <w:t>Nessuna modifica necessaria. Le meccaniche di visibilità (certo, proiettato, da report) e di stima delle scorte sono indipendenti dal tipo di risorsa. Quando le implementeremo, applicheremo l'incertezza a tutte le risorse (cibo vegetale, carne, pesce, legna, assi).</w:t>
       </w:r>
     </w:p>
@@ -2865,6 +2914,7 @@
           <w:bCs/>
           <w:lang w:val="it-IT"/>
         </w:rPr>
+        <w:lastRenderedPageBreak/>
         <w:t>CONCETTI DA RECUPERARE POI:</w:t>
       </w:r>
     </w:p>
@@ -2920,7 +2970,6 @@
         <w:rPr>
           <w:lang w:val="it-IT"/>
         </w:rPr>
-        <w:lastRenderedPageBreak/>
         <w:t>Le iterazioni successive del prototipo seguiranno la progressione storica (Era 1: stanzialità, agricoltura, prime strutture; Era 2: metalli, scrittura, amministrazione; ecc.), sbloccando funzionalità corrispondenti man mano che le fondamenta tecniche lo permettono. La priorità sarà sempre validare il loop di base prima di aggiungere complessità.</w:t>
       </w:r>
     </w:p>

</xml_diff>

<commit_message>
0.0.6.4 - Batch 6.2/6.3: Centralized config, debug panel, and dynamic parameter updates
- Created GameConfig object in config.js with all game parameters and explanatory comments.
- Replaced hard-coded constants across world.js, units.js, main.js with dynamic GameConfig references.
- Added HTML/CSS debug panel with real-time input fields for all config values.
- Added debug.js to link panel inputs to GameConfig (with console log on change).
- Added isInputFocused() helper to prevent game hotkeys from firing while typing in debug inputs.
- Made day length, expedition speed, max capacity, and all consumption rates read dynamically at runtime.
- Fixed missing 'needed' variable in expedition creation.
- Fixed missing semicolon in findBestCellInArea.
- Updated Prototipo 1.md with new Batch 6.6 tasks (provisions recalculation, speed/distance scaling, rest mechanics).
- Added reminders for JSON loading from Excel and Monte Carlo simulations.
</commit_message>
<xml_diff>
--- a/Docs/Prototipo 1.docx
+++ b/Docs/Prototipo 1.docx
@@ -163,7 +163,23 @@
         <w:t xml:space="preserve"> – ciò che sai dipende da chi te lo dice. </w:t>
       </w:r>
       <w:r>
-        <w:t>Le certezze sono poche.</w:t>
+        <w:t xml:space="preserve">Le </w:t>
+      </w:r>
+      <w:proofErr w:type="spellStart"/>
+      <w:r>
+        <w:t>certezze</w:t>
+      </w:r>
+      <w:proofErr w:type="spellEnd"/>
+      <w:r>
+        <w:t xml:space="preserve"> </w:t>
+      </w:r>
+      <w:proofErr w:type="spellStart"/>
+      <w:r>
+        <w:t>sono</w:t>
+      </w:r>
+      <w:proofErr w:type="spellEnd"/>
+      <w:r>
+        <w:t xml:space="preserve"> poche.</w:t>
       </w:r>
     </w:p>
     <w:p>
@@ -197,8 +213,17 @@
           <w:b/>
           <w:bCs/>
         </w:rPr>
-        <w:t>Game Loop minimo</w:t>
-      </w:r>
+        <w:t xml:space="preserve">Game Loop </w:t>
+      </w:r>
+      <w:proofErr w:type="spellStart"/>
+      <w:r>
+        <w:rPr>
+          <w:b/>
+          <w:bCs/>
+        </w:rPr>
+        <w:t>minimo</w:t>
+      </w:r>
+      <w:proofErr w:type="spellEnd"/>
     </w:p>
     <w:p>
       <w:pPr>
@@ -369,13 +394,31 @@
       </w:r>
     </w:p>
     <w:p>
+      <w:proofErr w:type="spellStart"/>
       <w:r>
         <w:rPr>
           <w:b/>
           <w:bCs/>
         </w:rPr>
-        <w:t>Confini del prototipo</w:t>
-      </w:r>
+        <w:t>Confini</w:t>
+      </w:r>
+      <w:proofErr w:type="spellEnd"/>
+      <w:r>
+        <w:rPr>
+          <w:b/>
+          <w:bCs/>
+        </w:rPr>
+        <w:t xml:space="preserve"> del </w:t>
+      </w:r>
+      <w:proofErr w:type="spellStart"/>
+      <w:r>
+        <w:rPr>
+          <w:b/>
+          <w:bCs/>
+        </w:rPr>
+        <w:t>prototipo</w:t>
+      </w:r>
+      <w:proofErr w:type="spellEnd"/>
     </w:p>
     <w:p>
       <w:pPr>
@@ -454,7 +497,15 @@
       </w:pPr>
       <w:r>
         <w:lastRenderedPageBreak/>
-        <w:t>Pausa/play/accelerazione.</w:t>
+        <w:t>Pausa/play/</w:t>
+      </w:r>
+      <w:proofErr w:type="spellStart"/>
+      <w:r>
+        <w:t>accelerazione</w:t>
+      </w:r>
+      <w:proofErr w:type="spellEnd"/>
+      <w:r>
+        <w:t>.</w:t>
       </w:r>
     </w:p>
     <w:p>
@@ -471,7 +522,21 @@
         <w:rPr>
           <w:lang w:val="it-IT"/>
         </w:rPr>
-        <w:t>Movimento con pathfinding base (verso il click).</w:t>
+        <w:t xml:space="preserve">Movimento con </w:t>
+      </w:r>
+      <w:proofErr w:type="spellStart"/>
+      <w:r>
+        <w:rPr>
+          <w:lang w:val="it-IT"/>
+        </w:rPr>
+        <w:t>pathfinding</w:t>
+      </w:r>
+      <w:proofErr w:type="spellEnd"/>
+      <w:r>
+        <w:rPr>
+          <w:lang w:val="it-IT"/>
+        </w:rPr>
+        <w:t xml:space="preserve"> base (verso il click).</w:t>
       </w:r>
     </w:p>
     <w:p>
@@ -510,7 +575,21 @@
           <w:lang w:val="it-IT"/>
         </w:rPr>
         <w:br/>
-        <w:t>HTML5, CSS, JavaScript con libreria Phaser 3 (rendering 2D, input, gestione scene).</w:t>
+        <w:t xml:space="preserve">HTML5, CSS, JavaScript con libreria </w:t>
+      </w:r>
+      <w:proofErr w:type="spellStart"/>
+      <w:r>
+        <w:rPr>
+          <w:lang w:val="it-IT"/>
+        </w:rPr>
+        <w:t>Phaser</w:t>
+      </w:r>
+      <w:proofErr w:type="spellEnd"/>
+      <w:r>
+        <w:rPr>
+          <w:lang w:val="it-IT"/>
+        </w:rPr>
+        <w:t xml:space="preserve"> 3 (rendering 2D, input, gestione scene).</w:t>
       </w:r>
     </w:p>
     <w:p>
@@ -538,11 +617,19 @@
           <w:lang w:val="it-IT"/>
         </w:rPr>
       </w:pPr>
-      <w:r>
-        <w:rPr>
-          <w:lang w:val="it-IT"/>
-        </w:rPr>
-        <w:t>Crusader Kings 3 (dinastia, informazione imperfetta, tempo reale con pausa)</w:t>
+      <w:proofErr w:type="spellStart"/>
+      <w:r>
+        <w:rPr>
+          <w:lang w:val="it-IT"/>
+        </w:rPr>
+        <w:t>Crusader</w:t>
+      </w:r>
+      <w:proofErr w:type="spellEnd"/>
+      <w:r>
+        <w:rPr>
+          <w:lang w:val="it-IT"/>
+        </w:rPr>
+        <w:t xml:space="preserve"> Kings 3 (dinastia, informazione imperfetta, tempo reale con pausa)</w:t>
       </w:r>
     </w:p>
     <w:p>
@@ -553,7 +640,23 @@
         </w:numPr>
       </w:pPr>
       <w:r>
-        <w:t>Victoria 3 / Stellaris (pop system, risorse logistiche)</w:t>
+        <w:t xml:space="preserve">Victoria 3 / Stellaris (pop system, </w:t>
+      </w:r>
+      <w:proofErr w:type="spellStart"/>
+      <w:r>
+        <w:t>risorse</w:t>
+      </w:r>
+      <w:proofErr w:type="spellEnd"/>
+      <w:r>
+        <w:t xml:space="preserve"> </w:t>
+      </w:r>
+      <w:proofErr w:type="spellStart"/>
+      <w:r>
+        <w:t>logistiche</w:t>
+      </w:r>
+      <w:proofErr w:type="spellEnd"/>
+      <w:r>
+        <w:t>)</w:t>
       </w:r>
     </w:p>
     <w:p>
@@ -564,7 +667,39 @@
         </w:numPr>
       </w:pPr>
       <w:r>
-        <w:t>Banished / Dawn of Man (sopravvivenza tribale, risorse tangibili)</w:t>
+        <w:t>Banished / Dawn of Man (</w:t>
+      </w:r>
+      <w:proofErr w:type="spellStart"/>
+      <w:r>
+        <w:t>sopravvivenza</w:t>
+      </w:r>
+      <w:proofErr w:type="spellEnd"/>
+      <w:r>
+        <w:t xml:space="preserve"> </w:t>
+      </w:r>
+      <w:proofErr w:type="spellStart"/>
+      <w:r>
+        <w:t>tribale</w:t>
+      </w:r>
+      <w:proofErr w:type="spellEnd"/>
+      <w:r>
+        <w:t xml:space="preserve">, </w:t>
+      </w:r>
+      <w:proofErr w:type="spellStart"/>
+      <w:r>
+        <w:t>risorse</w:t>
+      </w:r>
+      <w:proofErr w:type="spellEnd"/>
+      <w:r>
+        <w:t xml:space="preserve"> </w:t>
+      </w:r>
+      <w:proofErr w:type="spellStart"/>
+      <w:r>
+        <w:t>tangibili</w:t>
+      </w:r>
+      <w:proofErr w:type="spellEnd"/>
+      <w:r>
+        <w:t>)</w:t>
       </w:r>
     </w:p>
     <w:p>
@@ -577,11 +712,19 @@
           <w:lang w:val="it-IT"/>
         </w:rPr>
       </w:pPr>
-      <w:r>
-        <w:rPr>
-          <w:lang w:val="it-IT"/>
-        </w:rPr>
-        <w:t>King's Orders (report e comunicazione)</w:t>
+      <w:proofErr w:type="spellStart"/>
+      <w:r>
+        <w:rPr>
+          <w:lang w:val="it-IT"/>
+        </w:rPr>
+        <w:t>King's</w:t>
+      </w:r>
+      <w:proofErr w:type="spellEnd"/>
+      <w:r>
+        <w:rPr>
+          <w:lang w:val="it-IT"/>
+        </w:rPr>
+        <w:t xml:space="preserve"> Orders (report e comunicazione)</w:t>
       </w:r>
     </w:p>
     <w:p>
@@ -669,8 +812,17 @@
           <w:b/>
           <w:bCs/>
         </w:rPr>
-        <w:t>Batch 1 – Setup Phaser funzionante</w:t>
-      </w:r>
+        <w:t xml:space="preserve">Batch 1 – Setup Phaser </w:t>
+      </w:r>
+      <w:proofErr w:type="spellStart"/>
+      <w:r>
+        <w:rPr>
+          <w:b/>
+          <w:bCs/>
+        </w:rPr>
+        <w:t>funzionante</w:t>
+      </w:r>
+      <w:proofErr w:type="spellEnd"/>
     </w:p>
     <w:p>
       <w:pPr>
@@ -686,7 +838,21 @@
         <w:rPr>
           <w:lang w:val="it-IT"/>
         </w:rPr>
-        <w:t>Installazione di Phaser 3 via CDN.</w:t>
+        <w:t xml:space="preserve">Installazione di </w:t>
+      </w:r>
+      <w:proofErr w:type="spellStart"/>
+      <w:r>
+        <w:rPr>
+          <w:lang w:val="it-IT"/>
+        </w:rPr>
+        <w:t>Phaser</w:t>
+      </w:r>
+      <w:proofErr w:type="spellEnd"/>
+      <w:r>
+        <w:rPr>
+          <w:lang w:val="it-IT"/>
+        </w:rPr>
+        <w:t xml:space="preserve"> 3 via CDN.</w:t>
       </w:r>
     </w:p>
     <w:p>
@@ -788,7 +954,21 @@
         <w:rPr>
           <w:lang w:val="it-IT"/>
         </w:rPr>
-        <w:t>Layer forageDensity con distribuzione non uniforme:</w:t>
+        <w:t xml:space="preserve">Layer </w:t>
+      </w:r>
+      <w:proofErr w:type="spellStart"/>
+      <w:r>
+        <w:rPr>
+          <w:lang w:val="it-IT"/>
+        </w:rPr>
+        <w:t>forageDensity</w:t>
+      </w:r>
+      <w:proofErr w:type="spellEnd"/>
+      <w:r>
+        <w:rPr>
+          <w:lang w:val="it-IT"/>
+        </w:rPr>
+        <w:t xml:space="preserve"> con distribuzione non uniforme:</w:t>
       </w:r>
     </w:p>
     <w:p>
@@ -1031,8 +1211,17 @@
           <w:b/>
           <w:bCs/>
         </w:rPr>
-        <w:t>Batch 3 – Pop e movimento</w:t>
-      </w:r>
+        <w:t xml:space="preserve">Batch 3 – Pop e </w:t>
+      </w:r>
+      <w:proofErr w:type="spellStart"/>
+      <w:r>
+        <w:rPr>
+          <w:b/>
+          <w:bCs/>
+        </w:rPr>
+        <w:t>movimento</w:t>
+      </w:r>
+      <w:proofErr w:type="spellEnd"/>
     </w:p>
     <w:p>
       <w:pPr>
@@ -1099,7 +1288,47 @@
         <w:t xml:space="preserve">Meccanica: interazione diretta con il mondo. Non esistono griglie visibili che vincolano il movimento. </w:t>
       </w:r>
       <w:r>
-        <w:t>Il giocatore sposta fisicamente la sua gente.</w:t>
+        <w:t xml:space="preserve">Il </w:t>
+      </w:r>
+      <w:proofErr w:type="spellStart"/>
+      <w:r>
+        <w:t>giocatore</w:t>
+      </w:r>
+      <w:proofErr w:type="spellEnd"/>
+      <w:r>
+        <w:t xml:space="preserve"> </w:t>
+      </w:r>
+      <w:proofErr w:type="spellStart"/>
+      <w:r>
+        <w:t>sposta</w:t>
+      </w:r>
+      <w:proofErr w:type="spellEnd"/>
+      <w:r>
+        <w:t xml:space="preserve"> </w:t>
+      </w:r>
+      <w:proofErr w:type="spellStart"/>
+      <w:r>
+        <w:t>fisicamente</w:t>
+      </w:r>
+      <w:proofErr w:type="spellEnd"/>
+      <w:r>
+        <w:t xml:space="preserve"> la </w:t>
+      </w:r>
+      <w:proofErr w:type="spellStart"/>
+      <w:r>
+        <w:t>sua</w:t>
+      </w:r>
+      <w:proofErr w:type="spellEnd"/>
+      <w:r>
+        <w:t xml:space="preserve"> </w:t>
+      </w:r>
+      <w:proofErr w:type="spellStart"/>
+      <w:r>
+        <w:t>gente</w:t>
+      </w:r>
+      <w:proofErr w:type="spellEnd"/>
+      <w:r>
+        <w:t>.</w:t>
       </w:r>
     </w:p>
     <w:p>
@@ -1133,7 +1362,21 @@
         <w:rPr>
           <w:lang w:val="it-IT"/>
         </w:rPr>
-        <w:t>Quando il pop arriva su una cella con forageDensity maggiore di zero, inizia automaticamente a raccogliere cibo.</w:t>
+        <w:t xml:space="preserve">Quando il pop arriva su una cella con </w:t>
+      </w:r>
+      <w:proofErr w:type="spellStart"/>
+      <w:r>
+        <w:rPr>
+          <w:lang w:val="it-IT"/>
+        </w:rPr>
+        <w:t>forageDensity</w:t>
+      </w:r>
+      <w:proofErr w:type="spellEnd"/>
+      <w:r>
+        <w:rPr>
+          <w:lang w:val="it-IT"/>
+        </w:rPr>
+        <w:t xml:space="preserve"> maggiore di zero, inizia automaticamente a raccogliere cibo.</w:t>
       </w:r>
     </w:p>
     <w:p>
@@ -1167,7 +1410,21 @@
         <w:rPr>
           <w:lang w:val="it-IT"/>
         </w:rPr>
-        <w:t>La funzione modifyDensity riduce la densità della cella e di quelle vicine (raggio configurabile), simulando un prelievo localizzato.</w:t>
+        <w:t xml:space="preserve">La funzione </w:t>
+      </w:r>
+      <w:proofErr w:type="spellStart"/>
+      <w:r>
+        <w:rPr>
+          <w:lang w:val="it-IT"/>
+        </w:rPr>
+        <w:t>modifyDensity</w:t>
+      </w:r>
+      <w:proofErr w:type="spellEnd"/>
+      <w:r>
+        <w:rPr>
+          <w:lang w:val="it-IT"/>
+        </w:rPr>
+        <w:t xml:space="preserve"> riduce la densità della cella e di quelle vicine (raggio configurabile), simulando un prelievo localizzato.</w:t>
       </w:r>
     </w:p>
     <w:p>
@@ -1329,7 +1586,21 @@
         <w:rPr>
           <w:lang w:val="it-IT" w:eastAsia="en-GB"/>
         </w:rPr>
-        <w:t>Dopo un breve cooldown, la spedizione riparte automaticamente verso la stessa area, se ci sono ancora lavoratori disponibili.</w:t>
+        <w:t xml:space="preserve">Dopo un breve </w:t>
+      </w:r>
+      <w:proofErr w:type="spellStart"/>
+      <w:r>
+        <w:rPr>
+          <w:lang w:val="it-IT" w:eastAsia="en-GB"/>
+        </w:rPr>
+        <w:t>cooldown</w:t>
+      </w:r>
+      <w:proofErr w:type="spellEnd"/>
+      <w:r>
+        <w:rPr>
+          <w:lang w:val="it-IT" w:eastAsia="en-GB"/>
+        </w:rPr>
+        <w:t>, la spedizione riparte automaticamente verso la stessa area, se ci sono ancora lavoratori disponibili.</w:t>
       </w:r>
     </w:p>
     <w:p>
@@ -1395,7 +1666,25 @@
           <w:bCs/>
           <w:lang w:eastAsia="en-GB"/>
         </w:rPr>
-        <w:t>6.1 – Time Manager (pausa/play/velocità)</w:t>
+        <w:t>6.1 – Time Manager (pausa/play/</w:t>
+      </w:r>
+      <w:proofErr w:type="spellStart"/>
+      <w:r>
+        <w:rPr>
+          <w:b/>
+          <w:bCs/>
+          <w:lang w:eastAsia="en-GB"/>
+        </w:rPr>
+        <w:t>velocità</w:t>
+      </w:r>
+      <w:proofErr w:type="spellEnd"/>
+      <w:r>
+        <w:rPr>
+          <w:b/>
+          <w:bCs/>
+          <w:lang w:eastAsia="en-GB"/>
+        </w:rPr>
+        <w:t>)</w:t>
       </w:r>
     </w:p>
     <w:p>
@@ -1429,8 +1718,30 @@
         <w:rPr>
           <w:lang w:val="it-IT" w:eastAsia="en-GB"/>
         </w:rPr>
-        <w:t>Modificare update in main.js per usare il gameDelta dal TimeManager</w:t>
-      </w:r>
+        <w:t>Modificare update in main.js per usare il </w:t>
+      </w:r>
+      <w:proofErr w:type="spellStart"/>
+      <w:r>
+        <w:rPr>
+          <w:lang w:val="it-IT" w:eastAsia="en-GB"/>
+        </w:rPr>
+        <w:t>gameDelta</w:t>
+      </w:r>
+      <w:proofErr w:type="spellEnd"/>
+      <w:r>
+        <w:rPr>
+          <w:lang w:val="it-IT" w:eastAsia="en-GB"/>
+        </w:rPr>
+        <w:t xml:space="preserve"> dal </w:t>
+      </w:r>
+      <w:proofErr w:type="spellStart"/>
+      <w:r>
+        <w:rPr>
+          <w:lang w:val="it-IT" w:eastAsia="en-GB"/>
+        </w:rPr>
+        <w:t>TimeManager</w:t>
+      </w:r>
+      <w:proofErr w:type="spellEnd"/>
     </w:p>
     <w:p>
       <w:pPr>
@@ -1510,56 +1821,102 @@
           <w:bCs/>
           <w:lang w:eastAsia="en-GB"/>
         </w:rPr>
-        <w:t>6.5 – Cancellazione spedizioni</w:t>
-      </w:r>
-    </w:p>
-    <w:p>
-      <w:pPr>
-        <w:numPr>
-          <w:ilvl w:val="0"/>
-          <w:numId w:val="46"/>
-        </w:numPr>
-        <w:rPr>
-          <w:lang w:val="it-IT" w:eastAsia="en-GB"/>
-        </w:rPr>
-      </w:pPr>
-      <w:r>
-        <w:rPr>
-          <w:lang w:val="it-IT" w:eastAsia="en-GB"/>
-        </w:rPr>
-        <w:t>Tasto C per cancellare la spedizione selezionata</w:t>
-      </w:r>
-    </w:p>
-    <w:p>
-      <w:pPr>
-        <w:numPr>
-          <w:ilvl w:val="0"/>
-          <w:numId w:val="46"/>
-        </w:numPr>
-        <w:rPr>
-          <w:lang w:val="it-IT" w:eastAsia="en-GB"/>
-        </w:rPr>
-      </w:pPr>
-      <w:r>
-        <w:rPr>
-          <w:lang w:val="it-IT" w:eastAsia="en-GB"/>
-        </w:rPr>
-        <w:t>La spedizione torna al campo, deposita il cibo, restituisce i lavoratori al pop</w:t>
-      </w:r>
-    </w:p>
-    <w:p>
-      <w:pPr>
-        <w:rPr>
-          <w:lang w:eastAsia="en-GB"/>
-        </w:rPr>
-      </w:pPr>
+        <w:t xml:space="preserve">6.5 – </w:t>
+      </w:r>
+      <w:proofErr w:type="spellStart"/>
       <w:r>
         <w:rPr>
           <w:b/>
           <w:bCs/>
           <w:lang w:eastAsia="en-GB"/>
         </w:rPr>
-        <w:t>6.2 – Pannello di debug via console</w:t>
+        <w:t>Cancellazione</w:t>
+      </w:r>
+      <w:proofErr w:type="spellEnd"/>
+      <w:r>
+        <w:rPr>
+          <w:b/>
+          <w:bCs/>
+          <w:lang w:eastAsia="en-GB"/>
+        </w:rPr>
+        <w:t xml:space="preserve"> </w:t>
+      </w:r>
+      <w:proofErr w:type="spellStart"/>
+      <w:r>
+        <w:rPr>
+          <w:b/>
+          <w:bCs/>
+          <w:lang w:eastAsia="en-GB"/>
+        </w:rPr>
+        <w:t>spedizioni</w:t>
+      </w:r>
+      <w:proofErr w:type="spellEnd"/>
+    </w:p>
+    <w:p>
+      <w:pPr>
+        <w:numPr>
+          <w:ilvl w:val="0"/>
+          <w:numId w:val="46"/>
+        </w:numPr>
+        <w:rPr>
+          <w:lang w:val="it-IT" w:eastAsia="en-GB"/>
+        </w:rPr>
+      </w:pPr>
+      <w:r>
+        <w:rPr>
+          <w:lang w:val="it-IT" w:eastAsia="en-GB"/>
+        </w:rPr>
+        <w:t>Tasto C per cancellare la spedizione selezionata</w:t>
+      </w:r>
+    </w:p>
+    <w:p>
+      <w:pPr>
+        <w:numPr>
+          <w:ilvl w:val="0"/>
+          <w:numId w:val="46"/>
+        </w:numPr>
+        <w:rPr>
+          <w:lang w:val="it-IT" w:eastAsia="en-GB"/>
+        </w:rPr>
+      </w:pPr>
+      <w:r>
+        <w:rPr>
+          <w:lang w:val="it-IT" w:eastAsia="en-GB"/>
+        </w:rPr>
+        <w:t>La spedizione torna al campo, deposita il cibo, restituisce i lavoratori al pop</w:t>
+      </w:r>
+    </w:p>
+    <w:p>
+      <w:pPr>
+        <w:rPr>
+          <w:lang w:eastAsia="en-GB"/>
+        </w:rPr>
+      </w:pPr>
+      <w:r>
+        <w:rPr>
+          <w:b/>
+          <w:bCs/>
+          <w:lang w:eastAsia="en-GB"/>
+        </w:rPr>
+        <w:t xml:space="preserve">6.2 – </w:t>
+      </w:r>
+      <w:proofErr w:type="spellStart"/>
+      <w:r>
+        <w:rPr>
+          <w:b/>
+          <w:bCs/>
+          <w:lang w:eastAsia="en-GB"/>
+        </w:rPr>
+        <w:t>Pannello</w:t>
+      </w:r>
+      <w:proofErr w:type="spellEnd"/>
+      <w:r>
+        <w:rPr>
+          <w:b/>
+          <w:bCs/>
+          <w:lang w:eastAsia="en-GB"/>
+        </w:rPr>
+        <w:t xml:space="preserve"> di debug via console</w:t>
       </w:r>
     </w:p>
     <w:p>
@@ -1577,7 +1934,21 @@
           <w:lang w:val="it-IT" w:eastAsia="en-GB"/>
         </w:rPr>
         <w:lastRenderedPageBreak/>
-        <w:t>Rendere accessibili e modificabili da console le variabili chiave (tasso consumo, velocità raccolta, soglia abbandono, cooldown, raggio)</w:t>
+        <w:t xml:space="preserve">Rendere accessibili e modificabili da console le variabili chiave (tasso consumo, velocità raccolta, soglia abbandono, </w:t>
+      </w:r>
+      <w:proofErr w:type="spellStart"/>
+      <w:r>
+        <w:rPr>
+          <w:lang w:val="it-IT" w:eastAsia="en-GB"/>
+        </w:rPr>
+        <w:t>cooldown</w:t>
+      </w:r>
+      <w:proofErr w:type="spellEnd"/>
+      <w:r>
+        <w:rPr>
+          <w:lang w:val="it-IT" w:eastAsia="en-GB"/>
+        </w:rPr>
+        <w:t>, raggio)</w:t>
       </w:r>
     </w:p>
     <w:p>
@@ -1642,12 +2013,42 @@
           <w:lang w:eastAsia="en-GB"/>
         </w:rPr>
       </w:pPr>
+      <w:proofErr w:type="spellStart"/>
       <w:r>
         <w:rPr>
           <w:lang w:eastAsia="en-GB"/>
         </w:rPr>
-        <w:t>Collegarlo alle variabili di gioco</w:t>
-      </w:r>
+        <w:t>Collegarlo</w:t>
+      </w:r>
+      <w:proofErr w:type="spellEnd"/>
+      <w:r>
+        <w:rPr>
+          <w:lang w:eastAsia="en-GB"/>
+        </w:rPr>
+        <w:t xml:space="preserve"> alle </w:t>
+      </w:r>
+      <w:proofErr w:type="spellStart"/>
+      <w:r>
+        <w:rPr>
+          <w:lang w:eastAsia="en-GB"/>
+        </w:rPr>
+        <w:t>variabili</w:t>
+      </w:r>
+      <w:proofErr w:type="spellEnd"/>
+      <w:r>
+        <w:rPr>
+          <w:lang w:eastAsia="en-GB"/>
+        </w:rPr>
+        <w:t xml:space="preserve"> di </w:t>
+      </w:r>
+      <w:proofErr w:type="spellStart"/>
+      <w:r>
+        <w:rPr>
+          <w:lang w:eastAsia="en-GB"/>
+        </w:rPr>
+        <w:t>gioco</w:t>
+      </w:r>
+      <w:proofErr w:type="spellEnd"/>
     </w:p>
     <w:p>
       <w:pPr>
@@ -1661,8 +2062,54 @@
           <w:bCs/>
           <w:lang w:eastAsia="en-GB"/>
         </w:rPr>
-        <w:t>6.6 – Ribilanciamento e parametri esposti</w:t>
-      </w:r>
+        <w:t xml:space="preserve">6.6 – </w:t>
+      </w:r>
+      <w:proofErr w:type="spellStart"/>
+      <w:r>
+        <w:rPr>
+          <w:b/>
+          <w:bCs/>
+          <w:lang w:eastAsia="en-GB"/>
+        </w:rPr>
+        <w:t>Ribilanciamento</w:t>
+      </w:r>
+      <w:proofErr w:type="spellEnd"/>
+      <w:r>
+        <w:rPr>
+          <w:b/>
+          <w:bCs/>
+          <w:lang w:eastAsia="en-GB"/>
+        </w:rPr>
+        <w:t xml:space="preserve"> e </w:t>
+      </w:r>
+      <w:proofErr w:type="spellStart"/>
+      <w:r>
+        <w:rPr>
+          <w:b/>
+          <w:bCs/>
+          <w:lang w:eastAsia="en-GB"/>
+        </w:rPr>
+        <w:t>parametri</w:t>
+      </w:r>
+      <w:proofErr w:type="spellEnd"/>
+      <w:r>
+        <w:rPr>
+          <w:b/>
+          <w:bCs/>
+          <w:lang w:eastAsia="en-GB"/>
+        </w:rPr>
+        <w:t xml:space="preserve"> </w:t>
+      </w:r>
+      <w:proofErr w:type="spellStart"/>
+      <w:r>
+        <w:rPr>
+          <w:b/>
+          <w:bCs/>
+          <w:lang w:eastAsia="en-GB"/>
+        </w:rPr>
+        <w:t>esposti</w:t>
+      </w:r>
+      <w:proofErr w:type="spellEnd"/>
     </w:p>
     <w:p>
       <w:pPr>
@@ -1678,7 +2125,92 @@
         <w:rPr>
           <w:lang w:val="it-IT" w:eastAsia="en-GB"/>
         </w:rPr>
-        <w:t>Esporre tutti i parametri di gioco nel pannello di debug</w:t>
+        <w:t>Ricalcolare le provviste per spedizione e legare tra di loro variabili sulla base di durata effettiva del giorno e velocità di spostamento (ma anche in generale). Da sistemare:</w:t>
+      </w:r>
+    </w:p>
+    <w:p>
+      <w:pPr>
+        <w:numPr>
+          <w:ilvl w:val="1"/>
+          <w:numId w:val="47"/>
+        </w:numPr>
+        <w:rPr>
+          <w:lang w:val="it-IT" w:eastAsia="en-GB"/>
+        </w:rPr>
+      </w:pPr>
+      <w:r>
+        <w:rPr>
+          <w:lang w:val="it-IT" w:eastAsia="en-GB"/>
+        </w:rPr>
+        <w:t xml:space="preserve">Logica </w:t>
+      </w:r>
+      <w:proofErr w:type="spellStart"/>
+      <w:r>
+        <w:rPr>
+          <w:lang w:val="it-IT" w:eastAsia="en-GB"/>
+        </w:rPr>
+        <w:t>provisions</w:t>
+      </w:r>
+      <w:proofErr w:type="spellEnd"/>
+      <w:r>
+        <w:rPr>
+          <w:lang w:val="it-IT" w:eastAsia="en-GB"/>
+        </w:rPr>
+        <w:t xml:space="preserve"> assegnate (vedi </w:t>
+      </w:r>
+      <w:proofErr w:type="spellStart"/>
+      <w:r>
+        <w:rPr>
+          <w:lang w:val="it-IT" w:eastAsia="en-GB"/>
+        </w:rPr>
+        <w:t>reminder</w:t>
+      </w:r>
+      <w:proofErr w:type="spellEnd"/>
+      <w:r>
+        <w:rPr>
+          <w:lang w:val="it-IT" w:eastAsia="en-GB"/>
+        </w:rPr>
+        <w:t>)</w:t>
+      </w:r>
+    </w:p>
+    <w:p>
+      <w:pPr>
+        <w:numPr>
+          <w:ilvl w:val="1"/>
+          <w:numId w:val="47"/>
+        </w:numPr>
+        <w:rPr>
+          <w:lang w:val="it-IT" w:eastAsia="en-GB"/>
+        </w:rPr>
+      </w:pPr>
+      <w:r>
+        <w:rPr>
+          <w:lang w:val="it-IT" w:eastAsia="en-GB"/>
+        </w:rPr>
+        <w:t>Logica velocità (se 50 pixel è 1km, in un giorno una spedizione può fare quanto?) O meglio fare 10 pixel 1 km?)</w:t>
+      </w:r>
+    </w:p>
+    <w:p>
+      <w:pPr>
+        <w:numPr>
+          <w:ilvl w:val="1"/>
+          <w:numId w:val="47"/>
+        </w:numPr>
+        <w:rPr>
+          <w:lang w:val="it-IT" w:eastAsia="en-GB"/>
+        </w:rPr>
+      </w:pPr>
+      <w:r>
+        <w:rPr>
+          <w:lang w:val="it-IT" w:eastAsia="en-GB"/>
+        </w:rPr>
+        <w:t xml:space="preserve">Logica riposo: forse deve essere </w:t>
+      </w:r>
+      <w:r>
+        <w:rPr>
+          <w:lang w:val="it-IT" w:eastAsia="en-GB"/>
+        </w:rPr>
+        <w:t>basata su durata della spedizione (aggiungere parametro energia/stanchezza?) e possibilità di costringere spedizioni a riposo a ripartire comunque? Sennò al momento basarlo su durata del giorno (riposo = 1 giorno o 1,5/2 giorni)</w:t>
       </w:r>
     </w:p>
     <w:p>
@@ -1695,6 +2227,23 @@
         <w:rPr>
           <w:lang w:val="it-IT" w:eastAsia="en-GB"/>
         </w:rPr>
+        <w:t>Esporre tutti i parametri di gioco nel pannello di debug</w:t>
+      </w:r>
+    </w:p>
+    <w:p>
+      <w:pPr>
+        <w:numPr>
+          <w:ilvl w:val="0"/>
+          <w:numId w:val="47"/>
+        </w:numPr>
+        <w:rPr>
+          <w:lang w:val="it-IT" w:eastAsia="en-GB"/>
+        </w:rPr>
+      </w:pPr>
+      <w:r>
+        <w:rPr>
+          <w:lang w:val="it-IT" w:eastAsia="en-GB"/>
+        </w:rPr>
         <w:t>Testare diverse combinazioni per trovare un bilanciamento iniziale</w:t>
       </w:r>
     </w:p>
@@ -1726,8 +2275,44 @@
         <w:rPr>
           <w:lang w:val="it-IT" w:eastAsia="en-GB"/>
         </w:rPr>
-        <w:t>Se io rimando una spedizione e ho gatherers disponibili, non prende quelli, ma ne crea di nuovi (se vi sono gathers disponibili, prendi prima quelli, questa stessa logica sarà applicata su tutti i tipi di spedizioni ma, in futuro, potremmo volere che il giocatore scelga da quale pool pescare i gahterers</w:t>
-      </w:r>
+        <w:t xml:space="preserve">Se io rimando una spedizione e ho </w:t>
+      </w:r>
+      <w:proofErr w:type="spellStart"/>
+      <w:r>
+        <w:rPr>
+          <w:lang w:val="it-IT" w:eastAsia="en-GB"/>
+        </w:rPr>
+        <w:t>gatherers</w:t>
+      </w:r>
+      <w:proofErr w:type="spellEnd"/>
+      <w:r>
+        <w:rPr>
+          <w:lang w:val="it-IT" w:eastAsia="en-GB"/>
+        </w:rPr>
+        <w:t xml:space="preserve"> disponibili, non prende quelli, ma ne crea di nuovi (se vi sono </w:t>
+      </w:r>
+      <w:proofErr w:type="spellStart"/>
+      <w:r>
+        <w:rPr>
+          <w:lang w:val="it-IT" w:eastAsia="en-GB"/>
+        </w:rPr>
+        <w:t>gathers</w:t>
+      </w:r>
+      <w:proofErr w:type="spellEnd"/>
+      <w:r>
+        <w:rPr>
+          <w:lang w:val="it-IT" w:eastAsia="en-GB"/>
+        </w:rPr>
+        <w:t xml:space="preserve"> disponibili, prendi prima quelli, questa stessa logica sarà applicata su tutti i tipi di spedizioni ma, in futuro, potremmo volere che il giocatore scelga da quale pool pescare i </w:t>
+      </w:r>
+      <w:proofErr w:type="spellStart"/>
+      <w:r>
+        <w:rPr>
+          <w:lang w:val="it-IT" w:eastAsia="en-GB"/>
+        </w:rPr>
+        <w:t>gahterers</w:t>
+      </w:r>
+      <w:proofErr w:type="spellEnd"/>
     </w:p>
     <w:p>
       <w:pPr>
@@ -1784,7 +2369,21 @@
         <w:rPr>
           <w:lang w:val="it-IT"/>
         </w:rPr>
-        <w:t>Le celle con forageDensity si rigenerano lentamente nel tempo (es. una piccola frazione al giorno).</w:t>
+        <w:t xml:space="preserve">Le celle con </w:t>
+      </w:r>
+      <w:proofErr w:type="spellStart"/>
+      <w:r>
+        <w:rPr>
+          <w:lang w:val="it-IT"/>
+        </w:rPr>
+        <w:t>forageDensity</w:t>
+      </w:r>
+      <w:proofErr w:type="spellEnd"/>
+      <w:r>
+        <w:rPr>
+          <w:lang w:val="it-IT"/>
+        </w:rPr>
+        <w:t xml:space="preserve"> si rigenerano lentamente nel tempo (es. una piccola frazione al giorno).</w:t>
       </w:r>
     </w:p>
     <w:p>
@@ -1836,7 +2435,14 @@
         <w:rPr>
           <w:lang w:val="it-IT" w:eastAsia="en-GB"/>
         </w:rPr>
-        <w:t>Nota: la rigenerazione qui implementata sarà una versione semplificata e temporanea. In futuro sarà legata alla tipologia di terreno e seguirà una curva di crescita più realistica (rigenerazione più rapida a densità più alte). I valori attuali andranno poi bilanciati tramite il pannello di debug (Batch 6).</w:t>
+        <w:t xml:space="preserve">Nota: la rigenerazione qui implementata sarà una versione semplificata e temporanea. In futuro sarà legata alla tipologia di terreno e seguirà una curva di crescita più realistica </w:t>
+      </w:r>
+      <w:r>
+        <w:rPr>
+          <w:lang w:val="it-IT" w:eastAsia="en-GB"/>
+        </w:rPr>
+        <w:lastRenderedPageBreak/>
+        <w:t>(rigenerazione più rapida a densità più alte). I valori attuali andranno poi bilanciati tramite il pannello di debug (Batch 6).</w:t>
       </w:r>
     </w:p>
     <w:p>
@@ -1964,7 +2570,6 @@
           <w:bCs/>
           <w:lang w:val="it-IT"/>
         </w:rPr>
-        <w:lastRenderedPageBreak/>
         <w:t>NOTE FINE MVP1</w:t>
       </w:r>
     </w:p>
@@ -1985,7 +2590,21 @@
         <w:rPr>
           <w:lang w:val="it-IT"/>
         </w:rPr>
-        <w:t>Tool per disegnare la mappa (apporre foreste, pesci, gathering food ecc. con dei pennelli) [è forse troppo presto]</w:t>
+        <w:t xml:space="preserve">Tool per disegnare la mappa (apporre foreste, pesci, </w:t>
+      </w:r>
+      <w:proofErr w:type="spellStart"/>
+      <w:r>
+        <w:rPr>
+          <w:lang w:val="it-IT"/>
+        </w:rPr>
+        <w:t>gathering</w:t>
+      </w:r>
+      <w:proofErr w:type="spellEnd"/>
+      <w:r>
+        <w:rPr>
+          <w:lang w:val="it-IT"/>
+        </w:rPr>
+        <w:t xml:space="preserve"> food ecc. con dei pennelli) [è forse troppo presto]</w:t>
       </w:r>
     </w:p>
     <w:p>
@@ -2031,7 +2650,21 @@
         <w:rPr>
           <w:lang w:val="it-IT"/>
         </w:rPr>
-        <w:t xml:space="preserve"> Implementiamo già diversi layer di visualizzazione (terreno, cibo, risorse varie ecc.)?</w:t>
+        <w:t xml:space="preserve"> Implementiamo già diversi </w:t>
+      </w:r>
+      <w:proofErr w:type="spellStart"/>
+      <w:r>
+        <w:rPr>
+          <w:lang w:val="it-IT"/>
+        </w:rPr>
+        <w:t>layer</w:t>
+      </w:r>
+      <w:proofErr w:type="spellEnd"/>
+      <w:r>
+        <w:rPr>
+          <w:lang w:val="it-IT"/>
+        </w:rPr>
+        <w:t xml:space="preserve"> di visualizzazione (terreno, cibo, risorse varie ecc.)?</w:t>
       </w:r>
     </w:p>
     <w:p>
@@ -2139,7 +2772,21 @@
         <w:rPr>
           <w:lang w:val="it-IT" w:eastAsia="en-GB"/>
         </w:rPr>
-        <w:t>Meccaniche di frizione/resistenza al cambio di pop della popolazione (o che si evolve nel tempo e inizialmente la basiamo solo sul sesso, tipo uomini giovani infelice se assegnati a gathering perché disonorevole). Da capire come fare distinzione popolazione per sesso ma soprattutto per età senza dover monitorare ogni singolo abitante</w:t>
+        <w:t xml:space="preserve">Meccaniche di frizione/resistenza al cambio di pop della popolazione (o che si evolve nel tempo e inizialmente la basiamo solo sul sesso, tipo uomini giovani infelice se assegnati a </w:t>
+      </w:r>
+      <w:proofErr w:type="spellStart"/>
+      <w:r>
+        <w:rPr>
+          <w:lang w:val="it-IT" w:eastAsia="en-GB"/>
+        </w:rPr>
+        <w:t>gathering</w:t>
+      </w:r>
+      <w:proofErr w:type="spellEnd"/>
+      <w:r>
+        <w:rPr>
+          <w:lang w:val="it-IT" w:eastAsia="en-GB"/>
+        </w:rPr>
+        <w:t xml:space="preserve"> perché disonorevole). Da capire come fare distinzione popolazione per sesso ma soprattutto per età senza dover monitorare ogni singolo abitante</w:t>
       </w:r>
     </w:p>
     <w:p>
@@ -2193,6 +2840,7 @@
         <w:rPr>
           <w:lang w:val="it-IT" w:eastAsia="en-GB"/>
         </w:rPr>
+        <w:lastRenderedPageBreak/>
         <w:t>Aggiungere crescita demografica: più cibo c’è, più la popolazione cresce. Se cibo scarseggia, aumenta il tasso di morte. Se spedizione finisce scorte, iniziano a morire o a consumare cibo raccolto</w:t>
       </w:r>
     </w:p>
@@ -2211,7 +2859,63 @@
         <w:rPr>
           <w:lang w:val="it-IT" w:eastAsia="en-GB"/>
         </w:rPr>
-        <w:t>Da ragionare: in che contesto siamo, quale è la narrativa? Che anno di partenza e con che tecnologie? In quanti anni arrivare a creare una città, in modo che il gioco non risulti troppo lento e noioso all’inizio (ma senza nemmeno fare come civilization che dura questa età come una roba da 10 minuti). Vogliamo fare che in realtà è un gruppo di superstiti che riparte e recupera le tecnologie già apprese? In che anni? Vogliamo fare un gioco diverso per era (quindi tipo qui con meccaniche più stilizzate) tipo come fa spore? Vogliamo andare sul lungo termine come civilization 4 cavemen to cosmos e quindi comunque rendere intriganti le meccaniche di sopravvivenza della tribù (e praticamente fare solo un gioco su questo, magari come primo titolo di una serie)</w:t>
+        <w:t xml:space="preserve">Da ragionare: in che contesto siamo, quale è la narrativa? Che anno di partenza e con che tecnologie? In quanti anni arrivare a creare una città, in modo che il gioco non risulti troppo lento e noioso all’inizio (ma senza nemmeno fare come </w:t>
+      </w:r>
+      <w:proofErr w:type="spellStart"/>
+      <w:r>
+        <w:rPr>
+          <w:lang w:val="it-IT" w:eastAsia="en-GB"/>
+        </w:rPr>
+        <w:t>civilization</w:t>
+      </w:r>
+      <w:proofErr w:type="spellEnd"/>
+      <w:r>
+        <w:rPr>
+          <w:lang w:val="it-IT" w:eastAsia="en-GB"/>
+        </w:rPr>
+        <w:t xml:space="preserve"> che dura questa età come una roba da 10 minuti). Vogliamo fare che in realtà è un gruppo di superstiti che riparte e recupera le tecnologie già apprese? In che anni? Vogliamo fare un gioco diverso per era (quindi tipo qui con meccaniche più stilizzate) tipo come fa spore? Vogliamo andare sul lungo termine come </w:t>
+      </w:r>
+      <w:proofErr w:type="spellStart"/>
+      <w:r>
+        <w:rPr>
+          <w:lang w:val="it-IT" w:eastAsia="en-GB"/>
+        </w:rPr>
+        <w:t>civilization</w:t>
+      </w:r>
+      <w:proofErr w:type="spellEnd"/>
+      <w:r>
+        <w:rPr>
+          <w:lang w:val="it-IT" w:eastAsia="en-GB"/>
+        </w:rPr>
+        <w:t xml:space="preserve"> 4 </w:t>
+      </w:r>
+      <w:proofErr w:type="spellStart"/>
+      <w:r>
+        <w:rPr>
+          <w:lang w:val="it-IT" w:eastAsia="en-GB"/>
+        </w:rPr>
+        <w:t>cavemen</w:t>
+      </w:r>
+      <w:proofErr w:type="spellEnd"/>
+      <w:r>
+        <w:rPr>
+          <w:lang w:val="it-IT" w:eastAsia="en-GB"/>
+        </w:rPr>
+        <w:t xml:space="preserve"> to </w:t>
+      </w:r>
+      <w:proofErr w:type="spellStart"/>
+      <w:r>
+        <w:rPr>
+          <w:lang w:val="it-IT" w:eastAsia="en-GB"/>
+        </w:rPr>
+        <w:t>cosmos</w:t>
+      </w:r>
+      <w:proofErr w:type="spellEnd"/>
+      <w:r>
+        <w:rPr>
+          <w:lang w:val="it-IT" w:eastAsia="en-GB"/>
+        </w:rPr>
+        <w:t xml:space="preserve"> e quindi comunque rendere intriganti le meccaniche di sopravvivenza della tribù (e praticamente fare solo un gioco su questo, magari come primo titolo di una serie)</w:t>
       </w:r>
     </w:p>
     <w:p>
@@ -2229,7 +2933,6 @@
         <w:rPr>
           <w:lang w:val="it-IT" w:eastAsia="en-GB"/>
         </w:rPr>
-        <w:lastRenderedPageBreak/>
         <w:t>Ragionare sull’acqua</w:t>
       </w:r>
     </w:p>
@@ -2248,7 +2951,85 @@
         <w:rPr>
           <w:lang w:val="it-IT" w:eastAsia="en-GB"/>
         </w:rPr>
-        <w:t>Basare lo sviluppo su: tecnologie cavemen 2 to cosmos con edifici e unità e meccaniche intorno e link di timeline del progresso (wiki e altri link se funzionano)</w:t>
+        <w:t xml:space="preserve">Basare lo sviluppo su: tecnologie </w:t>
+      </w:r>
+      <w:proofErr w:type="spellStart"/>
+      <w:r>
+        <w:rPr>
+          <w:lang w:val="it-IT" w:eastAsia="en-GB"/>
+        </w:rPr>
+        <w:t>cavemen</w:t>
+      </w:r>
+      <w:proofErr w:type="spellEnd"/>
+      <w:r>
+        <w:rPr>
+          <w:lang w:val="it-IT" w:eastAsia="en-GB"/>
+        </w:rPr>
+        <w:t xml:space="preserve"> 2 to </w:t>
+      </w:r>
+      <w:proofErr w:type="spellStart"/>
+      <w:r>
+        <w:rPr>
+          <w:lang w:val="it-IT" w:eastAsia="en-GB"/>
+        </w:rPr>
+        <w:t>cosmos</w:t>
+      </w:r>
+      <w:proofErr w:type="spellEnd"/>
+      <w:r>
+        <w:rPr>
+          <w:lang w:val="it-IT" w:eastAsia="en-GB"/>
+        </w:rPr>
+        <w:t xml:space="preserve"> con edifici e unità e meccaniche intorno e link di timeline del progresso (wiki e altri link se funzionano)</w:t>
+      </w:r>
+    </w:p>
+    <w:p>
+      <w:pPr>
+        <w:pStyle w:val="ListParagraph"/>
+        <w:numPr>
+          <w:ilvl w:val="0"/>
+          <w:numId w:val="41"/>
+        </w:numPr>
+        <w:rPr>
+          <w:lang w:val="it-IT" w:eastAsia="en-GB"/>
+        </w:rPr>
+      </w:pPr>
+      <w:r>
+        <w:rPr>
+          <w:lang w:val="it-IT" w:eastAsia="en-GB"/>
+        </w:rPr>
+        <w:t xml:space="preserve">Aggiungere caricamento JSON da Excel per impostare i valori in </w:t>
+      </w:r>
+      <w:proofErr w:type="spellStart"/>
+      <w:r>
+        <w:rPr>
+          <w:lang w:val="it-IT" w:eastAsia="en-GB"/>
+        </w:rPr>
+        <w:t>config</w:t>
+      </w:r>
+      <w:proofErr w:type="spellEnd"/>
+    </w:p>
+    <w:p>
+      <w:pPr>
+        <w:pStyle w:val="ListParagraph"/>
+        <w:numPr>
+          <w:ilvl w:val="0"/>
+          <w:numId w:val="41"/>
+        </w:numPr>
+        <w:rPr>
+          <w:lang w:val="it-IT" w:eastAsia="en-GB"/>
+        </w:rPr>
+      </w:pPr>
+      <w:r>
+        <w:rPr>
+          <w:lang w:val="it-IT" w:eastAsia="en-GB"/>
+        </w:rPr>
+        <w:t>Creare script per simulazioni montecarlo</w:t>
+      </w:r>
+      <w:r>
+        <w:rPr>
+          <w:lang w:val="it-IT" w:eastAsia="en-GB"/>
+        </w:rPr>
+        <w:t>. Da simulare in montecarlo il cambio cella e la quantità di provviste da prendere, ma magari non deve sempre essere perfetto ma dipendere dall’esperienza (dei singoli, della civiltà/città/comunità, del livello tecnologico?)</w:t>
       </w:r>
     </w:p>
     <w:p>
@@ -2281,7 +3062,15 @@
     </w:p>
     <w:p>
       <w:r>
-        <w:t>Nuova definizione:</w:t>
+        <w:t xml:space="preserve">Nuova </w:t>
+      </w:r>
+      <w:proofErr w:type="spellStart"/>
+      <w:r>
+        <w:t>definizione</w:t>
+      </w:r>
+      <w:proofErr w:type="spellEnd"/>
+      <w:r>
+        <w:t>:</w:t>
       </w:r>
     </w:p>
     <w:p>
@@ -2332,7 +3121,35 @@
         <w:rPr>
           <w:lang w:val="it-IT"/>
         </w:rPr>
-        <w:t>Nelle celle che intersecano fiumi o laghi, il layer fishDensity permette la pesca. Funziona come la raccolta vegetale (riduce densità, si rigenera), ma solo in acqua.</w:t>
+        <w:t xml:space="preserve">Nelle celle che intersecano fiumi o laghi, il </w:t>
+      </w:r>
+      <w:proofErr w:type="spellStart"/>
+      <w:r>
+        <w:rPr>
+          <w:lang w:val="it-IT"/>
+        </w:rPr>
+        <w:t>layer</w:t>
+      </w:r>
+      <w:proofErr w:type="spellEnd"/>
+      <w:r>
+        <w:rPr>
+          <w:lang w:val="it-IT"/>
+        </w:rPr>
+        <w:t xml:space="preserve"> </w:t>
+      </w:r>
+      <w:proofErr w:type="spellStart"/>
+      <w:r>
+        <w:rPr>
+          <w:lang w:val="it-IT"/>
+        </w:rPr>
+        <w:t>fishDensity</w:t>
+      </w:r>
+      <w:proofErr w:type="spellEnd"/>
+      <w:r>
+        <w:rPr>
+          <w:lang w:val="it-IT"/>
+        </w:rPr>
+        <w:t xml:space="preserve"> permette la pesca. Funziona come la raccolta vegetale (riduce densità, si rigenera), ma solo in acqua.</w:t>
       </w:r>
     </w:p>
     <w:p>
@@ -2381,6 +3198,7 @@
           <w:bCs/>
           <w:lang w:val="it-IT"/>
         </w:rPr>
+        <w:lastRenderedPageBreak/>
         <w:t xml:space="preserve">MVP3 – Raccolta legna, lavorazione e </w:t>
       </w:r>
       <w:r>
@@ -2402,7 +3220,35 @@
         <w:rPr>
           <w:lang w:val="it-IT"/>
         </w:rPr>
-        <w:t xml:space="preserve">MVP3 introduce il layer forestDensity e la raccolta di legna. Poi la lavorazione (legna → </w:t>
+        <w:t xml:space="preserve">MVP3 introduce il </w:t>
+      </w:r>
+      <w:proofErr w:type="spellStart"/>
+      <w:r>
+        <w:rPr>
+          <w:lang w:val="it-IT"/>
+        </w:rPr>
+        <w:t>layer</w:t>
+      </w:r>
+      <w:proofErr w:type="spellEnd"/>
+      <w:r>
+        <w:rPr>
+          <w:lang w:val="it-IT"/>
+        </w:rPr>
+        <w:t xml:space="preserve"> </w:t>
+      </w:r>
+      <w:proofErr w:type="spellStart"/>
+      <w:r>
+        <w:rPr>
+          <w:lang w:val="it-IT"/>
+        </w:rPr>
+        <w:t>forestDensity</w:t>
+      </w:r>
+      <w:proofErr w:type="spellEnd"/>
+      <w:r>
+        <w:rPr>
+          <w:lang w:val="it-IT"/>
+        </w:rPr>
+        <w:t xml:space="preserve"> e la raccolta di legna. Poi la lavorazione (legna → </w:t>
       </w:r>
       <w:r>
         <w:rPr>
@@ -2481,7 +3327,49 @@
         <w:rPr>
           <w:lang w:val="it-IT"/>
         </w:rPr>
-        <w:t>Attivazione del layer forestDensity sulla griglia. Le foreste sono visivamente distinguibili (verde scuro). La raccolta di legna riduce la densità localmente, come per il forage.</w:t>
+        <w:t xml:space="preserve">Attivazione del </w:t>
+      </w:r>
+      <w:proofErr w:type="spellStart"/>
+      <w:r>
+        <w:rPr>
+          <w:lang w:val="it-IT"/>
+        </w:rPr>
+        <w:t>layer</w:t>
+      </w:r>
+      <w:proofErr w:type="spellEnd"/>
+      <w:r>
+        <w:rPr>
+          <w:lang w:val="it-IT"/>
+        </w:rPr>
+        <w:t xml:space="preserve"> </w:t>
+      </w:r>
+      <w:proofErr w:type="spellStart"/>
+      <w:r>
+        <w:rPr>
+          <w:lang w:val="it-IT"/>
+        </w:rPr>
+        <w:t>forestDensity</w:t>
+      </w:r>
+      <w:proofErr w:type="spellEnd"/>
+      <w:r>
+        <w:rPr>
+          <w:lang w:val="it-IT"/>
+        </w:rPr>
+        <w:t xml:space="preserve"> sulla griglia. Le foreste sono visivamente distinguibili (verde scuro). La raccolta di legna riduce la densità localmente, come per il </w:t>
+      </w:r>
+      <w:proofErr w:type="spellStart"/>
+      <w:r>
+        <w:rPr>
+          <w:lang w:val="it-IT"/>
+        </w:rPr>
+        <w:t>forage</w:t>
+      </w:r>
+      <w:proofErr w:type="spellEnd"/>
+      <w:r>
+        <w:rPr>
+          <w:lang w:val="it-IT"/>
+        </w:rPr>
+        <w:t>.</w:t>
       </w:r>
     </w:p>
     <w:p>
@@ -2544,7 +3432,6 @@
         <w:rPr>
           <w:lang w:val="it-IT"/>
         </w:rPr>
-        <w:lastRenderedPageBreak/>
         <w:t xml:space="preserve">Costruzione </w:t>
       </w:r>
       <w:r>
@@ -2625,7 +3512,23 @@
     </w:p>
     <w:p>
       <w:r>
-        <w:t>Testo attuale confermato:</w:t>
+        <w:t xml:space="preserve">Testo </w:t>
+      </w:r>
+      <w:proofErr w:type="spellStart"/>
+      <w:r>
+        <w:t>attuale</w:t>
+      </w:r>
+      <w:proofErr w:type="spellEnd"/>
+      <w:r>
+        <w:t xml:space="preserve"> </w:t>
+      </w:r>
+      <w:proofErr w:type="spellStart"/>
+      <w:r>
+        <w:t>confermato</w:t>
+      </w:r>
+      <w:proofErr w:type="spellEnd"/>
+      <w:r>
+        <w:t>:</w:t>
       </w:r>
     </w:p>
     <w:p>
@@ -2720,8 +3623,21 @@
           <w:numId w:val="10"/>
         </w:numPr>
       </w:pPr>
-      <w:r>
-        <w:t>Indicatore di posizione:</w:t>
+      <w:proofErr w:type="spellStart"/>
+      <w:r>
+        <w:t>Indicatore</w:t>
+      </w:r>
+      <w:proofErr w:type="spellEnd"/>
+      <w:r>
+        <w:t xml:space="preserve"> di </w:t>
+      </w:r>
+      <w:proofErr w:type="spellStart"/>
+      <w:r>
+        <w:t>posizione</w:t>
+      </w:r>
+      <w:proofErr w:type="spellEnd"/>
+      <w:r>
+        <w:t>:</w:t>
       </w:r>
     </w:p>
     <w:p>
@@ -2772,6 +3688,7 @@
         <w:rPr>
           <w:lang w:val="it-IT"/>
         </w:rPr>
+        <w:lastRenderedPageBreak/>
         <w:t>Da report (lampeggiante o con indicatore "R") quando arriva un messaggio.</w:t>
       </w:r>
     </w:p>
@@ -2785,11 +3702,19 @@
           <w:lang w:val="it-IT"/>
         </w:rPr>
       </w:pPr>
-      <w:r>
-        <w:rPr>
-          <w:lang w:val="it-IT"/>
-        </w:rPr>
-        <w:t>Tooltip base per risorse e pop.</w:t>
+      <w:proofErr w:type="spellStart"/>
+      <w:r>
+        <w:rPr>
+          <w:lang w:val="it-IT"/>
+        </w:rPr>
+        <w:t>Tooltip</w:t>
+      </w:r>
+      <w:proofErr w:type="spellEnd"/>
+      <w:r>
+        <w:rPr>
+          <w:lang w:val="it-IT"/>
+        </w:rPr>
+        <w:t xml:space="preserve"> base per risorse e pop.</w:t>
       </w:r>
     </w:p>
     <w:p>
@@ -2817,12 +3742,42 @@
         <w:rPr>
           <w:lang w:val="it-IT"/>
         </w:rPr>
-        <w:t>Nessuna modifica necessaria. La competizione per le risorse funziona con qualsiasi tipo di layer o branco.</w:t>
-      </w:r>
-    </w:p>
-    <w:p>
-      <w:r>
-        <w:t>Testo attuale confermato:</w:t>
+        <w:t xml:space="preserve">Nessuna modifica necessaria. La competizione per le risorse funziona con qualsiasi tipo di </w:t>
+      </w:r>
+      <w:proofErr w:type="spellStart"/>
+      <w:r>
+        <w:rPr>
+          <w:lang w:val="it-IT"/>
+        </w:rPr>
+        <w:t>layer</w:t>
+      </w:r>
+      <w:proofErr w:type="spellEnd"/>
+      <w:r>
+        <w:rPr>
+          <w:lang w:val="it-IT"/>
+        </w:rPr>
+        <w:t xml:space="preserve"> o branco.</w:t>
+      </w:r>
+    </w:p>
+    <w:p>
+      <w:r>
+        <w:t xml:space="preserve">Testo </w:t>
+      </w:r>
+      <w:proofErr w:type="spellStart"/>
+      <w:r>
+        <w:t>attuale</w:t>
+      </w:r>
+      <w:proofErr w:type="spellEnd"/>
+      <w:r>
+        <w:t xml:space="preserve"> </w:t>
+      </w:r>
+      <w:proofErr w:type="spellStart"/>
+      <w:r>
+        <w:t>confermato</w:t>
+      </w:r>
+      <w:proofErr w:type="spellEnd"/>
+      <w:r>
+        <w:t>:</w:t>
       </w:r>
     </w:p>
     <w:p>
@@ -2914,7 +3869,6 @@
           <w:bCs/>
           <w:lang w:val="it-IT"/>
         </w:rPr>
-        <w:lastRenderedPageBreak/>
         <w:t>CONCETTI DA RECUPERARE POI:</w:t>
       </w:r>
     </w:p>
@@ -6586,7 +7540,7 @@
         <w:sz w:val="20"/>
       </w:rPr>
     </w:lvl>
-    <w:lvl w:ilvl="1" w:tentative="1">
+    <w:lvl w:ilvl="1">
       <w:start w:val="1"/>
       <w:numFmt w:val="bullet"/>
       <w:lvlText w:val="o"/>

</xml_diff>

<commit_message>
Realignement for agent use
</commit_message>
<xml_diff>
--- a/Docs/Prototipo 1.docx
+++ b/Docs/Prototipo 1.docx
@@ -2806,12 +2806,480 @@
         <w:rPr>
           <w:b/>
           <w:bCs/>
-          <w:sz w:val="36"/>
-          <w:szCs w:val="36"/>
-          <w:lang w:val="it-IT"/>
-        </w:rPr>
-      </w:pPr>
-      <w:r>
+          <w:lang w:val="it-IT" w:eastAsia="en-GB"/>
+        </w:rPr>
+      </w:pPr>
+      <w:r>
+        <w:rPr>
+          <w:b/>
+          <w:bCs/>
+          <w:lang w:val="it-IT" w:eastAsia="en-GB"/>
+        </w:rPr>
+        <w:t>4. Previsioni e avvisi</w:t>
+      </w:r>
+    </w:p>
+    <w:p>
+      <w:pPr>
+        <w:numPr>
+          <w:ilvl w:val="0"/>
+          <w:numId w:val="29"/>
+        </w:numPr>
+        <w:rPr>
+          <w:lang w:val="it-IT" w:eastAsia="en-GB"/>
+        </w:rPr>
+      </w:pPr>
+      <w:r>
+        <w:rPr>
+          <w:b/>
+          <w:bCs/>
+          <w:lang w:val="it-IT" w:eastAsia="en-GB"/>
+        </w:rPr>
+        <w:t>Soglia unica di avviso:</w:t>
+      </w:r>
+      <w:r>
+        <w:rPr>
+          <w:lang w:val="it-IT" w:eastAsia="en-GB"/>
+        </w:rPr>
+        <w:t> </w:t>
+      </w:r>
+      <w:proofErr w:type="spellStart"/>
+      <w:r>
+        <w:rPr>
+          <w:lang w:val="it-IT" w:eastAsia="en-GB"/>
+        </w:rPr>
+        <w:t>cellWarningThreshold</w:t>
+      </w:r>
+      <w:proofErr w:type="spellEnd"/>
+      <w:r>
+        <w:rPr>
+          <w:lang w:val="it-IT" w:eastAsia="en-GB"/>
+        </w:rPr>
+        <w:t xml:space="preserve"> = 0.25.</w:t>
+      </w:r>
+    </w:p>
+    <w:p>
+      <w:pPr>
+        <w:numPr>
+          <w:ilvl w:val="0"/>
+          <w:numId w:val="29"/>
+        </w:numPr>
+        <w:rPr>
+          <w:lang w:val="it-IT" w:eastAsia="en-GB"/>
+        </w:rPr>
+      </w:pPr>
+      <w:r>
+        <w:rPr>
+          <w:lang w:val="it-IT" w:eastAsia="en-GB"/>
+        </w:rPr>
+        <w:t>Quando una cella con lavoratori scende sotto la soglia, mostrare un avviso unico.</w:t>
+      </w:r>
+    </w:p>
+    <w:p>
+      <w:pPr>
+        <w:numPr>
+          <w:ilvl w:val="0"/>
+          <w:numId w:val="29"/>
+        </w:numPr>
+        <w:rPr>
+          <w:lang w:val="it-IT" w:eastAsia="en-GB"/>
+        </w:rPr>
+      </w:pPr>
+      <w:r>
+        <w:rPr>
+          <w:lang w:val="it-IT" w:eastAsia="en-GB"/>
+        </w:rPr>
+        <w:t>Nella schermata città, riepilogo giornaliero:</w:t>
+      </w:r>
+    </w:p>
+    <w:p>
+      <w:pPr>
+        <w:numPr>
+          <w:ilvl w:val="1"/>
+          <w:numId w:val="29"/>
+        </w:numPr>
+        <w:rPr>
+          <w:lang w:eastAsia="en-GB"/>
+        </w:rPr>
+      </w:pPr>
+      <w:r>
+        <w:rPr>
+          <w:lang w:eastAsia="en-GB"/>
+        </w:rPr>
+        <w:t xml:space="preserve">Cibo </w:t>
+      </w:r>
+      <w:proofErr w:type="spellStart"/>
+      <w:r>
+        <w:rPr>
+          <w:lang w:eastAsia="en-GB"/>
+        </w:rPr>
+        <w:t>raccolto</w:t>
+      </w:r>
+      <w:proofErr w:type="spellEnd"/>
+      <w:r>
+        <w:rPr>
+          <w:lang w:eastAsia="en-GB"/>
+        </w:rPr>
+        <w:t xml:space="preserve"> </w:t>
+      </w:r>
+      <w:proofErr w:type="spellStart"/>
+      <w:r>
+        <w:rPr>
+          <w:lang w:eastAsia="en-GB"/>
+        </w:rPr>
+        <w:t>oggi</w:t>
+      </w:r>
+      <w:proofErr w:type="spellEnd"/>
+      <w:r>
+        <w:rPr>
+          <w:lang w:eastAsia="en-GB"/>
+        </w:rPr>
+        <w:t>.</w:t>
+      </w:r>
+    </w:p>
+    <w:p>
+      <w:pPr>
+        <w:numPr>
+          <w:ilvl w:val="1"/>
+          <w:numId w:val="29"/>
+        </w:numPr>
+        <w:rPr>
+          <w:lang w:eastAsia="en-GB"/>
+        </w:rPr>
+      </w:pPr>
+      <w:r>
+        <w:rPr>
+          <w:lang w:eastAsia="en-GB"/>
+        </w:rPr>
+        <w:t xml:space="preserve">Cibo </w:t>
+      </w:r>
+      <w:proofErr w:type="spellStart"/>
+      <w:r>
+        <w:rPr>
+          <w:lang w:eastAsia="en-GB"/>
+        </w:rPr>
+        <w:t>consumato</w:t>
+      </w:r>
+      <w:proofErr w:type="spellEnd"/>
+      <w:r>
+        <w:rPr>
+          <w:lang w:eastAsia="en-GB"/>
+        </w:rPr>
+        <w:t xml:space="preserve"> </w:t>
+      </w:r>
+      <w:proofErr w:type="spellStart"/>
+      <w:r>
+        <w:rPr>
+          <w:lang w:eastAsia="en-GB"/>
+        </w:rPr>
+        <w:t>oggi</w:t>
+      </w:r>
+      <w:proofErr w:type="spellEnd"/>
+      <w:r>
+        <w:rPr>
+          <w:lang w:eastAsia="en-GB"/>
+        </w:rPr>
+        <w:t>.</w:t>
+      </w:r>
+    </w:p>
+    <w:p>
+      <w:pPr>
+        <w:numPr>
+          <w:ilvl w:val="1"/>
+          <w:numId w:val="29"/>
+        </w:numPr>
+        <w:rPr>
+          <w:lang w:val="it-IT" w:eastAsia="en-GB"/>
+        </w:rPr>
+      </w:pPr>
+      <w:r>
+        <w:rPr>
+          <w:lang w:val="it-IT" w:eastAsia="en-GB"/>
+        </w:rPr>
+        <w:t>Cibo rimanente sfruttabile nell'area locale (fino a soglia 0.25) e teorico (fino a 0).</w:t>
+      </w:r>
+    </w:p>
+    <w:p>
+      <w:pPr>
+        <w:numPr>
+          <w:ilvl w:val="1"/>
+          <w:numId w:val="29"/>
+        </w:numPr>
+        <w:rPr>
+          <w:lang w:val="it-IT" w:eastAsia="en-GB"/>
+        </w:rPr>
+      </w:pPr>
+      <w:r>
+        <w:rPr>
+          <w:lang w:val="it-IT" w:eastAsia="en-GB"/>
+        </w:rPr>
+        <w:t xml:space="preserve">Lavoratori per pop (al momento avremo solo </w:t>
+      </w:r>
+      <w:proofErr w:type="spellStart"/>
+      <w:r>
+        <w:rPr>
+          <w:lang w:val="it-IT" w:eastAsia="en-GB"/>
+        </w:rPr>
+        <w:t>gatherers</w:t>
+      </w:r>
+      <w:proofErr w:type="spellEnd"/>
+      <w:r>
+        <w:rPr>
+          <w:lang w:val="it-IT" w:eastAsia="en-GB"/>
+        </w:rPr>
+        <w:t xml:space="preserve">), poi suddivisi in </w:t>
+      </w:r>
+      <w:proofErr w:type="spellStart"/>
+      <w:r>
+        <w:rPr>
+          <w:lang w:val="it-IT" w:eastAsia="en-GB"/>
+        </w:rPr>
+        <w:t>gatherers</w:t>
+      </w:r>
+      <w:proofErr w:type="spellEnd"/>
+      <w:r>
+        <w:rPr>
+          <w:lang w:val="it-IT" w:eastAsia="en-GB"/>
+        </w:rPr>
+        <w:t xml:space="preserve"> locali e </w:t>
+      </w:r>
+      <w:proofErr w:type="spellStart"/>
+      <w:r>
+        <w:rPr>
+          <w:lang w:val="it-IT" w:eastAsia="en-GB"/>
+        </w:rPr>
+        <w:t>gatherers</w:t>
+      </w:r>
+      <w:proofErr w:type="spellEnd"/>
+      <w:r>
+        <w:rPr>
+          <w:lang w:val="it-IT" w:eastAsia="en-GB"/>
+        </w:rPr>
+        <w:t xml:space="preserve"> in spedizioni</w:t>
+      </w:r>
+    </w:p>
+    <w:p>
+      <w:pPr>
+        <w:numPr>
+          <w:ilvl w:val="0"/>
+          <w:numId w:val="29"/>
+        </w:numPr>
+        <w:rPr>
+          <w:lang w:val="it-IT" w:eastAsia="en-GB"/>
+        </w:rPr>
+      </w:pPr>
+      <w:r>
+        <w:rPr>
+          <w:lang w:val="it-IT" w:eastAsia="en-GB"/>
+        </w:rPr>
+        <w:t>Queste informazioni saranno offuscate in futuro.</w:t>
+      </w:r>
+    </w:p>
+    <w:p>
+      <w:pPr>
+        <w:numPr>
+          <w:ilvl w:val="0"/>
+          <w:numId w:val="29"/>
+        </w:numPr>
+        <w:rPr>
+          <w:lang w:val="it-IT" w:eastAsia="en-GB"/>
+        </w:rPr>
+      </w:pPr>
+      <w:r>
+        <w:rPr>
+          <w:lang w:val="it-IT" w:eastAsia="en-GB"/>
+        </w:rPr>
+        <w:t xml:space="preserve">Per ogni cella mostrare sopra il numero di cittadini che la stanno lavorando (anche in </w:t>
+      </w:r>
+      <w:proofErr w:type="spellStart"/>
+      <w:r>
+        <w:rPr>
+          <w:lang w:val="it-IT" w:eastAsia="en-GB"/>
+        </w:rPr>
+        <w:t>gamestate</w:t>
+      </w:r>
+      <w:proofErr w:type="spellEnd"/>
+      <w:r>
+        <w:rPr>
+          <w:lang w:val="it-IT" w:eastAsia="en-GB"/>
+        </w:rPr>
+        <w:t>)</w:t>
+      </w:r>
+    </w:p>
+    <w:p>
+      <w:pPr>
+        <w:numPr>
+          <w:ilvl w:val="0"/>
+          <w:numId w:val="29"/>
+        </w:numPr>
+        <w:rPr>
+          <w:lang w:val="it-IT" w:eastAsia="en-GB"/>
+        </w:rPr>
+      </w:pPr>
+      <w:r>
+        <w:rPr>
+          <w:lang w:val="it-IT" w:eastAsia="en-GB"/>
+        </w:rPr>
+        <w:t>Per ogni cella, quando selezionata mostrare:</w:t>
+      </w:r>
+    </w:p>
+    <w:p>
+      <w:pPr>
+        <w:numPr>
+          <w:ilvl w:val="1"/>
+          <w:numId w:val="29"/>
+        </w:numPr>
+        <w:rPr>
+          <w:lang w:val="it-IT" w:eastAsia="en-GB"/>
+        </w:rPr>
+      </w:pPr>
+      <w:r>
+        <w:rPr>
+          <w:lang w:val="it-IT" w:eastAsia="en-GB"/>
+        </w:rPr>
+        <w:t>Cibo raccolto ad oggi</w:t>
+      </w:r>
+    </w:p>
+    <w:p>
+      <w:pPr>
+        <w:numPr>
+          <w:ilvl w:val="1"/>
+          <w:numId w:val="29"/>
+        </w:numPr>
+        <w:rPr>
+          <w:lang w:val="it-IT" w:eastAsia="en-GB"/>
+        </w:rPr>
+      </w:pPr>
+      <w:r>
+        <w:rPr>
+          <w:lang w:val="it-IT" w:eastAsia="en-GB"/>
+        </w:rPr>
+        <w:t>Cibo rimanente sfruttabile</w:t>
+      </w:r>
+    </w:p>
+    <w:p>
+      <w:pPr>
+        <w:numPr>
+          <w:ilvl w:val="1"/>
+          <w:numId w:val="29"/>
+        </w:numPr>
+        <w:rPr>
+          <w:lang w:val="it-IT" w:eastAsia="en-GB"/>
+        </w:rPr>
+      </w:pPr>
+      <w:r>
+        <w:rPr>
+          <w:lang w:val="it-IT" w:eastAsia="en-GB"/>
+        </w:rPr>
+        <w:t>Giorni al raggiungimento soglia 0.25 con attuale ritmo</w:t>
+      </w:r>
+    </w:p>
+    <w:p>
+      <w:pPr>
+        <w:numPr>
+          <w:ilvl w:val="1"/>
+          <w:numId w:val="29"/>
+        </w:numPr>
+        <w:rPr>
+          <w:lang w:val="it-IT" w:eastAsia="en-GB"/>
+        </w:rPr>
+      </w:pPr>
+      <w:r>
+        <w:rPr>
+          <w:lang w:val="it-IT" w:eastAsia="en-GB"/>
+        </w:rPr>
+        <w:t>Giorni al raggiungimento soglia 0 con attuale ritmo</w:t>
+      </w:r>
+    </w:p>
+    <w:p>
+      <w:pPr>
+        <w:numPr>
+          <w:ilvl w:val="1"/>
+          <w:numId w:val="29"/>
+        </w:numPr>
+        <w:rPr>
+          <w:lang w:val="it-IT" w:eastAsia="en-GB"/>
+        </w:rPr>
+      </w:pPr>
+      <w:r>
+        <w:rPr>
+          <w:lang w:val="it-IT" w:eastAsia="en-GB"/>
+        </w:rPr>
+        <w:t>Aumento di cibo raccolto al giorno se aggiungo qualcuno a lavorarci</w:t>
+      </w:r>
+    </w:p>
+    <w:p>
+      <w:pPr>
+        <w:numPr>
+          <w:ilvl w:val="1"/>
+          <w:numId w:val="29"/>
+        </w:numPr>
+        <w:rPr>
+          <w:lang w:val="it-IT" w:eastAsia="en-GB"/>
+        </w:rPr>
+      </w:pPr>
+      <w:r>
+        <w:rPr>
+          <w:lang w:val="it-IT" w:eastAsia="en-GB"/>
+        </w:rPr>
+        <w:lastRenderedPageBreak/>
+        <w:t>Giorni in meno che ci vorranno per raggiungere la soglia 0.25 e 0 se aggiungo un lavoratore</w:t>
+      </w:r>
+    </w:p>
+    <w:p>
+      <w:pPr>
+        <w:numPr>
+          <w:ilvl w:val="0"/>
+          <w:numId w:val="29"/>
+        </w:numPr>
+        <w:rPr>
+          <w:lang w:val="it-IT" w:eastAsia="en-GB"/>
+        </w:rPr>
+      </w:pPr>
+      <w:r>
+        <w:rPr>
+          <w:lang w:val="it-IT" w:eastAsia="en-GB"/>
+        </w:rPr>
+        <w:t xml:space="preserve">Quando un lavoratore viene assegnato a lavorare come </w:t>
+      </w:r>
+      <w:proofErr w:type="spellStart"/>
+      <w:r>
+        <w:rPr>
+          <w:lang w:val="it-IT" w:eastAsia="en-GB"/>
+        </w:rPr>
+        <w:t>gatherer</w:t>
+      </w:r>
+      <w:proofErr w:type="spellEnd"/>
+      <w:r>
+        <w:rPr>
+          <w:lang w:val="it-IT" w:eastAsia="en-GB"/>
+        </w:rPr>
+        <w:t xml:space="preserve"> una cella, esso diventa membro del pop dei </w:t>
+      </w:r>
+      <w:proofErr w:type="spellStart"/>
+      <w:r>
+        <w:rPr>
+          <w:lang w:val="it-IT" w:eastAsia="en-GB"/>
+        </w:rPr>
+        <w:t>gatherers</w:t>
+      </w:r>
+      <w:proofErr w:type="spellEnd"/>
+      <w:r>
+        <w:rPr>
+          <w:lang w:val="it-IT" w:eastAsia="en-GB"/>
+        </w:rPr>
+        <w:t xml:space="preserve"> anche se non fa parte di una spedizione </w:t>
+      </w:r>
+      <w:proofErr w:type="spellStart"/>
+      <w:r>
+        <w:rPr>
+          <w:lang w:val="it-IT" w:eastAsia="en-GB"/>
+        </w:rPr>
+        <w:t>gatherers</w:t>
+      </w:r>
+      <w:proofErr w:type="spellEnd"/>
+    </w:p>
+    <w:p>
+      <w:pPr>
         <w:rPr>
           <w:b/>
           <w:bCs/>
@@ -2819,485 +3287,17 @@
           <w:szCs w:val="36"/>
           <w:lang w:val="it-IT"/>
         </w:rPr>
-        <w:t>DA IMPLEMENTARE</w:t>
-      </w:r>
-    </w:p>
-    <w:p>
-      <w:pPr>
+      </w:pPr>
+      <w:r>
         <w:rPr>
           <w:b/>
           <w:bCs/>
-          <w:lang w:val="it-IT" w:eastAsia="en-GB"/>
-        </w:rPr>
-      </w:pPr>
-      <w:r>
-        <w:rPr>
-          <w:b/>
-          <w:bCs/>
-          <w:lang w:val="it-IT" w:eastAsia="en-GB"/>
-        </w:rPr>
-        <w:t>4. Previsioni e avvisi</w:t>
-      </w:r>
-    </w:p>
-    <w:p>
-      <w:pPr>
-        <w:numPr>
-          <w:ilvl w:val="0"/>
-          <w:numId w:val="29"/>
-        </w:numPr>
-        <w:rPr>
-          <w:lang w:val="it-IT" w:eastAsia="en-GB"/>
-        </w:rPr>
-      </w:pPr>
-      <w:r>
-        <w:rPr>
-          <w:b/>
-          <w:bCs/>
-          <w:lang w:val="it-IT" w:eastAsia="en-GB"/>
-        </w:rPr>
-        <w:t>Soglia unica di avviso:</w:t>
-      </w:r>
-      <w:r>
-        <w:rPr>
-          <w:lang w:val="it-IT" w:eastAsia="en-GB"/>
-        </w:rPr>
-        <w:t> </w:t>
-      </w:r>
-      <w:proofErr w:type="spellStart"/>
-      <w:r>
-        <w:rPr>
-          <w:lang w:val="it-IT" w:eastAsia="en-GB"/>
-        </w:rPr>
-        <w:t>cellWarningThreshold</w:t>
-      </w:r>
-      <w:proofErr w:type="spellEnd"/>
-      <w:r>
-        <w:rPr>
-          <w:lang w:val="it-IT" w:eastAsia="en-GB"/>
-        </w:rPr>
-        <w:t xml:space="preserve"> = 0.25.</w:t>
-      </w:r>
-    </w:p>
-    <w:p>
-      <w:pPr>
-        <w:numPr>
-          <w:ilvl w:val="0"/>
-          <w:numId w:val="29"/>
-        </w:numPr>
-        <w:rPr>
-          <w:lang w:val="it-IT" w:eastAsia="en-GB"/>
-        </w:rPr>
-      </w:pPr>
-      <w:r>
-        <w:rPr>
-          <w:lang w:val="it-IT" w:eastAsia="en-GB"/>
-        </w:rPr>
-        <w:t>Quando una cella con lavoratori scende sotto la soglia, mostrare un avviso unico.</w:t>
-      </w:r>
-    </w:p>
-    <w:p>
-      <w:pPr>
-        <w:numPr>
-          <w:ilvl w:val="0"/>
-          <w:numId w:val="29"/>
-        </w:numPr>
-        <w:rPr>
-          <w:lang w:val="it-IT" w:eastAsia="en-GB"/>
-        </w:rPr>
-      </w:pPr>
-      <w:r>
-        <w:rPr>
-          <w:lang w:val="it-IT" w:eastAsia="en-GB"/>
-        </w:rPr>
-        <w:t>Nella schermata città, riepilogo giornaliero:</w:t>
-      </w:r>
-    </w:p>
-    <w:p>
-      <w:pPr>
-        <w:numPr>
-          <w:ilvl w:val="1"/>
-          <w:numId w:val="29"/>
-        </w:numPr>
-        <w:rPr>
-          <w:lang w:eastAsia="en-GB"/>
-        </w:rPr>
-      </w:pPr>
-      <w:r>
-        <w:rPr>
-          <w:lang w:eastAsia="en-GB"/>
-        </w:rPr>
-        <w:t xml:space="preserve">Cibo </w:t>
-      </w:r>
-      <w:proofErr w:type="spellStart"/>
-      <w:r>
-        <w:rPr>
-          <w:lang w:eastAsia="en-GB"/>
-        </w:rPr>
-        <w:t>raccolto</w:t>
-      </w:r>
-      <w:proofErr w:type="spellEnd"/>
-      <w:r>
-        <w:rPr>
-          <w:lang w:eastAsia="en-GB"/>
-        </w:rPr>
-        <w:t xml:space="preserve"> </w:t>
-      </w:r>
-      <w:proofErr w:type="spellStart"/>
-      <w:r>
-        <w:rPr>
-          <w:lang w:eastAsia="en-GB"/>
-        </w:rPr>
-        <w:t>oggi</w:t>
-      </w:r>
-      <w:proofErr w:type="spellEnd"/>
-      <w:r>
-        <w:rPr>
-          <w:lang w:eastAsia="en-GB"/>
-        </w:rPr>
-        <w:t>.</w:t>
-      </w:r>
-    </w:p>
-    <w:p>
-      <w:pPr>
-        <w:numPr>
-          <w:ilvl w:val="1"/>
-          <w:numId w:val="29"/>
-        </w:numPr>
-        <w:rPr>
-          <w:lang w:eastAsia="en-GB"/>
-        </w:rPr>
-      </w:pPr>
-      <w:r>
-        <w:rPr>
-          <w:lang w:eastAsia="en-GB"/>
-        </w:rPr>
-        <w:t xml:space="preserve">Cibo </w:t>
-      </w:r>
-      <w:proofErr w:type="spellStart"/>
-      <w:r>
-        <w:rPr>
-          <w:lang w:eastAsia="en-GB"/>
-        </w:rPr>
-        <w:t>consumato</w:t>
-      </w:r>
-      <w:proofErr w:type="spellEnd"/>
-      <w:r>
-        <w:rPr>
-          <w:lang w:eastAsia="en-GB"/>
-        </w:rPr>
-        <w:t xml:space="preserve"> </w:t>
-      </w:r>
-      <w:proofErr w:type="spellStart"/>
-      <w:r>
-        <w:rPr>
-          <w:lang w:eastAsia="en-GB"/>
-        </w:rPr>
-        <w:t>oggi</w:t>
-      </w:r>
-      <w:proofErr w:type="spellEnd"/>
-      <w:r>
-        <w:rPr>
-          <w:lang w:eastAsia="en-GB"/>
-        </w:rPr>
-        <w:t>.</w:t>
-      </w:r>
-    </w:p>
-    <w:p>
-      <w:pPr>
-        <w:numPr>
-          <w:ilvl w:val="1"/>
-          <w:numId w:val="29"/>
-        </w:numPr>
-        <w:rPr>
-          <w:lang w:val="it-IT" w:eastAsia="en-GB"/>
-        </w:rPr>
-      </w:pPr>
-      <w:r>
-        <w:rPr>
-          <w:lang w:val="it-IT" w:eastAsia="en-GB"/>
-        </w:rPr>
-        <w:t>Cibo rimanente sfruttabile nell'area locale (fino a soglia 0.25) e teorico (fino a 0).</w:t>
-      </w:r>
-    </w:p>
-    <w:p>
-      <w:pPr>
-        <w:numPr>
-          <w:ilvl w:val="1"/>
-          <w:numId w:val="29"/>
-        </w:numPr>
-        <w:rPr>
-          <w:lang w:val="it-IT" w:eastAsia="en-GB"/>
-        </w:rPr>
-      </w:pPr>
-      <w:r>
-        <w:rPr>
-          <w:lang w:val="it-IT" w:eastAsia="en-GB"/>
-        </w:rPr>
-        <w:t xml:space="preserve">Lavoratori per pop (al momento avremo solo </w:t>
-      </w:r>
-      <w:proofErr w:type="spellStart"/>
-      <w:r>
-        <w:rPr>
-          <w:lang w:val="it-IT" w:eastAsia="en-GB"/>
-        </w:rPr>
-        <w:t>gatherers</w:t>
-      </w:r>
-      <w:proofErr w:type="spellEnd"/>
-      <w:r>
-        <w:rPr>
-          <w:lang w:val="it-IT" w:eastAsia="en-GB"/>
-        </w:rPr>
-        <w:t xml:space="preserve">), poi suddivisi in </w:t>
-      </w:r>
-      <w:proofErr w:type="spellStart"/>
-      <w:r>
-        <w:rPr>
-          <w:lang w:val="it-IT" w:eastAsia="en-GB"/>
-        </w:rPr>
-        <w:t>gatherers</w:t>
-      </w:r>
-      <w:proofErr w:type="spellEnd"/>
-      <w:r>
-        <w:rPr>
-          <w:lang w:val="it-IT" w:eastAsia="en-GB"/>
-        </w:rPr>
-        <w:t xml:space="preserve"> locali e </w:t>
-      </w:r>
-      <w:proofErr w:type="spellStart"/>
-      <w:r>
-        <w:rPr>
-          <w:lang w:val="it-IT" w:eastAsia="en-GB"/>
-        </w:rPr>
-        <w:t>gatherers</w:t>
-      </w:r>
-      <w:proofErr w:type="spellEnd"/>
-      <w:r>
-        <w:rPr>
-          <w:lang w:val="it-IT" w:eastAsia="en-GB"/>
-        </w:rPr>
-        <w:t xml:space="preserve"> in spedizioni</w:t>
-      </w:r>
-    </w:p>
-    <w:p>
-      <w:pPr>
-        <w:numPr>
-          <w:ilvl w:val="0"/>
-          <w:numId w:val="29"/>
-        </w:numPr>
-        <w:rPr>
-          <w:lang w:val="it-IT" w:eastAsia="en-GB"/>
-        </w:rPr>
-      </w:pPr>
-      <w:r>
-        <w:rPr>
-          <w:lang w:val="it-IT" w:eastAsia="en-GB"/>
-        </w:rPr>
-        <w:t>Queste informazioni saranno offuscate in futuro.</w:t>
-      </w:r>
-    </w:p>
-    <w:p>
-      <w:pPr>
-        <w:numPr>
-          <w:ilvl w:val="0"/>
-          <w:numId w:val="29"/>
-        </w:numPr>
-        <w:rPr>
-          <w:lang w:val="it-IT" w:eastAsia="en-GB"/>
-        </w:rPr>
-      </w:pPr>
-      <w:r>
-        <w:rPr>
-          <w:lang w:val="it-IT" w:eastAsia="en-GB"/>
-        </w:rPr>
-        <w:t xml:space="preserve">Per ogni cella mostrare sopra il numero di cittadini che la stanno lavorando (anche in </w:t>
-      </w:r>
-      <w:proofErr w:type="spellStart"/>
-      <w:r>
-        <w:rPr>
-          <w:lang w:val="it-IT" w:eastAsia="en-GB"/>
-        </w:rPr>
-        <w:t>gamestate</w:t>
-      </w:r>
-      <w:proofErr w:type="spellEnd"/>
-      <w:r>
-        <w:rPr>
-          <w:lang w:val="it-IT" w:eastAsia="en-GB"/>
-        </w:rPr>
-        <w:t>)</w:t>
-      </w:r>
-    </w:p>
-    <w:p>
-      <w:pPr>
-        <w:numPr>
-          <w:ilvl w:val="0"/>
-          <w:numId w:val="29"/>
-        </w:numPr>
-        <w:rPr>
-          <w:lang w:val="it-IT" w:eastAsia="en-GB"/>
-        </w:rPr>
-      </w:pPr>
-      <w:r>
-        <w:rPr>
-          <w:lang w:val="it-IT" w:eastAsia="en-GB"/>
-        </w:rPr>
-        <w:t>Per ogni cella, quando selezionata mostrare:</w:t>
-      </w:r>
-    </w:p>
-    <w:p>
-      <w:pPr>
-        <w:numPr>
-          <w:ilvl w:val="1"/>
-          <w:numId w:val="29"/>
-        </w:numPr>
-        <w:rPr>
-          <w:lang w:val="it-IT" w:eastAsia="en-GB"/>
-        </w:rPr>
-      </w:pPr>
-      <w:r>
-        <w:rPr>
-          <w:lang w:val="it-IT" w:eastAsia="en-GB"/>
-        </w:rPr>
-        <w:t>Cibo raccolto ad oggi</w:t>
-      </w:r>
-    </w:p>
-    <w:p>
-      <w:pPr>
-        <w:numPr>
-          <w:ilvl w:val="1"/>
-          <w:numId w:val="29"/>
-        </w:numPr>
-        <w:rPr>
-          <w:lang w:val="it-IT" w:eastAsia="en-GB"/>
-        </w:rPr>
-      </w:pPr>
-      <w:r>
-        <w:rPr>
-          <w:lang w:val="it-IT" w:eastAsia="en-GB"/>
-        </w:rPr>
-        <w:t>Cibo rimanente sfruttabile</w:t>
-      </w:r>
-    </w:p>
-    <w:p>
-      <w:pPr>
-        <w:numPr>
-          <w:ilvl w:val="1"/>
-          <w:numId w:val="29"/>
-        </w:numPr>
-        <w:rPr>
-          <w:lang w:val="it-IT" w:eastAsia="en-GB"/>
-        </w:rPr>
-      </w:pPr>
-      <w:r>
-        <w:rPr>
-          <w:lang w:val="it-IT" w:eastAsia="en-GB"/>
-        </w:rPr>
-        <w:t>Giorni al raggiungimento soglia 0.25 con attuale ritmo</w:t>
-      </w:r>
-    </w:p>
-    <w:p>
-      <w:pPr>
-        <w:numPr>
-          <w:ilvl w:val="1"/>
-          <w:numId w:val="29"/>
-        </w:numPr>
-        <w:rPr>
-          <w:lang w:val="it-IT" w:eastAsia="en-GB"/>
-        </w:rPr>
-      </w:pPr>
-      <w:r>
-        <w:rPr>
-          <w:lang w:val="it-IT" w:eastAsia="en-GB"/>
-        </w:rPr>
-        <w:t>Giorni al raggiungimento soglia 0 con attuale ritmo</w:t>
-      </w:r>
-    </w:p>
-    <w:p>
-      <w:pPr>
-        <w:numPr>
-          <w:ilvl w:val="1"/>
-          <w:numId w:val="29"/>
-        </w:numPr>
-        <w:rPr>
-          <w:lang w:val="it-IT" w:eastAsia="en-GB"/>
-        </w:rPr>
-      </w:pPr>
-      <w:r>
-        <w:rPr>
-          <w:lang w:val="it-IT" w:eastAsia="en-GB"/>
-        </w:rPr>
-        <w:t>Aumento di cibo raccolto al giorno se aggiungo qualcuno a lavorarci</w:t>
-      </w:r>
-    </w:p>
-    <w:p>
-      <w:pPr>
-        <w:numPr>
-          <w:ilvl w:val="1"/>
-          <w:numId w:val="29"/>
-        </w:numPr>
-        <w:rPr>
-          <w:lang w:val="it-IT" w:eastAsia="en-GB"/>
-        </w:rPr>
-      </w:pPr>
-      <w:r>
-        <w:rPr>
-          <w:lang w:val="it-IT" w:eastAsia="en-GB"/>
-        </w:rPr>
-        <w:lastRenderedPageBreak/>
-        <w:t>Giorni in meno che ci vorranno per raggiungere la soglia 0.25 e 0 se aggiungo un lavoratore</w:t>
-      </w:r>
-    </w:p>
-    <w:p>
-      <w:pPr>
-        <w:numPr>
-          <w:ilvl w:val="0"/>
-          <w:numId w:val="29"/>
-        </w:numPr>
-        <w:rPr>
-          <w:lang w:val="it-IT" w:eastAsia="en-GB"/>
-        </w:rPr>
-      </w:pPr>
-      <w:r>
-        <w:rPr>
-          <w:lang w:val="it-IT" w:eastAsia="en-GB"/>
-        </w:rPr>
-        <w:t xml:space="preserve">Quando un lavoratore viene assegnato a lavorare come </w:t>
-      </w:r>
-      <w:proofErr w:type="spellStart"/>
-      <w:r>
-        <w:rPr>
-          <w:lang w:val="it-IT" w:eastAsia="en-GB"/>
-        </w:rPr>
-        <w:t>gatherer</w:t>
-      </w:r>
-      <w:proofErr w:type="spellEnd"/>
-      <w:r>
-        <w:rPr>
-          <w:lang w:val="it-IT" w:eastAsia="en-GB"/>
-        </w:rPr>
-        <w:t xml:space="preserve"> una cella, esso diventa membro del pop dei </w:t>
-      </w:r>
-      <w:proofErr w:type="spellStart"/>
-      <w:r>
-        <w:rPr>
-          <w:lang w:val="it-IT" w:eastAsia="en-GB"/>
-        </w:rPr>
-        <w:t>gatherers</w:t>
-      </w:r>
-      <w:proofErr w:type="spellEnd"/>
-      <w:r>
-        <w:rPr>
-          <w:lang w:val="it-IT" w:eastAsia="en-GB"/>
-        </w:rPr>
-        <w:t xml:space="preserve"> anche se non fa parte di una spedizione </w:t>
-      </w:r>
-      <w:proofErr w:type="spellStart"/>
-      <w:r>
-        <w:rPr>
-          <w:lang w:val="it-IT" w:eastAsia="en-GB"/>
-        </w:rPr>
-        <w:t>gatherers</w:t>
-      </w:r>
-      <w:proofErr w:type="spellEnd"/>
+          <w:sz w:val="36"/>
+          <w:szCs w:val="36"/>
+          <w:lang w:val="it-IT"/>
+        </w:rPr>
+        <w:t>DA IMPLEMENTARE</w:t>
+      </w:r>
     </w:p>
     <w:p>
       <w:pPr>
@@ -3769,6 +3769,7 @@
         <w:rPr>
           <w:lang w:val="it-IT"/>
         </w:rPr>
+        <w:lastRenderedPageBreak/>
         <w:t>Meccanica: il giocatore non può esaurire una zona per sempre, ma deve ruotare le aree di raccolta per non restare senza cibo. Questo introduce una prima forma di gestione sostenibile delle risorse.</w:t>
       </w:r>
     </w:p>
@@ -3787,7 +3788,6 @@
         <w:rPr>
           <w:lang w:val="it-IT" w:eastAsia="en-GB"/>
         </w:rPr>
-        <w:lastRenderedPageBreak/>
         <w:t>Nota: la rigenerazione qui implementata sarà una versione semplificata e temporanea. In futuro sarà legata alla tipologia di terreno e seguirà una curva di crescita più realistica (rigenerazione più rapida a densità più alte). I valori attuali andranno poi bilanciati tramite il pannello di debug (Batch 6).</w:t>
       </w:r>
     </w:p>
@@ -4203,6 +4203,7 @@
         <w:rPr>
           <w:lang w:val="it-IT" w:eastAsia="en-GB"/>
         </w:rPr>
+        <w:lastRenderedPageBreak/>
         <w:t>Rotazione automatica delle aree di raccolta da parte delle spedizioni, per evitare l'impoverimento permanente di una singola zona (comportamento di raccolta più conservativo e sostenibile).</w:t>
       </w:r>
     </w:p>
@@ -4221,7 +4222,6 @@
         <w:rPr>
           <w:lang w:val="it-IT" w:eastAsia="en-GB"/>
         </w:rPr>
-        <w:lastRenderedPageBreak/>
         <w:t>Algoritmo di raccolta con priorità alle celle a media densità (es. 0.4-0.7) per massimizzare la rigenerazione complessiva dell'area.</w:t>
       </w:r>
     </w:p>
@@ -4572,6 +4572,7 @@
         <w:rPr>
           <w:lang w:val="it-IT"/>
         </w:rPr>
+        <w:lastRenderedPageBreak/>
         <w:t>Branchi di grandi animali appaiono sulla mappa come entità mobili. Ogni branco ha una specie, un numero di capi, un habitat preferito e un tasso di riproduzione.</w:t>
       </w:r>
     </w:p>
@@ -4589,7 +4590,6 @@
         <w:rPr>
           <w:lang w:val="it-IT"/>
         </w:rPr>
-        <w:lastRenderedPageBreak/>
         <w:t>Il giocatore può assegnare un pop alla caccia: deve avvicinarsi al branco, e ogni ciclo di caccia riduce i capi e produce carne e pelli. Se il branco scende sotto una soglia, si estingue localmente.</w:t>
       </w:r>
     </w:p>
@@ -4997,6 +4997,7 @@
     </w:p>
     <w:p>
       <w:r>
+        <w:lastRenderedPageBreak/>
         <w:t xml:space="preserve">Testo </w:t>
       </w:r>
       <w:proofErr w:type="spellStart"/>
@@ -5030,7 +5031,6 @@
         <w:rPr>
           <w:lang w:val="it-IT"/>
         </w:rPr>
-        <w:lastRenderedPageBreak/>
         <w:t>Il campo base ha una "riserva di cibo" che non conosci esattamente: vedi una stima arrotondata.</w:t>
       </w:r>
     </w:p>
@@ -5422,6 +5422,7 @@
         <w:rPr>
           <w:lang w:val="it-IT"/>
         </w:rPr>
+        <w:lastRenderedPageBreak/>
         <w:t>Prima però procederemo a raffinare il loop cacciatore/raccoglitore con lo sviluppo tecnologico della pietra, dei primi edifici e delle prime strutture sociali e progressi culturali.</w:t>
       </w:r>
     </w:p>

</xml_diff>